<commit_message>
Add bibliography section and refresh Word document
</commit_message>
<xml_diff>
--- a/docs/DOCUMENT_COMPLEMENTAIRE_CONTENU_FR.docx
+++ b/docs/DOCUMENT_COMPLEMENTAIRE_CONTENU_FR.docx
@@ -273,7 +273,7 @@
         </w:rPr>
         <w:fldChar w:fldCharType="separate"/>
       </w:r>
-      <w:hyperlink w:anchor="_Toc227932562" w:history="1">
+      <w:hyperlink w:anchor="_Toc227953899" w:history="1">
         <w:r>
           <w:rPr>
             <w:rStyle w:val="Lienhypertexte"/>
@@ -300,7 +300,7 @@
             <w:noProof/>
             <w:webHidden/>
           </w:rPr>
-          <w:instrText xml:space="preserve"> PAGEREF _Toc227932562 \h </w:instrText>
+          <w:instrText xml:space="preserve"> PAGEREF _Toc227953899 \h </w:instrText>
         </w:r>
         <w:r>
           <w:rPr>
@@ -344,7 +344,7 @@
           <w14:ligatures w14:val="standardContextual"/>
         </w:rPr>
       </w:pPr>
-      <w:hyperlink w:anchor="_Toc227932563" w:history="1">
+      <w:hyperlink w:anchor="_Toc227953900" w:history="1">
         <w:r>
           <w:rPr>
             <w:rStyle w:val="Lienhypertexte"/>
@@ -372,7 +372,7 @@
             <w:noProof/>
             <w:webHidden/>
           </w:rPr>
-          <w:instrText xml:space="preserve"> PAGEREF _Toc227932563 \h </w:instrText>
+          <w:instrText xml:space="preserve"> PAGEREF _Toc227953900 \h </w:instrText>
         </w:r>
         <w:r>
           <w:rPr>
@@ -416,7 +416,7 @@
           <w14:ligatures w14:val="standardContextual"/>
         </w:rPr>
       </w:pPr>
-      <w:hyperlink w:anchor="_Toc227932564" w:history="1">
+      <w:hyperlink w:anchor="_Toc227953901" w:history="1">
         <w:r>
           <w:rPr>
             <w:rStyle w:val="Lienhypertexte"/>
@@ -443,7 +443,7 @@
             <w:noProof/>
             <w:webHidden/>
           </w:rPr>
-          <w:instrText xml:space="preserve"> PAGEREF _Toc227932564 \h </w:instrText>
+          <w:instrText xml:space="preserve"> PAGEREF _Toc227953901 \h </w:instrText>
         </w:r>
         <w:r>
           <w:rPr>
@@ -487,7 +487,7 @@
           <w14:ligatures w14:val="standardContextual"/>
         </w:rPr>
       </w:pPr>
-      <w:hyperlink w:anchor="_Toc227932565" w:history="1">
+      <w:hyperlink w:anchor="_Toc227953902" w:history="1">
         <w:r>
           <w:rPr>
             <w:rStyle w:val="Lienhypertexte"/>
@@ -515,7 +515,7 @@
             <w:noProof/>
             <w:webHidden/>
           </w:rPr>
-          <w:instrText xml:space="preserve"> PAGEREF _Toc227932565 \h </w:instrText>
+          <w:instrText xml:space="preserve"> PAGEREF _Toc227953902 \h </w:instrText>
         </w:r>
         <w:r>
           <w:rPr>
@@ -559,13 +559,13 @@
           <w14:ligatures w14:val="standardContextual"/>
         </w:rPr>
       </w:pPr>
-      <w:hyperlink w:anchor="_Toc227932566" w:history="1">
+      <w:hyperlink w:anchor="_Toc227953903" w:history="1">
         <w:r>
           <w:rPr>
             <w:rStyle w:val="Lienhypertexte"/>
             <w:noProof/>
           </w:rPr>
-          <w:t>2. PROPOSITION D’UN CADRE D’ANALYSE</w:t>
+          <w:t>2. CADRE D’ANALYSE</w:t>
         </w:r>
         <w:r>
           <w:rPr>
@@ -586,7 +586,7 @@
             <w:noProof/>
             <w:webHidden/>
           </w:rPr>
-          <w:instrText xml:space="preserve"> PAGEREF _Toc227932566 \h </w:instrText>
+          <w:instrText xml:space="preserve"> PAGEREF _Toc227953903 \h </w:instrText>
         </w:r>
         <w:r>
           <w:rPr>
@@ -630,7 +630,7 @@
           <w14:ligatures w14:val="standardContextual"/>
         </w:rPr>
       </w:pPr>
-      <w:hyperlink w:anchor="_Toc227932567" w:history="1">
+      <w:hyperlink w:anchor="_Toc227953904" w:history="1">
         <w:r>
           <w:rPr>
             <w:rStyle w:val="Lienhypertexte"/>
@@ -658,7 +658,7 @@
             <w:noProof/>
             <w:webHidden/>
           </w:rPr>
-          <w:instrText xml:space="preserve"> PAGEREF _Toc227932567 \h </w:instrText>
+          <w:instrText xml:space="preserve"> PAGEREF _Toc227953904 \h </w:instrText>
         </w:r>
         <w:r>
           <w:rPr>
@@ -702,7 +702,7 @@
           <w14:ligatures w14:val="standardContextual"/>
         </w:rPr>
       </w:pPr>
-      <w:hyperlink w:anchor="_Toc227932568" w:history="1">
+      <w:hyperlink w:anchor="_Toc227953905" w:history="1">
         <w:r>
           <w:rPr>
             <w:rStyle w:val="Lienhypertexte"/>
@@ -729,7 +729,7 @@
             <w:noProof/>
             <w:webHidden/>
           </w:rPr>
-          <w:instrText xml:space="preserve"> PAGEREF _Toc227932568 \h </w:instrText>
+          <w:instrText xml:space="preserve"> PAGEREF _Toc227953905 \h </w:instrText>
         </w:r>
         <w:r>
           <w:rPr>
@@ -773,7 +773,7 @@
           <w14:ligatures w14:val="standardContextual"/>
         </w:rPr>
       </w:pPr>
-      <w:hyperlink w:anchor="_Toc227932569" w:history="1">
+      <w:hyperlink w:anchor="_Toc227953906" w:history="1">
         <w:r>
           <w:rPr>
             <w:rStyle w:val="Lienhypertexte"/>
@@ -800,7 +800,7 @@
             <w:noProof/>
             <w:webHidden/>
           </w:rPr>
-          <w:instrText xml:space="preserve"> PAGEREF _Toc227932569 \h </w:instrText>
+          <w:instrText xml:space="preserve"> PAGEREF _Toc227953906 \h </w:instrText>
         </w:r>
         <w:r>
           <w:rPr>
@@ -844,7 +844,7 @@
           <w14:ligatures w14:val="standardContextual"/>
         </w:rPr>
       </w:pPr>
-      <w:hyperlink w:anchor="_Toc227932570" w:history="1">
+      <w:hyperlink w:anchor="_Toc227953907" w:history="1">
         <w:r>
           <w:rPr>
             <w:rStyle w:val="Lienhypertexte"/>
@@ -871,7 +871,7 @@
             <w:noProof/>
             <w:webHidden/>
           </w:rPr>
-          <w:instrText xml:space="preserve"> PAGEREF _Toc227932570 \h </w:instrText>
+          <w:instrText xml:space="preserve"> PAGEREF _Toc227953907 \h </w:instrText>
         </w:r>
         <w:r>
           <w:rPr>
@@ -915,7 +915,7 @@
           <w14:ligatures w14:val="standardContextual"/>
         </w:rPr>
       </w:pPr>
-      <w:hyperlink w:anchor="_Toc227932571" w:history="1">
+      <w:hyperlink w:anchor="_Toc227953908" w:history="1">
         <w:r>
           <w:rPr>
             <w:rStyle w:val="Lienhypertexte"/>
@@ -942,7 +942,7 @@
             <w:noProof/>
             <w:webHidden/>
           </w:rPr>
-          <w:instrText xml:space="preserve"> PAGEREF _Toc227932571 \h </w:instrText>
+          <w:instrText xml:space="preserve"> PAGEREF _Toc227953908 \h </w:instrText>
         </w:r>
         <w:r>
           <w:rPr>
@@ -986,14 +986,14 @@
           <w14:ligatures w14:val="standardContextual"/>
         </w:rPr>
       </w:pPr>
-      <w:hyperlink w:anchor="_Toc227932572" w:history="1">
+      <w:hyperlink w:anchor="_Toc227953909" w:history="1">
         <w:r>
           <w:rPr>
             <w:rStyle w:val="Lienhypertexte"/>
             <w:rFonts w:eastAsia="Times New Roman"/>
             <w:noProof/>
           </w:rPr>
-          <w:t>TROIS PROPOSITIONS, P1, P2, P3</w:t>
+          <w:t>LE CADRE PROPOSITIONNEL INTEGRÉ : P1, P2, P3</w:t>
         </w:r>
         <w:r>
           <w:rPr>
@@ -1014,7 +1014,7 @@
             <w:noProof/>
             <w:webHidden/>
           </w:rPr>
-          <w:instrText xml:space="preserve"> PAGEREF _Toc227932572 \h </w:instrText>
+          <w:instrText xml:space="preserve"> PAGEREF _Toc227953909 \h </w:instrText>
         </w:r>
         <w:r>
           <w:rPr>
@@ -1058,7 +1058,7 @@
           <w14:ligatures w14:val="standardContextual"/>
         </w:rPr>
       </w:pPr>
-      <w:hyperlink w:anchor="_Toc227932573" w:history="1">
+      <w:hyperlink w:anchor="_Toc227953910" w:history="1">
         <w:r>
           <w:rPr>
             <w:rStyle w:val="Lienhypertexte"/>
@@ -1086,7 +1086,7 @@
             <w:noProof/>
             <w:webHidden/>
           </w:rPr>
-          <w:instrText xml:space="preserve"> PAGEREF _Toc227932573 \h </w:instrText>
+          <w:instrText xml:space="preserve"> PAGEREF _Toc227953910 \h </w:instrText>
         </w:r>
         <w:r>
           <w:rPr>
@@ -1130,7 +1130,7 @@
           <w14:ligatures w14:val="standardContextual"/>
         </w:rPr>
       </w:pPr>
-      <w:hyperlink w:anchor="_Toc227932574" w:history="1">
+      <w:hyperlink w:anchor="_Toc227953911" w:history="1">
         <w:r>
           <w:rPr>
             <w:rStyle w:val="Lienhypertexte"/>
@@ -1157,7 +1157,7 @@
             <w:noProof/>
             <w:webHidden/>
           </w:rPr>
-          <w:instrText xml:space="preserve"> PAGEREF _Toc227932574 \h </w:instrText>
+          <w:instrText xml:space="preserve"> PAGEREF _Toc227953911 \h </w:instrText>
         </w:r>
         <w:r>
           <w:rPr>
@@ -1201,7 +1201,7 @@
           <w14:ligatures w14:val="standardContextual"/>
         </w:rPr>
       </w:pPr>
-      <w:hyperlink w:anchor="_Toc227932575" w:history="1">
+      <w:hyperlink w:anchor="_Toc227953912" w:history="1">
         <w:r>
           <w:rPr>
             <w:rStyle w:val="Lienhypertexte"/>
@@ -1229,7 +1229,7 @@
             <w:noProof/>
             <w:webHidden/>
           </w:rPr>
-          <w:instrText xml:space="preserve"> PAGEREF _Toc227932575 \h </w:instrText>
+          <w:instrText xml:space="preserve"> PAGEREF _Toc227953912 \h </w:instrText>
         </w:r>
         <w:r>
           <w:rPr>
@@ -1273,7 +1273,7 @@
           <w14:ligatures w14:val="standardContextual"/>
         </w:rPr>
       </w:pPr>
-      <w:hyperlink w:anchor="_Toc227932576" w:history="1">
+      <w:hyperlink w:anchor="_Toc227953913" w:history="1">
         <w:r>
           <w:rPr>
             <w:rStyle w:val="Lienhypertexte"/>
@@ -1301,7 +1301,7 @@
             <w:noProof/>
             <w:webHidden/>
           </w:rPr>
-          <w:instrText xml:space="preserve"> PAGEREF _Toc227932576 \h </w:instrText>
+          <w:instrText xml:space="preserve"> PAGEREF _Toc227953913 \h </w:instrText>
         </w:r>
         <w:r>
           <w:rPr>
@@ -1345,7 +1345,7 @@
           <w14:ligatures w14:val="standardContextual"/>
         </w:rPr>
       </w:pPr>
-      <w:hyperlink w:anchor="_Toc227932577" w:history="1">
+      <w:hyperlink w:anchor="_Toc227953914" w:history="1">
         <w:r>
           <w:rPr>
             <w:rStyle w:val="Lienhypertexte"/>
@@ -1373,7 +1373,7 @@
             <w:noProof/>
             <w:webHidden/>
           </w:rPr>
-          <w:instrText xml:space="preserve"> PAGEREF _Toc227932577 \h </w:instrText>
+          <w:instrText xml:space="preserve"> PAGEREF _Toc227953914 \h </w:instrText>
         </w:r>
         <w:r>
           <w:rPr>
@@ -1417,7 +1417,7 @@
           <w14:ligatures w14:val="standardContextual"/>
         </w:rPr>
       </w:pPr>
-      <w:hyperlink w:anchor="_Toc227932578" w:history="1">
+      <w:hyperlink w:anchor="_Toc227953915" w:history="1">
         <w:r>
           <w:rPr>
             <w:rStyle w:val="Lienhypertexte"/>
@@ -1445,7 +1445,7 @@
             <w:noProof/>
             <w:webHidden/>
           </w:rPr>
-          <w:instrText xml:space="preserve"> PAGEREF _Toc227932578 \h </w:instrText>
+          <w:instrText xml:space="preserve"> PAGEREF _Toc227953915 \h </w:instrText>
         </w:r>
         <w:r>
           <w:rPr>
@@ -1489,7 +1489,7 @@
           <w14:ligatures w14:val="standardContextual"/>
         </w:rPr>
       </w:pPr>
-      <w:hyperlink w:anchor="_Toc227932579" w:history="1">
+      <w:hyperlink w:anchor="_Toc227953916" w:history="1">
         <w:r>
           <w:rPr>
             <w:rStyle w:val="Lienhypertexte"/>
@@ -1516,7 +1516,7 @@
             <w:noProof/>
             <w:webHidden/>
           </w:rPr>
-          <w:instrText xml:space="preserve"> PAGEREF _Toc227932579 \h </w:instrText>
+          <w:instrText xml:space="preserve"> PAGEREF _Toc227953916 \h </w:instrText>
         </w:r>
         <w:r>
           <w:rPr>
@@ -1560,7 +1560,7 @@
           <w14:ligatures w14:val="standardContextual"/>
         </w:rPr>
       </w:pPr>
-      <w:hyperlink w:anchor="_Toc227932580" w:history="1">
+      <w:hyperlink w:anchor="_Toc227953917" w:history="1">
         <w:r>
           <w:rPr>
             <w:rStyle w:val="Lienhypertexte"/>
@@ -1588,7 +1588,7 @@
             <w:noProof/>
             <w:webHidden/>
           </w:rPr>
-          <w:instrText xml:space="preserve"> PAGEREF _Toc227932580 \h </w:instrText>
+          <w:instrText xml:space="preserve"> PAGEREF _Toc227953917 \h </w:instrText>
         </w:r>
         <w:r>
           <w:rPr>
@@ -1632,7 +1632,7 @@
           <w14:ligatures w14:val="standardContextual"/>
         </w:rPr>
       </w:pPr>
-      <w:hyperlink w:anchor="_Toc227932581" w:history="1">
+      <w:hyperlink w:anchor="_Toc227953918" w:history="1">
         <w:r>
           <w:rPr>
             <w:rStyle w:val="Lienhypertexte"/>
@@ -1660,7 +1660,7 @@
             <w:noProof/>
             <w:webHidden/>
           </w:rPr>
-          <w:instrText xml:space="preserve"> PAGEREF _Toc227932581 \h </w:instrText>
+          <w:instrText xml:space="preserve"> PAGEREF _Toc227953918 \h </w:instrText>
         </w:r>
         <w:r>
           <w:rPr>
@@ -1704,7 +1704,7 @@
           <w14:ligatures w14:val="standardContextual"/>
         </w:rPr>
       </w:pPr>
-      <w:hyperlink w:anchor="_Toc227932582" w:history="1">
+      <w:hyperlink w:anchor="_Toc227953919" w:history="1">
         <w:r>
           <w:rPr>
             <w:rStyle w:val="Lienhypertexte"/>
@@ -1731,7 +1731,7 @@
             <w:noProof/>
             <w:webHidden/>
           </w:rPr>
-          <w:instrText xml:space="preserve"> PAGEREF _Toc227932582 \h </w:instrText>
+          <w:instrText xml:space="preserve"> PAGEREF _Toc227953919 \h </w:instrText>
         </w:r>
         <w:r>
           <w:rPr>
@@ -1775,7 +1775,7 @@
           <w14:ligatures w14:val="standardContextual"/>
         </w:rPr>
       </w:pPr>
-      <w:hyperlink w:anchor="_Toc227932583" w:history="1">
+      <w:hyperlink w:anchor="_Toc227953920" w:history="1">
         <w:r>
           <w:rPr>
             <w:rStyle w:val="Lienhypertexte"/>
@@ -1802,7 +1802,7 @@
             <w:noProof/>
             <w:webHidden/>
           </w:rPr>
-          <w:instrText xml:space="preserve"> PAGEREF _Toc227932583 \h </w:instrText>
+          <w:instrText xml:space="preserve"> PAGEREF _Toc227953920 \h </w:instrText>
         </w:r>
         <w:r>
           <w:rPr>
@@ -1856,7 +1856,7 @@
       <w:pPr>
         <w:pStyle w:val="Titre1"/>
       </w:pPr>
-      <w:bookmarkStart w:id="0" w:name="_Toc227932562"/>
+      <w:bookmarkStart w:id="0" w:name="_Toc227953899"/>
       <w:r>
         <w:t>1. POSITIONNEMENT DE LA RECHERCHE</w:t>
       </w:r>
@@ -1870,7 +1870,7 @@
           <w:color w:val="4472C4" w:themeColor="accent1"/>
         </w:rPr>
       </w:pPr>
-      <w:bookmarkStart w:id="1" w:name="_Toc227932563"/>
+      <w:bookmarkStart w:id="1" w:name="_Toc227953900"/>
       <w:r>
         <w:rPr>
           <w:rFonts w:eastAsia="Times New Roman"/>
@@ -2649,7 +2649,7 @@
       <w:pPr>
         <w:pStyle w:val="Titre2"/>
       </w:pPr>
-      <w:bookmarkStart w:id="2" w:name="_Toc227932564"/>
+      <w:bookmarkStart w:id="2" w:name="_Toc227953901"/>
       <w:r>
         <w:t>E</w:t>
       </w:r>
@@ -3203,7 +3203,7 @@
         </w:rPr>
       </w:pPr>
       <w:bookmarkStart w:id="3" w:name="_Hlk227872854"/>
-      <w:bookmarkStart w:id="4" w:name="_Toc227932565"/>
+      <w:bookmarkStart w:id="4" w:name="_Toc227953902"/>
       <w:r>
         <w:rPr>
           <w:rFonts w:eastAsia="Times New Roman"/>
@@ -4373,7 +4373,7 @@
       <w:pPr>
         <w:pStyle w:val="Titre1"/>
       </w:pPr>
-      <w:bookmarkStart w:id="5" w:name="_Toc227932566"/>
+      <w:bookmarkStart w:id="5" w:name="_Toc227953903"/>
       <w:r>
         <w:lastRenderedPageBreak/>
         <w:t xml:space="preserve">2. CADRE </w:t>
@@ -4391,7 +4391,7 @@
           <w:color w:val="3A332D"/>
         </w:rPr>
       </w:pPr>
-      <w:bookmarkStart w:id="6" w:name="_Toc227932567"/>
+      <w:bookmarkStart w:id="6" w:name="_Toc227953904"/>
       <w:r>
         <w:rPr>
           <w:rFonts w:eastAsia="Times New Roman"/>
@@ -4410,7 +4410,7 @@
       <w:pPr>
         <w:pStyle w:val="Titre3"/>
       </w:pPr>
-      <w:bookmarkStart w:id="7" w:name="_Toc227932568"/>
+      <w:bookmarkStart w:id="7" w:name="_Toc227953905"/>
       <w:r>
         <w:t>L</w:t>
       </w:r>
@@ -4794,7 +4794,7 @@
       <w:pPr>
         <w:pStyle w:val="Titre3"/>
       </w:pPr>
-      <w:bookmarkStart w:id="8" w:name="_Toc227932569"/>
+      <w:bookmarkStart w:id="8" w:name="_Toc227953906"/>
       <w:r>
         <w:t xml:space="preserve">La valeur perçue </w:t>
       </w:r>
@@ -6263,7 +6263,7 @@
       <w:pPr>
         <w:pStyle w:val="Titre3"/>
       </w:pPr>
-      <w:bookmarkStart w:id="9" w:name="_Toc227932570"/>
+      <w:bookmarkStart w:id="9" w:name="_Toc227953907"/>
       <w:r>
         <w:t>L’IA</w:t>
       </w:r>
@@ -7433,7 +7433,7 @@
       <w:pPr>
         <w:pStyle w:val="Titre2"/>
       </w:pPr>
-      <w:bookmarkStart w:id="10" w:name="_Toc227932571"/>
+      <w:bookmarkStart w:id="10" w:name="_Toc227953908"/>
       <w:r>
         <w:t>Propositions</w:t>
       </w:r>
@@ -7490,7 +7490,71 @@
           <w:sz w:val="27"/>
           <w:szCs w:val="27"/>
         </w:rPr>
-        <w:t>un cadre propositionnel intégré, où P1 est la composante ontologique, P2 la composante mécanistique et P3 la composante contingente.</w:t>
+        <w:t>un cadre propositionnel intégré</w:t>
+      </w:r>
+      <w:r>
+        <w:rPr>
+          <w:rFonts w:ascii="-webkit-standard" w:hAnsi="-webkit-standard"/>
+          <w:color w:val="000000"/>
+          <w:sz w:val="27"/>
+          <w:szCs w:val="27"/>
+        </w:rPr>
+        <w:t xml:space="preserve"> </w:t>
+      </w:r>
+      <w:r>
+        <w:rPr>
+          <w:rFonts w:ascii="-webkit-standard" w:hAnsi="-webkit-standard"/>
+          <w:color w:val="000000"/>
+          <w:sz w:val="27"/>
+          <w:szCs w:val="27"/>
+        </w:rPr>
+        <w:fldChar w:fldCharType="begin"/>
+      </w:r>
+      <w:r>
+        <w:rPr>
+          <w:rFonts w:ascii="-webkit-standard" w:hAnsi="-webkit-standard"/>
+          <w:color w:val="000000"/>
+          <w:sz w:val="27"/>
+          <w:szCs w:val="27"/>
+        </w:rPr>
+        <w:instrText xml:space="preserve"> ADDIN ZOTERO_ITEM CSL_CITATION {"citationID":"AMw5uRqT","properties":{"unsorted":false,"formattedCitation":"(Eisenhardt, 1989; Eisenhardt &amp; Graebner, 2007)","plainCitation":"(Eisenhardt, 1989; Eisenhardt &amp; Graebner, 2007)","noteIndex":0},"citationItems":[{"id":14687,"uris":["http://zotero.org/users/12622049/items/XLRDNNCZ"],"itemData":{"id":14687,"type":"article-journal","abstract":"This paper describes the process of inducting theory using case studies-from specifying the research questions to reaching closure. Some features of the process, such as problem definition and construct validation, are similar to hypothesis-testing research. Others, such as within-case analysis and replication logic, are unique to the inductive, case-oriented process. Overall, the process described here is highly iterative and tightly linked to data. This research approach is especially appropriate in new topic areas. The resultant theory is often novel, testable, and empirically valid. Finally, framebreaking insights, the tests of good theory (e.g., parsimony, logical coherence), and convincing grounding in the evidence are the key criteria for evaluating this type of research.","call-number":"1*","citation-key":"eisenhardtBuildingTheoriesCase1989","container-title":"The Academy of Management Review","DOI":"10.2307/258557","ISSN":"0363-7425","issue":"4","page":"532-550","publisher":"Academy of Management","source":"JSTOR","title":"Building Theories from Case Study Research","volume":"14","author":[{"family":"Eisenhardt","given":"Kathleen M."}],"issued":{"date-parts":[["1989"]]}}},{"id":14695,"uris":["http://zotero.org/users/12622049/items/LMHTVQTL"],"itemData":{"id":14695,"type":"document","call-number":"1*","citation-key":"NoTitleFound","language":"en","publisher":"Academy of Management","source":"DOI.org (Crossref)","title":"Theory Building from Cases: Opportunities and Challenges","author":[{"family":"Eisenhardt","given":"Kathleen M."},{"family":"Graebner","given":"Melissa E."}],"issued":{"date-parts":[["2007",2]]}}}],"schema":"https://github.com/citation-style-language/schema/raw/master/csl-citation.json"} </w:instrText>
+      </w:r>
+      <w:r>
+        <w:rPr>
+          <w:rFonts w:ascii="-webkit-standard" w:hAnsi="-webkit-standard"/>
+          <w:color w:val="000000"/>
+          <w:sz w:val="27"/>
+          <w:szCs w:val="27"/>
+        </w:rPr>
+        <w:fldChar w:fldCharType="separate"/>
+      </w:r>
+      <w:r>
+        <w:rPr>
+          <w:rFonts w:ascii="-webkit-standard" w:hAnsi="-webkit-standard"/>
+          <w:noProof/>
+          <w:color w:val="000000"/>
+          <w:sz w:val="27"/>
+          <w:szCs w:val="27"/>
+        </w:rPr>
+        <w:t>(Eisenhardt, 1989; Eisenhardt &amp; Graebner, 2007)</w:t>
+      </w:r>
+      <w:r>
+        <w:rPr>
+          <w:rFonts w:ascii="-webkit-standard" w:hAnsi="-webkit-standard"/>
+          <w:color w:val="000000"/>
+          <w:sz w:val="27"/>
+          <w:szCs w:val="27"/>
+        </w:rPr>
+        <w:fldChar w:fldCharType="end"/>
+      </w:r>
+      <w:r>
+        <w:rPr>
+          <w:rFonts w:ascii="-webkit-standard" w:hAnsi="-webkit-standard"/>
+          <w:color w:val="000000"/>
+          <w:sz w:val="27"/>
+          <w:szCs w:val="27"/>
+        </w:rPr>
+        <w:t>, où P1 est la composante ontologique, P2 la composante mécanistique et P3 la composante contingente.</w:t>
       </w:r>
     </w:p>
     <w:p>
@@ -7658,7 +7722,7 @@
           <w:rFonts w:eastAsia="Times New Roman"/>
         </w:rPr>
       </w:pPr>
-      <w:bookmarkStart w:id="11" w:name="_Toc227932572"/>
+      <w:bookmarkStart w:id="11" w:name="_Toc227953909"/>
       <w:r>
         <w:rPr>
           <w:rFonts w:eastAsia="Times New Roman"/>
@@ -7963,7 +8027,7 @@
           <w:rFonts w:eastAsia="Times New Roman"/>
         </w:rPr>
       </w:pPr>
-      <w:bookmarkStart w:id="12" w:name="_Toc227932573"/>
+      <w:bookmarkStart w:id="12" w:name="_Toc227953910"/>
       <w:r>
         <w:rPr>
           <w:rFonts w:eastAsia="Times New Roman"/>
@@ -10098,7 +10162,7 @@
       <w:pPr>
         <w:pStyle w:val="Titre1"/>
       </w:pPr>
-      <w:bookmarkStart w:id="13" w:name="_Toc227932574"/>
+      <w:bookmarkStart w:id="13" w:name="_Toc227953911"/>
       <w:r>
         <w:lastRenderedPageBreak/>
         <w:t>3. CADRE D'OBSERVATION</w:t>
@@ -10115,7 +10179,7 @@
           <w:rFonts w:eastAsia="Times New Roman"/>
         </w:rPr>
       </w:pPr>
-      <w:bookmarkStart w:id="14" w:name="_Toc227932575"/>
+      <w:bookmarkStart w:id="14" w:name="_Toc227953912"/>
       <w:r>
         <w:rPr>
           <w:rFonts w:eastAsia="Times New Roman"/>
@@ -10729,7 +10793,7 @@
           <w:rFonts w:eastAsia="Times New Roman"/>
         </w:rPr>
       </w:pPr>
-      <w:bookmarkStart w:id="15" w:name="_Toc227932576"/>
+      <w:bookmarkStart w:id="15" w:name="_Toc227953913"/>
       <w:r>
         <w:rPr>
           <w:rFonts w:eastAsia="Times New Roman"/>
@@ -11017,7 +11081,7 @@
           <w:color w:val="4A4038"/>
         </w:rPr>
       </w:pPr>
-      <w:bookmarkStart w:id="16" w:name="_Toc227932577"/>
+      <w:bookmarkStart w:id="16" w:name="_Toc227953914"/>
       <w:r>
         <w:rPr>
           <w:rFonts w:eastAsia="Times New Roman"/>
@@ -11253,7 +11317,7 @@
           <w:color w:val="4A4038"/>
         </w:rPr>
       </w:pPr>
-      <w:bookmarkStart w:id="17" w:name="_Toc227932578"/>
+      <w:bookmarkStart w:id="17" w:name="_Toc227953915"/>
       <w:r>
         <w:rPr>
           <w:rFonts w:eastAsia="Times New Roman"/>
@@ -11609,7 +11673,7 @@
       <w:pPr>
         <w:pStyle w:val="Titre1"/>
       </w:pPr>
-      <w:bookmarkStart w:id="18" w:name="_Toc227932579"/>
+      <w:bookmarkStart w:id="18" w:name="_Toc227953916"/>
       <w:r>
         <w:t>4. ILLUSTRATION</w:t>
       </w:r>
@@ -11624,7 +11688,7 @@
           <w:szCs w:val="28"/>
         </w:rPr>
       </w:pPr>
-      <w:bookmarkStart w:id="19" w:name="_Toc227932580"/>
+      <w:bookmarkStart w:id="19" w:name="_Toc227953917"/>
       <w:r>
         <w:rPr>
           <w:rFonts w:eastAsia="Times New Roman"/>
@@ -12217,7 +12281,7 @@
           <w:szCs w:val="28"/>
         </w:rPr>
       </w:pPr>
-      <w:bookmarkStart w:id="20" w:name="_Toc227932581"/>
+      <w:bookmarkStart w:id="20" w:name="_Toc227953918"/>
       <w:r>
         <w:rPr>
           <w:rFonts w:eastAsia="Times New Roman"/>
@@ -13927,7 +13991,7 @@
           <w:color w:val="4472C4" w:themeColor="accent1"/>
         </w:rPr>
       </w:pPr>
-      <w:bookmarkStart w:id="21" w:name="_Toc227932582"/>
+      <w:bookmarkStart w:id="21" w:name="_Toc227953919"/>
       <w:r>
         <w:rPr>
           <w:b w:val="0"/>
@@ -14150,7 +14214,7 @@
         <w:pStyle w:val="Titre1"/>
         <w:divId w:val="491409308"/>
       </w:pPr>
-      <w:bookmarkStart w:id="22" w:name="_Toc227932583"/>
+      <w:bookmarkStart w:id="22" w:name="_Toc227953920"/>
       <w:r>
         <w:lastRenderedPageBreak/>
         <w:t>BIBLIOGRAPHIE</w:t>
@@ -14559,6 +14623,7 @@
     <w:p>
       <w:pPr>
         <w:pStyle w:val="Bibliographie"/>
+        <w:ind w:left="1416"/>
         <w:divId w:val="491409308"/>
         <w:rPr>
           <w:rFonts w:eastAsia="Times New Roman"/>
@@ -14806,7 +14871,6 @@
           <w:lang w:val="en-US"/>
         </w:rPr>
       </w:pPr>
-      <w:proofErr w:type="spellStart"/>
       <w:r>
         <w:rPr>
           <w:rFonts w:eastAsia="Times New Roman"/>
@@ -14814,57 +14878,7 @@
           <w:sz w:val="28"/>
           <w:lang w:val="en-US"/>
         </w:rPr>
-        <w:t>Glückler</w:t>
-      </w:r>
-      <w:proofErr w:type="spellEnd"/>
-      <w:r>
-        <w:rPr>
-          <w:rFonts w:eastAsia="Times New Roman"/>
-          <w:color w:val="808080"/>
-          <w:sz w:val="28"/>
-          <w:lang w:val="en-US"/>
-        </w:rPr>
-        <w:t xml:space="preserve">, J., &amp; </w:t>
-      </w:r>
-      <w:proofErr w:type="spellStart"/>
-      <w:r>
-        <w:rPr>
-          <w:rFonts w:eastAsia="Times New Roman"/>
-          <w:color w:val="808080"/>
-          <w:sz w:val="28"/>
-          <w:lang w:val="en-US"/>
-        </w:rPr>
-        <w:t>Armbrüster</w:t>
-      </w:r>
-      <w:proofErr w:type="spellEnd"/>
-      <w:r>
-        <w:rPr>
-          <w:rFonts w:eastAsia="Times New Roman"/>
-          <w:color w:val="808080"/>
-          <w:sz w:val="28"/>
-          <w:lang w:val="en-US"/>
-        </w:rPr>
-        <w:t xml:space="preserve">, T. (2003). Bridging Uncertainty in Management </w:t>
-      </w:r>
-      <w:proofErr w:type="gramStart"/>
-      <w:r>
-        <w:rPr>
-          <w:rFonts w:eastAsia="Times New Roman"/>
-          <w:color w:val="808080"/>
-          <w:sz w:val="28"/>
-          <w:lang w:val="en-US"/>
-        </w:rPr>
-        <w:t>Consulting :</w:t>
-      </w:r>
-      <w:proofErr w:type="gramEnd"/>
-      <w:r>
-        <w:rPr>
-          <w:rFonts w:eastAsia="Times New Roman"/>
-          <w:color w:val="808080"/>
-          <w:sz w:val="28"/>
-          <w:lang w:val="en-US"/>
-        </w:rPr>
-        <w:t xml:space="preserve"> The Mechanisms of Trust and Networked Reputation. </w:t>
+        <w:t xml:space="preserve">Eisenhardt, K. M. (1989). Building Theories from Case Study Research. </w:t>
       </w:r>
       <w:r>
         <w:rPr>
@@ -14875,7 +14889,7 @@
           <w:sz w:val="28"/>
           <w:lang w:val="en-US"/>
         </w:rPr>
-        <w:t>Organization Studies</w:t>
+        <w:t>The Academy of Management Review</w:t>
       </w:r>
       <w:r>
         <w:rPr>
@@ -14884,7 +14898,27 @@
           <w:sz w:val="28"/>
           <w:lang w:val="en-US"/>
         </w:rPr>
-        <w:t>.</w:t>
+        <w:t xml:space="preserve">, </w:t>
+      </w:r>
+      <w:r>
+        <w:rPr>
+          <w:rFonts w:eastAsia="Times New Roman"/>
+          <w:i/>
+          <w:iCs/>
+          <w:color w:val="808080"/>
+          <w:sz w:val="28"/>
+          <w:lang w:val="en-US"/>
+        </w:rPr>
+        <w:t>14</w:t>
+      </w:r>
+      <w:r>
+        <w:rPr>
+          <w:rFonts w:eastAsia="Times New Roman"/>
+          <w:color w:val="808080"/>
+          <w:sz w:val="28"/>
+          <w:lang w:val="en-US"/>
+        </w:rPr>
+        <w:t>(4), 532‑550. https://doi.org/10.2307/258557</w:t>
       </w:r>
     </w:p>
     <w:p>
@@ -14898,6 +14932,15 @@
           <w:lang w:val="en-US"/>
         </w:rPr>
       </w:pPr>
+      <w:r>
+        <w:rPr>
+          <w:rFonts w:eastAsia="Times New Roman"/>
+          <w:color w:val="808080"/>
+          <w:sz w:val="28"/>
+          <w:lang w:val="en-US"/>
+        </w:rPr>
+        <w:t xml:space="preserve">Eisenhardt, K. M., &amp; </w:t>
+      </w:r>
       <w:proofErr w:type="spellStart"/>
       <w:r>
         <w:rPr>
@@ -14906,7 +14949,7 @@
           <w:sz w:val="28"/>
           <w:lang w:val="en-US"/>
         </w:rPr>
-        <w:t>Grönroos</w:t>
+        <w:t>Graebner</w:t>
       </w:r>
       <w:proofErr w:type="spellEnd"/>
       <w:r>
@@ -14916,7 +14959,7 @@
           <w:sz w:val="28"/>
           <w:lang w:val="en-US"/>
         </w:rPr>
-        <w:t xml:space="preserve">, C., &amp; </w:t>
+        <w:t xml:space="preserve">, M. E. (2007, </w:t>
       </w:r>
       <w:proofErr w:type="spellStart"/>
       <w:r>
@@ -14926,7 +14969,7 @@
           <w:sz w:val="28"/>
           <w:lang w:val="en-US"/>
         </w:rPr>
-        <w:t>Voima</w:t>
+        <w:t>février</w:t>
       </w:r>
       <w:proofErr w:type="spellEnd"/>
       <w:r>
@@ -14936,27 +14979,7 @@
           <w:sz w:val="28"/>
           <w:lang w:val="en-US"/>
         </w:rPr>
-        <w:t xml:space="preserve">, P. (2013). Critical Service </w:t>
-      </w:r>
-      <w:proofErr w:type="gramStart"/>
-      <w:r>
-        <w:rPr>
-          <w:rFonts w:eastAsia="Times New Roman"/>
-          <w:color w:val="808080"/>
-          <w:sz w:val="28"/>
-          <w:lang w:val="en-US"/>
-        </w:rPr>
-        <w:t>Logic :</w:t>
-      </w:r>
-      <w:proofErr w:type="gramEnd"/>
-      <w:r>
-        <w:rPr>
-          <w:rFonts w:eastAsia="Times New Roman"/>
-          <w:color w:val="808080"/>
-          <w:sz w:val="28"/>
-          <w:lang w:val="en-US"/>
-        </w:rPr>
-        <w:t xml:space="preserve"> Making Sense of Value Creation and Co-Creation. </w:t>
+        <w:t xml:space="preserve">). </w:t>
       </w:r>
       <w:r>
         <w:rPr>
@@ -14967,17 +14990,9 @@
           <w:sz w:val="28"/>
           <w:lang w:val="en-US"/>
         </w:rPr>
-        <w:t>Journal of the Academy of Marketing Science</w:t>
-      </w:r>
-      <w:r>
-        <w:rPr>
-          <w:rFonts w:eastAsia="Times New Roman"/>
-          <w:color w:val="808080"/>
-          <w:sz w:val="28"/>
-          <w:lang w:val="en-US"/>
-        </w:rPr>
-        <w:t xml:space="preserve">, </w:t>
-      </w:r>
+        <w:t xml:space="preserve">Theory Building from </w:t>
+      </w:r>
+      <w:proofErr w:type="gramStart"/>
       <w:r>
         <w:rPr>
           <w:rFonts w:eastAsia="Times New Roman"/>
@@ -14987,16 +15002,28 @@
           <w:sz w:val="28"/>
           <w:lang w:val="en-US"/>
         </w:rPr>
-        <w:t>41</w:t>
-      </w:r>
-      <w:r>
-        <w:rPr>
-          <w:rFonts w:eastAsia="Times New Roman"/>
+        <w:t>Cases :</w:t>
+      </w:r>
+      <w:proofErr w:type="gramEnd"/>
+      <w:r>
+        <w:rPr>
+          <w:rFonts w:eastAsia="Times New Roman"/>
+          <w:i/>
+          <w:iCs/>
           <w:color w:val="808080"/>
           <w:sz w:val="28"/>
           <w:lang w:val="en-US"/>
         </w:rPr>
-        <w:t>, 133‑150. https://doi.org/10.1007/s11747-012-0308-3</w:t>
+        <w:t xml:space="preserve"> Opportunities and Challenges</w:t>
+      </w:r>
+      <w:r>
+        <w:rPr>
+          <w:rFonts w:eastAsia="Times New Roman"/>
+          <w:color w:val="808080"/>
+          <w:sz w:val="28"/>
+          <w:lang w:val="en-US"/>
+        </w:rPr>
+        <w:t>. Academy of Management.</w:t>
       </w:r>
     </w:p>
     <w:p>
@@ -15010,22 +15037,15 @@
           <w:lang w:val="en-US"/>
         </w:rPr>
       </w:pPr>
-      <w:r>
-        <w:rPr>
-          <w:rFonts w:eastAsia="Times New Roman"/>
-          <w:color w:val="808080"/>
-          <w:sz w:val="28"/>
-        </w:rPr>
-        <w:t xml:space="preserve">Harfouche, A., </w:t>
-      </w:r>
       <w:proofErr w:type="spellStart"/>
       <w:r>
         <w:rPr>
           <w:rFonts w:eastAsia="Times New Roman"/>
           <w:color w:val="808080"/>
           <w:sz w:val="28"/>
-        </w:rPr>
-        <w:t>Quinio</w:t>
+          <w:lang w:val="en-US"/>
+        </w:rPr>
+        <w:t>Glückler</w:t>
       </w:r>
       <w:proofErr w:type="spellEnd"/>
       <w:r>
@@ -15033,17 +15053,29 @@
           <w:rFonts w:eastAsia="Times New Roman"/>
           <w:color w:val="808080"/>
           <w:sz w:val="28"/>
-        </w:rPr>
-        <w:t xml:space="preserve">, B., Saba, M., &amp; Saba, P. B. (2023). </w:t>
-      </w:r>
-      <w:r>
-        <w:rPr>
-          <w:rFonts w:eastAsia="Times New Roman"/>
-          <w:color w:val="808080"/>
-          <w:sz w:val="28"/>
           <w:lang w:val="en-US"/>
         </w:rPr>
-        <w:t xml:space="preserve">The Recursive Theory of Knowledge </w:t>
+        <w:t xml:space="preserve">, J., &amp; </w:t>
+      </w:r>
+      <w:proofErr w:type="spellStart"/>
+      <w:r>
+        <w:rPr>
+          <w:rFonts w:eastAsia="Times New Roman"/>
+          <w:color w:val="808080"/>
+          <w:sz w:val="28"/>
+          <w:lang w:val="en-US"/>
+        </w:rPr>
+        <w:t>Armbrüster</w:t>
+      </w:r>
+      <w:proofErr w:type="spellEnd"/>
+      <w:r>
+        <w:rPr>
+          <w:rFonts w:eastAsia="Times New Roman"/>
+          <w:color w:val="808080"/>
+          <w:sz w:val="28"/>
+          <w:lang w:val="en-US"/>
+        </w:rPr>
+        <w:t xml:space="preserve">, T. (2003). Bridging Uncertainty in Management </w:t>
       </w:r>
       <w:proofErr w:type="gramStart"/>
       <w:r>
@@ -15053,7 +15085,7 @@
           <w:sz w:val="28"/>
           <w:lang w:val="en-US"/>
         </w:rPr>
-        <w:t>Augmentation :</w:t>
+        <w:t>Consulting :</w:t>
       </w:r>
       <w:proofErr w:type="gramEnd"/>
       <w:r>
@@ -15063,7 +15095,7 @@
           <w:sz w:val="28"/>
           <w:lang w:val="en-US"/>
         </w:rPr>
-        <w:t xml:space="preserve"> Integrating human intuition and knowledge in Artificial Intelligence to augment organizational knowledge. </w:t>
+        <w:t xml:space="preserve"> The Mechanisms of Trust and Networked Reputation. </w:t>
       </w:r>
       <w:r>
         <w:rPr>
@@ -15074,7 +15106,7 @@
           <w:sz w:val="28"/>
           <w:lang w:val="en-US"/>
         </w:rPr>
-        <w:t>Information Systems Frontiers</w:t>
+        <w:t>Organization Studies</w:t>
       </w:r>
       <w:r>
         <w:rPr>
@@ -15083,7 +15115,79 @@
           <w:sz w:val="28"/>
           <w:lang w:val="en-US"/>
         </w:rPr>
-        <w:t xml:space="preserve">, </w:t>
+        <w:t>.</w:t>
+      </w:r>
+    </w:p>
+    <w:p>
+      <w:pPr>
+        <w:pStyle w:val="Bibliographie"/>
+        <w:divId w:val="491409308"/>
+        <w:rPr>
+          <w:rFonts w:eastAsia="Times New Roman"/>
+          <w:color w:val="808080"/>
+          <w:sz w:val="28"/>
+          <w:lang w:val="en-US"/>
+        </w:rPr>
+      </w:pPr>
+      <w:proofErr w:type="spellStart"/>
+      <w:r>
+        <w:rPr>
+          <w:rFonts w:eastAsia="Times New Roman"/>
+          <w:color w:val="808080"/>
+          <w:sz w:val="28"/>
+          <w:lang w:val="en-US"/>
+        </w:rPr>
+        <w:t>Grönroos</w:t>
+      </w:r>
+      <w:proofErr w:type="spellEnd"/>
+      <w:r>
+        <w:rPr>
+          <w:rFonts w:eastAsia="Times New Roman"/>
+          <w:color w:val="808080"/>
+          <w:sz w:val="28"/>
+          <w:lang w:val="en-US"/>
+        </w:rPr>
+        <w:t xml:space="preserve">, C., &amp; </w:t>
+      </w:r>
+      <w:proofErr w:type="spellStart"/>
+      <w:r>
+        <w:rPr>
+          <w:rFonts w:eastAsia="Times New Roman"/>
+          <w:color w:val="808080"/>
+          <w:sz w:val="28"/>
+          <w:lang w:val="en-US"/>
+        </w:rPr>
+        <w:t>Voima</w:t>
+      </w:r>
+      <w:proofErr w:type="spellEnd"/>
+      <w:r>
+        <w:rPr>
+          <w:rFonts w:eastAsia="Times New Roman"/>
+          <w:color w:val="808080"/>
+          <w:sz w:val="28"/>
+          <w:lang w:val="en-US"/>
+        </w:rPr>
+        <w:t xml:space="preserve">, P. (2013). Critical Service </w:t>
+      </w:r>
+      <w:proofErr w:type="gramStart"/>
+      <w:r>
+        <w:rPr>
+          <w:rFonts w:eastAsia="Times New Roman"/>
+          <w:color w:val="808080"/>
+          <w:sz w:val="28"/>
+          <w:lang w:val="en-US"/>
+        </w:rPr>
+        <w:t>Logic :</w:t>
+      </w:r>
+      <w:proofErr w:type="gramEnd"/>
+      <w:r>
+        <w:rPr>
+          <w:rFonts w:eastAsia="Times New Roman"/>
+          <w:color w:val="808080"/>
+          <w:sz w:val="28"/>
+          <w:lang w:val="en-US"/>
+        </w:rPr>
+        <w:t xml:space="preserve"> Making Sense of Value Creation and Co-Creation. </w:t>
       </w:r>
       <w:r>
         <w:rPr>
@@ -15094,7 +15198,7 @@
           <w:sz w:val="28"/>
           <w:lang w:val="en-US"/>
         </w:rPr>
-        <w:t>25</w:t>
+        <w:t>Journal of the Academy of Marketing Science</w:t>
       </w:r>
       <w:r>
         <w:rPr>
@@ -15103,7 +15207,27 @@
           <w:sz w:val="28"/>
           <w:lang w:val="en-US"/>
         </w:rPr>
-        <w:t>(1), 55‑70. https://doi.org/10.1007/s10796-022-10352-8</w:t>
+        <w:t xml:space="preserve">, </w:t>
+      </w:r>
+      <w:r>
+        <w:rPr>
+          <w:rFonts w:eastAsia="Times New Roman"/>
+          <w:i/>
+          <w:iCs/>
+          <w:color w:val="808080"/>
+          <w:sz w:val="28"/>
+          <w:lang w:val="en-US"/>
+        </w:rPr>
+        <w:t>41</w:t>
+      </w:r>
+      <w:r>
+        <w:rPr>
+          <w:rFonts w:eastAsia="Times New Roman"/>
+          <w:color w:val="808080"/>
+          <w:sz w:val="28"/>
+          <w:lang w:val="en-US"/>
+        </w:rPr>
+        <w:t>, 133‑150. https://doi.org/10.1007/s11747-012-0308-3</w:t>
       </w:r>
     </w:p>
     <w:p>
@@ -15122,11 +15246,37 @@
           <w:rFonts w:eastAsia="Times New Roman"/>
           <w:color w:val="808080"/>
           <w:sz w:val="28"/>
+        </w:rPr>
+        <w:t xml:space="preserve">Harfouche, A., </w:t>
+      </w:r>
+      <w:proofErr w:type="spellStart"/>
+      <w:r>
+        <w:rPr>
+          <w:rFonts w:eastAsia="Times New Roman"/>
+          <w:color w:val="808080"/>
+          <w:sz w:val="28"/>
+        </w:rPr>
+        <w:t>Quinio</w:t>
+      </w:r>
+      <w:proofErr w:type="spellEnd"/>
+      <w:r>
+        <w:rPr>
+          <w:rFonts w:eastAsia="Times New Roman"/>
+          <w:color w:val="808080"/>
+          <w:sz w:val="28"/>
+        </w:rPr>
+        <w:t xml:space="preserve">, B., Saba, M., &amp; Saba, P. B. (2023). </w:t>
+      </w:r>
+      <w:r>
+        <w:rPr>
+          <w:rFonts w:eastAsia="Times New Roman"/>
+          <w:color w:val="808080"/>
+          <w:sz w:val="28"/>
           <w:lang w:val="en-US"/>
         </w:rPr>
-        <w:t xml:space="preserve">Long, D., &amp; </w:t>
-      </w:r>
-      <w:proofErr w:type="spellStart"/>
+        <w:t xml:space="preserve">The Recursive Theory of Knowledge </w:t>
+      </w:r>
+      <w:proofErr w:type="gramStart"/>
       <w:r>
         <w:rPr>
           <w:rFonts w:eastAsia="Times New Roman"/>
@@ -15134,9 +15284,9 @@
           <w:sz w:val="28"/>
           <w:lang w:val="en-US"/>
         </w:rPr>
-        <w:t>Magerko</w:t>
-      </w:r>
-      <w:proofErr w:type="spellEnd"/>
+        <w:t>Augmentation :</w:t>
+      </w:r>
+      <w:proofErr w:type="gramEnd"/>
       <w:r>
         <w:rPr>
           <w:rFonts w:eastAsia="Times New Roman"/>
@@ -15144,7 +15294,7 @@
           <w:sz w:val="28"/>
           <w:lang w:val="en-US"/>
         </w:rPr>
-        <w:t xml:space="preserve">, B. (2020). What is AI Literacy? Competencies and Design Considerations. </w:t>
+        <w:t xml:space="preserve"> Integrating human intuition and knowledge in Artificial Intelligence to augment organizational knowledge. </w:t>
       </w:r>
       <w:r>
         <w:rPr>
@@ -15155,7 +15305,7 @@
           <w:sz w:val="28"/>
           <w:lang w:val="en-US"/>
         </w:rPr>
-        <w:t>Proceedings of the 2020 CHI Conference on Human Factors in Computing Systems</w:t>
+        <w:t>Information Systems Frontiers</w:t>
       </w:r>
       <w:r>
         <w:rPr>
@@ -15164,7 +15314,27 @@
           <w:sz w:val="28"/>
           <w:lang w:val="en-US"/>
         </w:rPr>
-        <w:t>, 1‑16. https://doi.org/10.1145/3313831.3376727</w:t>
+        <w:t xml:space="preserve">, </w:t>
+      </w:r>
+      <w:r>
+        <w:rPr>
+          <w:rFonts w:eastAsia="Times New Roman"/>
+          <w:i/>
+          <w:iCs/>
+          <w:color w:val="808080"/>
+          <w:sz w:val="28"/>
+          <w:lang w:val="en-US"/>
+        </w:rPr>
+        <w:t>25</w:t>
+      </w:r>
+      <w:r>
+        <w:rPr>
+          <w:rFonts w:eastAsia="Times New Roman"/>
+          <w:color w:val="808080"/>
+          <w:sz w:val="28"/>
+          <w:lang w:val="en-US"/>
+        </w:rPr>
+        <w:t>(1), 55‑70. https://doi.org/10.1007/s10796-022-10352-8</w:t>
       </w:r>
     </w:p>
     <w:p>
@@ -15175,15 +15345,17 @@
           <w:rFonts w:eastAsia="Times New Roman"/>
           <w:color w:val="808080"/>
           <w:sz w:val="28"/>
-        </w:rPr>
-      </w:pPr>
-      <w:r>
-        <w:rPr>
-          <w:rFonts w:eastAsia="Times New Roman"/>
-          <w:color w:val="808080"/>
-          <w:sz w:val="28"/>
-        </w:rPr>
-        <w:t xml:space="preserve">Masson, P., &amp; </w:t>
+          <w:lang w:val="en-US"/>
+        </w:rPr>
+      </w:pPr>
+      <w:r>
+        <w:rPr>
+          <w:rFonts w:eastAsia="Times New Roman"/>
+          <w:color w:val="808080"/>
+          <w:sz w:val="28"/>
+          <w:lang w:val="en-US"/>
+        </w:rPr>
+        <w:t xml:space="preserve">Long, D., &amp; </w:t>
       </w:r>
       <w:proofErr w:type="spellStart"/>
       <w:r>
@@ -15191,8 +15363,9 @@
           <w:rFonts w:eastAsia="Times New Roman"/>
           <w:color w:val="808080"/>
           <w:sz w:val="28"/>
-        </w:rPr>
-        <w:t>Dautrif</w:t>
+          <w:lang w:val="en-US"/>
+        </w:rPr>
+        <w:t>Magerko</w:t>
       </w:r>
       <w:proofErr w:type="spellEnd"/>
       <w:r>
@@ -15200,10 +15373,10 @@
           <w:rFonts w:eastAsia="Times New Roman"/>
           <w:color w:val="808080"/>
           <w:sz w:val="28"/>
-        </w:rPr>
-        <w:t xml:space="preserve">, S. (2026, janvier 27). </w:t>
-      </w:r>
-      <w:proofErr w:type="spellStart"/>
+          <w:lang w:val="en-US"/>
+        </w:rPr>
+        <w:t xml:space="preserve">, B. (2020). What is AI Literacy? Competencies and Design Considerations. </w:t>
+      </w:r>
       <w:r>
         <w:rPr>
           <w:rFonts w:eastAsia="Times New Roman"/>
@@ -15211,17 +15384,18 @@
           <w:iCs/>
           <w:color w:val="808080"/>
           <w:sz w:val="28"/>
-        </w:rPr>
-        <w:t>Livre_Blanc_Conseil_Puissance_IA</w:t>
-      </w:r>
-      <w:proofErr w:type="spellEnd"/>
-      <w:r>
-        <w:rPr>
-          <w:rFonts w:eastAsia="Times New Roman"/>
-          <w:color w:val="808080"/>
-          <w:sz w:val="28"/>
-        </w:rPr>
-        <w:t>. HEC Alumni. https://conseil-puissance-ia.fr</w:t>
+          <w:lang w:val="en-US"/>
+        </w:rPr>
+        <w:t>Proceedings of the 2020 CHI Conference on Human Factors in Computing Systems</w:t>
+      </w:r>
+      <w:r>
+        <w:rPr>
+          <w:rFonts w:eastAsia="Times New Roman"/>
+          <w:color w:val="808080"/>
+          <w:sz w:val="28"/>
+          <w:lang w:val="en-US"/>
+        </w:rPr>
+        <w:t>, 1‑16. https://doi.org/10.1145/3313831.3376727</w:t>
       </w:r>
     </w:p>
     <w:p>
@@ -15232,9 +15406,17 @@
           <w:rFonts w:eastAsia="Times New Roman"/>
           <w:color w:val="808080"/>
           <w:sz w:val="28"/>
-          <w:lang w:val="en-US"/>
-        </w:rPr>
-      </w:pPr>
+        </w:rPr>
+      </w:pPr>
+      <w:r>
+        <w:rPr>
+          <w:rFonts w:eastAsia="Times New Roman"/>
+          <w:color w:val="808080"/>
+          <w:sz w:val="28"/>
+        </w:rPr>
+        <w:lastRenderedPageBreak/>
+        <w:t xml:space="preserve">Masson, P., &amp; </w:t>
+      </w:r>
       <w:proofErr w:type="spellStart"/>
       <w:r>
         <w:rPr>
@@ -15242,7 +15424,7 @@
           <w:color w:val="808080"/>
           <w:sz w:val="28"/>
         </w:rPr>
-        <w:t>Nikolova</w:t>
+        <w:t>Dautrif</w:t>
       </w:r>
       <w:proofErr w:type="spellEnd"/>
       <w:r>
@@ -15251,26 +15433,9 @@
           <w:color w:val="808080"/>
           <w:sz w:val="28"/>
         </w:rPr>
-        <w:t xml:space="preserve">, N., &amp; </w:t>
+        <w:t xml:space="preserve">, S. (2026, janvier 27). </w:t>
       </w:r>
       <w:proofErr w:type="spellStart"/>
-      <w:r>
-        <w:rPr>
-          <w:rFonts w:eastAsia="Times New Roman"/>
-          <w:color w:val="808080"/>
-          <w:sz w:val="28"/>
-        </w:rPr>
-        <w:t>Devinney</w:t>
-      </w:r>
-      <w:proofErr w:type="spellEnd"/>
-      <w:r>
-        <w:rPr>
-          <w:rFonts w:eastAsia="Times New Roman"/>
-          <w:color w:val="808080"/>
-          <w:sz w:val="28"/>
-        </w:rPr>
-        <w:t xml:space="preserve">, T. (2012, mars 29). </w:t>
-      </w:r>
       <w:r>
         <w:rPr>
           <w:rFonts w:eastAsia="Times New Roman"/>
@@ -15278,11 +15443,66 @@
           <w:iCs/>
           <w:color w:val="808080"/>
           <w:sz w:val="28"/>
+        </w:rPr>
+        <w:t>Livre_Blanc_Conseil_Puissance_IA</w:t>
+      </w:r>
+      <w:proofErr w:type="spellEnd"/>
+      <w:r>
+        <w:rPr>
+          <w:rFonts w:eastAsia="Times New Roman"/>
+          <w:color w:val="808080"/>
+          <w:sz w:val="28"/>
+        </w:rPr>
+        <w:t>. HEC Alumni. https://conseil-puissance-ia.fr</w:t>
+      </w:r>
+    </w:p>
+    <w:p>
+      <w:pPr>
+        <w:pStyle w:val="Bibliographie"/>
+        <w:divId w:val="491409308"/>
+        <w:rPr>
+          <w:rFonts w:eastAsia="Times New Roman"/>
+          <w:color w:val="808080"/>
+          <w:sz w:val="28"/>
           <w:lang w:val="en-US"/>
         </w:rPr>
-        <w:t xml:space="preserve">The Nature Of Client–Consultant </w:t>
-      </w:r>
-      <w:proofErr w:type="gramStart"/>
+      </w:pPr>
+      <w:proofErr w:type="spellStart"/>
+      <w:r>
+        <w:rPr>
+          <w:rFonts w:eastAsia="Times New Roman"/>
+          <w:color w:val="808080"/>
+          <w:sz w:val="28"/>
+        </w:rPr>
+        <w:t>Nikolova</w:t>
+      </w:r>
+      <w:proofErr w:type="spellEnd"/>
+      <w:r>
+        <w:rPr>
+          <w:rFonts w:eastAsia="Times New Roman"/>
+          <w:color w:val="808080"/>
+          <w:sz w:val="28"/>
+        </w:rPr>
+        <w:t xml:space="preserve">, N., &amp; </w:t>
+      </w:r>
+      <w:proofErr w:type="spellStart"/>
+      <w:r>
+        <w:rPr>
+          <w:rFonts w:eastAsia="Times New Roman"/>
+          <w:color w:val="808080"/>
+          <w:sz w:val="28"/>
+        </w:rPr>
+        <w:t>Devinney</w:t>
+      </w:r>
+      <w:proofErr w:type="spellEnd"/>
+      <w:r>
+        <w:rPr>
+          <w:rFonts w:eastAsia="Times New Roman"/>
+          <w:color w:val="808080"/>
+          <w:sz w:val="28"/>
+        </w:rPr>
+        <w:t xml:space="preserve">, T. (2012, mars 29). </w:t>
+      </w:r>
       <w:r>
         <w:rPr>
           <w:rFonts w:eastAsia="Times New Roman"/>
@@ -15292,9 +15512,9 @@
           <w:sz w:val="28"/>
           <w:lang w:val="en-US"/>
         </w:rPr>
-        <w:t>Interaction :</w:t>
-      </w:r>
-      <w:proofErr w:type="gramEnd"/>
+        <w:t xml:space="preserve">The Nature Of Client–Consultant </w:t>
+      </w:r>
+      <w:proofErr w:type="gramStart"/>
       <w:r>
         <w:rPr>
           <w:rFonts w:eastAsia="Times New Roman"/>
@@ -15304,6 +15524,18 @@
           <w:sz w:val="28"/>
           <w:lang w:val="en-US"/>
         </w:rPr>
+        <w:t>Interaction :</w:t>
+      </w:r>
+      <w:proofErr w:type="gramEnd"/>
+      <w:r>
+        <w:rPr>
+          <w:rFonts w:eastAsia="Times New Roman"/>
+          <w:i/>
+          <w:iCs/>
+          <w:color w:val="808080"/>
+          <w:sz w:val="28"/>
+          <w:lang w:val="en-US"/>
+        </w:rPr>
         <w:t xml:space="preserve"> A Critical Review</w:t>
       </w:r>
       <w:r>
@@ -15334,7 +15566,6 @@
           <w:sz w:val="28"/>
           <w:lang w:val="en-US"/>
         </w:rPr>
-        <w:lastRenderedPageBreak/>
         <w:t xml:space="preserve">Oesterle, S., Buchwald, A., &amp; </w:t>
       </w:r>
       <w:proofErr w:type="spellStart"/>
@@ -15742,6 +15973,7 @@
           <w:sz w:val="28"/>
           <w:lang w:val="en-US"/>
         </w:rPr>
+        <w:lastRenderedPageBreak/>
         <w:t>Raisch</w:t>
       </w:r>
       <w:proofErr w:type="spellEnd"/>
@@ -15884,17 +16116,7 @@
           <w:sz w:val="28"/>
           <w:lang w:val="en-US"/>
         </w:rPr>
-        <w:t>. https://www.semanticscholar.org/paper/Artificial-</w:t>
-      </w:r>
-      <w:r>
-        <w:rPr>
-          <w:rFonts w:eastAsia="Times New Roman"/>
-          <w:color w:val="808080"/>
-          <w:sz w:val="28"/>
-          <w:lang w:val="en-US"/>
-        </w:rPr>
-        <w:lastRenderedPageBreak/>
-        <w:t>Intelligence-and-Management%3A-The-Paradox-Raisch-Krakowski/9c145390e6073c96e89cf03d3df3b559f0bb0496</w:t>
+        <w:t>. https://www.semanticscholar.org/paper/Artificial-Intelligence-and-Management%3A-The-Paradox-Raisch-Krakowski/9c145390e6073c96e89cf03d3df3b559f0bb0496</w:t>
       </w:r>
     </w:p>
     <w:p>
@@ -16167,7 +16389,6 @@
     <w:p>
       <w:pPr>
         <w:pStyle w:val="Bibliographie"/>
-        <w:jc w:val="both"/>
         <w:divId w:val="491409308"/>
         <w:rPr>
           <w:sz w:val="28"/>

</xml_diff>

<commit_message>
Refresh exploratory framework micro-edits
</commit_message>
<xml_diff>
--- a/docs/DOCUMENT_COMPLEMENTAIRE_CONTENU_FR.docx
+++ b/docs/DOCUMENT_COMPLEMENTAIRE_CONTENU_FR.docx
@@ -313,7 +313,7 @@
         </w:rPr>
         <w:fldChar w:fldCharType="separate"/>
       </w:r>
-      <w:hyperlink w:anchor="_Toc228079808" w:history="1">
+      <w:hyperlink w:anchor="_Toc228080643" w:history="1">
         <w:r>
           <w:rPr>
             <w:rStyle w:val="Lienhypertexte"/>
@@ -340,7 +340,7 @@
             <w:noProof/>
             <w:webHidden/>
           </w:rPr>
-          <w:instrText xml:space="preserve"> PAGEREF _Toc228079808 \h </w:instrText>
+          <w:instrText xml:space="preserve"> PAGEREF _Toc228080643 \h </w:instrText>
         </w:r>
         <w:r>
           <w:rPr>
@@ -384,7 +384,7 @@
           <w14:ligatures w14:val="standardContextual"/>
         </w:rPr>
       </w:pPr>
-      <w:hyperlink w:anchor="_Toc228079809" w:history="1">
+      <w:hyperlink w:anchor="_Toc228080644" w:history="1">
         <w:r>
           <w:rPr>
             <w:rStyle w:val="Lienhypertexte"/>
@@ -412,7 +412,7 @@
             <w:noProof/>
             <w:webHidden/>
           </w:rPr>
-          <w:instrText xml:space="preserve"> PAGEREF _Toc228079809 \h </w:instrText>
+          <w:instrText xml:space="preserve"> PAGEREF _Toc228080644 \h </w:instrText>
         </w:r>
         <w:r>
           <w:rPr>
@@ -456,7 +456,7 @@
           <w14:ligatures w14:val="standardContextual"/>
         </w:rPr>
       </w:pPr>
-      <w:hyperlink w:anchor="_Toc228079810" w:history="1">
+      <w:hyperlink w:anchor="_Toc228080645" w:history="1">
         <w:r>
           <w:rPr>
             <w:rStyle w:val="Lienhypertexte"/>
@@ -483,7 +483,7 @@
             <w:noProof/>
             <w:webHidden/>
           </w:rPr>
-          <w:instrText xml:space="preserve"> PAGEREF _Toc228079810 \h </w:instrText>
+          <w:instrText xml:space="preserve"> PAGEREF _Toc228080645 \h </w:instrText>
         </w:r>
         <w:r>
           <w:rPr>
@@ -527,7 +527,7 @@
           <w14:ligatures w14:val="standardContextual"/>
         </w:rPr>
       </w:pPr>
-      <w:hyperlink w:anchor="_Toc228079811" w:history="1">
+      <w:hyperlink w:anchor="_Toc228080646" w:history="1">
         <w:r>
           <w:rPr>
             <w:rStyle w:val="Lienhypertexte"/>
@@ -555,7 +555,7 @@
             <w:noProof/>
             <w:webHidden/>
           </w:rPr>
-          <w:instrText xml:space="preserve"> PAGEREF _Toc228079811 \h </w:instrText>
+          <w:instrText xml:space="preserve"> PAGEREF _Toc228080646 \h </w:instrText>
         </w:r>
         <w:r>
           <w:rPr>
@@ -599,7 +599,7 @@
           <w14:ligatures w14:val="standardContextual"/>
         </w:rPr>
       </w:pPr>
-      <w:hyperlink w:anchor="_Toc228079812" w:history="1">
+      <w:hyperlink w:anchor="_Toc228080647" w:history="1">
         <w:r>
           <w:rPr>
             <w:rStyle w:val="Lienhypertexte"/>
@@ -626,7 +626,7 @@
             <w:noProof/>
             <w:webHidden/>
           </w:rPr>
-          <w:instrText xml:space="preserve"> PAGEREF _Toc228079812 \h </w:instrText>
+          <w:instrText xml:space="preserve"> PAGEREF _Toc228080647 \h </w:instrText>
         </w:r>
         <w:r>
           <w:rPr>
@@ -670,7 +670,7 @@
           <w14:ligatures w14:val="standardContextual"/>
         </w:rPr>
       </w:pPr>
-      <w:hyperlink w:anchor="_Toc228079813" w:history="1">
+      <w:hyperlink w:anchor="_Toc228080648" w:history="1">
         <w:r>
           <w:rPr>
             <w:rStyle w:val="Lienhypertexte"/>
@@ -698,7 +698,7 @@
             <w:noProof/>
             <w:webHidden/>
           </w:rPr>
-          <w:instrText xml:space="preserve"> PAGEREF _Toc228079813 \h </w:instrText>
+          <w:instrText xml:space="preserve"> PAGEREF _Toc228080648 \h </w:instrText>
         </w:r>
         <w:r>
           <w:rPr>
@@ -742,7 +742,7 @@
           <w14:ligatures w14:val="standardContextual"/>
         </w:rPr>
       </w:pPr>
-      <w:hyperlink w:anchor="_Toc228079814" w:history="1">
+      <w:hyperlink w:anchor="_Toc228080649" w:history="1">
         <w:r>
           <w:rPr>
             <w:rStyle w:val="Lienhypertexte"/>
@@ -769,7 +769,7 @@
             <w:noProof/>
             <w:webHidden/>
           </w:rPr>
-          <w:instrText xml:space="preserve"> PAGEREF _Toc228079814 \h </w:instrText>
+          <w:instrText xml:space="preserve"> PAGEREF _Toc228080649 \h </w:instrText>
         </w:r>
         <w:r>
           <w:rPr>
@@ -813,7 +813,7 @@
           <w14:ligatures w14:val="standardContextual"/>
         </w:rPr>
       </w:pPr>
-      <w:hyperlink w:anchor="_Toc228079815" w:history="1">
+      <w:hyperlink w:anchor="_Toc228080650" w:history="1">
         <w:r>
           <w:rPr>
             <w:rStyle w:val="Lienhypertexte"/>
@@ -840,7 +840,7 @@
             <w:noProof/>
             <w:webHidden/>
           </w:rPr>
-          <w:instrText xml:space="preserve"> PAGEREF _Toc228079815 \h </w:instrText>
+          <w:instrText xml:space="preserve"> PAGEREF _Toc228080650 \h </w:instrText>
         </w:r>
         <w:r>
           <w:rPr>
@@ -884,7 +884,7 @@
           <w14:ligatures w14:val="standardContextual"/>
         </w:rPr>
       </w:pPr>
-      <w:hyperlink w:anchor="_Toc228079816" w:history="1">
+      <w:hyperlink w:anchor="_Toc228080651" w:history="1">
         <w:r>
           <w:rPr>
             <w:rStyle w:val="Lienhypertexte"/>
@@ -911,7 +911,7 @@
             <w:noProof/>
             <w:webHidden/>
           </w:rPr>
-          <w:instrText xml:space="preserve"> PAGEREF _Toc228079816 \h </w:instrText>
+          <w:instrText xml:space="preserve"> PAGEREF _Toc228080651 \h </w:instrText>
         </w:r>
         <w:r>
           <w:rPr>
@@ -955,7 +955,7 @@
           <w14:ligatures w14:val="standardContextual"/>
         </w:rPr>
       </w:pPr>
-      <w:hyperlink w:anchor="_Toc228079817" w:history="1">
+      <w:hyperlink w:anchor="_Toc228080652" w:history="1">
         <w:r>
           <w:rPr>
             <w:rStyle w:val="Lienhypertexte"/>
@@ -982,7 +982,7 @@
             <w:noProof/>
             <w:webHidden/>
           </w:rPr>
-          <w:instrText xml:space="preserve"> PAGEREF _Toc228079817 \h </w:instrText>
+          <w:instrText xml:space="preserve"> PAGEREF _Toc228080652 \h </w:instrText>
         </w:r>
         <w:r>
           <w:rPr>
@@ -1026,7 +1026,7 @@
           <w14:ligatures w14:val="standardContextual"/>
         </w:rPr>
       </w:pPr>
-      <w:hyperlink w:anchor="_Toc228079818" w:history="1">
+      <w:hyperlink w:anchor="_Toc228080653" w:history="1">
         <w:r>
           <w:rPr>
             <w:rStyle w:val="Lienhypertexte"/>
@@ -1054,7 +1054,7 @@
             <w:noProof/>
             <w:webHidden/>
           </w:rPr>
-          <w:instrText xml:space="preserve"> PAGEREF _Toc228079818 \h </w:instrText>
+          <w:instrText xml:space="preserve"> PAGEREF _Toc228080653 \h </w:instrText>
         </w:r>
         <w:r>
           <w:rPr>
@@ -1098,7 +1098,7 @@
           <w14:ligatures w14:val="standardContextual"/>
         </w:rPr>
       </w:pPr>
-      <w:hyperlink w:anchor="_Toc228079819" w:history="1">
+      <w:hyperlink w:anchor="_Toc228080654" w:history="1">
         <w:r>
           <w:rPr>
             <w:rStyle w:val="Lienhypertexte"/>
@@ -1126,7 +1126,7 @@
             <w:noProof/>
             <w:webHidden/>
           </w:rPr>
-          <w:instrText xml:space="preserve"> PAGEREF _Toc228079819 \h </w:instrText>
+          <w:instrText xml:space="preserve"> PAGEREF _Toc228080654 \h </w:instrText>
         </w:r>
         <w:r>
           <w:rPr>
@@ -1170,7 +1170,7 @@
           <w14:ligatures w14:val="standardContextual"/>
         </w:rPr>
       </w:pPr>
-      <w:hyperlink w:anchor="_Toc228079820" w:history="1">
+      <w:hyperlink w:anchor="_Toc228080655" w:history="1">
         <w:r>
           <w:rPr>
             <w:rStyle w:val="Lienhypertexte"/>
@@ -1197,7 +1197,7 @@
             <w:noProof/>
             <w:webHidden/>
           </w:rPr>
-          <w:instrText xml:space="preserve"> PAGEREF _Toc228079820 \h </w:instrText>
+          <w:instrText xml:space="preserve"> PAGEREF _Toc228080655 \h </w:instrText>
         </w:r>
         <w:r>
           <w:rPr>
@@ -1241,7 +1241,7 @@
           <w14:ligatures w14:val="standardContextual"/>
         </w:rPr>
       </w:pPr>
-      <w:hyperlink w:anchor="_Toc228079821" w:history="1">
+      <w:hyperlink w:anchor="_Toc228080656" w:history="1">
         <w:r>
           <w:rPr>
             <w:rStyle w:val="Lienhypertexte"/>
@@ -1269,7 +1269,7 @@
             <w:noProof/>
             <w:webHidden/>
           </w:rPr>
-          <w:instrText xml:space="preserve"> PAGEREF _Toc228079821 \h </w:instrText>
+          <w:instrText xml:space="preserve"> PAGEREF _Toc228080656 \h </w:instrText>
         </w:r>
         <w:r>
           <w:rPr>
@@ -1313,7 +1313,7 @@
           <w14:ligatures w14:val="standardContextual"/>
         </w:rPr>
       </w:pPr>
-      <w:hyperlink w:anchor="_Toc228079822" w:history="1">
+      <w:hyperlink w:anchor="_Toc228080657" w:history="1">
         <w:r>
           <w:rPr>
             <w:rStyle w:val="Lienhypertexte"/>
@@ -1341,7 +1341,7 @@
             <w:noProof/>
             <w:webHidden/>
           </w:rPr>
-          <w:instrText xml:space="preserve"> PAGEREF _Toc228079822 \h </w:instrText>
+          <w:instrText xml:space="preserve"> PAGEREF _Toc228080657 \h </w:instrText>
         </w:r>
         <w:r>
           <w:rPr>
@@ -1385,7 +1385,7 @@
           <w14:ligatures w14:val="standardContextual"/>
         </w:rPr>
       </w:pPr>
-      <w:hyperlink w:anchor="_Toc228079823" w:history="1">
+      <w:hyperlink w:anchor="_Toc228080658" w:history="1">
         <w:r>
           <w:rPr>
             <w:rStyle w:val="Lienhypertexte"/>
@@ -1413,7 +1413,7 @@
             <w:noProof/>
             <w:webHidden/>
           </w:rPr>
-          <w:instrText xml:space="preserve"> PAGEREF _Toc228079823 \h </w:instrText>
+          <w:instrText xml:space="preserve"> PAGEREF _Toc228080658 \h </w:instrText>
         </w:r>
         <w:r>
           <w:rPr>
@@ -1457,7 +1457,7 @@
           <w14:ligatures w14:val="standardContextual"/>
         </w:rPr>
       </w:pPr>
-      <w:hyperlink w:anchor="_Toc228079824" w:history="1">
+      <w:hyperlink w:anchor="_Toc228080659" w:history="1">
         <w:r>
           <w:rPr>
             <w:rStyle w:val="Lienhypertexte"/>
@@ -1485,7 +1485,7 @@
             <w:noProof/>
             <w:webHidden/>
           </w:rPr>
-          <w:instrText xml:space="preserve"> PAGEREF _Toc228079824 \h </w:instrText>
+          <w:instrText xml:space="preserve"> PAGEREF _Toc228080659 \h </w:instrText>
         </w:r>
         <w:r>
           <w:rPr>
@@ -1529,7 +1529,7 @@
           <w14:ligatures w14:val="standardContextual"/>
         </w:rPr>
       </w:pPr>
-      <w:hyperlink w:anchor="_Toc228079825" w:history="1">
+      <w:hyperlink w:anchor="_Toc228080660" w:history="1">
         <w:r>
           <w:rPr>
             <w:rStyle w:val="Lienhypertexte"/>
@@ -1556,7 +1556,7 @@
             <w:noProof/>
             <w:webHidden/>
           </w:rPr>
-          <w:instrText xml:space="preserve"> PAGEREF _Toc228079825 \h </w:instrText>
+          <w:instrText xml:space="preserve"> PAGEREF _Toc228080660 \h </w:instrText>
         </w:r>
         <w:r>
           <w:rPr>
@@ -1600,7 +1600,7 @@
           <w14:ligatures w14:val="standardContextual"/>
         </w:rPr>
       </w:pPr>
-      <w:hyperlink w:anchor="_Toc228079826" w:history="1">
+      <w:hyperlink w:anchor="_Toc228080661" w:history="1">
         <w:r>
           <w:rPr>
             <w:rStyle w:val="Lienhypertexte"/>
@@ -1628,7 +1628,7 @@
             <w:noProof/>
             <w:webHidden/>
           </w:rPr>
-          <w:instrText xml:space="preserve"> PAGEREF _Toc228079826 \h </w:instrText>
+          <w:instrText xml:space="preserve"> PAGEREF _Toc228080661 \h </w:instrText>
         </w:r>
         <w:r>
           <w:rPr>
@@ -1672,7 +1672,7 @@
           <w14:ligatures w14:val="standardContextual"/>
         </w:rPr>
       </w:pPr>
-      <w:hyperlink w:anchor="_Toc228079827" w:history="1">
+      <w:hyperlink w:anchor="_Toc228080662" w:history="1">
         <w:r>
           <w:rPr>
             <w:rStyle w:val="Lienhypertexte"/>
@@ -1700,7 +1700,7 @@
             <w:noProof/>
             <w:webHidden/>
           </w:rPr>
-          <w:instrText xml:space="preserve"> PAGEREF _Toc228079827 \h </w:instrText>
+          <w:instrText xml:space="preserve"> PAGEREF _Toc228080662 \h </w:instrText>
         </w:r>
         <w:r>
           <w:rPr>
@@ -1744,7 +1744,7 @@
           <w14:ligatures w14:val="standardContextual"/>
         </w:rPr>
       </w:pPr>
-      <w:hyperlink w:anchor="_Toc228079828" w:history="1">
+      <w:hyperlink w:anchor="_Toc228080663" w:history="1">
         <w:r>
           <w:rPr>
             <w:rStyle w:val="Lienhypertexte"/>
@@ -1771,7 +1771,7 @@
             <w:noProof/>
             <w:webHidden/>
           </w:rPr>
-          <w:instrText xml:space="preserve"> PAGEREF _Toc228079828 \h </w:instrText>
+          <w:instrText xml:space="preserve"> PAGEREF _Toc228080663 \h </w:instrText>
         </w:r>
         <w:r>
           <w:rPr>
@@ -1815,7 +1815,7 @@
           <w14:ligatures w14:val="standardContextual"/>
         </w:rPr>
       </w:pPr>
-      <w:hyperlink w:anchor="_Toc228079829" w:history="1">
+      <w:hyperlink w:anchor="_Toc228080664" w:history="1">
         <w:r>
           <w:rPr>
             <w:rStyle w:val="Lienhypertexte"/>
@@ -1842,7 +1842,7 @@
             <w:noProof/>
             <w:webHidden/>
           </w:rPr>
-          <w:instrText xml:space="preserve"> PAGEREF _Toc228079829 \h </w:instrText>
+          <w:instrText xml:space="preserve"> PAGEREF _Toc228080664 \h </w:instrText>
         </w:r>
         <w:r>
           <w:rPr>
@@ -1896,7 +1896,7 @@
       <w:pPr>
         <w:pStyle w:val="Titre1"/>
       </w:pPr>
-      <w:bookmarkStart w:id="0" w:name="_Toc228079808"/>
+      <w:bookmarkStart w:id="0" w:name="_Toc228080643"/>
       <w:r>
         <w:t>1. POSITIONNEMENT DE LA RECHERCHE</w:t>
       </w:r>
@@ -1910,7 +1910,7 @@
           <w:color w:val="4472C4" w:themeColor="accent1"/>
         </w:rPr>
       </w:pPr>
-      <w:bookmarkStart w:id="1" w:name="_Toc228079809"/>
+      <w:bookmarkStart w:id="1" w:name="_Toc228080644"/>
       <w:r>
         <w:rPr>
           <w:rFonts w:eastAsia="Times New Roman"/>
@@ -1980,25 +1980,16 @@
           <w:sz w:val="28"/>
           <w:szCs w:val="28"/>
         </w:rPr>
-        <w:t xml:space="preserve">, </w:t>
-      </w:r>
-      <w:r>
-        <w:rPr>
-          <w:rFonts w:eastAsia="Times New Roman"/>
-          <w:color w:val="1F1A16"/>
-          <w:sz w:val="28"/>
-          <w:szCs w:val="28"/>
-        </w:rPr>
-        <w:t>pensé</w:t>
-      </w:r>
-      <w:r>
-        <w:rPr>
-          <w:rFonts w:eastAsia="Times New Roman"/>
-          <w:color w:val="1F1A16"/>
-          <w:sz w:val="28"/>
-          <w:szCs w:val="28"/>
-        </w:rPr>
-        <w:t xml:space="preserve"> comme une opportunité d’accroitre la valeur, tout en générant des défis en matière de sécurité, d’éthique, de gouvernance des données</w:t>
+        <w:t xml:space="preserve">. Il constitue </w:t>
+      </w:r>
+      <w:r>
+        <w:rPr>
+          <w:rFonts w:eastAsia="Times New Roman"/>
+          <w:color w:val="1F1A16"/>
+          <w:sz w:val="28"/>
+          <w:szCs w:val="28"/>
+        </w:rPr>
+        <w:t>une opportunité d’accroitre la valeur, tout en générant des défis en matière de sécurité, d’éthique, de gouvernance des données</w:t>
       </w:r>
       <w:r>
         <w:rPr>
@@ -2051,43 +2042,7 @@
           <w:color w:val="000000"/>
           <w:sz w:val="28"/>
         </w:rPr>
-        <w:t xml:space="preserve">(de Man et al., 2016; Masson &amp; </w:t>
-      </w:r>
-      <w:proofErr w:type="spellStart"/>
-      <w:r>
-        <w:rPr>
-          <w:rFonts w:eastAsia="Times New Roman"/>
-          <w:color w:val="000000"/>
-          <w:sz w:val="28"/>
-        </w:rPr>
-        <w:t>Dautrif</w:t>
-      </w:r>
-      <w:proofErr w:type="spellEnd"/>
-      <w:r>
-        <w:rPr>
-          <w:rFonts w:eastAsia="Times New Roman"/>
-          <w:color w:val="000000"/>
-          <w:sz w:val="28"/>
-        </w:rPr>
-        <w:t xml:space="preserve">, 2026; Mohan, 2024; </w:t>
-      </w:r>
-      <w:proofErr w:type="spellStart"/>
-      <w:r>
-        <w:rPr>
-          <w:rFonts w:eastAsia="Times New Roman"/>
-          <w:color w:val="000000"/>
-          <w:sz w:val="28"/>
-        </w:rPr>
-        <w:t>Tavoletti</w:t>
-      </w:r>
-      <w:proofErr w:type="spellEnd"/>
-      <w:r>
-        <w:rPr>
-          <w:rFonts w:eastAsia="Times New Roman"/>
-          <w:color w:val="000000"/>
-          <w:sz w:val="28"/>
-        </w:rPr>
-        <w:t xml:space="preserve"> et al., 2021; </w:t>
+        <w:t xml:space="preserve">(Mohan, 2024; </w:t>
       </w:r>
       <w:proofErr w:type="spellStart"/>
       <w:r>
@@ -2377,6 +2332,104 @@
           <w:sz w:val="28"/>
           <w:szCs w:val="28"/>
         </w:rPr>
+        <w:t xml:space="preserve"> </w:t>
+      </w:r>
+      <w:r>
+        <w:rPr>
+          <w:color w:val="1F1A16"/>
+          <w:sz w:val="28"/>
+          <w:szCs w:val="28"/>
+        </w:rPr>
+        <w:fldChar w:fldCharType="begin"/>
+      </w:r>
+      <w:r>
+        <w:rPr>
+          <w:color w:val="1F1A16"/>
+          <w:sz w:val="28"/>
+          <w:szCs w:val="28"/>
+        </w:rPr>
+        <w:instrText xml:space="preserve"> ADDIN ZOTERO_ITEM CSL_CITATION {"citationID":"HdGbtfoW","properties":{"unsorted":false,"formattedCitation":"(Candy et al., 2024; de\\uc0\\u160{}Man et al., 2016)","plainCitation":"(Candy et al., 2024; de Man et al., 2016)","noteIndex":0},"citationItems":[{"id":7624,"uris":["http://zotero.org/users/12622049/items/Q9ZRUSVL"],"itemData":{"id":7624,"type":"article-journal","abstract":"Software and talent are converging to create new value. Are your consultants accelerating progress—or sticking to the status quo?","container-title":"IBM Institute for Business Value","language":"en","source":"Zotero","title":"On the cusp of convergence","author":[{"family":"Candy","given":"Matthew"},{"family":"Dolph","given":"Blaine"},{"family":"Lin","given":"Salima"},{"family":"Dencik","given":"Jacob"}],"issued":{"date-parts":[["2024"]]}}},{"id":2045,"uris":["http://zotero.org/users/12622049/items/K23M6UC4"],"itemData":{"id":2045,"type":"article-journal","container-title":"Academy of Management Proceedings","DOI":"10.5465/AMBPP.2016.16812abstract","journalAbbreviation":"Academy of Management Proceedings","note":"2 citations (Crossref) [2023-12-16]","page":"16812","source":"ResearchGate","title":"The Characteristics of New Business Models in Consulting: An Analysis of Practice","title-short":"The Characteristics of New Business Models in Consulting","volume":"2016","author":[{"family":"Man","given":"Ard-Pieter","non-dropping-particle":"de"},{"family":"Man","given":"Marguerithe","non-dropping-particle":"de"},{"family":"Stoppelenburg","given":"Annemieke"}],"issued":{"date-parts":[["2016",1,1]]}}}],"schema":"https://github.com/citation-style-language/schema/raw/master/csl-citation.json"} </w:instrText>
+      </w:r>
+      <w:r>
+        <w:rPr>
+          <w:color w:val="1F1A16"/>
+          <w:sz w:val="28"/>
+          <w:szCs w:val="28"/>
+        </w:rPr>
+        <w:fldChar w:fldCharType="separate"/>
+      </w:r>
+      <w:r>
+        <w:rPr>
+          <w:rFonts w:eastAsia="Times New Roman"/>
+          <w:color w:val="000000"/>
+          <w:sz w:val="28"/>
+        </w:rPr>
+        <w:t>(Candy et al., 2024; de Man et al., 2016</w:t>
+      </w:r>
+      <w:r>
+        <w:rPr>
+          <w:rFonts w:eastAsia="Times New Roman"/>
+          <w:color w:val="000000"/>
+          <w:sz w:val="28"/>
+        </w:rPr>
+        <w:t>;</w:t>
+      </w:r>
+      <w:r>
+        <w:rPr>
+          <w:rFonts w:eastAsia="Times New Roman"/>
+          <w:color w:val="000000"/>
+          <w:sz w:val="28"/>
+        </w:rPr>
+        <w:t xml:space="preserve"> </w:t>
+      </w:r>
+      <w:r>
+        <w:rPr>
+          <w:rFonts w:eastAsia="Times New Roman"/>
+          <w:color w:val="000000"/>
+          <w:sz w:val="28"/>
+        </w:rPr>
+        <w:t xml:space="preserve">Masson &amp; </w:t>
+      </w:r>
+      <w:proofErr w:type="spellStart"/>
+      <w:r>
+        <w:rPr>
+          <w:rFonts w:eastAsia="Times New Roman"/>
+          <w:color w:val="000000"/>
+          <w:sz w:val="28"/>
+        </w:rPr>
+        <w:t>Dautrif</w:t>
+      </w:r>
+      <w:proofErr w:type="spellEnd"/>
+      <w:r>
+        <w:rPr>
+          <w:rFonts w:eastAsia="Times New Roman"/>
+          <w:color w:val="000000"/>
+          <w:sz w:val="28"/>
+        </w:rPr>
+        <w:t>, 2026</w:t>
+      </w:r>
+      <w:r>
+        <w:rPr>
+          <w:rFonts w:eastAsia="Times New Roman"/>
+          <w:color w:val="000000"/>
+          <w:sz w:val="28"/>
+        </w:rPr>
+        <w:t>)</w:t>
+      </w:r>
+      <w:r>
+        <w:rPr>
+          <w:color w:val="1F1A16"/>
+          <w:sz w:val="28"/>
+          <w:szCs w:val="28"/>
+        </w:rPr>
+        <w:fldChar w:fldCharType="end"/>
+      </w:r>
+      <w:r>
+        <w:rPr>
+          <w:color w:val="1F1A16"/>
+          <w:sz w:val="28"/>
+          <w:szCs w:val="28"/>
+        </w:rPr>
         <w:t>.</w:t>
       </w:r>
     </w:p>
@@ -4359,7 +4412,7 @@
       <w:pPr>
         <w:pStyle w:val="Titre2"/>
       </w:pPr>
-      <w:bookmarkStart w:id="3" w:name="_Toc228079810"/>
+      <w:bookmarkStart w:id="3" w:name="_Toc228080645"/>
       <w:r>
         <w:t>E</w:t>
       </w:r>
@@ -5880,7 +5933,7 @@
         </w:rPr>
       </w:pPr>
       <w:bookmarkStart w:id="4" w:name="_Hlk227872854"/>
-      <w:bookmarkStart w:id="5" w:name="_Toc228079811"/>
+      <w:bookmarkStart w:id="5" w:name="_Toc228080646"/>
       <w:r>
         <w:rPr>
           <w:rFonts w:eastAsia="Times New Roman"/>
@@ -7095,7 +7148,7 @@
       <w:pPr>
         <w:pStyle w:val="Titre1"/>
       </w:pPr>
-      <w:bookmarkStart w:id="6" w:name="_Toc228079812"/>
+      <w:bookmarkStart w:id="6" w:name="_Toc228080647"/>
       <w:r>
         <w:lastRenderedPageBreak/>
         <w:t xml:space="preserve">2. CADRE </w:t>
@@ -7113,7 +7166,7 @@
           <w:color w:val="3A332D"/>
         </w:rPr>
       </w:pPr>
-      <w:bookmarkStart w:id="7" w:name="_Toc228079813"/>
+      <w:bookmarkStart w:id="7" w:name="_Toc228080648"/>
       <w:r>
         <w:rPr>
           <w:rFonts w:eastAsia="Times New Roman"/>
@@ -7132,7 +7185,7 @@
       <w:pPr>
         <w:pStyle w:val="Titre3"/>
       </w:pPr>
-      <w:bookmarkStart w:id="8" w:name="_Toc228079814"/>
+      <w:bookmarkStart w:id="8" w:name="_Toc228080649"/>
       <w:r>
         <w:t>L</w:t>
       </w:r>
@@ -8754,7 +8807,7 @@
       <w:pPr>
         <w:pStyle w:val="Titre3"/>
       </w:pPr>
-      <w:bookmarkStart w:id="9" w:name="_Toc228079815"/>
+      <w:bookmarkStart w:id="9" w:name="_Toc228080650"/>
       <w:r>
         <w:t xml:space="preserve">La valeur perçue </w:t>
       </w:r>
@@ -10756,7 +10809,7 @@
       <w:pPr>
         <w:pStyle w:val="Titre3"/>
       </w:pPr>
-      <w:bookmarkStart w:id="10" w:name="_Toc228079816"/>
+      <w:bookmarkStart w:id="10" w:name="_Toc228080651"/>
       <w:r>
         <w:t>L’IA</w:t>
       </w:r>
@@ -11891,7 +11944,7 @@
       <w:pPr>
         <w:pStyle w:val="Titre2"/>
       </w:pPr>
-      <w:bookmarkStart w:id="11" w:name="_Toc228079817"/>
+      <w:bookmarkStart w:id="11" w:name="_Toc228080652"/>
       <w:r>
         <w:lastRenderedPageBreak/>
         <w:t>Cadre propositionnel</w:t>
@@ -12152,7 +12205,7 @@
           <w:rFonts w:eastAsia="Times New Roman"/>
         </w:rPr>
       </w:pPr>
-      <w:bookmarkStart w:id="12" w:name="_Toc228079818"/>
+      <w:bookmarkStart w:id="12" w:name="_Toc228080653"/>
       <w:r>
         <w:rPr>
           <w:rFonts w:eastAsia="Times New Roman"/>
@@ -12475,7 +12528,7 @@
           <w:rFonts w:eastAsia="Times New Roman"/>
         </w:rPr>
       </w:pPr>
-      <w:bookmarkStart w:id="13" w:name="_Toc228079819"/>
+      <w:bookmarkStart w:id="13" w:name="_Toc228080654"/>
       <w:r>
         <w:rPr>
           <w:rFonts w:eastAsia="Times New Roman"/>
@@ -14602,7 +14655,7 @@
       <w:pPr>
         <w:pStyle w:val="Titre1"/>
       </w:pPr>
-      <w:bookmarkStart w:id="14" w:name="_Toc228079820"/>
+      <w:bookmarkStart w:id="14" w:name="_Toc228080655"/>
       <w:r>
         <w:lastRenderedPageBreak/>
         <w:t>3. CADRE D'OBSERVATION</w:t>
@@ -14616,7 +14669,7 @@
           <w:rFonts w:eastAsia="Times New Roman"/>
         </w:rPr>
       </w:pPr>
-      <w:bookmarkStart w:id="15" w:name="_Toc228079821"/>
+      <w:bookmarkStart w:id="15" w:name="_Toc228080656"/>
       <w:r>
         <w:rPr>
           <w:rFonts w:eastAsia="Times New Roman"/>
@@ -15236,7 +15289,7 @@
           <w:rFonts w:eastAsia="Times New Roman"/>
         </w:rPr>
       </w:pPr>
-      <w:bookmarkStart w:id="16" w:name="_Toc228079822"/>
+      <w:bookmarkStart w:id="16" w:name="_Toc228080657"/>
       <w:r>
         <w:rPr>
           <w:rFonts w:eastAsia="Times New Roman"/>
@@ -15524,7 +15577,7 @@
           <w:color w:val="4A4038"/>
         </w:rPr>
       </w:pPr>
-      <w:bookmarkStart w:id="17" w:name="_Toc228079823"/>
+      <w:bookmarkStart w:id="17" w:name="_Toc228080658"/>
       <w:r>
         <w:rPr>
           <w:rFonts w:eastAsia="Times New Roman"/>
@@ -15760,7 +15813,7 @@
           <w:color w:val="4A4038"/>
         </w:rPr>
       </w:pPr>
-      <w:bookmarkStart w:id="18" w:name="_Toc228079824"/>
+      <w:bookmarkStart w:id="18" w:name="_Toc228080659"/>
       <w:r>
         <w:rPr>
           <w:rFonts w:eastAsia="Times New Roman"/>
@@ -16116,7 +16169,7 @@
       <w:pPr>
         <w:pStyle w:val="Titre1"/>
       </w:pPr>
-      <w:bookmarkStart w:id="19" w:name="_Toc228079825"/>
+      <w:bookmarkStart w:id="19" w:name="_Toc228080660"/>
       <w:r>
         <w:t>4. ILLUSTRATION</w:t>
       </w:r>
@@ -16131,7 +16184,7 @@
           <w:szCs w:val="28"/>
         </w:rPr>
       </w:pPr>
-      <w:bookmarkStart w:id="20" w:name="_Toc228079826"/>
+      <w:bookmarkStart w:id="20" w:name="_Toc228080661"/>
       <w:r>
         <w:rPr>
           <w:rFonts w:eastAsia="Times New Roman"/>
@@ -16724,7 +16777,7 @@
           <w:szCs w:val="28"/>
         </w:rPr>
       </w:pPr>
-      <w:bookmarkStart w:id="21" w:name="_Toc228079827"/>
+      <w:bookmarkStart w:id="21" w:name="_Toc228080662"/>
       <w:r>
         <w:rPr>
           <w:rFonts w:eastAsia="Times New Roman"/>
@@ -18434,7 +18487,7 @@
           <w:color w:val="4472C4" w:themeColor="accent1"/>
         </w:rPr>
       </w:pPr>
-      <w:bookmarkStart w:id="22" w:name="_Toc228079828"/>
+      <w:bookmarkStart w:id="22" w:name="_Toc228080663"/>
       <w:r>
         <w:rPr>
           <w:b w:val="0"/>
@@ -18657,7 +18710,7 @@
         <w:pStyle w:val="Titre1"/>
         <w:divId w:val="491409308"/>
       </w:pPr>
-      <w:bookmarkStart w:id="23" w:name="_Toc228079829"/>
+      <w:bookmarkStart w:id="23" w:name="_Toc228080664"/>
       <w:r>
         <w:lastRenderedPageBreak/>
         <w:t>BIBLIOGRAPHIE</w:t>
@@ -19385,6 +19438,79 @@
           <w:lang w:val="en-US"/>
         </w:rPr>
         <w:t>(1), 1‑15. https://doi.org/10.1111/1467-8551.00147</w:t>
+      </w:r>
+    </w:p>
+    <w:p>
+      <w:pPr>
+        <w:pStyle w:val="Bibliographie"/>
+        <w:divId w:val="491409308"/>
+        <w:rPr>
+          <w:rFonts w:eastAsia="Times New Roman"/>
+          <w:sz w:val="28"/>
+          <w:lang w:val="en-US"/>
+        </w:rPr>
+      </w:pPr>
+      <w:r>
+        <w:rPr>
+          <w:rFonts w:eastAsia="Times New Roman"/>
+          <w:sz w:val="28"/>
+          <w:lang w:val="en-US"/>
+        </w:rPr>
+        <w:t xml:space="preserve">Candy, M., </w:t>
+      </w:r>
+      <w:proofErr w:type="spellStart"/>
+      <w:r>
+        <w:rPr>
+          <w:rFonts w:eastAsia="Times New Roman"/>
+          <w:sz w:val="28"/>
+          <w:lang w:val="en-US"/>
+        </w:rPr>
+        <w:t>Dolph</w:t>
+      </w:r>
+      <w:proofErr w:type="spellEnd"/>
+      <w:r>
+        <w:rPr>
+          <w:rFonts w:eastAsia="Times New Roman"/>
+          <w:sz w:val="28"/>
+          <w:lang w:val="en-US"/>
+        </w:rPr>
+        <w:t xml:space="preserve">, B., Lin, S., &amp; </w:t>
+      </w:r>
+      <w:proofErr w:type="spellStart"/>
+      <w:r>
+        <w:rPr>
+          <w:rFonts w:eastAsia="Times New Roman"/>
+          <w:sz w:val="28"/>
+          <w:lang w:val="en-US"/>
+        </w:rPr>
+        <w:t>Dencik</w:t>
+      </w:r>
+      <w:proofErr w:type="spellEnd"/>
+      <w:r>
+        <w:rPr>
+          <w:rFonts w:eastAsia="Times New Roman"/>
+          <w:sz w:val="28"/>
+          <w:lang w:val="en-US"/>
+        </w:rPr>
+        <w:t xml:space="preserve">, J. (2024). On the cusp of convergence. </w:t>
+      </w:r>
+      <w:r>
+        <w:rPr>
+          <w:rFonts w:eastAsia="Times New Roman"/>
+          <w:i/>
+          <w:iCs/>
+          <w:sz w:val="28"/>
+          <w:lang w:val="en-US"/>
+        </w:rPr>
+        <w:t>IBM Institute for Business Value</w:t>
+      </w:r>
+      <w:r>
+        <w:rPr>
+          <w:rFonts w:eastAsia="Times New Roman"/>
+          <w:sz w:val="28"/>
+          <w:lang w:val="en-US"/>
+        </w:rPr>
+        <w:t>.</w:t>
       </w:r>
     </w:p>
     <w:p>

</xml_diff>

<commit_message>
Refresh exploratory framework wording
</commit_message>
<xml_diff>
--- a/docs/DOCUMENT_COMPLEMENTAIRE_CONTENU_FR.docx
+++ b/docs/DOCUMENT_COMPLEMENTAIRE_CONTENU_FR.docx
@@ -1980,7 +1980,23 @@
           <w:sz w:val="28"/>
           <w:szCs w:val="28"/>
         </w:rPr>
-        <w:t xml:space="preserve">. Il constitue </w:t>
+        <w:t xml:space="preserve">. </w:t>
+      </w:r>
+      <w:r>
+        <w:rPr>
+          <w:color w:val="1F1A16"/>
+          <w:sz w:val="28"/>
+          <w:szCs w:val="28"/>
+        </w:rPr>
+        <w:t>L’IA</w:t>
+      </w:r>
+      <w:r>
+        <w:rPr>
+          <w:color w:val="1F1A16"/>
+          <w:sz w:val="28"/>
+          <w:szCs w:val="28"/>
+        </w:rPr>
+        <w:t xml:space="preserve"> constitue </w:t>
       </w:r>
       <w:r>
         <w:rPr>

</xml_diff>

<commit_message>
Adjust exploratory framework paragraph break
</commit_message>
<xml_diff>
--- a/docs/DOCUMENT_COMPLEMENTAIRE_CONTENU_FR.docx
+++ b/docs/DOCUMENT_COMPLEMENTAIRE_CONTENU_FR.docx
@@ -3565,6 +3565,38 @@
         </w:rPr>
         <w:t xml:space="preserve">. </w:t>
       </w:r>
+      <w:r>
+        <w:rPr>
+          <w:color w:val="1F1A16"/>
+          <w:sz w:val="28"/>
+          <w:szCs w:val="28"/>
+        </w:rPr>
+        <w:t>Cependant,</w:t>
+      </w:r>
+      <w:r>
+        <w:rPr>
+          <w:color w:val="1F1A16"/>
+          <w:sz w:val="28"/>
+          <w:szCs w:val="28"/>
+        </w:rPr>
+        <w:t xml:space="preserve"> </w:t>
+      </w:r>
+      <w:r>
+        <w:rPr>
+          <w:color w:val="1F1A16"/>
+          <w:sz w:val="28"/>
+          <w:szCs w:val="28"/>
+        </w:rPr>
+        <w:t>l</w:t>
+      </w:r>
+      <w:r>
+        <w:rPr>
+          <w:color w:val="1F1A16"/>
+          <w:sz w:val="28"/>
+          <w:szCs w:val="28"/>
+        </w:rPr>
+        <w:t xml:space="preserve">’association révèle des effets plus profonds. </w:t>
+      </w:r>
     </w:p>
     <w:p>
       <w:pPr>
@@ -3575,38 +3607,6 @@
           <w:szCs w:val="28"/>
         </w:rPr>
       </w:pPr>
-      <w:r>
-        <w:rPr>
-          <w:color w:val="1F1A16"/>
-          <w:sz w:val="28"/>
-          <w:szCs w:val="28"/>
-        </w:rPr>
-        <w:t>Cependant,</w:t>
-      </w:r>
-      <w:r>
-        <w:rPr>
-          <w:color w:val="1F1A16"/>
-          <w:sz w:val="28"/>
-          <w:szCs w:val="28"/>
-        </w:rPr>
-        <w:t xml:space="preserve"> </w:t>
-      </w:r>
-      <w:r>
-        <w:rPr>
-          <w:color w:val="1F1A16"/>
-          <w:sz w:val="28"/>
-          <w:szCs w:val="28"/>
-        </w:rPr>
-        <w:t>l</w:t>
-      </w:r>
-      <w:r>
-        <w:rPr>
-          <w:color w:val="1F1A16"/>
-          <w:sz w:val="28"/>
-          <w:szCs w:val="28"/>
-        </w:rPr>
-        <w:t xml:space="preserve">’association révèle des effets plus profonds. </w:t>
-      </w:r>
       <w:r>
         <w:rPr>
           <w:color w:val="1F1A16"/>

</xml_diff>

<commit_message>
Refresh app text from exploratory framework
</commit_message>
<xml_diff>
--- a/docs/DOCUMENT_COMPLEMENTAIRE_CONTENU_FR.docx
+++ b/docs/DOCUMENT_COMPLEMENTAIRE_CONTENU_FR.docx
@@ -428,7 +428,7 @@
           <w14:ligatures w14:val="standardContextual"/>
         </w:rPr>
       </w:pPr>
-      <w:hyperlink w:anchor="_Toc228405241" w:history="1">
+      <w:hyperlink w:anchor="_Toc228414660" w:history="1">
         <w:r>
           <w:rPr>
             <w:rStyle w:val="Lienhypertexte"/>
@@ -455,7 +455,7 @@
             <w:noProof/>
             <w:webHidden/>
           </w:rPr>
-          <w:instrText xml:space="preserve"> PAGEREF _Toc228405241 \h </w:instrText>
+          <w:instrText xml:space="preserve"> PAGEREF _Toc228414660 \h </w:instrText>
         </w:r>
         <w:r>
           <w:rPr>
@@ -501,7 +501,7 @@
           <w14:ligatures w14:val="standardContextual"/>
         </w:rPr>
       </w:pPr>
-      <w:hyperlink w:anchor="_Toc228405242" w:history="1">
+      <w:hyperlink w:anchor="_Toc228414661" w:history="1">
         <w:r>
           <w:rPr>
             <w:rStyle w:val="Lienhypertexte"/>
@@ -529,7 +529,7 @@
             <w:noProof/>
             <w:webHidden/>
           </w:rPr>
-          <w:instrText xml:space="preserve"> PAGEREF _Toc228405242 \h </w:instrText>
+          <w:instrText xml:space="preserve"> PAGEREF _Toc228414661 \h </w:instrText>
         </w:r>
         <w:r>
           <w:rPr>
@@ -575,7 +575,7 @@
           <w14:ligatures w14:val="standardContextual"/>
         </w:rPr>
       </w:pPr>
-      <w:hyperlink w:anchor="_Toc228405243" w:history="1">
+      <w:hyperlink w:anchor="_Toc228414662" w:history="1">
         <w:r>
           <w:rPr>
             <w:rStyle w:val="Lienhypertexte"/>
@@ -603,7 +603,7 @@
             <w:noProof/>
             <w:webHidden/>
           </w:rPr>
-          <w:instrText xml:space="preserve"> PAGEREF _Toc228405243 \h </w:instrText>
+          <w:instrText xml:space="preserve"> PAGEREF _Toc228414662 \h </w:instrText>
         </w:r>
         <w:r>
           <w:rPr>
@@ -649,7 +649,7 @@
           <w14:ligatures w14:val="standardContextual"/>
         </w:rPr>
       </w:pPr>
-      <w:hyperlink w:anchor="_Toc228405244" w:history="1">
+      <w:hyperlink w:anchor="_Toc228414663" w:history="1">
         <w:r>
           <w:rPr>
             <w:rStyle w:val="Lienhypertexte"/>
@@ -676,7 +676,7 @@
             <w:noProof/>
             <w:webHidden/>
           </w:rPr>
-          <w:instrText xml:space="preserve"> PAGEREF _Toc228405244 \h </w:instrText>
+          <w:instrText xml:space="preserve"> PAGEREF _Toc228414663 \h </w:instrText>
         </w:r>
         <w:r>
           <w:rPr>
@@ -722,7 +722,7 @@
           <w14:ligatures w14:val="standardContextual"/>
         </w:rPr>
       </w:pPr>
-      <w:hyperlink w:anchor="_Toc228405245" w:history="1">
+      <w:hyperlink w:anchor="_Toc228414664" w:history="1">
         <w:r>
           <w:rPr>
             <w:rStyle w:val="Lienhypertexte"/>
@@ -750,7 +750,7 @@
             <w:noProof/>
             <w:webHidden/>
           </w:rPr>
-          <w:instrText xml:space="preserve"> PAGEREF _Toc228405245 \h </w:instrText>
+          <w:instrText xml:space="preserve"> PAGEREF _Toc228414664 \h </w:instrText>
         </w:r>
         <w:r>
           <w:rPr>
@@ -796,7 +796,7 @@
           <w14:ligatures w14:val="standardContextual"/>
         </w:rPr>
       </w:pPr>
-      <w:hyperlink w:anchor="_Toc228405246" w:history="1">
+      <w:hyperlink w:anchor="_Toc228414665" w:history="1">
         <w:r>
           <w:rPr>
             <w:rStyle w:val="Lienhypertexte"/>
@@ -823,7 +823,7 @@
             <w:noProof/>
             <w:webHidden/>
           </w:rPr>
-          <w:instrText xml:space="preserve"> PAGEREF _Toc228405246 \h </w:instrText>
+          <w:instrText xml:space="preserve"> PAGEREF _Toc228414665 \h </w:instrText>
         </w:r>
         <w:r>
           <w:rPr>
@@ -869,7 +869,7 @@
           <w14:ligatures w14:val="standardContextual"/>
         </w:rPr>
       </w:pPr>
-      <w:hyperlink w:anchor="_Toc228405247" w:history="1">
+      <w:hyperlink w:anchor="_Toc228414666" w:history="1">
         <w:r>
           <w:rPr>
             <w:rStyle w:val="Lienhypertexte"/>
@@ -896,7 +896,7 @@
             <w:noProof/>
             <w:webHidden/>
           </w:rPr>
-          <w:instrText xml:space="preserve"> PAGEREF _Toc228405247 \h </w:instrText>
+          <w:instrText xml:space="preserve"> PAGEREF _Toc228414666 \h </w:instrText>
         </w:r>
         <w:r>
           <w:rPr>
@@ -942,7 +942,7 @@
           <w14:ligatures w14:val="standardContextual"/>
         </w:rPr>
       </w:pPr>
-      <w:hyperlink w:anchor="_Toc228405248" w:history="1">
+      <w:hyperlink w:anchor="_Toc228414667" w:history="1">
         <w:r>
           <w:rPr>
             <w:rStyle w:val="Lienhypertexte"/>
@@ -969,7 +969,7 @@
             <w:noProof/>
             <w:webHidden/>
           </w:rPr>
-          <w:instrText xml:space="preserve"> PAGEREF _Toc228405248 \h </w:instrText>
+          <w:instrText xml:space="preserve"> PAGEREF _Toc228414667 \h </w:instrText>
         </w:r>
         <w:r>
           <w:rPr>
@@ -1015,7 +1015,7 @@
           <w14:ligatures w14:val="standardContextual"/>
         </w:rPr>
       </w:pPr>
-      <w:hyperlink w:anchor="_Toc228405249" w:history="1">
+      <w:hyperlink w:anchor="_Toc228414668" w:history="1">
         <w:r>
           <w:rPr>
             <w:rStyle w:val="Lienhypertexte"/>
@@ -1042,7 +1042,7 @@
             <w:noProof/>
             <w:webHidden/>
           </w:rPr>
-          <w:instrText xml:space="preserve"> PAGEREF _Toc228405249 \h </w:instrText>
+          <w:instrText xml:space="preserve"> PAGEREF _Toc228414668 \h </w:instrText>
         </w:r>
         <w:r>
           <w:rPr>
@@ -1062,7 +1062,7 @@
             <w:noProof/>
             <w:webHidden/>
           </w:rPr>
-          <w:t>8</w:t>
+          <w:t>9</w:t>
         </w:r>
         <w:r>
           <w:rPr>
@@ -1088,7 +1088,7 @@
           <w14:ligatures w14:val="standardContextual"/>
         </w:rPr>
       </w:pPr>
-      <w:hyperlink w:anchor="_Toc228405250" w:history="1">
+      <w:hyperlink w:anchor="_Toc228414669" w:history="1">
         <w:r>
           <w:rPr>
             <w:rStyle w:val="Lienhypertexte"/>
@@ -1115,7 +1115,7 @@
             <w:noProof/>
             <w:webHidden/>
           </w:rPr>
-          <w:instrText xml:space="preserve"> PAGEREF _Toc228405250 \h </w:instrText>
+          <w:instrText xml:space="preserve"> PAGEREF _Toc228414669 \h </w:instrText>
         </w:r>
         <w:r>
           <w:rPr>
@@ -1161,7 +1161,7 @@
           <w14:ligatures w14:val="standardContextual"/>
         </w:rPr>
       </w:pPr>
-      <w:hyperlink w:anchor="_Toc228405251" w:history="1">
+      <w:hyperlink w:anchor="_Toc228414670" w:history="1">
         <w:r>
           <w:rPr>
             <w:rStyle w:val="Lienhypertexte"/>
@@ -1188,7 +1188,7 @@
             <w:noProof/>
             <w:webHidden/>
           </w:rPr>
-          <w:instrText xml:space="preserve"> PAGEREF _Toc228405251 \h </w:instrText>
+          <w:instrText xml:space="preserve"> PAGEREF _Toc228414670 \h </w:instrText>
         </w:r>
         <w:r>
           <w:rPr>
@@ -1234,7 +1234,7 @@
           <w14:ligatures w14:val="standardContextual"/>
         </w:rPr>
       </w:pPr>
-      <w:hyperlink w:anchor="_Toc228405252" w:history="1">
+      <w:hyperlink w:anchor="_Toc228414671" w:history="1">
         <w:r>
           <w:rPr>
             <w:rStyle w:val="Lienhypertexte"/>
@@ -1261,7 +1261,7 @@
             <w:noProof/>
             <w:webHidden/>
           </w:rPr>
-          <w:instrText xml:space="preserve"> PAGEREF _Toc228405252 \h </w:instrText>
+          <w:instrText xml:space="preserve"> PAGEREF _Toc228414671 \h </w:instrText>
         </w:r>
         <w:r>
           <w:rPr>
@@ -1307,7 +1307,7 @@
           <w14:ligatures w14:val="standardContextual"/>
         </w:rPr>
       </w:pPr>
-      <w:hyperlink w:anchor="_Toc228405253" w:history="1">
+      <w:hyperlink w:anchor="_Toc228414672" w:history="1">
         <w:r>
           <w:rPr>
             <w:rStyle w:val="Lienhypertexte"/>
@@ -1334,7 +1334,7 @@
             <w:noProof/>
             <w:webHidden/>
           </w:rPr>
-          <w:instrText xml:space="preserve"> PAGEREF _Toc228405253 \h </w:instrText>
+          <w:instrText xml:space="preserve"> PAGEREF _Toc228414672 \h </w:instrText>
         </w:r>
         <w:r>
           <w:rPr>
@@ -1380,7 +1380,7 @@
           <w14:ligatures w14:val="standardContextual"/>
         </w:rPr>
       </w:pPr>
-      <w:hyperlink w:anchor="_Toc228405254" w:history="1">
+      <w:hyperlink w:anchor="_Toc228414673" w:history="1">
         <w:r>
           <w:rPr>
             <w:rStyle w:val="Lienhypertexte"/>
@@ -1407,7 +1407,7 @@
             <w:noProof/>
             <w:webHidden/>
           </w:rPr>
-          <w:instrText xml:space="preserve"> PAGEREF _Toc228405254 \h </w:instrText>
+          <w:instrText xml:space="preserve"> PAGEREF _Toc228414673 \h </w:instrText>
         </w:r>
         <w:r>
           <w:rPr>
@@ -1427,7 +1427,7 @@
             <w:noProof/>
             <w:webHidden/>
           </w:rPr>
-          <w:t>10</w:t>
+          <w:t>11</w:t>
         </w:r>
         <w:r>
           <w:rPr>
@@ -1453,7 +1453,7 @@
           <w14:ligatures w14:val="standardContextual"/>
         </w:rPr>
       </w:pPr>
-      <w:hyperlink w:anchor="_Toc228405255" w:history="1">
+      <w:hyperlink w:anchor="_Toc228414674" w:history="1">
         <w:r>
           <w:rPr>
             <w:rStyle w:val="Lienhypertexte"/>
@@ -1480,7 +1480,7 @@
             <w:noProof/>
             <w:webHidden/>
           </w:rPr>
-          <w:instrText xml:space="preserve"> PAGEREF _Toc228405255 \h </w:instrText>
+          <w:instrText xml:space="preserve"> PAGEREF _Toc228414674 \h </w:instrText>
         </w:r>
         <w:r>
           <w:rPr>
@@ -1500,7 +1500,7 @@
             <w:noProof/>
             <w:webHidden/>
           </w:rPr>
-          <w:t>10</w:t>
+          <w:t>11</w:t>
         </w:r>
         <w:r>
           <w:rPr>
@@ -1526,13 +1526,13 @@
           <w14:ligatures w14:val="standardContextual"/>
         </w:rPr>
       </w:pPr>
-      <w:hyperlink w:anchor="_Toc228405256" w:history="1">
+      <w:hyperlink w:anchor="_Toc228414675" w:history="1">
         <w:r>
           <w:rPr>
             <w:rStyle w:val="Lienhypertexte"/>
             <w:noProof/>
           </w:rPr>
-          <w:t>Comment l'IA reconfigure les trois interdépendances du triangle R - P – C (à vérifier)</w:t>
+          <w:t>Comment l'IA reconfigure les trois interdépendances du triangle R - P – C (à tester empiriquement)</w:t>
         </w:r>
         <w:r>
           <w:rPr>
@@ -1553,7 +1553,7 @@
             <w:noProof/>
             <w:webHidden/>
           </w:rPr>
-          <w:instrText xml:space="preserve"> PAGEREF _Toc228405256 \h </w:instrText>
+          <w:instrText xml:space="preserve"> PAGEREF _Toc228414675 \h </w:instrText>
         </w:r>
         <w:r>
           <w:rPr>
@@ -1599,7 +1599,7 @@
           <w14:ligatures w14:val="standardContextual"/>
         </w:rPr>
       </w:pPr>
-      <w:hyperlink w:anchor="_Toc228405257" w:history="1">
+      <w:hyperlink w:anchor="_Toc228414676" w:history="1">
         <w:r>
           <w:rPr>
             <w:rStyle w:val="Lienhypertexte"/>
@@ -1626,7 +1626,7 @@
             <w:noProof/>
             <w:webHidden/>
           </w:rPr>
-          <w:instrText xml:space="preserve"> PAGEREF _Toc228405257 \h </w:instrText>
+          <w:instrText xml:space="preserve"> PAGEREF _Toc228414676 \h </w:instrText>
         </w:r>
         <w:r>
           <w:rPr>
@@ -1672,7 +1672,7 @@
           <w14:ligatures w14:val="standardContextual"/>
         </w:rPr>
       </w:pPr>
-      <w:hyperlink w:anchor="_Toc228405258" w:history="1">
+      <w:hyperlink w:anchor="_Toc228414677" w:history="1">
         <w:r>
           <w:rPr>
             <w:rStyle w:val="Lienhypertexte"/>
@@ -1699,7 +1699,7 @@
             <w:noProof/>
             <w:webHidden/>
           </w:rPr>
-          <w:instrText xml:space="preserve"> PAGEREF _Toc228405258 \h </w:instrText>
+          <w:instrText xml:space="preserve"> PAGEREF _Toc228414677 \h </w:instrText>
         </w:r>
         <w:r>
           <w:rPr>
@@ -1745,7 +1745,7 @@
           <w14:ligatures w14:val="standardContextual"/>
         </w:rPr>
       </w:pPr>
-      <w:hyperlink w:anchor="_Toc228405259" w:history="1">
+      <w:hyperlink w:anchor="_Toc228414678" w:history="1">
         <w:r>
           <w:rPr>
             <w:rStyle w:val="Lienhypertexte"/>
@@ -1772,7 +1772,7 @@
             <w:noProof/>
             <w:webHidden/>
           </w:rPr>
-          <w:instrText xml:space="preserve"> PAGEREF _Toc228405259 \h </w:instrText>
+          <w:instrText xml:space="preserve"> PAGEREF _Toc228414678 \h </w:instrText>
         </w:r>
         <w:r>
           <w:rPr>
@@ -1818,7 +1818,7 @@
           <w14:ligatures w14:val="standardContextual"/>
         </w:rPr>
       </w:pPr>
-      <w:hyperlink w:anchor="_Toc228405260" w:history="1">
+      <w:hyperlink w:anchor="_Toc228414679" w:history="1">
         <w:r>
           <w:rPr>
             <w:rStyle w:val="Lienhypertexte"/>
@@ -1846,7 +1846,7 @@
             <w:noProof/>
             <w:webHidden/>
           </w:rPr>
-          <w:instrText xml:space="preserve"> PAGEREF _Toc228405260 \h </w:instrText>
+          <w:instrText xml:space="preserve"> PAGEREF _Toc228414679 \h </w:instrText>
         </w:r>
         <w:r>
           <w:rPr>
@@ -1892,7 +1892,7 @@
           <w14:ligatures w14:val="standardContextual"/>
         </w:rPr>
       </w:pPr>
-      <w:hyperlink w:anchor="_Toc228405261" w:history="1">
+      <w:hyperlink w:anchor="_Toc228414680" w:history="1">
         <w:r>
           <w:rPr>
             <w:rStyle w:val="Lienhypertexte"/>
@@ -1920,7 +1920,7 @@
             <w:noProof/>
             <w:webHidden/>
           </w:rPr>
-          <w:instrText xml:space="preserve"> PAGEREF _Toc228405261 \h </w:instrText>
+          <w:instrText xml:space="preserve"> PAGEREF _Toc228414680 \h </w:instrText>
         </w:r>
         <w:r>
           <w:rPr>
@@ -1966,7 +1966,7 @@
           <w14:ligatures w14:val="standardContextual"/>
         </w:rPr>
       </w:pPr>
-      <w:hyperlink w:anchor="_Toc228405262" w:history="1">
+      <w:hyperlink w:anchor="_Toc228414681" w:history="1">
         <w:r>
           <w:rPr>
             <w:rStyle w:val="Lienhypertexte"/>
@@ -1994,7 +1994,7 @@
             <w:noProof/>
             <w:webHidden/>
           </w:rPr>
-          <w:instrText xml:space="preserve"> PAGEREF _Toc228405262 \h </w:instrText>
+          <w:instrText xml:space="preserve"> PAGEREF _Toc228414681 \h </w:instrText>
         </w:r>
         <w:r>
           <w:rPr>
@@ -2040,7 +2040,7 @@
           <w14:ligatures w14:val="standardContextual"/>
         </w:rPr>
       </w:pPr>
-      <w:hyperlink w:anchor="_Toc228405263" w:history="1">
+      <w:hyperlink w:anchor="_Toc228414682" w:history="1">
         <w:r>
           <w:rPr>
             <w:rStyle w:val="Lienhypertexte"/>
@@ -2068,7 +2068,7 @@
             <w:noProof/>
             <w:webHidden/>
           </w:rPr>
-          <w:instrText xml:space="preserve"> PAGEREF _Toc228405263 \h </w:instrText>
+          <w:instrText xml:space="preserve"> PAGEREF _Toc228414682 \h </w:instrText>
         </w:r>
         <w:r>
           <w:rPr>
@@ -2114,7 +2114,7 @@
           <w14:ligatures w14:val="standardContextual"/>
         </w:rPr>
       </w:pPr>
-      <w:hyperlink w:anchor="_Toc228405264" w:history="1">
+      <w:hyperlink w:anchor="_Toc228414683" w:history="1">
         <w:r>
           <w:rPr>
             <w:rStyle w:val="Lienhypertexte"/>
@@ -2142,7 +2142,7 @@
             <w:noProof/>
             <w:webHidden/>
           </w:rPr>
-          <w:instrText xml:space="preserve"> PAGEREF _Toc228405264 \h </w:instrText>
+          <w:instrText xml:space="preserve"> PAGEREF _Toc228414683 \h </w:instrText>
         </w:r>
         <w:r>
           <w:rPr>
@@ -2188,7 +2188,7 @@
           <w14:ligatures w14:val="standardContextual"/>
         </w:rPr>
       </w:pPr>
-      <w:hyperlink w:anchor="_Toc228405265" w:history="1">
+      <w:hyperlink w:anchor="_Toc228414684" w:history="1">
         <w:r>
           <w:rPr>
             <w:rStyle w:val="Lienhypertexte"/>
@@ -2215,7 +2215,7 @@
             <w:noProof/>
             <w:webHidden/>
           </w:rPr>
-          <w:instrText xml:space="preserve"> PAGEREF _Toc228405265 \h </w:instrText>
+          <w:instrText xml:space="preserve"> PAGEREF _Toc228414684 \h </w:instrText>
         </w:r>
         <w:r>
           <w:rPr>
@@ -2235,7 +2235,7 @@
             <w:noProof/>
             <w:webHidden/>
           </w:rPr>
-          <w:t>16</w:t>
+          <w:t>17</w:t>
         </w:r>
         <w:r>
           <w:rPr>
@@ -2261,7 +2261,7 @@
           <w14:ligatures w14:val="standardContextual"/>
         </w:rPr>
       </w:pPr>
-      <w:hyperlink w:anchor="_Toc228405266" w:history="1">
+      <w:hyperlink w:anchor="_Toc228414685" w:history="1">
         <w:r>
           <w:rPr>
             <w:rStyle w:val="Lienhypertexte"/>
@@ -2288,7 +2288,7 @@
             <w:noProof/>
             <w:webHidden/>
           </w:rPr>
-          <w:instrText xml:space="preserve"> PAGEREF _Toc228405266 \h </w:instrText>
+          <w:instrText xml:space="preserve"> PAGEREF _Toc228414685 \h </w:instrText>
         </w:r>
         <w:r>
           <w:rPr>
@@ -2308,7 +2308,7 @@
             <w:noProof/>
             <w:webHidden/>
           </w:rPr>
-          <w:t>16</w:t>
+          <w:t>17</w:t>
         </w:r>
         <w:r>
           <w:rPr>
@@ -2334,7 +2334,7 @@
           <w14:ligatures w14:val="standardContextual"/>
         </w:rPr>
       </w:pPr>
-      <w:hyperlink w:anchor="_Toc228405267" w:history="1">
+      <w:hyperlink w:anchor="_Toc228414686" w:history="1">
         <w:r>
           <w:rPr>
             <w:rStyle w:val="Lienhypertexte"/>
@@ -2361,7 +2361,7 @@
             <w:noProof/>
             <w:webHidden/>
           </w:rPr>
-          <w:instrText xml:space="preserve"> PAGEREF _Toc228405267 \h </w:instrText>
+          <w:instrText xml:space="preserve"> PAGEREF _Toc228414686 \h </w:instrText>
         </w:r>
         <w:r>
           <w:rPr>
@@ -2381,7 +2381,7 @@
             <w:noProof/>
             <w:webHidden/>
           </w:rPr>
-          <w:t>16</w:t>
+          <w:t>17</w:t>
         </w:r>
         <w:r>
           <w:rPr>
@@ -2407,7 +2407,7 @@
           <w14:ligatures w14:val="standardContextual"/>
         </w:rPr>
       </w:pPr>
-      <w:hyperlink w:anchor="_Toc228405268" w:history="1">
+      <w:hyperlink w:anchor="_Toc228414687" w:history="1">
         <w:r>
           <w:rPr>
             <w:rStyle w:val="Lienhypertexte"/>
@@ -2434,7 +2434,7 @@
             <w:noProof/>
             <w:webHidden/>
           </w:rPr>
-          <w:instrText xml:space="preserve"> PAGEREF _Toc228405268 \h </w:instrText>
+          <w:instrText xml:space="preserve"> PAGEREF _Toc228414687 \h </w:instrText>
         </w:r>
         <w:r>
           <w:rPr>
@@ -2454,7 +2454,7 @@
             <w:noProof/>
             <w:webHidden/>
           </w:rPr>
-          <w:t>16</w:t>
+          <w:t>17</w:t>
         </w:r>
         <w:r>
           <w:rPr>
@@ -2480,7 +2480,7 @@
           <w14:ligatures w14:val="standardContextual"/>
         </w:rPr>
       </w:pPr>
-      <w:hyperlink w:anchor="_Toc228405269" w:history="1">
+      <w:hyperlink w:anchor="_Toc228414688" w:history="1">
         <w:r>
           <w:rPr>
             <w:rStyle w:val="Lienhypertexte"/>
@@ -2507,7 +2507,7 @@
             <w:noProof/>
             <w:webHidden/>
           </w:rPr>
-          <w:instrText xml:space="preserve"> PAGEREF _Toc228405269 \h </w:instrText>
+          <w:instrText xml:space="preserve"> PAGEREF _Toc228414688 \h </w:instrText>
         </w:r>
         <w:r>
           <w:rPr>
@@ -2527,7 +2527,7 @@
             <w:noProof/>
             <w:webHidden/>
           </w:rPr>
-          <w:t>17</w:t>
+          <w:t>18</w:t>
         </w:r>
         <w:r>
           <w:rPr>
@@ -2553,7 +2553,7 @@
           <w14:ligatures w14:val="standardContextual"/>
         </w:rPr>
       </w:pPr>
-      <w:hyperlink w:anchor="_Toc228405270" w:history="1">
+      <w:hyperlink w:anchor="_Toc228414689" w:history="1">
         <w:r>
           <w:rPr>
             <w:rStyle w:val="Lienhypertexte"/>
@@ -2581,7 +2581,7 @@
             <w:noProof/>
             <w:webHidden/>
           </w:rPr>
-          <w:instrText xml:space="preserve"> PAGEREF _Toc228405270 \h </w:instrText>
+          <w:instrText xml:space="preserve"> PAGEREF _Toc228414689 \h </w:instrText>
         </w:r>
         <w:r>
           <w:rPr>
@@ -2601,7 +2601,7 @@
             <w:noProof/>
             <w:webHidden/>
           </w:rPr>
-          <w:t>17</w:t>
+          <w:t>18</w:t>
         </w:r>
         <w:r>
           <w:rPr>
@@ -2627,7 +2627,7 @@
           <w14:ligatures w14:val="standardContextual"/>
         </w:rPr>
       </w:pPr>
-      <w:hyperlink w:anchor="_Toc228405271" w:history="1">
+      <w:hyperlink w:anchor="_Toc228414690" w:history="1">
         <w:r>
           <w:rPr>
             <w:rStyle w:val="Lienhypertexte"/>
@@ -2655,7 +2655,7 @@
             <w:noProof/>
             <w:webHidden/>
           </w:rPr>
-          <w:instrText xml:space="preserve"> PAGEREF _Toc228405271 \h </w:instrText>
+          <w:instrText xml:space="preserve"> PAGEREF _Toc228414690 \h </w:instrText>
         </w:r>
         <w:r>
           <w:rPr>
@@ -2675,7 +2675,7 @@
             <w:noProof/>
             <w:webHidden/>
           </w:rPr>
-          <w:t>17</w:t>
+          <w:t>18</w:t>
         </w:r>
         <w:r>
           <w:rPr>
@@ -2701,7 +2701,7 @@
           <w14:ligatures w14:val="standardContextual"/>
         </w:rPr>
       </w:pPr>
-      <w:hyperlink w:anchor="_Toc228405272" w:history="1">
+      <w:hyperlink w:anchor="_Toc228414691" w:history="1">
         <w:r>
           <w:rPr>
             <w:rStyle w:val="Lienhypertexte"/>
@@ -2728,7 +2728,7 @@
             <w:noProof/>
             <w:webHidden/>
           </w:rPr>
-          <w:instrText xml:space="preserve"> PAGEREF _Toc228405272 \h </w:instrText>
+          <w:instrText xml:space="preserve"> PAGEREF _Toc228414691 \h </w:instrText>
         </w:r>
         <w:r>
           <w:rPr>
@@ -2748,7 +2748,7 @@
             <w:noProof/>
             <w:webHidden/>
           </w:rPr>
-          <w:t>17</w:t>
+          <w:t>18</w:t>
         </w:r>
         <w:r>
           <w:rPr>
@@ -2774,7 +2774,7 @@
           <w14:ligatures w14:val="standardContextual"/>
         </w:rPr>
       </w:pPr>
-      <w:hyperlink w:anchor="_Toc228405273" w:history="1">
+      <w:hyperlink w:anchor="_Toc228414692" w:history="1">
         <w:r>
           <w:rPr>
             <w:rStyle w:val="Lienhypertexte"/>
@@ -2801,7 +2801,7 @@
             <w:noProof/>
             <w:webHidden/>
           </w:rPr>
-          <w:instrText xml:space="preserve"> PAGEREF _Toc228405273 \h </w:instrText>
+          <w:instrText xml:space="preserve"> PAGEREF _Toc228414692 \h </w:instrText>
         </w:r>
         <w:r>
           <w:rPr>
@@ -2821,7 +2821,7 @@
             <w:noProof/>
             <w:webHidden/>
           </w:rPr>
-          <w:t>18</w:t>
+          <w:t>19</w:t>
         </w:r>
         <w:r>
           <w:rPr>
@@ -2847,7 +2847,7 @@
           <w14:ligatures w14:val="standardContextual"/>
         </w:rPr>
       </w:pPr>
-      <w:hyperlink w:anchor="_Toc228405274" w:history="1">
+      <w:hyperlink w:anchor="_Toc228414693" w:history="1">
         <w:r>
           <w:rPr>
             <w:rStyle w:val="Lienhypertexte"/>
@@ -2874,7 +2874,7 @@
             <w:noProof/>
             <w:webHidden/>
           </w:rPr>
-          <w:instrText xml:space="preserve"> PAGEREF _Toc228405274 \h </w:instrText>
+          <w:instrText xml:space="preserve"> PAGEREF _Toc228414693 \h </w:instrText>
         </w:r>
         <w:r>
           <w:rPr>
@@ -2894,7 +2894,7 @@
             <w:noProof/>
             <w:webHidden/>
           </w:rPr>
-          <w:t>19</w:t>
+          <w:t>20</w:t>
         </w:r>
         <w:r>
           <w:rPr>
@@ -2920,7 +2920,7 @@
           <w14:ligatures w14:val="standardContextual"/>
         </w:rPr>
       </w:pPr>
-      <w:hyperlink w:anchor="_Toc228405275" w:history="1">
+      <w:hyperlink w:anchor="_Toc228414694" w:history="1">
         <w:r>
           <w:rPr>
             <w:rStyle w:val="Lienhypertexte"/>
@@ -2947,7 +2947,7 @@
             <w:noProof/>
             <w:webHidden/>
           </w:rPr>
-          <w:instrText xml:space="preserve"> PAGEREF _Toc228405275 \h </w:instrText>
+          <w:instrText xml:space="preserve"> PAGEREF _Toc228414694 \h </w:instrText>
         </w:r>
         <w:r>
           <w:rPr>
@@ -2967,7 +2967,7 @@
             <w:noProof/>
             <w:webHidden/>
           </w:rPr>
-          <w:t>19</w:t>
+          <w:t>20</w:t>
         </w:r>
         <w:r>
           <w:rPr>
@@ -2993,7 +2993,7 @@
           <w14:ligatures w14:val="standardContextual"/>
         </w:rPr>
       </w:pPr>
-      <w:hyperlink w:anchor="_Toc228405276" w:history="1">
+      <w:hyperlink w:anchor="_Toc228414695" w:history="1">
         <w:r>
           <w:rPr>
             <w:rStyle w:val="Lienhypertexte"/>
@@ -3020,7 +3020,7 @@
             <w:noProof/>
             <w:webHidden/>
           </w:rPr>
-          <w:instrText xml:space="preserve"> PAGEREF _Toc228405276 \h </w:instrText>
+          <w:instrText xml:space="preserve"> PAGEREF _Toc228414695 \h </w:instrText>
         </w:r>
         <w:r>
           <w:rPr>
@@ -3040,7 +3040,7 @@
             <w:noProof/>
             <w:webHidden/>
           </w:rPr>
-          <w:t>21</w:t>
+          <w:t>22</w:t>
         </w:r>
         <w:r>
           <w:rPr>
@@ -3074,7 +3074,7 @@
       <w:pPr>
         <w:pStyle w:val="Titre1"/>
       </w:pPr>
-      <w:bookmarkStart w:id="0" w:name="_Toc228405241"/>
+      <w:bookmarkStart w:id="0" w:name="_Toc228414660"/>
       <w:r>
         <w:lastRenderedPageBreak/>
         <w:t>1. POSITIONNEMENT DE LA RECHERCHE</w:t>
@@ -3089,7 +3089,7 @@
           <w:color w:val="4472C4" w:themeColor="accent1"/>
         </w:rPr>
       </w:pPr>
-      <w:bookmarkStart w:id="1" w:name="_Toc228405242"/>
+      <w:bookmarkStart w:id="1" w:name="_Toc228414661"/>
       <w:r>
         <w:rPr>
           <w:rFonts w:eastAsia="Times New Roman"/>
@@ -5737,7 +5737,7 @@
           <w:rFonts w:eastAsia="Times New Roman"/>
         </w:rPr>
       </w:pPr>
-      <w:bookmarkStart w:id="3" w:name="_Toc228405243"/>
+      <w:bookmarkStart w:id="3" w:name="_Toc228414662"/>
       <w:r>
         <w:rPr>
           <w:rFonts w:eastAsia="Times New Roman"/>
@@ -6189,7 +6189,7 @@
       <w:pPr>
         <w:pStyle w:val="Titre2"/>
       </w:pPr>
-      <w:bookmarkStart w:id="4" w:name="_Toc228405244"/>
+      <w:bookmarkStart w:id="4" w:name="_Toc228414663"/>
       <w:r>
         <w:t>E</w:t>
       </w:r>
@@ -6684,10 +6684,16 @@
         <w:t>cahier des charges</w:t>
       </w:r>
       <w:r>
+        <w:t>, par l’expertise, les livrables, la gestion de projet</w:t>
+      </w:r>
+      <w:r>
         <w:t>)</w:t>
       </w:r>
       <w:r>
-        <w:t xml:space="preserve"> et un axe politique, moins tangible, lié au fait de </w:t>
+        <w:t xml:space="preserve"> et un axe politique, moins tangible</w:t>
+      </w:r>
+      <w:r>
+        <w:t xml:space="preserve"> (le fait de </w:t>
       </w:r>
       <w:r>
         <w:t xml:space="preserve">construire le consensus et l’engagement autour des actions correctives, </w:t>
@@ -6696,6 +6702,9 @@
         <w:t>pour assoir les résultats de la mission</w:t>
       </w:r>
       <w:r>
+        <w:t>)</w:t>
+      </w:r>
+      <w:r>
         <w:t xml:space="preserve"> </w:t>
       </w:r>
       <w:r>
@@ -6796,7 +6805,12 @@
       </w:r>
       <w:bookmarkEnd w:id="5"/>
       <w:r>
-        <w:t xml:space="preserve"> Or, axe</w:t>
+        <w:t xml:space="preserve"> </w:t>
+      </w:r>
+    </w:p>
+    <w:p>
+      <w:r>
+        <w:t>Or, axe</w:t>
       </w:r>
       <w:r>
         <w:t xml:space="preserve"> technique et politique</w:t>
@@ -6940,19 +6954,19 @@
         <w:rPr>
           <w:rFonts w:eastAsia="Times New Roman"/>
         </w:rPr>
-        <w:t>et l</w:t>
-      </w:r>
-      <w:r>
-        <w:rPr>
-          <w:rFonts w:eastAsia="Times New Roman"/>
-        </w:rPr>
-        <w:t xml:space="preserve">eur </w:t>
-      </w:r>
-      <w:r>
-        <w:rPr>
-          <w:rFonts w:eastAsia="Times New Roman"/>
-        </w:rPr>
-        <w:t>appropriation</w:t>
+        <w:t>le fondement de l’aspect politique du conseil se fragilise</w:t>
+      </w:r>
+      <w:r>
+        <w:rPr>
+          <w:rFonts w:eastAsia="Times New Roman"/>
+        </w:rPr>
+        <w:t xml:space="preserve"> également</w:t>
+      </w:r>
+      <w:r>
+        <w:rPr>
+          <w:rFonts w:eastAsia="Times New Roman"/>
+        </w:rPr>
+        <w:t>.</w:t>
       </w:r>
       <w:r>
         <w:rPr>
@@ -6964,31 +6978,43 @@
         <w:rPr>
           <w:rFonts w:eastAsia="Times New Roman"/>
         </w:rPr>
-        <w:t xml:space="preserve">par le client </w:t>
-      </w:r>
-      <w:r>
-        <w:rPr>
-          <w:rFonts w:eastAsia="Times New Roman"/>
-        </w:rPr>
-        <w:t>interroge</w:t>
-      </w:r>
-      <w:r>
-        <w:rPr>
-          <w:rFonts w:eastAsia="Times New Roman"/>
-        </w:rPr>
-        <w:t xml:space="preserve">, </w:t>
-      </w:r>
-      <w:r>
-        <w:rPr>
-          <w:rFonts w:eastAsia="Times New Roman"/>
-        </w:rPr>
-        <w:t>le fondement de l’aspect politique du conseil se fragilise</w:t>
-      </w:r>
-      <w:r>
-        <w:rPr>
-          <w:rFonts w:eastAsia="Times New Roman"/>
-        </w:rPr>
-        <w:t xml:space="preserve"> également</w:t>
+        <w:t xml:space="preserve">Dit autrement, </w:t>
+      </w:r>
+      <w:r>
+        <w:rPr>
+          <w:rFonts w:eastAsia="Times New Roman"/>
+        </w:rPr>
+        <w:t xml:space="preserve">le conseil « marche moins bien », et </w:t>
+      </w:r>
+      <w:r>
+        <w:rPr>
+          <w:rFonts w:eastAsia="Times New Roman"/>
+        </w:rPr>
+        <w:t xml:space="preserve">la valeur </w:t>
+      </w:r>
+      <w:r>
+        <w:rPr>
+          <w:rFonts w:eastAsia="Times New Roman"/>
+        </w:rPr>
+        <w:t>perçue</w:t>
+      </w:r>
+      <w:r>
+        <w:rPr>
+          <w:rFonts w:eastAsia="Times New Roman"/>
+        </w:rPr>
+        <w:t xml:space="preserve"> </w:t>
+      </w:r>
+      <w:r>
+        <w:rPr>
+          <w:rFonts w:eastAsia="Times New Roman"/>
+        </w:rPr>
+        <w:t xml:space="preserve">du conseil </w:t>
+      </w:r>
+      <w:r>
+        <w:rPr>
+          <w:rFonts w:eastAsia="Times New Roman"/>
+        </w:rPr>
+        <w:t>se fragilise</w:t>
       </w:r>
       <w:r>
         <w:rPr>
@@ -7013,14 +7039,9 @@
         <w:rPr>
           <w:rFonts w:eastAsia="Times New Roman"/>
         </w:rPr>
-        <w:t xml:space="preserve">Dit autrement, la valeur </w:t>
-      </w:r>
-      <w:r>
-        <w:rPr>
-          <w:rFonts w:eastAsia="Times New Roman"/>
-        </w:rPr>
-        <w:t>perçue</w:t>
-      </w:r>
+        <w:t>La dimension émotionnelle de la valeur perçue relève de l’expérience</w:t>
+      </w:r>
+      <w:bookmarkStart w:id="6" w:name="_Hlk228412627"/>
       <w:r>
         <w:rPr>
           <w:rFonts w:eastAsia="Times New Roman"/>
@@ -7031,13 +7052,32 @@
         <w:rPr>
           <w:rFonts w:eastAsia="Times New Roman"/>
         </w:rPr>
-        <w:t xml:space="preserve">du conseil </w:t>
-      </w:r>
-      <w:r>
-        <w:rPr>
-          <w:rFonts w:eastAsia="Times New Roman"/>
-        </w:rPr>
-        <w:t>devient contestable</w:t>
+        <w:fldChar w:fldCharType="begin"/>
+      </w:r>
+      <w:r>
+        <w:rPr>
+          <w:rFonts w:eastAsia="Times New Roman"/>
+        </w:rPr>
+        <w:instrText xml:space="preserve"> ADDIN ZOTERO_ITEM CSL_CITATION {"citationID":"m7uKiTaZ","properties":{"unsorted":false,"formattedCitation":"(Arslanagic-Kalajdzic &amp; Zabkar, 2017)","plainCitation":"(Arslanagic-Kalajdzic &amp; Zabkar, 2017)","noteIndex":0},"citationItems":[{"id":14592,"uris":["http://zotero.org/users/12622049/items/HTJLFKWT"],"itemData":{"id":14592,"type":"article-journal","abstract":"It is well documented in the literature that customer perceived value plays an important role in understanding behavioral outcomes of business customers. However, most business-to-business research has focused on the functional dimension of perceived value, while consumer research has already advanced to a multidimensional value conceptualization. This study expands the concept of perceived value in the professional business services context to functional, emotional, and social perceived value. Based on signaling theory, we conceptualize and empirically support links between the three dimensions of perceived value and its antecedents (perceived corporate reputation, perceived corporate credibility, and perceived relationship quality) and outcomes (satisfaction and loyalty). The results of a survey involving 228 business clients reveal differences in links between value antecedents and the three perceived value dimensions: while perceived corporate credibility and relationship quality impact all dimensions, perceived corporate reputation impacts only perceived emotional value. Results of our study help in understanding how satisfaction and loyalty are viewed as perceived value outcomes; apart from functional value, emotional and social values play a significant role in the satisfaction and loyalty of professional business services clients.","call-number":"2","citation-key":"arslanagic-kalajdzicPerceivedValueMore2017","container-title":"Industrial Marketing Management","DOI":"10.1016/j.indmarman.2017.05.005","ISSN":"0019-8501","journalAbbreviation":"Industrial Marketing Management","page":"47-58","source":"ScienceDirect","title":"Is perceived value more than value for money in professional business services?","volume":"65","author":[{"family":"Arslanagic-Kalajdzic","given":"Maja"},{"family":"Zabkar","given":"Vesna"}],"issued":{"date-parts":[["2017",8,1]]}}}],"schema":"https://github.com/citation-style-language/schema/raw/master/csl-citation.json"} </w:instrText>
+      </w:r>
+      <w:r>
+        <w:rPr>
+          <w:rFonts w:eastAsia="Times New Roman"/>
+        </w:rPr>
+        <w:fldChar w:fldCharType="separate"/>
+      </w:r>
+      <w:r>
+        <w:rPr>
+          <w:rFonts w:eastAsia="Times New Roman"/>
+          <w:noProof/>
+        </w:rPr>
+        <w:t>(Arslanagic-Kalajdzic &amp; Zabkar, 2017)</w:t>
+      </w:r>
+      <w:r>
+        <w:rPr>
+          <w:rFonts w:eastAsia="Times New Roman"/>
+        </w:rPr>
+        <w:fldChar w:fldCharType="end"/>
       </w:r>
       <w:r>
         <w:rPr>
@@ -7051,40 +7091,284 @@
         </w:rPr>
         <w:t xml:space="preserve"> </w:t>
       </w:r>
-      <w:r>
-        <w:t>Dans ces conditions, q</w:t>
-      </w:r>
-      <w:r>
-        <w:t xml:space="preserve">uels </w:t>
-      </w:r>
-      <w:r>
-        <w:t xml:space="preserve">peuvent être les mécanismes </w:t>
-      </w:r>
-      <w:r>
-        <w:t>protecteur</w:t>
-      </w:r>
-      <w:r>
-        <w:t>s</w:t>
-      </w:r>
-      <w:r>
-        <w:t xml:space="preserve"> de </w:t>
-      </w:r>
-      <w:r>
-        <w:t xml:space="preserve">la </w:t>
-      </w:r>
-      <w:proofErr w:type="spellStart"/>
-      <w:r>
-        <w:t>co-création</w:t>
-      </w:r>
-      <w:proofErr w:type="spellEnd"/>
-      <w:r>
-        <w:t xml:space="preserve"> de valeur perçue du conseil à l’ère de l’IA</w:t>
-      </w:r>
-      <w:r>
+    </w:p>
+    <w:p>
+      <w:pPr>
+        <w:rPr>
+          <w:rFonts w:eastAsia="Times New Roman"/>
+        </w:rPr>
+      </w:pPr>
+      <w:r>
+        <w:rPr>
+          <w:rFonts w:eastAsia="Times New Roman"/>
+        </w:rPr>
+        <w:t>C</w:t>
+      </w:r>
+      <w:r>
+        <w:rPr>
+          <w:rFonts w:eastAsia="Times New Roman"/>
+        </w:rPr>
+        <w:t xml:space="preserve">ouplée à </w:t>
+      </w:r>
+      <w:r>
+        <w:rPr>
+          <w:rFonts w:eastAsia="Times New Roman"/>
+        </w:rPr>
+        <w:t>la qualité de la relation</w:t>
+      </w:r>
+      <w:r>
+        <w:rPr>
+          <w:rFonts w:eastAsia="Times New Roman"/>
+        </w:rPr>
+        <w:t>, l’expérience impacte</w:t>
+      </w:r>
+      <w:r>
+        <w:rPr>
+          <w:rFonts w:eastAsia="Times New Roman"/>
+        </w:rPr>
+        <w:t xml:space="preserve"> directement la valeur émotionnelle perçue par le client</w:t>
+      </w:r>
+      <w:r>
+        <w:rPr>
+          <w:rFonts w:eastAsia="Times New Roman"/>
+        </w:rPr>
+        <w:t>.</w:t>
+      </w:r>
+      <w:r>
+        <w:rPr>
+          <w:rFonts w:eastAsia="Times New Roman"/>
+        </w:rPr>
         <w:t xml:space="preserve"> </w:t>
       </w:r>
       <w:r>
-        <w:t xml:space="preserve">? </w:t>
+        <w:rPr>
+          <w:rFonts w:eastAsia="Times New Roman"/>
+        </w:rPr>
+        <w:t>L</w:t>
+      </w:r>
+      <w:r>
+        <w:rPr>
+          <w:rFonts w:eastAsia="Times New Roman"/>
+        </w:rPr>
+        <w:t>es besoins socio-émotionnels permettent de construire l'engagement et la confiance nécessaires à la réussite politique et humaine de la mission</w:t>
+      </w:r>
+      <w:r>
+        <w:rPr>
+          <w:rFonts w:eastAsia="Times New Roman"/>
+        </w:rPr>
+        <w:t>.</w:t>
+      </w:r>
+      <w:r>
+        <w:rPr>
+          <w:rFonts w:eastAsia="Times New Roman"/>
+        </w:rPr>
+        <w:t xml:space="preserve"> </w:t>
+      </w:r>
+      <w:r>
+        <w:rPr>
+          <w:rFonts w:eastAsia="Times New Roman"/>
+        </w:rPr>
+        <w:t xml:space="preserve">En premier lieu, </w:t>
+      </w:r>
+      <w:r>
+        <w:rPr>
+          <w:rFonts w:eastAsia="Times New Roman"/>
+        </w:rPr>
+        <w:t xml:space="preserve">le client évalue </w:t>
+      </w:r>
+      <w:r>
+        <w:rPr>
+          <w:rFonts w:eastAsia="Times New Roman"/>
+        </w:rPr>
+        <w:t>les</w:t>
+      </w:r>
+      <w:r>
+        <w:rPr>
+          <w:rFonts w:eastAsia="Times New Roman"/>
+        </w:rPr>
+        <w:t xml:space="preserve"> ressources liées à la tâche</w:t>
+      </w:r>
+      <w:r>
+        <w:rPr>
+          <w:rFonts w:eastAsia="Times New Roman"/>
+        </w:rPr>
+        <w:t xml:space="preserve"> </w:t>
+      </w:r>
+      <w:r>
+        <w:rPr>
+          <w:rFonts w:eastAsia="Times New Roman"/>
+        </w:rPr>
+        <w:t>(dimension fonctionnelle</w:t>
+      </w:r>
+      <w:r>
+        <w:rPr>
+          <w:rFonts w:eastAsia="Times New Roman"/>
+        </w:rPr>
+        <w:t>, le socle</w:t>
+      </w:r>
+      <w:r>
+        <w:rPr>
+          <w:rFonts w:eastAsia="Times New Roman"/>
+        </w:rPr>
+        <w:t xml:space="preserve">), </w:t>
+      </w:r>
+      <w:r>
+        <w:rPr>
+          <w:rFonts w:eastAsia="Times New Roman"/>
+        </w:rPr>
+        <w:t xml:space="preserve">puis </w:t>
+      </w:r>
+      <w:r>
+        <w:rPr>
+          <w:rFonts w:eastAsia="Times New Roman"/>
+        </w:rPr>
+        <w:t>l</w:t>
+      </w:r>
+      <w:r>
+        <w:rPr>
+          <w:rFonts w:eastAsia="Times New Roman"/>
+        </w:rPr>
+        <w:t>es ressources socio-émotionnelles</w:t>
+      </w:r>
+      <w:r>
+        <w:rPr>
+          <w:rFonts w:eastAsia="Times New Roman"/>
+        </w:rPr>
+        <w:t xml:space="preserve"> (</w:t>
+      </w:r>
+      <w:r>
+        <w:rPr>
+          <w:rFonts w:eastAsia="Times New Roman"/>
+        </w:rPr>
+        <w:t>la dimension humaine de l'interaction</w:t>
+      </w:r>
+      <w:r>
+        <w:rPr>
+          <w:rFonts w:eastAsia="Times New Roman"/>
+        </w:rPr>
+        <w:t xml:space="preserve">, i.e. </w:t>
+      </w:r>
+      <w:r>
+        <w:rPr>
+          <w:rFonts w:eastAsia="Times New Roman"/>
+        </w:rPr>
+        <w:t>l'empathie, l'écoute, le soutien, le développement d'une relation de confiance, la gestion du stress du client).</w:t>
+      </w:r>
+      <w:r>
+        <w:rPr>
+          <w:rFonts w:eastAsia="Times New Roman"/>
+        </w:rPr>
+        <w:t xml:space="preserve"> Or, l</w:t>
+      </w:r>
+      <w:r>
+        <w:rPr>
+          <w:rFonts w:eastAsia="Times New Roman"/>
+        </w:rPr>
+        <w:t>a valeur perçue par le client n'est pas statique : elle fluctue fortement en fonction du contexte et des contraintes de la situation</w:t>
+      </w:r>
+      <w:r>
+        <w:rPr>
+          <w:rFonts w:eastAsia="Times New Roman"/>
+        </w:rPr>
+        <w:t xml:space="preserve">. </w:t>
+      </w:r>
+      <w:r>
+        <w:rPr>
+          <w:rFonts w:eastAsia="Times New Roman"/>
+        </w:rPr>
+        <w:t xml:space="preserve">Lorsque le client fait face à de fortes contraintes de temps (urgence) ou de budget, la valeur accordée aux ressources socio-émotionnelles chute brutalement. Dans le cadre d'une relation à long terme, la valeur perçue des ressources socio-émotionnelles augmente considérablement par rapport à une relation à court terme. Pour qu'une mission longue réussisse, le client a besoin que le consultant s'investisse émotionnellement et relationnellement </w:t>
+      </w:r>
+      <w:r>
+        <w:rPr>
+          <w:rFonts w:eastAsia="Times New Roman"/>
+        </w:rPr>
+        <w:fldChar w:fldCharType="begin"/>
+      </w:r>
+      <w:r>
+        <w:rPr>
+          <w:rFonts w:eastAsia="Times New Roman"/>
+        </w:rPr>
+        <w:instrText xml:space="preserve"> ADDIN ZOTERO_ITEM CSL_CITATION {"citationID":"Wkh6pR73","properties":{"unsorted":false,"formattedCitation":"(Plenge et al., 2008)","plainCitation":"(Plenge et al., 2008)","noteIndex":0},"citationItems":[{"id":3191,"uris":["http://zotero.org/users/12622049/items/EYUM857J"],"itemData":{"id":3191,"type":"article-journal","abstract":"Purpose\nThis article aims to examine how situational constraints impact clients' valuations of the task and socio‐emotional resources exchanged when interacting with consultants. In consultant‐client relationships, the emphasis on economic resources has commodified these interactions into explicit exchanges of time, money, and deliverables.\n\nDesign/methodology/approach\nA total of five hypotheses were tested using a within‐subjects experimental design. Subjects consisted of 110 adult professionals who were presented with five different scenarios in a random sequence and asked to rank order and evaluate a list of professional‐service resources.\n\nFindings\nThe valuation of resources was found to change when situational constraints were present. Regardless of the context, task resources were generally valued more than socio‐emotional resources. When relational constraints were salient, socio‐emotional resources were valued more in long‐term than short‐term relationships. When faced with time pressure or budgetary constraints, task needs were valued more than socio‐emotional needs.\n\nResearch limitations/implications\nThere is potential bias due to snowball sampling, and the hypothetical nature of the experimental scenarios limits the generalizability of this study.\n\nPractical implications\nFor clients, this research indicates that the context surrounding consultant‐client interactions plays an important role in shaping clients' valuation of resources, both individually and collectively. For consultants, these findings suggest that a “one‐size‐fits‐all” strategy is not the most effective way to approach consultant‐client interactions.\n\nOriginality/value\nThis study contributes to our knowledge about how situational constraints impact clients' valuation of the task and socio‐emotional resources offered by consultants.","call-number":"N/A","citation-key":"plengeInfluenceSituationalConstraints2008","container-title":"International Journal of Organizational Analysis","DOI":"10.1108/19348830710868284","journalAbbreviation":"International Journal of Organizational Analysis","note":"1 citations (Crossref) [2024-02-01]","page":"136-151","source":"ResearchGate","title":"The influence of situational constraints on the perceived value of consulting services","volume":"15","author":[{"family":"Plenge","given":"Nicole"},{"family":"Erickson","given":"Robin"},{"family":"Roloff","given":"Michael"}],"issued":{"date-parts":[["2008",3,18]]}}}],"schema":"https://github.com/citation-style-language/schema/raw/master/csl-citation.json"} </w:instrText>
+      </w:r>
+      <w:r>
+        <w:rPr>
+          <w:rFonts w:eastAsia="Times New Roman"/>
+        </w:rPr>
+        <w:fldChar w:fldCharType="separate"/>
+      </w:r>
+      <w:r>
+        <w:rPr>
+          <w:rFonts w:eastAsia="Times New Roman"/>
+          <w:noProof/>
+        </w:rPr>
+        <w:t>(Plenge et al., 2008)</w:t>
+      </w:r>
+      <w:r>
+        <w:rPr>
+          <w:rFonts w:eastAsia="Times New Roman"/>
+        </w:rPr>
+        <w:fldChar w:fldCharType="end"/>
+      </w:r>
+      <w:r>
+        <w:rPr>
+          <w:rFonts w:eastAsia="Times New Roman"/>
+        </w:rPr>
+        <w:t>.</w:t>
+      </w:r>
+      <w:r>
+        <w:rPr>
+          <w:rFonts w:eastAsia="Times New Roman"/>
+        </w:rPr>
+        <w:t xml:space="preserve"> </w:t>
+      </w:r>
+    </w:p>
+    <w:p>
+      <w:pPr>
+        <w:rPr>
+          <w:rFonts w:eastAsia="Times New Roman"/>
+        </w:rPr>
+      </w:pPr>
+      <w:r>
+        <w:rPr>
+          <w:rFonts w:eastAsia="Times New Roman"/>
+        </w:rPr>
+        <w:t>Si le résultat de la tâche est perçu comme illisible ou suspect</w:t>
+      </w:r>
+      <w:r>
+        <w:rPr>
+          <w:rFonts w:eastAsia="Times New Roman"/>
+        </w:rPr>
+        <w:t xml:space="preserve"> du fait de l’IA</w:t>
+      </w:r>
+      <w:r>
+        <w:rPr>
+          <w:rFonts w:eastAsia="Times New Roman"/>
+        </w:rPr>
+        <w:t xml:space="preserve">, tout l'édifice socio-émotionnel </w:t>
+      </w:r>
+      <w:r>
+        <w:rPr>
+          <w:rFonts w:eastAsia="Times New Roman"/>
+        </w:rPr>
+        <w:t>risque l</w:t>
+      </w:r>
+      <w:r>
+        <w:rPr>
+          <w:rFonts w:eastAsia="Times New Roman"/>
+        </w:rPr>
+        <w:t>'écroule</w:t>
+      </w:r>
+      <w:r>
+        <w:rPr>
+          <w:rFonts w:eastAsia="Times New Roman"/>
+        </w:rPr>
+        <w:t>ment</w:t>
+      </w:r>
+      <w:r>
+        <w:rPr>
+          <w:rFonts w:eastAsia="Times New Roman"/>
+        </w:rPr>
+        <w:t>.</w:t>
       </w:r>
     </w:p>
     <w:p>
@@ -7095,22 +7379,23 @@
           <w:color w:val="3A332D"/>
         </w:rPr>
       </w:pPr>
-      <w:bookmarkStart w:id="6" w:name="_Hlk227872854"/>
-      <w:bookmarkStart w:id="7" w:name="_Toc228405245"/>
+      <w:bookmarkStart w:id="7" w:name="_Hlk227872854"/>
+      <w:bookmarkStart w:id="8" w:name="_Toc228414664"/>
+      <w:bookmarkEnd w:id="6"/>
       <w:r>
         <w:rPr>
           <w:rFonts w:eastAsia="Times New Roman"/>
         </w:rPr>
         <w:t>Implications</w:t>
       </w:r>
-      <w:bookmarkEnd w:id="6"/>
+      <w:bookmarkEnd w:id="7"/>
       <w:r>
         <w:rPr>
           <w:rFonts w:eastAsia="Times New Roman"/>
         </w:rPr>
         <w:t xml:space="preserve"> de la recherche</w:t>
       </w:r>
-      <w:bookmarkEnd w:id="7"/>
+      <w:bookmarkEnd w:id="8"/>
     </w:p>
     <w:p>
       <w:pPr>
@@ -7359,54 +7644,27 @@
         <w:t xml:space="preserve"> </w:t>
       </w:r>
       <w:r>
-        <w:t xml:space="preserve">En </w:t>
-      </w:r>
-      <w:r>
-        <w:t>interroge</w:t>
-      </w:r>
-      <w:r>
-        <w:t xml:space="preserve">ant les effets de l’IA sur la valeur perçue du conseil, nous visons à éclairer la manière de faire </w:t>
-      </w:r>
-      <w:r>
-        <w:t xml:space="preserve">du </w:t>
-      </w:r>
-      <w:r>
-        <w:t xml:space="preserve">conseil </w:t>
-      </w:r>
-      <w:r>
-        <w:t>dont la valeur est perçue</w:t>
-      </w:r>
-      <w:r>
-        <w:t xml:space="preserve"> à sa juste valeur</w:t>
-      </w:r>
-      <w:r>
-        <w:t xml:space="preserve">, </w:t>
-      </w:r>
-      <w:r>
-        <w:t>à l’ère de l’IA</w:t>
-      </w:r>
-      <w:r>
-        <w:t>.</w:t>
+        <w:t>Notre recherche interroge la validité du principe de ‘vase communiquant’ : déléguer la technique à l’IA sans se préoccuper des effets profonds de l’IA (floutage des contributions, appropriation) peut influencer la dimension sociale et émotionnelle, et au final, la valeur perçue.</w:t>
       </w:r>
     </w:p>
     <w:p>
       <w:pPr>
         <w:pStyle w:val="Titre1"/>
       </w:pPr>
-      <w:bookmarkStart w:id="8" w:name="_Toc228405246"/>
+      <w:bookmarkStart w:id="9" w:name="_Toc228414665"/>
       <w:r>
         <w:t xml:space="preserve">2. CADRE </w:t>
       </w:r>
       <w:r>
         <w:t>THEORIQUE</w:t>
       </w:r>
-      <w:bookmarkEnd w:id="8"/>
+      <w:bookmarkEnd w:id="9"/>
     </w:p>
     <w:p>
       <w:pPr>
         <w:pStyle w:val="Titre2"/>
       </w:pPr>
-      <w:bookmarkStart w:id="9" w:name="_Toc228405247"/>
+      <w:bookmarkStart w:id="10" w:name="_Toc228414666"/>
       <w:r>
         <w:t>L</w:t>
       </w:r>
@@ -7437,10 +7695,11 @@
       <w:r>
         <w:t>restent à explorer</w:t>
       </w:r>
-      <w:bookmarkEnd w:id="9"/>
-    </w:p>
-    <w:p>
-      <w:r>
+      <w:bookmarkEnd w:id="10"/>
+    </w:p>
+    <w:p>
+      <w:r>
+        <w:lastRenderedPageBreak/>
         <w:t xml:space="preserve">Notre recherche </w:t>
       </w:r>
       <w:r>
@@ -7773,11 +8032,7 @@
         <w:t xml:space="preserve"> pour devenir acteur dynamique</w:t>
       </w:r>
       <w:r>
-        <w:t xml:space="preserve"> à part </w:t>
-      </w:r>
-      <w:r>
-        <w:lastRenderedPageBreak/>
-        <w:t xml:space="preserve">entière, </w:t>
+        <w:t xml:space="preserve"> à part entière, </w:t>
       </w:r>
       <w:r>
         <w:t xml:space="preserve">capable de </w:t>
@@ -8419,7 +8674,11 @@
         <w:t>,</w:t>
       </w:r>
       <w:r>
-        <w:t xml:space="preserve"> où un système voit sa valeur détruite tandis que l'autre en crée. Dans le conseil IA-augmenté, le consultant peut gagner en efficacité (plus de clients traités, recommandations plus rapides) tandis que le client perd en qualité perçue (moins d'empathie, recommandations inadaptées à son contexte spécifique). L'enchevêtrement masque ce déséquilibre en présentant une façade </w:t>
+        <w:t xml:space="preserve"> où un système voit sa valeur détruite tandis que l'autre en crée. Dans le conseil IA-augmenté, le consultant peut gagner en efficacité (plus de clients traités, recommandations plus rapides) tandis que le client perd en qualité perçue (moins d'empathie, </w:t>
+      </w:r>
+      <w:r>
+        <w:lastRenderedPageBreak/>
+        <w:t xml:space="preserve">recommandations inadaptées à son contexte spécifique). L'enchevêtrement masque ce déséquilibre en présentant une façade </w:t>
       </w:r>
       <w:proofErr w:type="gramStart"/>
       <w:r>
@@ -8647,504 +8906,504 @@
     </w:p>
     <w:p>
       <w:r>
+        <w:t>Dans le conseil, l</w:t>
+      </w:r>
+      <w:r>
+        <w:t xml:space="preserve">a valeur perçue est </w:t>
+      </w:r>
+      <w:r>
+        <w:t xml:space="preserve">aussi </w:t>
+      </w:r>
+      <w:r>
+        <w:t xml:space="preserve">dépendante du contexte : par exemple, </w:t>
+      </w:r>
+      <w:r>
+        <w:fldChar w:fldCharType="begin"/>
+      </w:r>
+      <w:r>
+        <w:instrText xml:space="preserve"> ADDIN ZOTERO_ITEM CSL_CITATION {"citationID":"aGBISpIA","properties":{"unsorted":false,"formattedCitation":"(Plenge et al., 2008)","plainCitation":"(Plenge et al., 2008)","dontUpdate":true,"noteIndex":0},"citationItems":[{"id":3191,"uris":["http://zotero.org/users/12622049/items/EYUM857J"],"itemData":{"id":3191,"type":"article-journal","abstract":"Purpose\nThis article aims to examine how situational constraints impact clients' valuations of the task and socio‐emotional resources exchanged when interacting with consultants. In consultant‐client relationships, the emphasis on economic resources has commodified these interactions into explicit exchanges of time, money, and deliverables.\n\nDesign/methodology/approach\nA total of five hypotheses were tested using a within‐subjects experimental design. Subjects consisted of 110 adult professionals who were presented with five different scenarios in a random sequence and asked to rank order and evaluate a list of professional‐service resources.\n\nFindings\nThe valuation of resources was found to change when situational constraints were present. Regardless of the context, task resources were generally valued more than socio‐emotional resources. When relational constraints were salient, socio‐emotional resources were valued more in long‐term than short‐term relationships. When faced with time pressure or budgetary constraints, task needs were valued more than socio‐emotional needs.\n\nResearch limitations/implications\nThere is potential bias due to snowball sampling, and the hypothetical nature of the experimental scenarios limits the generalizability of this study.\n\nPractical implications\nFor clients, this research indicates that the context surrounding consultant‐client interactions plays an important role in shaping clients' valuation of resources, both individually and collectively. For consultants, these findings suggest that a “one‐size‐fits‐all” strategy is not the most effective way to approach consultant‐client interactions.\n\nOriginality/value\nThis study contributes to our knowledge about how situational constraints impact clients' valuation of the task and socio‐emotional resources offered by consultants.","call-number":"N/A","citation-key":"plengeInfluenceSituationalConstraints2008","container-title":"International Journal of Organizational Analysis","DOI":"10.1108/19348830710868284","journalAbbreviation":"International Journal of Organizational Analysis","note":"1 citations (Crossref) [2024-02-01]","page":"136-151","source":"ResearchGate","title":"The influence of situational constraints on the perceived value of consulting services","volume":"15","author":[{"family":"Plenge","given":"Nicole"},{"family":"Erickson","given":"Robin"},{"family":"Roloff","given":"Michael"}],"issued":{"date-parts":[["2008",3,18]]}}}],"schema":"https://github.com/citation-style-language/schema/raw/master/csl-citation.json"} </w:instrText>
+      </w:r>
+      <w:r>
+        <w:fldChar w:fldCharType="separate"/>
+      </w:r>
+      <w:r>
+        <w:rPr>
+          <w:noProof/>
+        </w:rPr>
+        <w:t>Plenge et al. (2008)</w:t>
+      </w:r>
+      <w:r>
+        <w:fldChar w:fldCharType="end"/>
+      </w:r>
+      <w:r>
+        <w:t xml:space="preserve">, montrent que </w:t>
+      </w:r>
+      <w:r>
+        <w:t xml:space="preserve">sous la contrainte de budget ou de temps, les ressources liées à la tâche pure </w:t>
+      </w:r>
+      <w:r>
+        <w:t xml:space="preserve">(la dimension technique) </w:t>
+      </w:r>
+      <w:r>
+        <w:t>ont bien plus de valeur perçue que les ressources socio-émotionnelles</w:t>
+      </w:r>
+      <w:r>
+        <w:t xml:space="preserve"> (la dimension relationnelle).</w:t>
+      </w:r>
+    </w:p>
+    <w:p>
+      <w:r>
+        <w:t xml:space="preserve">Notre fondement théorique central est celui de la </w:t>
+      </w:r>
+      <w:proofErr w:type="spellStart"/>
+      <w:r>
+        <w:t>co-création</w:t>
+      </w:r>
+      <w:proofErr w:type="spellEnd"/>
+      <w:r>
+        <w:t xml:space="preserve"> de valeur perçue, pas celui-de la </w:t>
+      </w:r>
+      <w:proofErr w:type="spellStart"/>
+      <w:r>
+        <w:t>co</w:t>
+      </w:r>
+      <w:proofErr w:type="spellEnd"/>
+      <w:r>
+        <w:t>-destruction. On comprend néanmoins que la frontière est ténue</w:t>
+      </w:r>
+      <w:r>
+        <w:t xml:space="preserve"> et ne peut donc être ignorée</w:t>
+      </w:r>
+      <w:r>
+        <w:t>.</w:t>
+      </w:r>
+    </w:p>
+    <w:p>
+      <w:pPr>
+        <w:pStyle w:val="Titre2"/>
+      </w:pPr>
+      <w:bookmarkStart w:id="11" w:name="_Toc228414667"/>
+      <w:r>
+        <w:t xml:space="preserve">La valeur perçue </w:t>
+      </w:r>
+      <w:r>
+        <w:t xml:space="preserve">du conseil </w:t>
+      </w:r>
+      <w:r>
+        <w:t>est avant tout un accomplissement social</w:t>
+      </w:r>
+      <w:bookmarkEnd w:id="11"/>
+    </w:p>
+    <w:p>
+      <w:r>
+        <w:t xml:space="preserve">Ainsi, dans le conseil, la valeur perçue relève de trois dimensions : fonctionnelle, émotionnelle et sociale </w:t>
+      </w:r>
+      <w:r>
+        <w:fldChar w:fldCharType="begin"/>
+      </w:r>
+      <w:r>
+        <w:instrText xml:space="preserve"> ADDIN ZOTERO_ITEM CSL_CITATION {"citationID":"EG1igQe4","properties":{"unsorted":false,"formattedCitation":"(Arslanagic-Kalajdzic &amp; Zabkar, 2017)","plainCitation":"(Arslanagic-Kalajdzic &amp; Zabkar, 2017)","noteIndex":0},"citationItems":[{"id":14592,"uris":["http://zotero.org/users/12622049/items/HTJLFKWT"],"itemData":{"id":14592,"type":"article-journal","abstract":"It is well documented in the literature that customer perceived value plays an important role in understanding behavioral outcomes of business customers. However, most business-to-business research has focused on the functional dimension of perceived value, while consumer research has already advanced to a multidimensional value conceptualization. This study expands the concept of perceived value in the professional business services context to functional, emotional, and social perceived value. Based on signaling theory, we conceptualize and empirically support links between the three dimensions of perceived value and its antecedents (perceived corporate reputation, perceived corporate credibility, and perceived relationship quality) and outcomes (satisfaction and loyalty). The results of a survey involving 228 business clients reveal differences in links between value antecedents and the three perceived value dimensions: while perceived corporate credibility and relationship quality impact all dimensions, perceived corporate reputation impacts only perceived emotional value. Results of our study help in understanding how satisfaction and loyalty are viewed as perceived value outcomes; apart from functional value, emotional and social values play a significant role in the satisfaction and loyalty of professional business services clients.","call-number":"2","citation-key":"arslanagic-kalajdzicPerceivedValueMore2017","container-title":"Industrial Marketing Management","DOI":"10.1016/j.indmarman.2017.05.005","ISSN":"0019-8501","journalAbbreviation":"Industrial Marketing Management","page":"47-58","source":"ScienceDirect","title":"Is perceived value more than value for money in professional business services?","volume":"65","author":[{"family":"Arslanagic-Kalajdzic","given":"Maja"},{"family":"Zabkar","given":"Vesna"}],"issued":{"date-parts":[["2017",8,1]]}}}],"schema":"https://github.com/citation-style-language/schema/raw/master/csl-citation.json"} </w:instrText>
+      </w:r>
+      <w:r>
+        <w:fldChar w:fldCharType="separate"/>
+      </w:r>
+      <w:r>
+        <w:rPr>
+          <w:noProof/>
+        </w:rPr>
+        <w:t>(Arslanagic-Kalajdzic &amp; Zabkar, 2017)</w:t>
+      </w:r>
+      <w:r>
+        <w:fldChar w:fldCharType="end"/>
+      </w:r>
+      <w:r>
+        <w:t xml:space="preserve">. </w:t>
+      </w:r>
+    </w:p>
+    <w:p>
+      <w:r>
+        <w:t xml:space="preserve">La littérature suggère empiriquement deux liens constitutifs entre les dimensions de la valeur perçue du conseil : la confiance relationnelle comme précondition de l'engagement processuel </w:t>
+      </w:r>
+      <w:r>
+        <w:fldChar w:fldCharType="begin"/>
+      </w:r>
+      <w:r>
+        <w:instrText xml:space="preserve"> ADDIN ZOTERO_ITEM CSL_CITATION {"citationID":"J9A4ia1I","properties":{"unsorted":false,"formattedCitation":"(Bourgoin, 2014; Gl\\uc0\\u252{}ckler &amp; Armbr\\uc0\\u252{}ster, 2003; Nikolova &amp; Devinney, 2012; Sturdy, 2009)","plainCitation":"(Bourgoin, 2014; Glückler &amp; Armbrüster, 2003; Nikolova &amp; Devinney, 2012; Sturdy, 2009)","dontUpdate":true,"noteIndex":0},"citationItems":[{"id":11412,"uris":["http://zotero.org/users/12622049/items/JLYHMHD6"],"itemData":{"id":11412,"type":"thesis","archive":"HAL","citation-key":"bourgoinConseilManagementLepreuve2014","language":"fr","publisher":"Ecole National Supérieure des Mines de Paris","source":"Zotero","title":"Le conseil en management à l'épreuve de sa mise en valeur: une étude empirique","URL":"https://pastel.hal.science/pastel-00957543/document","author":[{"family":"Bourgoin","given":"Alaric"}],"issued":{"date-parts":[["2014",3]]}}},{"id":14676,"uris":["http://zotero.org/users/12622049/items/8V645GZR"],"itemData":{"id":14676,"type":"article-journal","abstract":"This article analyzes the market of management consulting and identiﬁes institutional and transactional uncertainty as its principal features. Based on these uncertainties, we argue that competition in this market takes place on entirely different grounds than in other business sectors. We suggest that the main drivers of competitiveness are neither price nor measurable quality, but rather experience-based trust and a mechanism we label ‘networked reputation.’ An embeddedness perspective is employed to develop the concept of networked reputation as an intermediate mechanism that complements the duality of system versus personal trust and accounts for firm growth. We reinterpret secondary data on the German consulting market, illustrate the signiﬁcance of these mechanisms, and demonstrate how management consulting is situated in structures of social relations.","call-number":"1","citation-key":"glucklerBridgingUncertaintyManagement","container-title":"Organization studies","language":"en","source":"Zotero","title":"Bridging Uncertainty in Management Consulting: The Mechanisms of Trust and Networked Reputation","author":[{"family":"Glückler","given":"Johannes"},{"family":"Armbrüster","given":"Thomas"}],"issued":{"date-parts":[["2003"]]}}},{"id":44,"uris":["http://zotero.org/users/12622049/items/GAEFL669"],"itemData":{"id":44,"type":"paper-conference","abstract":"In this paper, we analyse the complex interaction between professional advisors and their clients. Our aim is to summarize and critically review the relevant literature and to outline major directions for future research. There are three competing models that discuss the interaction between professional service providers and their clients: the expert model, the ‘reflective practitioner’ model and the critical model. After reviewing assumptions underlying these approaches as well as their contributions and shortcomings, we suggest that the key problem with these models is that they offer only partial insights into the relationship between clients and professional business service providers. Additionally, they have different epistemological foundations and, as such, they are incompatible. Building upon the existing research and our discussion, we outline the major issues of client-consultant interaction that future research needs to address in order to provide a multifaceted understanding of the client-consultant relationship.","citation-key":"nikolovaNatureClientConsultant2012","DOI":"10.1093/oxfordhb/9780199235049.013.0019","note":"DOI: 10.1093/oxfordhb/9780199235049.013.0019","publisher":"Oxford University Press","source":"Semantic Scholar","title":"The Nature Of Client–Consultant Interaction: A Critical Review","title-short":"The Nature Of Client–Consultant Interaction","URL":"https://academic.oup.com/edited-volume/38572/chapter/334566078","author":[{"family":"Nikolova","given":"Natalia"},{"family":"Devinney","given":"Timothy"}],"accessed":{"date-parts":[["2023",10,7]]},"issued":{"date-parts":[["2012",3,29]]}}},{"id":4610,"uris":["http://zotero.org/users/12622049/items/3ZK9SL9P"],"itemData":{"id":4610,"type":"article-journal","abstract":"Unpacking the client(s): Constructions, positions and client–consultant dynamics","citation-key":"sturdyUnpackingClientsConstructions2009","container-title":"Scandinavian Journal of Management","language":"en","source":"www.academia.edu","title":"Unpacking the client(s): Constructions, positions and client–consultant dynamics","title-short":"Unpacking the client(s)","URL":"https://www.academia.edu/22841489/Unpacking_the_clients_Constructions_positions_and_client_consultant_dynamics","author":[{"family":"Sturdy","given":"Andrew"}],"accessed":{"date-parts":[["2024",5,24]]},"issued":{"date-parts":[["2009",1,1]]}}}],"schema":"https://github.com/citation-style-language/schema/raw/master/csl-citation.json"} </w:instrText>
+      </w:r>
+      <w:r>
+        <w:fldChar w:fldCharType="separate"/>
+      </w:r>
+      <w:r>
+        <w:rPr>
+          <w:rFonts w:eastAsia="Times New Roman"/>
+          <w:color w:val="000000"/>
+        </w:rPr>
+        <w:t>(Glückler &amp; Armbrüster, 2003; Nikolova &amp; Devinney, 2012; Sturdy, 2009)</w:t>
+      </w:r>
+      <w:r>
+        <w:fldChar w:fldCharType="end"/>
+      </w:r>
+      <w:r>
+        <w:t xml:space="preserve">, et l'expérience de </w:t>
+      </w:r>
+      <w:proofErr w:type="spellStart"/>
+      <w:r>
+        <w:t>co-création</w:t>
+      </w:r>
+      <w:proofErr w:type="spellEnd"/>
+      <w:r>
+        <w:t xml:space="preserve"> comme condition de l'appropriation cognitive par le client </w:t>
+      </w:r>
+      <w:r>
+        <w:fldChar w:fldCharType="begin"/>
+      </w:r>
+      <w:r>
+        <w:instrText xml:space="preserve"> ADDIN ZOTERO_ITEM CSL_CITATION {"citationID":"2AQFMXei","properties":{"unsorted":false,"formattedCitation":"(Aarikka-Stenroos &amp; Jaakkola, 2012; Ciampi, 2017; Harfouche et al., 2023; Oesterle et al., 2019)","plainCitation":"(Aarikka-Stenroos &amp; Jaakkola, 2012; Ciampi, 2017; Harfouche et al., 2023; Oesterle et al., 2019)","dontUpdate":true,"noteIndex":0},"citationItems":[{"id":14589,"uris":["http://zotero.org/users/12622049/items/RE29AQ34"],"itemData":{"id":14589,"type":"article-journal","call-number":"2","citation-key":"aarikka-stenroosValueCocreationKnowledge2012","container-title":"Industrial Marketing Management","DOI":"10.1016/j.indmarman.2011.11.008","ISSN":"00198501","issue":"1","journalAbbreviation":"Industrial Marketing Management","language":"en","license":"https://www.elsevier.com/tdm/userlicense/1.0/","page":"15-26","source":"DOI.org (Crossref)","title":"Value co-creation in knowledge intensive business services: A dyadic perspective on the joint problem solving process","title-short":"Value co-creation in knowledge intensive business services","volume":"41","author":[{"family":"Aarikka-Stenroos","given":"Leena"},{"family":"Jaakkola","given":"Elina"}],"issued":{"date-parts":[["2012",1]]}}},{"id":5417,"uris":["http://zotero.org/users/12622049/items/NIUR7YQW"],"itemData":{"id":5417,"type":"webpage","abstract":"Management consulting firms are often discussed as being the firms whose core product is knowledge itself. However, despite the fact that consulting firms are generally aware of the value of knowledge for their own organizations and for their clients, the empirical evidence shows that even today the (economic and, above all, cognitive) value-creation potential related to the transition from consulting approaches geared to the transfer of “best practices” (consultant as expert) to consulting approaches geared to the cooperative creation of new knowledge and managerial capabilities (consultant as a facilitator of new managerial knowledge and capabilities creation processes) is rarely consciously perceived and, consequently, is not adequately planned for and exploited. This book interprets management consulting from a knowledge perspective, and proposes a general conceptual framework for investigating and interpreting that potential.","citation-key":"ciampiKnowingConsultingAction2017","genre":"text","language":"en","license":"Author(s)","note":"archive_location: Florence\nISBN: 9788864536439","title":"Knowing Through Consulting in Action","URL":"https://books.fupress.com/catalogue/knowing-through-consulting-in-action/3575","author":[{"family":"Ciampi","given":"Francesco"}],"accessed":{"date-parts":[["2024",6,1]]},"issued":{"date-parts":[["2017"]]}}},{"id":5202,"uris":["http://zotero.org/users/12622049/items/AAYYYZC7"],"itemData":{"id":5202,"type":"article-journal","abstract":"Artificial intelligence (AI) has increased the ability of organizations to accumulate tacit and explicit knowledge to inform management decision-making. Despite the hype and popularity of AI, there is a noticeable scarcity of research focusing on AI's potential role in enriching and augmenting organizational knowledge. This paper develops a recursive theory of knowledge augmentation in organizations (the KAM model) based on a synthesis of extant literature and a four-year revised canonical action research project. The project aimed to design and implement a human-centric AI (called Project) to solve the lack of integration of tacit and explicit knowledge in a scientific research center (SRC). To explore the patterns of knowledge augmentation in organizations, this study extends Nonaka's SECI (socialization, externalization, combination, and internalization) model by incorporating the human-in-the-loop Informed Artificial Intelligence (IAI) approach. The proposed design offers the possibility to integrate experts' intuition and domain knowledge in AI in an explainable way. The findings show that organizational knowledge can be augmented through a recursive process enabled by the design and implementation of human-in-the-loop IAI. The study has important implications for research and practice.","call-number":"3","citation-key":"harfoucheRecursiveTheoryKnowledge2023","container-title":"Information Systems Frontiers","DOI":"10.1007/s10796-022-10352-8","ISSN":"1387-3326, 1572-9419","issue":"1","journalAbbreviation":"Inf Syst Front","language":"en","note":"7 citations (Crossref) [2024-05-29]","page":"55-70","source":"DOI.org (Crossref)","title":"The Recursive Theory of Knowledge Augmentation: Integrating human intuition and knowledge in Artificial Intelligence to augment organizational knowledge","title-short":"The Recursive Theory of Knowledge Augmentation","volume":"25","author":[{"family":"Harfouche","given":"Antoine"},{"family":"Quinio","given":"Bernard"},{"family":"Saba","given":"Mario"},{"family":"Saba","given":"Peter Bou"}],"issued":{"date-parts":[["2023",2]]}}},{"id":4312,"uris":["http://zotero.org/users/12622049/items/9KFAA5SH"],"itemData":{"id":4312,"type":"chapter","abstract":"While their fundamental business model has not changed for many decades, consulting firms are currently faced with serious challenges putting the complete market at the risk of disruption. Given that situation, it is essential for consultancies to understand how value emerges in consulting projects in the eyes of their clients. Turning to the customer perspective, it is also important to understand how value emerges from the relationship with consultancies. While previous literature provides valuable but fragmented starting points to explain the joint value creation in IT consulting projects, we suggested a synthesized conceptual model drawing on the service-dominant logic in a previous article that integrates both the service provider and client perspectives. In this article, we now put forth a measurement instrument that we subjected to a preliminary empirical validation with which the important determinants in both spheres can be assessed to ultimately explain the value of the IT consulting service in a follow-up, large-scale quantitative-empirical validation.","citation-key":"oesterleMeasureKnowDevelopment2019","container-title":"Contributions to Management Science","DOI":"10.1007/978-3-319-95999-3_4","ISBN":"978-3-319-95998-6","note":"journalAbbreviation: Contributions to Management Science","page":"79-101","source":"ResearchGate","title":"To Measure Is to Know: Development of an Instrument for Measuring Consulting Service Value: Recent Findings and Practical Cases","title-short":"To Measure Is to Know","author":[{"family":"Oesterle","given":"Severin"},{"family":"Buchwald","given":"Arne"},{"family":"Urbach","given":"Nils"}],"issued":{"date-parts":[["2019",1,1]]}}}],"schema":"https://github.com/citation-style-language/schema/raw/master/csl-citation.json"} </w:instrText>
+      </w:r>
+      <w:r>
+        <w:fldChar w:fldCharType="separate"/>
+      </w:r>
+      <w:r>
+        <w:rPr>
+          <w:noProof/>
+        </w:rPr>
+        <w:t>(Ciampi, 2017; Oesterle et al., 2019)</w:t>
+      </w:r>
+      <w:r>
+        <w:fldChar w:fldCharType="end"/>
+      </w:r>
+      <w:r>
+        <w:t>.</w:t>
+      </w:r>
+      <w:r>
+        <w:t xml:space="preserve"> </w:t>
+      </w:r>
+    </w:p>
+    <w:p>
+      <w:r>
+        <w:t xml:space="preserve">Sur ce point, </w:t>
+      </w:r>
+      <w:r>
+        <w:t xml:space="preserve">certains auteurs ont suggéré que </w:t>
+      </w:r>
+      <w:r>
+        <w:t>la posture même du consultant, coincé par son identité professionnelle</w:t>
+      </w:r>
+      <w:r>
+        <w:t xml:space="preserve"> (le consultant est l’analyste rationnel et logique, plutôt qu’exploratoire</w:t>
+      </w:r>
+      <w:r>
+        <w:t xml:space="preserve"> et audacieux</w:t>
+      </w:r>
+      <w:r>
+        <w:t xml:space="preserve">), participait de son inhibition à challenger le client, alors même que celui-ci est en demande. Ce faisant, l’apprentissage du client </w:t>
+      </w:r>
+      <w:r>
+        <w:t>n’est pas favorisé</w:t>
+      </w:r>
+      <w:r>
+        <w:t xml:space="preserve"> </w:t>
+      </w:r>
+      <w:r>
+        <w:fldChar w:fldCharType="begin"/>
+      </w:r>
+      <w:r>
+        <w:instrText xml:space="preserve"> ADDIN ZOTERO_ITEM CSL_CITATION {"citationID":"JJFa7s8U","properties":{"unsorted":false,"formattedCitation":"(Handley et al., 2005)","plainCitation":"(Handley et al., 2005)","noteIndex":0},"citationItems":[{"id":8512,"uris":["http://zotero.org/users/12622049/items/G2YY3HBH"],"itemData":{"id":8512,"type":"article-journal","citation-key":"handleyClientconsultantRelationsRole2005","language":"en","source":"Zotero","title":"Client-consultant relations and the role of challenge","author":[{"family":"Handley","given":"Karen"},{"family":"Sturdy","given":"Andrew"},{"family":"Clark","given":"Timothy"},{"family":"Fincham","given":"Robin"}],"issued":{"date-parts":[["2005"]]}}}],"schema":"https://github.com/citation-style-language/schema/raw/master/csl-citation.json"} </w:instrText>
+      </w:r>
+      <w:r>
+        <w:fldChar w:fldCharType="separate"/>
+      </w:r>
+      <w:r>
+        <w:rPr>
+          <w:noProof/>
+        </w:rPr>
+        <w:t>(Handley et al., 2005)</w:t>
+      </w:r>
+      <w:r>
+        <w:fldChar w:fldCharType="end"/>
+      </w:r>
+      <w:r>
+        <w:t>.</w:t>
+      </w:r>
+      <w:r>
+        <w:t xml:space="preserve"> De ce point de vue, l’IA </w:t>
+      </w:r>
+      <w:r>
+        <w:t>présente</w:t>
+      </w:r>
+      <w:r>
+        <w:t xml:space="preserve"> </w:t>
+      </w:r>
+      <w:r>
+        <w:t xml:space="preserve">en effet </w:t>
+      </w:r>
+      <w:r>
+        <w:t>une opportunité</w:t>
+      </w:r>
+      <w:r>
+        <w:t xml:space="preserve">, </w:t>
+      </w:r>
+      <w:r>
+        <w:t>stimulant la recherche de solutions plus innovantes. Cependant, l’adaptation au contexte</w:t>
+      </w:r>
+      <w:r>
+        <w:t xml:space="preserve"> </w:t>
+      </w:r>
+      <w:r>
+        <w:t xml:space="preserve">du client </w:t>
+      </w:r>
+      <w:r>
+        <w:t>reste</w:t>
+      </w:r>
+      <w:r>
+        <w:t xml:space="preserve"> dépendante du cadre d’interaction avec l’IA </w:t>
+      </w:r>
+      <w:r>
+        <w:fldChar w:fldCharType="begin"/>
+      </w:r>
+      <w:r>
+        <w:instrText xml:space="preserve"> ADDIN ZOTERO_ITEM CSL_CITATION {"citationID":"LAKIHtJV","properties":{"unsorted":false,"formattedCitation":"(Raisch &amp; Fomina, 2024)","plainCitation":"(Raisch &amp; Fomina, 2024)","noteIndex":0},"citationItems":[{"id":7722,"uris":["http://zotero.org/users/12622049/items/N2TXY3PZ"],"itemData":{"id":7722,"type":"article-journal","call-number":"1*","citation-key":"raischCombiningHumanArtificial2024","container-title":"Academy of Management Review","DOI":"10.5465/amr.2021.0421","ISSN":"0363-7425, 1930-3807","journalAbbreviation":"AMR","language":"en","note":"10 citations (Crossref) [2024-12-03]","page":"amr.2021.0421","source":"DOI.org (Crossref)","title":"Combining Human and Artificial Intelligence: Hybrid Problem-Solving in Organizations","title-short":"Combining Human and Artificial Intelligence","author":[{"family":"Raisch","given":"Sebastian"},{"family":"Fomina","given":"Kateryna"}],"issued":{"date-parts":[["2024",1,5]]}}}],"schema":"https://github.com/citation-style-language/schema/raw/master/csl-citation.json"} </w:instrText>
+      </w:r>
+      <w:r>
+        <w:fldChar w:fldCharType="separate"/>
+      </w:r>
+      <w:r>
+        <w:rPr>
+          <w:noProof/>
+        </w:rPr>
+        <w:t>(Raisch &amp; Fomina, 2024)</w:t>
+      </w:r>
+      <w:r>
+        <w:fldChar w:fldCharType="end"/>
+      </w:r>
+      <w:r>
+        <w:t xml:space="preserve">. </w:t>
+      </w:r>
+    </w:p>
+    <w:p>
+      <w:r>
+        <w:t xml:space="preserve">Dans le conseil, la relation est </w:t>
+      </w:r>
+      <w:r>
+        <w:t xml:space="preserve">donc </w:t>
+      </w:r>
+      <w:r>
+        <w:t xml:space="preserve">première, et l’expertise, seconde, condition pas toujours nécessaire et jamais suffisante pour initier l’interaction </w:t>
+      </w:r>
+      <w:r>
+        <w:fldChar w:fldCharType="begin"/>
+      </w:r>
+      <w:r>
+        <w:instrText xml:space="preserve"> ADDIN ZOTERO_ITEM CSL_CITATION {"citationID":"LZaAsp6x","properties":{"unsorted":false,"formattedCitation":"(Bourgoin, 2014)","plainCitation":"(Bourgoin, 2014)","dontUpdate":true,"noteIndex":0},"citationItems":[{"id":11412,"uris":["http://zotero.org/users/12622049/items/JLYHMHD6"],"itemData":{"id":11412,"type":"thesis","archive":"HAL","citation-key":"bourgoinConseilManagementLepreuve2014","language":"fr","publisher":"Ecole National Supérieure des Mines de Paris","source":"Zotero","title":"Le conseil en management à l'épreuve de sa mise en valeur: une étude empirique","URL":"https://pastel.hal.science/pastel-00957543/document","author":[{"family":"Bourgoin","given":"Alaric"}],"issued":{"date-parts":[["2014",3]]}}}],"schema":"https://github.com/citation-style-language/schema/raw/master/csl-citation.json"} </w:instrText>
+      </w:r>
+      <w:r>
+        <w:fldChar w:fldCharType="separate"/>
+      </w:r>
+      <w:r>
+        <w:rPr>
+          <w:noProof/>
+        </w:rPr>
+        <w:t>(in Bourgoin, 2014)</w:t>
+      </w:r>
+      <w:r>
+        <w:fldChar w:fldCharType="end"/>
+      </w:r>
+      <w:r>
+        <w:t>.</w:t>
+      </w:r>
+      <w:r>
+        <w:t xml:space="preserve"> La valeur perçue est donc un accomplissement social qui se produit et est réalisé au cours des interactions récurrentes entre consultant et client. </w:t>
+      </w:r>
+    </w:p>
+    <w:p>
+      <w:r>
+        <w:t>L</w:t>
+      </w:r>
+      <w:r>
+        <w:t xml:space="preserve">e prestataire, pour initier </w:t>
+      </w:r>
+      <w:r>
+        <w:t xml:space="preserve">puis </w:t>
+      </w:r>
+      <w:r>
+        <w:t>concrétiser</w:t>
+      </w:r>
+      <w:r>
+        <w:t xml:space="preserve"> </w:t>
+      </w:r>
+      <w:r>
+        <w:t xml:space="preserve">la </w:t>
+      </w:r>
+      <w:r>
+        <w:t xml:space="preserve">fonction de </w:t>
+      </w:r>
+      <w:proofErr w:type="spellStart"/>
+      <w:r>
+        <w:t>co-création</w:t>
+      </w:r>
+      <w:proofErr w:type="spellEnd"/>
+      <w:r>
+        <w:t xml:space="preserve"> de valeur perçue</w:t>
+      </w:r>
+      <w:r>
+        <w:t xml:space="preserve">, </w:t>
+      </w:r>
+      <w:r>
+        <w:t xml:space="preserve">doit avant tout chercher à pénétrer la sphère conjointe, </w:t>
+      </w:r>
+      <w:r>
+        <w:t xml:space="preserve">vue comme la </w:t>
+      </w:r>
+      <w:r>
+        <w:t xml:space="preserve">plateforme de </w:t>
+      </w:r>
+      <w:proofErr w:type="spellStart"/>
+      <w:r>
+        <w:t>co-création</w:t>
+      </w:r>
+      <w:proofErr w:type="spellEnd"/>
+      <w:r>
+        <w:t xml:space="preserve"> de valeur</w:t>
+      </w:r>
+      <w:r>
+        <w:t xml:space="preserve"> par l’interaction</w:t>
+      </w:r>
+      <w:r>
+        <w:t xml:space="preserve"> </w:t>
+      </w:r>
+      <w:r>
+        <w:fldChar w:fldCharType="begin"/>
+      </w:r>
+      <w:r>
+        <w:instrText xml:space="preserve"> ADDIN ZOTERO_ITEM CSL_CITATION {"citationID":"dqqLWTaN","properties":{"unsorted":false,"formattedCitation":"(Gr\\uc0\\u246{}nroos &amp; Voima, 2013)","plainCitation":"(Grönroos &amp; Voima, 2013)","noteIndex":0},"citationItems":[{"id":5964,"uris":["http://zotero.org/users/12622049/items/8LRGQBWX"],"itemData":{"id":5964,"type":"article-journal","abstract":"Because extant literature on the service logic of marketing is dominated by a metaphorical view of value co-creation, the roles of both service providers and customers remain analytically unspecified, without a theoretically sound foundation for value creation or co-creation. This article analyzes value creation and co-creation in services by analytically defining the roles of the customer and the firm, as well as the scope, locus, and nature of value and value creation. Value creation refers to customers’ creation of value-in-use; co-creation is a function of interaction. Both the firm’s and the customer’s actions can be categorized by spheres (provider, joint, customer), and their interactions are either direct or indirect, leading to different forms of value creation and co-creation. This conceptualization of value creation spheres extends knowledge about how value-in-use emerges and how value creation can be managed; it also emphasizes the pivotal role of direct interactions for value co-creation opportunities.","call-number":"1","citation-key":"gronroosCriticalServiceLogic2013","container-title":"Journal of the Academy of Marketing Science","DOI":"10.1007/s11747-012-0308-3","journalAbbreviation":"Journal of the Academy of Marketing Science","note":"1661 citations (Crossref) [2024-08-29]","page":"133-150","source":"ResearchGate","title":"Critical Service Logic: Making Sense of Value Creation and Co-Creation","title-short":"Critical Service Logic","volume":"41","author":[{"family":"Grönroos","given":"Christian"},{"family":"Voima","given":"Päivi"}],"issued":{"date-parts":[["2013",3,1]]}}}],"schema":"https://github.com/citation-style-language/schema/raw/master/csl-citation.json"} </w:instrText>
+      </w:r>
+      <w:r>
+        <w:fldChar w:fldCharType="separate"/>
+      </w:r>
+      <w:r>
+        <w:rPr>
+          <w:rFonts w:eastAsia="Times New Roman"/>
+          <w:color w:val="000000"/>
+        </w:rPr>
+        <w:t>(Grönroos &amp; Voima, 2013)</w:t>
+      </w:r>
+      <w:r>
+        <w:fldChar w:fldCharType="end"/>
+      </w:r>
+      <w:r>
+        <w:t>. C’est au sein de cette sphère que nous install</w:t>
+      </w:r>
+      <w:r>
+        <w:t>ons</w:t>
+      </w:r>
+      <w:r>
+        <w:t xml:space="preserve"> </w:t>
+      </w:r>
+      <w:r>
+        <w:t>la</w:t>
+      </w:r>
+      <w:r>
+        <w:t xml:space="preserve"> focale d’observation</w:t>
+      </w:r>
+      <w:r>
+        <w:t xml:space="preserve"> d</w:t>
+      </w:r>
+      <w:r>
+        <w:t xml:space="preserve">u </w:t>
+      </w:r>
+      <w:r>
+        <w:t>cadre exploratoire</w:t>
+      </w:r>
+      <w:r>
+        <w:t xml:space="preserve"> de notre recherche</w:t>
+      </w:r>
+      <w:r>
+        <w:t xml:space="preserve">. </w:t>
+      </w:r>
+    </w:p>
+    <w:p>
+      <w:r>
+        <w:t>Premièrement</w:t>
+      </w:r>
+      <w:r>
+        <w:t>, l</w:t>
+      </w:r>
+      <w:r>
+        <w:t>’</w:t>
+      </w:r>
+      <w:r>
+        <w:t xml:space="preserve">interaction </w:t>
+      </w:r>
+      <w:r>
+        <w:t>permet</w:t>
+      </w:r>
+      <w:r>
+        <w:t xml:space="preserve"> </w:t>
+      </w:r>
+      <w:r>
+        <w:t xml:space="preserve">avant tout </w:t>
+      </w:r>
+      <w:r>
+        <w:t>la réalisation d</w:t>
+      </w:r>
+      <w:r>
+        <w:t xml:space="preserve">es </w:t>
+      </w:r>
+      <w:r>
+        <w:t xml:space="preserve">activités </w:t>
+      </w:r>
+      <w:r>
+        <w:t xml:space="preserve">cognitives </w:t>
+      </w:r>
+      <w:r>
+        <w:t xml:space="preserve">conjointes de résolution du problème, </w:t>
+      </w:r>
+      <w:r>
+        <w:t xml:space="preserve">sous pilotage du </w:t>
+      </w:r>
+      <w:r>
+        <w:t xml:space="preserve">consultant, </w:t>
+      </w:r>
+      <w:r>
+        <w:t>comme la clarification du besoin</w:t>
+      </w:r>
+      <w:r>
+        <w:t xml:space="preserve">, </w:t>
+      </w:r>
+      <w:r>
+        <w:t>la définition de la solution</w:t>
+      </w:r>
+      <w:r>
+        <w:t xml:space="preserve">, l’organisation de la mission </w:t>
+      </w:r>
+      <w:r>
+        <w:t xml:space="preserve"> </w:t>
+      </w:r>
+      <w:r>
+        <w:fldChar w:fldCharType="begin"/>
+      </w:r>
+      <w:r>
+        <w:instrText xml:space="preserve"> ADDIN ZOTERO_ITEM CSL_CITATION {"citationID":"Zq0uzcSf","properties":{"unsorted":false,"formattedCitation":"(Aarikka-Stenroos &amp; Jaakkola, 2012; Svensson, 2010)","plainCitation":"(Aarikka-Stenroos &amp; Jaakkola, 2012; Svensson, 2010)","noteIndex":0},"citationItems":[{"id":14589,"uris":["http://zotero.org/users/12622049/items/RE29AQ34"],"itemData":{"id":14589,"type":"article-journal","call-number":"2","citation-key":"aarikka-stenroosValueCocreationKnowledge2012","container-title":"Industrial Marketing Management","DOI":"10.1016/j.indmarman.2011.11.008","ISSN":"00198501","issue":"1","journalAbbreviation":"Industrial Marketing Management","language":"en","license":"https://www.elsevier.com/tdm/userlicense/1.0/","page":"15-26","source":"DOI.org (Crossref)","title":"Value co-creation in knowledge intensive business services: A dyadic perspective on the joint problem solving process","title-short":"Value co-creation in knowledge intensive business services","volume":"41","author":[{"family":"Aarikka-Stenroos","given":"Leena"},{"family":"Jaakkola","given":"Elina"}],"issued":{"date-parts":[["2012",1]]}}},{"id":4988,"uris":["http://zotero.org/users/12622049/items/SWQCNPRP"],"itemData":{"id":4988,"type":"article-journal","abstract":"This paper examines the ways in which the value of management consultancy services is socially and discursively accomplished in the social interaction between consultants and their clients. A meeting between a consultant and his potential client is studied in detail, with a particular focus on discursive interaction. It is suggested that value is accomplished as an ongoing interplay between exclusion and inclusion of consultancy knowledge. The tension between what is included and excluded is related to Georg Simmel’s ideas on the geometry of value and the ideal type of ‘the stranger’, the figure who is both near and far.","citation-key":"svenssonDoingValueExclusion2010","container-title":"Lund University - Working papers series","language":"en","source":"Zotero","title":"Doing value : Exclusion and Inclusion in Management Consultant-Client Interactions","author":[{"family":"Svensson","given":"Peter"}],"issued":{"date-parts":[["2010"]]}}}],"schema":"https://github.com/citation-style-language/schema/raw/master/csl-citation.json"} </w:instrText>
+      </w:r>
+      <w:r>
+        <w:fldChar w:fldCharType="separate"/>
+      </w:r>
+      <w:r>
+        <w:rPr>
+          <w:noProof/>
+        </w:rPr>
+        <w:t>(Aarikka-Stenroos &amp; Jaakkola, 2012; Svensson, 2010)</w:t>
+      </w:r>
+      <w:r>
+        <w:fldChar w:fldCharType="end"/>
+      </w:r>
+      <w:r>
+        <w:t xml:space="preserve">. </w:t>
+      </w:r>
+    </w:p>
+    <w:p>
+      <w:r>
         <w:lastRenderedPageBreak/>
-        <w:t>Dans le conseil, l</w:t>
-      </w:r>
-      <w:r>
-        <w:t xml:space="preserve">a valeur perçue est </w:t>
-      </w:r>
-      <w:r>
-        <w:t xml:space="preserve">aussi </w:t>
-      </w:r>
-      <w:r>
-        <w:t xml:space="preserve">dépendante du contexte : par exemple, </w:t>
-      </w:r>
-      <w:r>
-        <w:fldChar w:fldCharType="begin"/>
-      </w:r>
-      <w:r>
-        <w:instrText xml:space="preserve"> ADDIN ZOTERO_ITEM CSL_CITATION {"citationID":"aGBISpIA","properties":{"unsorted":false,"formattedCitation":"(Plenge et al., 2008)","plainCitation":"(Plenge et al., 2008)","dontUpdate":true,"noteIndex":0},"citationItems":[{"id":3191,"uris":["http://zotero.org/users/12622049/items/EYUM857J"],"itemData":{"id":3191,"type":"article-journal","abstract":"Purpose\nThis article aims to examine how situational constraints impact clients' valuations of the task and socio‐emotional resources exchanged when interacting with consultants. In consultant‐client relationships, the emphasis on economic resources has commodified these interactions into explicit exchanges of time, money, and deliverables.\n\nDesign/methodology/approach\nA total of five hypotheses were tested using a within‐subjects experimental design. Subjects consisted of 110 adult professionals who were presented with five different scenarios in a random sequence and asked to rank order and evaluate a list of professional‐service resources.\n\nFindings\nThe valuation of resources was found to change when situational constraints were present. Regardless of the context, task resources were generally valued more than socio‐emotional resources. When relational constraints were salient, socio‐emotional resources were valued more in long‐term than short‐term relationships. When faced with time pressure or budgetary constraints, task needs were valued more than socio‐emotional needs.\n\nResearch limitations/implications\nThere is potential bias due to snowball sampling, and the hypothetical nature of the experimental scenarios limits the generalizability of this study.\n\nPractical implications\nFor clients, this research indicates that the context surrounding consultant‐client interactions plays an important role in shaping clients' valuation of resources, both individually and collectively. For consultants, these findings suggest that a “one‐size‐fits‐all” strategy is not the most effective way to approach consultant‐client interactions.\n\nOriginality/value\nThis study contributes to our knowledge about how situational constraints impact clients' valuation of the task and socio‐emotional resources offered by consultants.","call-number":"N/A","citation-key":"plengeInfluenceSituationalConstraints2008","container-title":"International Journal of Organizational Analysis","DOI":"10.1108/19348830710868284","journalAbbreviation":"International Journal of Organizational Analysis","note":"1 citations (Crossref) [2024-02-01]","page":"136-151","source":"ResearchGate","title":"The influence of situational constraints on the perceived value of consulting services","volume":"15","author":[{"family":"Plenge","given":"Nicole"},{"family":"Erickson","given":"Robin"},{"family":"Roloff","given":"Michael"}],"issued":{"date-parts":[["2008",3,18]]}}}],"schema":"https://github.com/citation-style-language/schema/raw/master/csl-citation.json"} </w:instrText>
-      </w:r>
-      <w:r>
-        <w:fldChar w:fldCharType="separate"/>
-      </w:r>
-      <w:r>
-        <w:rPr>
-          <w:noProof/>
-        </w:rPr>
-        <w:t>Plenge et al. (2008)</w:t>
-      </w:r>
-      <w:r>
-        <w:fldChar w:fldCharType="end"/>
-      </w:r>
-      <w:r>
-        <w:t xml:space="preserve">, montrent que </w:t>
-      </w:r>
-      <w:r>
-        <w:t xml:space="preserve">sous la contrainte de budget ou de temps, les ressources liées à la tâche pure </w:t>
-      </w:r>
-      <w:r>
-        <w:t xml:space="preserve">(la dimension technique) </w:t>
-      </w:r>
-      <w:r>
-        <w:t>ont bien plus de valeur perçue que les ressources socio-émotionnelles</w:t>
-      </w:r>
-      <w:r>
-        <w:t xml:space="preserve"> (la dimension relationnelle).</w:t>
-      </w:r>
-    </w:p>
-    <w:p>
-      <w:r>
-        <w:t xml:space="preserve">Notre fondement théorique central est celui de la </w:t>
-      </w:r>
-      <w:proofErr w:type="spellStart"/>
-      <w:r>
-        <w:t>co-création</w:t>
-      </w:r>
-      <w:proofErr w:type="spellEnd"/>
-      <w:r>
-        <w:t xml:space="preserve"> de valeur perçue, pas celui-de la </w:t>
-      </w:r>
-      <w:proofErr w:type="spellStart"/>
-      <w:r>
-        <w:t>co</w:t>
-      </w:r>
-      <w:proofErr w:type="spellEnd"/>
-      <w:r>
-        <w:t>-destruction. On comprend néanmoins que la frontière est ténue</w:t>
-      </w:r>
-      <w:r>
-        <w:t xml:space="preserve"> et ne peut donc être ignorée</w:t>
-      </w:r>
-      <w:r>
-        <w:t>.</w:t>
-      </w:r>
-    </w:p>
-    <w:p>
-      <w:pPr>
-        <w:pStyle w:val="Titre2"/>
-      </w:pPr>
-      <w:bookmarkStart w:id="10" w:name="_Toc228405248"/>
-      <w:r>
-        <w:t xml:space="preserve">La valeur perçue </w:t>
-      </w:r>
-      <w:r>
-        <w:t xml:space="preserve">du conseil </w:t>
-      </w:r>
-      <w:r>
-        <w:t>est avant tout un accomplissement social</w:t>
-      </w:r>
-      <w:bookmarkEnd w:id="10"/>
-    </w:p>
-    <w:p>
-      <w:r>
-        <w:t xml:space="preserve">Ainsi, dans le conseil, la valeur perçue relève de trois dimensions : fonctionnelle, émotionnelle et sociale </w:t>
-      </w:r>
-      <w:r>
-        <w:fldChar w:fldCharType="begin"/>
-      </w:r>
-      <w:r>
-        <w:instrText xml:space="preserve"> ADDIN ZOTERO_ITEM CSL_CITATION {"citationID":"EG1igQe4","properties":{"unsorted":false,"formattedCitation":"(Arslanagic-Kalajdzic &amp; Zabkar, 2017)","plainCitation":"(Arslanagic-Kalajdzic &amp; Zabkar, 2017)","noteIndex":0},"citationItems":[{"id":14592,"uris":["http://zotero.org/users/12622049/items/HTJLFKWT"],"itemData":{"id":14592,"type":"article-journal","abstract":"It is well documented in the literature that customer perceived value plays an important role in understanding behavioral outcomes of business customers. However, most business-to-business research has focused on the functional dimension of perceived value, while consumer research has already advanced to a multidimensional value conceptualization. This study expands the concept of perceived value in the professional business services context to functional, emotional, and social perceived value. Based on signaling theory, we conceptualize and empirically support links between the three dimensions of perceived value and its antecedents (perceived corporate reputation, perceived corporate credibility, and perceived relationship quality) and outcomes (satisfaction and loyalty). The results of a survey involving 228 business clients reveal differences in links between value antecedents and the three perceived value dimensions: while perceived corporate credibility and relationship quality impact all dimensions, perceived corporate reputation impacts only perceived emotional value. Results of our study help in understanding how satisfaction and loyalty are viewed as perceived value outcomes; apart from functional value, emotional and social values play a significant role in the satisfaction and loyalty of professional business services clients.","call-number":"2","citation-key":"arslanagic-kalajdzicPerceivedValueMore2017","container-title":"Industrial Marketing Management","DOI":"10.1016/j.indmarman.2017.05.005","ISSN":"0019-8501","journalAbbreviation":"Industrial Marketing Management","page":"47-58","source":"ScienceDirect","title":"Is perceived value more than value for money in professional business services?","volume":"65","author":[{"family":"Arslanagic-Kalajdzic","given":"Maja"},{"family":"Zabkar","given":"Vesna"}],"issued":{"date-parts":[["2017",8,1]]}}}],"schema":"https://github.com/citation-style-language/schema/raw/master/csl-citation.json"} </w:instrText>
-      </w:r>
-      <w:r>
-        <w:fldChar w:fldCharType="separate"/>
-      </w:r>
-      <w:r>
-        <w:rPr>
-          <w:noProof/>
-        </w:rPr>
-        <w:t>(Arslanagic-Kalajdzic &amp; Zabkar, 2017)</w:t>
-      </w:r>
-      <w:r>
-        <w:fldChar w:fldCharType="end"/>
-      </w:r>
-      <w:r>
-        <w:t xml:space="preserve">. </w:t>
-      </w:r>
-    </w:p>
-    <w:p>
-      <w:r>
-        <w:t xml:space="preserve">La littérature suggère empiriquement deux liens constitutifs entre les dimensions de la valeur perçue du conseil : la confiance relationnelle comme précondition de l'engagement processuel </w:t>
-      </w:r>
-      <w:r>
-        <w:fldChar w:fldCharType="begin"/>
-      </w:r>
-      <w:r>
-        <w:instrText xml:space="preserve"> ADDIN ZOTERO_ITEM CSL_CITATION {"citationID":"J9A4ia1I","properties":{"unsorted":false,"formattedCitation":"(Bourgoin, 2014; Gl\\uc0\\u252{}ckler &amp; Armbr\\uc0\\u252{}ster, 2003; Nikolova &amp; Devinney, 2012; Sturdy, 2009)","plainCitation":"(Bourgoin, 2014; Glückler &amp; Armbrüster, 2003; Nikolova &amp; Devinney, 2012; Sturdy, 2009)","dontUpdate":true,"noteIndex":0},"citationItems":[{"id":11412,"uris":["http://zotero.org/users/12622049/items/JLYHMHD6"],"itemData":{"id":11412,"type":"thesis","archive":"HAL","citation-key":"bourgoinConseilManagementLepreuve2014","language":"fr","publisher":"Ecole National Supérieure des Mines de Paris","source":"Zotero","title":"Le conseil en management à l'épreuve de sa mise en valeur: une étude empirique","URL":"https://pastel.hal.science/pastel-00957543/document","author":[{"family":"Bourgoin","given":"Alaric"}],"issued":{"date-parts":[["2014",3]]}}},{"id":14676,"uris":["http://zotero.org/users/12622049/items/8V645GZR"],"itemData":{"id":14676,"type":"article-journal","abstract":"This article analyzes the market of management consulting and identiﬁes institutional and transactional uncertainty as its principal features. Based on these uncertainties, we argue that competition in this market takes place on entirely different grounds than in other business sectors. We suggest that the main drivers of competitiveness are neither price nor measurable quality, but rather experience-based trust and a mechanism we label ‘networked reputation.’ An embeddedness perspective is employed to develop the concept of networked reputation as an intermediate mechanism that complements the duality of system versus personal trust and accounts for firm growth. We reinterpret secondary data on the German consulting market, illustrate the signiﬁcance of these mechanisms, and demonstrate how management consulting is situated in structures of social relations.","call-number":"1","citation-key":"glucklerBridgingUncertaintyManagement","container-title":"Organization studies","language":"en","source":"Zotero","title":"Bridging Uncertainty in Management Consulting: The Mechanisms of Trust and Networked Reputation","author":[{"family":"Glückler","given":"Johannes"},{"family":"Armbrüster","given":"Thomas"}],"issued":{"date-parts":[["2003"]]}}},{"id":44,"uris":["http://zotero.org/users/12622049/items/GAEFL669"],"itemData":{"id":44,"type":"paper-conference","abstract":"In this paper, we analyse the complex interaction between professional advisors and their clients. Our aim is to summarize and critically review the relevant literature and to outline major directions for future research. There are three competing models that discuss the interaction between professional service providers and their clients: the expert model, the ‘reflective practitioner’ model and the critical model. After reviewing assumptions underlying these approaches as well as their contributions and shortcomings, we suggest that the key problem with these models is that they offer only partial insights into the relationship between clients and professional business service providers. Additionally, they have different epistemological foundations and, as such, they are incompatible. Building upon the existing research and our discussion, we outline the major issues of client-consultant interaction that future research needs to address in order to provide a multifaceted understanding of the client-consultant relationship.","citation-key":"nikolovaNatureClientConsultant2012","DOI":"10.1093/oxfordhb/9780199235049.013.0019","note":"DOI: 10.1093/oxfordhb/9780199235049.013.0019","publisher":"Oxford University Press","source":"Semantic Scholar","title":"The Nature Of Client–Consultant Interaction: A Critical Review","title-short":"The Nature Of Client–Consultant Interaction","URL":"https://academic.oup.com/edited-volume/38572/chapter/334566078","author":[{"family":"Nikolova","given":"Natalia"},{"family":"Devinney","given":"Timothy"}],"accessed":{"date-parts":[["2023",10,7]]},"issued":{"date-parts":[["2012",3,29]]}}},{"id":4610,"uris":["http://zotero.org/users/12622049/items/3ZK9SL9P"],"itemData":{"id":4610,"type":"article-journal","abstract":"Unpacking the client(s): Constructions, positions and client–consultant dynamics","citation-key":"sturdyUnpackingClientsConstructions2009","container-title":"Scandinavian Journal of Management","language":"en","source":"www.academia.edu","title":"Unpacking the client(s): Constructions, positions and client–consultant dynamics","title-short":"Unpacking the client(s)","URL":"https://www.academia.edu/22841489/Unpacking_the_clients_Constructions_positions_and_client_consultant_dynamics","author":[{"family":"Sturdy","given":"Andrew"}],"accessed":{"date-parts":[["2024",5,24]]},"issued":{"date-parts":[["2009",1,1]]}}}],"schema":"https://github.com/citation-style-language/schema/raw/master/csl-citation.json"} </w:instrText>
-      </w:r>
-      <w:r>
-        <w:fldChar w:fldCharType="separate"/>
-      </w:r>
-      <w:r>
-        <w:rPr>
-          <w:rFonts w:eastAsia="Times New Roman"/>
-          <w:color w:val="000000"/>
-        </w:rPr>
-        <w:t>(Glückler &amp; Armbrüster, 2003; Nikolova &amp; Devinney, 2012; Sturdy, 2009)</w:t>
-      </w:r>
-      <w:r>
-        <w:fldChar w:fldCharType="end"/>
-      </w:r>
-      <w:r>
-        <w:t xml:space="preserve">, et l'expérience de </w:t>
-      </w:r>
-      <w:proofErr w:type="spellStart"/>
-      <w:r>
-        <w:t>co-création</w:t>
-      </w:r>
-      <w:proofErr w:type="spellEnd"/>
-      <w:r>
-        <w:t xml:space="preserve"> comme condition de l'appropriation cognitive par le client </w:t>
-      </w:r>
-      <w:r>
-        <w:fldChar w:fldCharType="begin"/>
-      </w:r>
-      <w:r>
-        <w:instrText xml:space="preserve"> ADDIN ZOTERO_ITEM CSL_CITATION {"citationID":"2AQFMXei","properties":{"unsorted":false,"formattedCitation":"(Aarikka-Stenroos &amp; Jaakkola, 2012; Ciampi, 2017; Harfouche et al., 2023; Oesterle et al., 2019)","plainCitation":"(Aarikka-Stenroos &amp; Jaakkola, 2012; Ciampi, 2017; Harfouche et al., 2023; Oesterle et al., 2019)","dontUpdate":true,"noteIndex":0},"citationItems":[{"id":14589,"uris":["http://zotero.org/users/12622049/items/RE29AQ34"],"itemData":{"id":14589,"type":"article-journal","call-number":"2","citation-key":"aarikka-stenroosValueCocreationKnowledge2012","container-title":"Industrial Marketing Management","DOI":"10.1016/j.indmarman.2011.11.008","ISSN":"00198501","issue":"1","journalAbbreviation":"Industrial Marketing Management","language":"en","license":"https://www.elsevier.com/tdm/userlicense/1.0/","page":"15-26","source":"DOI.org (Crossref)","title":"Value co-creation in knowledge intensive business services: A dyadic perspective on the joint problem solving process","title-short":"Value co-creation in knowledge intensive business services","volume":"41","author":[{"family":"Aarikka-Stenroos","given":"Leena"},{"family":"Jaakkola","given":"Elina"}],"issued":{"date-parts":[["2012",1]]}}},{"id":5417,"uris":["http://zotero.org/users/12622049/items/NIUR7YQW"],"itemData":{"id":5417,"type":"webpage","abstract":"Management consulting firms are often discussed as being the firms whose core product is knowledge itself. However, despite the fact that consulting firms are generally aware of the value of knowledge for their own organizations and for their clients, the empirical evidence shows that even today the (economic and, above all, cognitive) value-creation potential related to the transition from consulting approaches geared to the transfer of “best practices” (consultant as expert) to consulting approaches geared to the cooperative creation of new knowledge and managerial capabilities (consultant as a facilitator of new managerial knowledge and capabilities creation processes) is rarely consciously perceived and, consequently, is not adequately planned for and exploited. This book interprets management consulting from a knowledge perspective, and proposes a general conceptual framework for investigating and interpreting that potential.","citation-key":"ciampiKnowingConsultingAction2017","genre":"text","language":"en","license":"Author(s)","note":"archive_location: Florence\nISBN: 9788864536439","title":"Knowing Through Consulting in Action","URL":"https://books.fupress.com/catalogue/knowing-through-consulting-in-action/3575","author":[{"family":"Ciampi","given":"Francesco"}],"accessed":{"date-parts":[["2024",6,1]]},"issued":{"date-parts":[["2017"]]}}},{"id":5202,"uris":["http://zotero.org/users/12622049/items/AAYYYZC7"],"itemData":{"id":5202,"type":"article-journal","abstract":"Artificial intelligence (AI) has increased the ability of organizations to accumulate tacit and explicit knowledge to inform management decision-making. Despite the hype and popularity of AI, there is a noticeable scarcity of research focusing on AI's potential role in enriching and augmenting organizational knowledge. This paper develops a recursive theory of knowledge augmentation in organizations (the KAM model) based on a synthesis of extant literature and a four-year revised canonical action research project. The project aimed to design and implement a human-centric AI (called Project) to solve the lack of integration of tacit and explicit knowledge in a scientific research center (SRC). To explore the patterns of knowledge augmentation in organizations, this study extends Nonaka's SECI (socialization, externalization, combination, and internalization) model by incorporating the human-in-the-loop Informed Artificial Intelligence (IAI) approach. The proposed design offers the possibility to integrate experts' intuition and domain knowledge in AI in an explainable way. The findings show that organizational knowledge can be augmented through a recursive process enabled by the design and implementation of human-in-the-loop IAI. The study has important implications for research and practice.","call-number":"3","citation-key":"harfoucheRecursiveTheoryKnowledge2023","container-title":"Information Systems Frontiers","DOI":"10.1007/s10796-022-10352-8","ISSN":"1387-3326, 1572-9419","issue":"1","journalAbbreviation":"Inf Syst Front","language":"en","note":"7 citations (Crossref) [2024-05-29]","page":"55-70","source":"DOI.org (Crossref)","title":"The Recursive Theory of Knowledge Augmentation: Integrating human intuition and knowledge in Artificial Intelligence to augment organizational knowledge","title-short":"The Recursive Theory of Knowledge Augmentation","volume":"25","author":[{"family":"Harfouche","given":"Antoine"},{"family":"Quinio","given":"Bernard"},{"family":"Saba","given":"Mario"},{"family":"Saba","given":"Peter Bou"}],"issued":{"date-parts":[["2023",2]]}}},{"id":4312,"uris":["http://zotero.org/users/12622049/items/9KFAA5SH"],"itemData":{"id":4312,"type":"chapter","abstract":"While their fundamental business model has not changed for many decades, consulting firms are currently faced with serious challenges putting the complete market at the risk of disruption. Given that situation, it is essential for consultancies to understand how value emerges in consulting projects in the eyes of their clients. Turning to the customer perspective, it is also important to understand how value emerges from the relationship with consultancies. While previous literature provides valuable but fragmented starting points to explain the joint value creation in IT consulting projects, we suggested a synthesized conceptual model drawing on the service-dominant logic in a previous article that integrates both the service provider and client perspectives. In this article, we now put forth a measurement instrument that we subjected to a preliminary empirical validation with which the important determinants in both spheres can be assessed to ultimately explain the value of the IT consulting service in a follow-up, large-scale quantitative-empirical validation.","citation-key":"oesterleMeasureKnowDevelopment2019","container-title":"Contributions to Management Science","DOI":"10.1007/978-3-319-95999-3_4","ISBN":"978-3-319-95998-6","note":"journalAbbreviation: Contributions to Management Science","page":"79-101","source":"ResearchGate","title":"To Measure Is to Know: Development of an Instrument for Measuring Consulting Service Value: Recent Findings and Practical Cases","title-short":"To Measure Is to Know","author":[{"family":"Oesterle","given":"Severin"},{"family":"Buchwald","given":"Arne"},{"family":"Urbach","given":"Nils"}],"issued":{"date-parts":[["2019",1,1]]}}}],"schema":"https://github.com/citation-style-language/schema/raw/master/csl-citation.json"} </w:instrText>
-      </w:r>
-      <w:r>
-        <w:fldChar w:fldCharType="separate"/>
-      </w:r>
-      <w:r>
-        <w:rPr>
-          <w:noProof/>
-        </w:rPr>
-        <w:t>(Ciampi, 2017; Oesterle et al., 2019)</w:t>
-      </w:r>
-      <w:r>
-        <w:fldChar w:fldCharType="end"/>
-      </w:r>
-      <w:r>
-        <w:t>.</w:t>
-      </w:r>
-      <w:r>
-        <w:t xml:space="preserve"> </w:t>
-      </w:r>
-    </w:p>
-    <w:p>
-      <w:r>
-        <w:t xml:space="preserve">Sur ce point, </w:t>
-      </w:r>
-      <w:r>
-        <w:t xml:space="preserve">certains auteurs ont suggéré que </w:t>
-      </w:r>
-      <w:r>
-        <w:t>la posture même du consultant, coincé par son identité professionnelle</w:t>
-      </w:r>
-      <w:r>
-        <w:t xml:space="preserve"> (le consultant est l’analyste rationnel et logique, plutôt qu’exploratoire</w:t>
-      </w:r>
-      <w:r>
-        <w:t xml:space="preserve"> et audacieux</w:t>
-      </w:r>
-      <w:r>
-        <w:t xml:space="preserve">), participait de son inhibition à challenger le client, alors même que celui-ci est en demande. Ce faisant, l’apprentissage du client </w:t>
-      </w:r>
-      <w:r>
-        <w:t>n’est pas favorisé</w:t>
-      </w:r>
-      <w:r>
-        <w:t xml:space="preserve"> </w:t>
-      </w:r>
-      <w:r>
-        <w:fldChar w:fldCharType="begin"/>
-      </w:r>
-      <w:r>
-        <w:instrText xml:space="preserve"> ADDIN ZOTERO_ITEM CSL_CITATION {"citationID":"JJFa7s8U","properties":{"unsorted":false,"formattedCitation":"(Handley et al., 2005)","plainCitation":"(Handley et al., 2005)","noteIndex":0},"citationItems":[{"id":8512,"uris":["http://zotero.org/users/12622049/items/G2YY3HBH"],"itemData":{"id":8512,"type":"article-journal","citation-key":"handleyClientconsultantRelationsRole2005","language":"en","source":"Zotero","title":"Client-consultant relations and the role of challenge","author":[{"family":"Handley","given":"Karen"},{"family":"Sturdy","given":"Andrew"},{"family":"Clark","given":"Timothy"},{"family":"Fincham","given":"Robin"}],"issued":{"date-parts":[["2005"]]}}}],"schema":"https://github.com/citation-style-language/schema/raw/master/csl-citation.json"} </w:instrText>
-      </w:r>
-      <w:r>
-        <w:fldChar w:fldCharType="separate"/>
-      </w:r>
-      <w:r>
-        <w:rPr>
-          <w:noProof/>
-        </w:rPr>
-        <w:t>(Handley et al., 2005)</w:t>
-      </w:r>
-      <w:r>
-        <w:fldChar w:fldCharType="end"/>
-      </w:r>
-      <w:r>
-        <w:t>.</w:t>
-      </w:r>
-      <w:r>
-        <w:t xml:space="preserve"> De ce point de vue, l’IA </w:t>
-      </w:r>
-      <w:r>
-        <w:t>présente</w:t>
-      </w:r>
-      <w:r>
-        <w:t xml:space="preserve"> </w:t>
-      </w:r>
-      <w:r>
-        <w:t xml:space="preserve">en effet </w:t>
-      </w:r>
-      <w:r>
-        <w:t>une opportunité</w:t>
-      </w:r>
-      <w:r>
-        <w:t xml:space="preserve">, </w:t>
-      </w:r>
-      <w:r>
-        <w:t>stimulant la recherche de solutions plus innovantes. Cependant, l’adaptation au contexte</w:t>
-      </w:r>
-      <w:r>
-        <w:t xml:space="preserve"> </w:t>
-      </w:r>
-      <w:r>
-        <w:t xml:space="preserve">du client </w:t>
-      </w:r>
-      <w:r>
-        <w:t>reste</w:t>
-      </w:r>
-      <w:r>
-        <w:t xml:space="preserve"> dépendante du cadre d’interaction avec l’IA </w:t>
-      </w:r>
-      <w:r>
-        <w:fldChar w:fldCharType="begin"/>
-      </w:r>
-      <w:r>
-        <w:instrText xml:space="preserve"> ADDIN ZOTERO_ITEM CSL_CITATION {"citationID":"LAKIHtJV","properties":{"unsorted":false,"formattedCitation":"(Raisch &amp; Fomina, 2024)","plainCitation":"(Raisch &amp; Fomina, 2024)","noteIndex":0},"citationItems":[{"id":7722,"uris":["http://zotero.org/users/12622049/items/N2TXY3PZ"],"itemData":{"id":7722,"type":"article-journal","call-number":"1*","citation-key":"raischCombiningHumanArtificial2024","container-title":"Academy of Management Review","DOI":"10.5465/amr.2021.0421","ISSN":"0363-7425, 1930-3807","journalAbbreviation":"AMR","language":"en","note":"10 citations (Crossref) [2024-12-03]","page":"amr.2021.0421","source":"DOI.org (Crossref)","title":"Combining Human and Artificial Intelligence: Hybrid Problem-Solving in Organizations","title-short":"Combining Human and Artificial Intelligence","author":[{"family":"Raisch","given":"Sebastian"},{"family":"Fomina","given":"Kateryna"}],"issued":{"date-parts":[["2024",1,5]]}}}],"schema":"https://github.com/citation-style-language/schema/raw/master/csl-citation.json"} </w:instrText>
-      </w:r>
-      <w:r>
-        <w:fldChar w:fldCharType="separate"/>
-      </w:r>
-      <w:r>
-        <w:rPr>
-          <w:noProof/>
-        </w:rPr>
-        <w:t>(Raisch &amp; Fomina, 2024)</w:t>
-      </w:r>
-      <w:r>
-        <w:fldChar w:fldCharType="end"/>
-      </w:r>
-      <w:r>
-        <w:t xml:space="preserve">. </w:t>
-      </w:r>
-    </w:p>
-    <w:p>
-      <w:r>
-        <w:t xml:space="preserve">Dans le conseil, la relation est </w:t>
-      </w:r>
-      <w:r>
-        <w:t xml:space="preserve">donc </w:t>
-      </w:r>
-      <w:r>
-        <w:t xml:space="preserve">première, et l’expertise, seconde, condition pas toujours nécessaire et jamais suffisante pour initier l’interaction </w:t>
-      </w:r>
-      <w:r>
-        <w:fldChar w:fldCharType="begin"/>
-      </w:r>
-      <w:r>
-        <w:instrText xml:space="preserve"> ADDIN ZOTERO_ITEM CSL_CITATION {"citationID":"LZaAsp6x","properties":{"unsorted":false,"formattedCitation":"(Bourgoin, 2014)","plainCitation":"(Bourgoin, 2014)","dontUpdate":true,"noteIndex":0},"citationItems":[{"id":11412,"uris":["http://zotero.org/users/12622049/items/JLYHMHD6"],"itemData":{"id":11412,"type":"thesis","archive":"HAL","citation-key":"bourgoinConseilManagementLepreuve2014","language":"fr","publisher":"Ecole National Supérieure des Mines de Paris","source":"Zotero","title":"Le conseil en management à l'épreuve de sa mise en valeur: une étude empirique","URL":"https://pastel.hal.science/pastel-00957543/document","author":[{"family":"Bourgoin","given":"Alaric"}],"issued":{"date-parts":[["2014",3]]}}}],"schema":"https://github.com/citation-style-language/schema/raw/master/csl-citation.json"} </w:instrText>
-      </w:r>
-      <w:r>
-        <w:fldChar w:fldCharType="separate"/>
-      </w:r>
-      <w:r>
-        <w:rPr>
-          <w:noProof/>
-        </w:rPr>
-        <w:t>(in Bourgoin, 2014)</w:t>
-      </w:r>
-      <w:r>
-        <w:fldChar w:fldCharType="end"/>
-      </w:r>
-      <w:r>
-        <w:t>.</w:t>
-      </w:r>
-      <w:r>
-        <w:t xml:space="preserve"> La valeur perçue est donc un accomplissement social qui se produit et est réalisé au cours des interactions récurrentes entre consultant et client. </w:t>
-      </w:r>
-    </w:p>
-    <w:p>
-      <w:r>
-        <w:t>L</w:t>
-      </w:r>
-      <w:r>
-        <w:t xml:space="preserve">e prestataire, pour initier </w:t>
-      </w:r>
-      <w:r>
-        <w:t xml:space="preserve">puis </w:t>
-      </w:r>
-      <w:r>
-        <w:t>concrétiser</w:t>
-      </w:r>
-      <w:r>
-        <w:t xml:space="preserve"> </w:t>
-      </w:r>
-      <w:r>
-        <w:t xml:space="preserve">la </w:t>
-      </w:r>
-      <w:r>
-        <w:t xml:space="preserve">fonction de </w:t>
-      </w:r>
-      <w:proofErr w:type="spellStart"/>
-      <w:r>
-        <w:t>co-création</w:t>
-      </w:r>
-      <w:proofErr w:type="spellEnd"/>
-      <w:r>
-        <w:t xml:space="preserve"> de valeur perçue</w:t>
-      </w:r>
-      <w:r>
-        <w:t xml:space="preserve">, </w:t>
-      </w:r>
-      <w:r>
-        <w:t xml:space="preserve">doit avant tout chercher à pénétrer la sphère conjointe, </w:t>
-      </w:r>
-      <w:r>
-        <w:t xml:space="preserve">vue comme la </w:t>
-      </w:r>
-      <w:r>
-        <w:t xml:space="preserve">plateforme de </w:t>
-      </w:r>
-      <w:proofErr w:type="spellStart"/>
-      <w:r>
-        <w:t>co-création</w:t>
-      </w:r>
-      <w:proofErr w:type="spellEnd"/>
-      <w:r>
-        <w:t xml:space="preserve"> de valeur</w:t>
-      </w:r>
-      <w:r>
-        <w:t xml:space="preserve"> par l’interaction</w:t>
-      </w:r>
-      <w:r>
-        <w:t xml:space="preserve"> </w:t>
-      </w:r>
-      <w:r>
-        <w:fldChar w:fldCharType="begin"/>
-      </w:r>
-      <w:r>
-        <w:instrText xml:space="preserve"> ADDIN ZOTERO_ITEM CSL_CITATION {"citationID":"dqqLWTaN","properties":{"unsorted":false,"formattedCitation":"(Gr\\uc0\\u246{}nroos &amp; Voima, 2013)","plainCitation":"(Grönroos &amp; Voima, 2013)","noteIndex":0},"citationItems":[{"id":5964,"uris":["http://zotero.org/users/12622049/items/8LRGQBWX"],"itemData":{"id":5964,"type":"article-journal","abstract":"Because extant literature on the service logic of marketing is dominated by a metaphorical view of value co-creation, the roles of both service providers and customers remain analytically unspecified, without a theoretically sound foundation for value creation or co-creation. This article analyzes value creation and co-creation in services by analytically defining the roles of the customer and the firm, as well as the scope, locus, and nature of value and value creation. Value creation refers to customers’ creation of value-in-use; co-creation is a function of interaction. Both the firm’s and the customer’s actions can be categorized by spheres (provider, joint, customer), and their interactions are either direct or indirect, leading to different forms of value creation and co-creation. This conceptualization of value creation spheres extends knowledge about how value-in-use emerges and how value creation can be managed; it also emphasizes the pivotal role of direct interactions for value co-creation opportunities.","call-number":"1","citation-key":"gronroosCriticalServiceLogic2013","container-title":"Journal of the Academy of Marketing Science","DOI":"10.1007/s11747-012-0308-3","journalAbbreviation":"Journal of the Academy of Marketing Science","note":"1661 citations (Crossref) [2024-08-29]","page":"133-150","source":"ResearchGate","title":"Critical Service Logic: Making Sense of Value Creation and Co-Creation","title-short":"Critical Service Logic","volume":"41","author":[{"family":"Grönroos","given":"Christian"},{"family":"Voima","given":"Päivi"}],"issued":{"date-parts":[["2013",3,1]]}}}],"schema":"https://github.com/citation-style-language/schema/raw/master/csl-citation.json"} </w:instrText>
-      </w:r>
-      <w:r>
-        <w:fldChar w:fldCharType="separate"/>
-      </w:r>
-      <w:r>
-        <w:rPr>
-          <w:rFonts w:eastAsia="Times New Roman"/>
-          <w:color w:val="000000"/>
-        </w:rPr>
-        <w:t>(Grönroos &amp; Voima, 2013)</w:t>
-      </w:r>
-      <w:r>
-        <w:fldChar w:fldCharType="end"/>
-      </w:r>
-      <w:r>
-        <w:t>. C’est au sein de cette sphère que nous install</w:t>
-      </w:r>
-      <w:r>
-        <w:t>ons</w:t>
-      </w:r>
-      <w:r>
-        <w:t xml:space="preserve"> </w:t>
-      </w:r>
-      <w:r>
-        <w:t>la</w:t>
-      </w:r>
-      <w:r>
-        <w:t xml:space="preserve"> focale d’observation</w:t>
-      </w:r>
-      <w:r>
-        <w:t xml:space="preserve"> d</w:t>
-      </w:r>
-      <w:r>
-        <w:t xml:space="preserve">u </w:t>
-      </w:r>
-      <w:r>
-        <w:t>cadre exploratoire</w:t>
-      </w:r>
-      <w:r>
-        <w:t xml:space="preserve"> de notre recherche</w:t>
-      </w:r>
-      <w:r>
-        <w:t xml:space="preserve">. </w:t>
-      </w:r>
-    </w:p>
-    <w:p>
-      <w:r>
-        <w:t>Premièrement</w:t>
-      </w:r>
-      <w:r>
-        <w:t>, l</w:t>
-      </w:r>
-      <w:r>
-        <w:t>’</w:t>
-      </w:r>
-      <w:r>
-        <w:t xml:space="preserve">interaction </w:t>
-      </w:r>
-      <w:r>
-        <w:t>permet</w:t>
-      </w:r>
-      <w:r>
-        <w:t xml:space="preserve"> </w:t>
-      </w:r>
-      <w:r>
-        <w:t xml:space="preserve">avant tout </w:t>
-      </w:r>
-      <w:r>
-        <w:t>la réalisation d</w:t>
-      </w:r>
-      <w:r>
-        <w:t xml:space="preserve">es </w:t>
-      </w:r>
-      <w:r>
-        <w:t xml:space="preserve">activités </w:t>
-      </w:r>
-      <w:r>
-        <w:t xml:space="preserve">cognitives </w:t>
-      </w:r>
-      <w:r>
-        <w:t xml:space="preserve">conjointes de résolution du problème, </w:t>
-      </w:r>
-      <w:r>
-        <w:t xml:space="preserve">sous pilotage du </w:t>
-      </w:r>
-      <w:r>
-        <w:t xml:space="preserve">consultant, </w:t>
-      </w:r>
-      <w:r>
-        <w:t>comme la clarification du besoin</w:t>
-      </w:r>
-      <w:r>
-        <w:t xml:space="preserve">, </w:t>
-      </w:r>
-      <w:r>
-        <w:t>la définition de la solution</w:t>
-      </w:r>
-      <w:r>
-        <w:t xml:space="preserve">, l’organisation de la mission </w:t>
-      </w:r>
-      <w:r>
-        <w:t xml:space="preserve"> </w:t>
-      </w:r>
-      <w:r>
-        <w:fldChar w:fldCharType="begin"/>
-      </w:r>
-      <w:r>
-        <w:instrText xml:space="preserve"> ADDIN ZOTERO_ITEM CSL_CITATION {"citationID":"Zq0uzcSf","properties":{"unsorted":false,"formattedCitation":"(Aarikka-Stenroos &amp; Jaakkola, 2012; Svensson, 2010)","plainCitation":"(Aarikka-Stenroos &amp; Jaakkola, 2012; Svensson, 2010)","noteIndex":0},"citationItems":[{"id":14589,"uris":["http://zotero.org/users/12622049/items/RE29AQ34"],"itemData":{"id":14589,"type":"article-journal","call-number":"2","citation-key":"aarikka-stenroosValueCocreationKnowledge2012","container-title":"Industrial Marketing Management","DOI":"10.1016/j.indmarman.2011.11.008","ISSN":"00198501","issue":"1","journalAbbreviation":"Industrial Marketing Management","language":"en","license":"https://www.elsevier.com/tdm/userlicense/1.0/","page":"15-26","source":"DOI.org (Crossref)","title":"Value co-creation in knowledge intensive business services: A dyadic perspective on the joint problem solving process","title-short":"Value co-creation in knowledge intensive business services","volume":"41","author":[{"family":"Aarikka-Stenroos","given":"Leena"},{"family":"Jaakkola","given":"Elina"}],"issued":{"date-parts":[["2012",1]]}}},{"id":4988,"uris":["http://zotero.org/users/12622049/items/SWQCNPRP"],"itemData":{"id":4988,"type":"article-journal","abstract":"This paper examines the ways in which the value of management consultancy services is socially and discursively accomplished in the social interaction between consultants and their clients. A meeting between a consultant and his potential client is studied in detail, with a particular focus on discursive interaction. It is suggested that value is accomplished as an ongoing interplay between exclusion and inclusion of consultancy knowledge. The tension between what is included and excluded is related to Georg Simmel’s ideas on the geometry of value and the ideal type of ‘the stranger’, the figure who is both near and far.","citation-key":"svenssonDoingValueExclusion2010","container-title":"Lund University - Working papers series","language":"en","source":"Zotero","title":"Doing value : Exclusion and Inclusion in Management Consultant-Client Interactions","author":[{"family":"Svensson","given":"Peter"}],"issued":{"date-parts":[["2010"]]}}}],"schema":"https://github.com/citation-style-language/schema/raw/master/csl-citation.json"} </w:instrText>
-      </w:r>
-      <w:r>
-        <w:fldChar w:fldCharType="separate"/>
-      </w:r>
-      <w:r>
-        <w:rPr>
-          <w:noProof/>
-        </w:rPr>
-        <w:t>(Aarikka-Stenroos &amp; Jaakkola, 2012; Svensson, 2010)</w:t>
-      </w:r>
-      <w:r>
-        <w:fldChar w:fldCharType="end"/>
-      </w:r>
-      <w:r>
-        <w:t xml:space="preserve">. </w:t>
-      </w:r>
-    </w:p>
-    <w:p>
-      <w:r>
         <w:t xml:space="preserve">La </w:t>
       </w:r>
       <w:proofErr w:type="spellStart"/>
@@ -9314,7 +9573,7 @@
       <w:pPr>
         <w:pStyle w:val="Titre2"/>
       </w:pPr>
-      <w:bookmarkStart w:id="11" w:name="_Toc228405249"/>
+      <w:bookmarkStart w:id="12" w:name="_Toc228414668"/>
       <w:r>
         <w:t>L’IA</w:t>
       </w:r>
@@ -9336,7 +9595,7 @@
       <w:r>
         <w:t>ment social</w:t>
       </w:r>
-      <w:bookmarkEnd w:id="11"/>
+      <w:bookmarkEnd w:id="12"/>
       <w:r>
         <w:t xml:space="preserve"> </w:t>
       </w:r>
@@ -9346,7 +9605,6 @@
         <w:pStyle w:val="doc-paragraph"/>
       </w:pPr>
       <w:r>
-        <w:lastRenderedPageBreak/>
         <w:t>Or, l</w:t>
       </w:r>
       <w:r>
@@ -9695,7 +9953,7 @@
       <w:pPr>
         <w:pStyle w:val="Titre1"/>
       </w:pPr>
-      <w:bookmarkStart w:id="12" w:name="_Toc228405250"/>
+      <w:bookmarkStart w:id="13" w:name="_Toc228414669"/>
       <w:r>
         <w:t xml:space="preserve">3. </w:t>
       </w:r>
@@ -9705,7 +9963,7 @@
       <w:r>
         <w:t>ADRE PROPOSITIONNEL</w:t>
       </w:r>
-      <w:bookmarkEnd w:id="12"/>
+      <w:bookmarkEnd w:id="13"/>
     </w:p>
     <w:p>
       <w:pPr>
@@ -9813,14 +10071,15 @@
       <w:pPr>
         <w:pStyle w:val="Titre2"/>
       </w:pPr>
-      <w:bookmarkStart w:id="13" w:name="_Toc228405251"/>
+      <w:bookmarkStart w:id="14" w:name="_Toc228414670"/>
       <w:r>
         <w:t>P1 — Reconfiguration multidimensionnelle de la valeur perçue</w:t>
       </w:r>
-      <w:bookmarkEnd w:id="13"/>
-    </w:p>
-    <w:p>
-      <w:r>
+      <w:bookmarkEnd w:id="14"/>
+    </w:p>
+    <w:p>
+      <w:r>
+        <w:lastRenderedPageBreak/>
         <w:t xml:space="preserve">L'intégration de l'IA dans les missions de conseil reconfigure la valeur perçue par le client selon trois dimensions interdépendantes — </w:t>
       </w:r>
       <w:r>
@@ -9884,9 +10143,8 @@
       <w:pPr>
         <w:pStyle w:val="Titre2"/>
       </w:pPr>
-      <w:bookmarkStart w:id="14" w:name="_Toc228405252"/>
-      <w:r>
-        <w:lastRenderedPageBreak/>
+      <w:bookmarkStart w:id="15" w:name="_Toc228414671"/>
+      <w:r>
         <w:t>D</w:t>
       </w:r>
       <w:r>
@@ -9928,7 +10186,7 @@
       <w:r>
         <w:t>(à vérifier)</w:t>
       </w:r>
-      <w:bookmarkEnd w:id="14"/>
+      <w:bookmarkEnd w:id="15"/>
     </w:p>
     <w:p>
       <w:r>
@@ -10088,7 +10346,7 @@
       <w:pPr>
         <w:pStyle w:val="Titre3"/>
       </w:pPr>
-      <w:bookmarkStart w:id="15" w:name="_Toc228405253"/>
+      <w:bookmarkStart w:id="16" w:name="_Toc228414672"/>
       <w:r>
         <w:rPr>
           <w:rStyle w:val="lev"/>
@@ -10098,10 +10356,11 @@
         </w:rPr>
         <w:t>R — Relationnelle</w:t>
       </w:r>
-      <w:bookmarkEnd w:id="15"/>
-    </w:p>
-    <w:p>
-      <w:r>
+      <w:bookmarkEnd w:id="16"/>
+    </w:p>
+    <w:p>
+      <w:r>
+        <w:lastRenderedPageBreak/>
         <w:t>Confiance</w:t>
       </w:r>
       <w:r>
@@ -10127,7 +10386,7 @@
           <w:color w:val="4472C4" w:themeColor="accent1"/>
         </w:rPr>
       </w:pPr>
-      <w:bookmarkStart w:id="16" w:name="_Toc228405254"/>
+      <w:bookmarkStart w:id="17" w:name="_Toc228414673"/>
       <w:r>
         <w:rPr>
           <w:rStyle w:val="lev"/>
@@ -10137,7 +10396,7 @@
         </w:rPr>
         <w:t>P — Processuelle</w:t>
       </w:r>
-      <w:bookmarkEnd w:id="16"/>
+      <w:bookmarkEnd w:id="17"/>
     </w:p>
     <w:p>
       <w:r>
@@ -10169,7 +10428,7 @@
           <w:color w:val="4472C4" w:themeColor="accent1"/>
         </w:rPr>
       </w:pPr>
-      <w:bookmarkStart w:id="17" w:name="_Toc228405255"/>
+      <w:bookmarkStart w:id="18" w:name="_Toc228414674"/>
       <w:r>
         <w:rPr>
           <w:rStyle w:val="lev"/>
@@ -10179,7 +10438,7 @@
         </w:rPr>
         <w:t>C — Cognitive</w:t>
       </w:r>
-      <w:bookmarkEnd w:id="17"/>
+      <w:bookmarkEnd w:id="18"/>
     </w:p>
     <w:p>
       <w:r>
@@ -10200,7 +10459,6 @@
         </w:rPr>
       </w:pPr>
       <w:r>
-        <w:lastRenderedPageBreak/>
         <w:t>C₂ — création de connaissances managériales : explicites (know-</w:t>
       </w:r>
       <w:proofErr w:type="spellStart"/>
@@ -10460,7 +10718,7 @@
       <w:pPr>
         <w:pStyle w:val="Titre3"/>
       </w:pPr>
-      <w:bookmarkStart w:id="18" w:name="_Toc228405256"/>
+      <w:bookmarkStart w:id="19" w:name="_Toc228414675"/>
       <w:r>
         <w:t xml:space="preserve">Comment l'IA reconfigure </w:t>
       </w:r>
@@ -10485,7 +10743,7 @@
       <w:r>
         <w:t>)</w:t>
       </w:r>
-      <w:bookmarkEnd w:id="18"/>
+      <w:bookmarkEnd w:id="19"/>
     </w:p>
     <w:tbl>
       <w:tblPr>
@@ -10794,7 +11052,16 @@
                 <w:sz w:val="18"/>
                 <w:szCs w:val="18"/>
               </w:rPr>
-              <w:t xml:space="preserve"> visible avec l'IA enrichit la diversité et la nouveauté des insights (C₁ appropriation, C₂ création) lorsque le client est cognitivement engagé. Réciproquement, l'appropriation et la création de connaissances nourrissent l'engagement dans la suite de la mission.</w:t>
+              <w:t xml:space="preserve"> visible avec l'IA enrichit la diversité et la </w:t>
+            </w:r>
+            <w:r>
+              <w:rPr>
+                <w:color w:val="000000"/>
+                <w:sz w:val="18"/>
+                <w:szCs w:val="18"/>
+              </w:rPr>
+              <w:lastRenderedPageBreak/>
+              <w:t>nouveauté des insights (C₁ appropriation, C₂ création) lorsque le client est cognitivement engagé. Réciproquement, l'appropriation et la création de connaissances nourrissent l'engagement dans la suite de la mission.</w:t>
             </w:r>
           </w:p>
         </w:tc>
@@ -10818,7 +11085,17 @@
                 <w:sz w:val="18"/>
                 <w:szCs w:val="18"/>
               </w:rPr>
-              <w:t>L'IA peut découpler la connaissance de la co-production : le client reçoit des outputs sans participer à leur génération, ce qui inhibe l'appropriation (C₁) et empêche la création de connaissances tacites (C₂).</w:t>
+              <w:lastRenderedPageBreak/>
+              <w:t xml:space="preserve">L'IA peut découpler la connaissance de la co-production : </w:t>
+            </w:r>
+            <w:r>
+              <w:rPr>
+                <w:color w:val="000000"/>
+                <w:sz w:val="18"/>
+                <w:szCs w:val="18"/>
+              </w:rPr>
+              <w:lastRenderedPageBreak/>
+              <w:t>le client reçoit des outputs sans participer à leur génération, ce qui inhibe l'appropriation (C₁) et empêche la création de connaissances tacites (C₂).</w:t>
             </w:r>
           </w:p>
         </w:tc>
@@ -10842,7 +11119,17 @@
                 <w:sz w:val="18"/>
                 <w:szCs w:val="18"/>
               </w:rPr>
-              <w:t>Dépend de l'explicitation substantive du consultant (P2) et, via P3, de l'intelligibilité, de l'acceptation et des conditions situationnelles.</w:t>
+              <w:lastRenderedPageBreak/>
+              <w:t xml:space="preserve">Dépend de l'explicitation substantive du consultant (P2) </w:t>
+            </w:r>
+            <w:r>
+              <w:rPr>
+                <w:color w:val="000000"/>
+                <w:sz w:val="18"/>
+                <w:szCs w:val="18"/>
+              </w:rPr>
+              <w:lastRenderedPageBreak/>
+              <w:t>et, via P3, de l'intelligibilité, de l'acceptation et des conditions situationnelles.</w:t>
             </w:r>
           </w:p>
         </w:tc>
@@ -10877,6 +11164,7 @@
                 <w:sz w:val="18"/>
                 <w:szCs w:val="18"/>
               </w:rPr>
+              <w:lastRenderedPageBreak/>
               <w:t>R</w:t>
             </w:r>
             <w:r>
@@ -11019,12 +11307,11 @@
       <w:pPr>
         <w:pStyle w:val="Titre2"/>
       </w:pPr>
-      <w:bookmarkStart w:id="19" w:name="_Toc228405257"/>
-      <w:r>
-        <w:lastRenderedPageBreak/>
+      <w:bookmarkStart w:id="20" w:name="_Toc228414676"/>
+      <w:r>
         <w:t>P2 — La transparence comme mécanisme médiateur</w:t>
       </w:r>
-      <w:bookmarkEnd w:id="19"/>
+      <w:bookmarkEnd w:id="20"/>
     </w:p>
     <w:p>
       <w:r>
@@ -11121,7 +11408,7 @@
       <w:pPr>
         <w:pStyle w:val="Titre2"/>
       </w:pPr>
-      <w:bookmarkStart w:id="20" w:name="_Toc228405258"/>
+      <w:bookmarkStart w:id="21" w:name="_Toc228414677"/>
       <w:r>
         <w:t xml:space="preserve">P3 — </w:t>
       </w:r>
@@ -11137,7 +11424,7 @@
       <w:r>
         <w:t>onditions de modération</w:t>
       </w:r>
-      <w:bookmarkEnd w:id="20"/>
+      <w:bookmarkEnd w:id="21"/>
     </w:p>
     <w:p>
       <w:r>
@@ -11343,6 +11630,7 @@
           <w:b/>
           <w:bCs/>
         </w:rPr>
+        <w:lastRenderedPageBreak/>
         <w:t>au niveau de l’acteur</w:t>
       </w:r>
       <w:r>
@@ -11414,7 +11702,6 @@
     </w:p>
     <w:p>
       <w:r>
-        <w:lastRenderedPageBreak/>
         <w:t>Dans ce cadre, l'attribution correcte est traitée comme une condition observable importante de l'appropriation par le client et, par cette appropriation, comme une voie par laquelle la transparence agit sur la valeur perçue.</w:t>
       </w:r>
     </w:p>
@@ -11432,7 +11719,7 @@
       <w:pPr>
         <w:pStyle w:val="Titre1"/>
       </w:pPr>
-      <w:bookmarkStart w:id="21" w:name="_Toc228405259"/>
+      <w:bookmarkStart w:id="22" w:name="_Toc228414678"/>
       <w:r>
         <w:lastRenderedPageBreak/>
         <w:t>4</w:t>
@@ -11440,7 +11727,7 @@
       <w:r>
         <w:t>. CADRE D'OBSERVATION</w:t>
       </w:r>
-      <w:bookmarkEnd w:id="21"/>
+      <w:bookmarkEnd w:id="22"/>
     </w:p>
     <w:p>
       <w:pPr>
@@ -11449,7 +11736,7 @@
           <w:rFonts w:eastAsia="Times New Roman"/>
         </w:rPr>
       </w:pPr>
-      <w:bookmarkStart w:id="22" w:name="_Toc228405260"/>
+      <w:bookmarkStart w:id="23" w:name="_Toc228414679"/>
       <w:r>
         <w:rPr>
           <w:rFonts w:eastAsia="Times New Roman"/>
@@ -11476,7 +11763,7 @@
         </w:rPr>
         <w:t> : S1, S2, S3</w:t>
       </w:r>
-      <w:bookmarkEnd w:id="22"/>
+      <w:bookmarkEnd w:id="23"/>
     </w:p>
     <w:p>
       <w:r>
@@ -11763,8 +12050,8 @@
         <w:pStyle w:val="figure-title"/>
         <w:divId w:val="118577035"/>
       </w:pPr>
-      <w:commentRangeStart w:id="23"/>
       <w:commentRangeStart w:id="24"/>
+      <w:commentRangeStart w:id="25"/>
       <w:r>
         <w:rPr>
           <w:noProof/>
@@ -11805,7 +12092,7 @@
           </wp:inline>
         </w:drawing>
       </w:r>
-      <w:commentRangeEnd w:id="23"/>
+      <w:commentRangeEnd w:id="24"/>
       <w:r>
         <w:rPr>
           <w:rStyle w:val="Marquedecommentaire"/>
@@ -11815,9 +12102,9 @@
           <w:color w:val="auto"/>
           <w:spacing w:val="0"/>
         </w:rPr>
-        <w:commentReference w:id="23"/>
-      </w:r>
-      <w:commentRangeEnd w:id="24"/>
+        <w:commentReference w:id="24"/>
+      </w:r>
+      <w:commentRangeEnd w:id="25"/>
       <w:r>
         <w:rPr>
           <w:rStyle w:val="Marquedecommentaire"/>
@@ -11827,7 +12114,7 @@
           <w:color w:val="auto"/>
           <w:spacing w:val="0"/>
         </w:rPr>
-        <w:commentReference w:id="24"/>
+        <w:commentReference w:id="25"/>
       </w:r>
     </w:p>
     <w:p>
@@ -11998,14 +12285,14 @@
           <w:rFonts w:eastAsia="Times New Roman"/>
         </w:rPr>
       </w:pPr>
-      <w:bookmarkStart w:id="25" w:name="_Toc228405261"/>
+      <w:bookmarkStart w:id="26" w:name="_Toc228414680"/>
       <w:r>
         <w:rPr>
           <w:rFonts w:eastAsia="Times New Roman"/>
         </w:rPr>
         <w:t>Situations et observables</w:t>
       </w:r>
-      <w:bookmarkEnd w:id="25"/>
+      <w:bookmarkEnd w:id="26"/>
     </w:p>
     <w:p>
       <w:pPr>
@@ -12014,14 +12301,14 @@
           <w:rFonts w:eastAsia="Times New Roman"/>
         </w:rPr>
       </w:pPr>
-      <w:bookmarkStart w:id="26" w:name="_Toc228405262"/>
+      <w:bookmarkStart w:id="27" w:name="_Toc228414681"/>
       <w:r>
         <w:rPr>
           <w:rFonts w:eastAsia="Times New Roman"/>
         </w:rPr>
         <w:t>S1 — Sans IA</w:t>
       </w:r>
-      <w:bookmarkEnd w:id="26"/>
+      <w:bookmarkEnd w:id="27"/>
     </w:p>
     <w:p>
       <w:r>
@@ -12126,14 +12413,14 @@
           <w:color w:val="4A4038"/>
         </w:rPr>
       </w:pPr>
-      <w:bookmarkStart w:id="27" w:name="_Toc228405263"/>
+      <w:bookmarkStart w:id="28" w:name="_Toc228414682"/>
       <w:r>
         <w:rPr>
           <w:rFonts w:eastAsia="Times New Roman"/>
         </w:rPr>
         <w:t>S2 — IA en silo</w:t>
       </w:r>
-      <w:bookmarkEnd w:id="27"/>
+      <w:bookmarkEnd w:id="28"/>
     </w:p>
     <w:p>
       <w:r>
@@ -12217,7 +12504,7 @@
           <w:color w:val="4A4038"/>
         </w:rPr>
       </w:pPr>
-      <w:bookmarkStart w:id="28" w:name="_Toc228405264"/>
+      <w:bookmarkStart w:id="29" w:name="_Toc228414683"/>
       <w:r>
         <w:rPr>
           <w:rFonts w:eastAsia="Times New Roman"/>
@@ -12238,7 +12525,7 @@
         </w:rPr>
         <w:t xml:space="preserve"> tripartite</w:t>
       </w:r>
-      <w:bookmarkEnd w:id="28"/>
+      <w:bookmarkEnd w:id="29"/>
     </w:p>
     <w:p>
       <w:pPr>
@@ -12366,7 +12653,7 @@
       <w:pPr>
         <w:pStyle w:val="Titre1"/>
       </w:pPr>
-      <w:bookmarkStart w:id="29" w:name="_Toc228405265"/>
+      <w:bookmarkStart w:id="30" w:name="_Toc228414684"/>
       <w:r>
         <w:lastRenderedPageBreak/>
         <w:t xml:space="preserve">5. </w:t>
@@ -12377,17 +12664,17 @@
       <w:r>
         <w:t>OSTURE DU CHERCHEUR ET DESIGN DE LA RECHERCHE</w:t>
       </w:r>
-      <w:bookmarkEnd w:id="29"/>
+      <w:bookmarkEnd w:id="30"/>
     </w:p>
     <w:p>
       <w:pPr>
         <w:pStyle w:val="Titre2"/>
       </w:pPr>
-      <w:bookmarkStart w:id="30" w:name="_Toc228405266"/>
+      <w:bookmarkStart w:id="31" w:name="_Toc228414685"/>
       <w:r>
         <w:t>Un design d'étude de cas exemplaire en grandeur réelle</w:t>
       </w:r>
-      <w:bookmarkEnd w:id="30"/>
+      <w:bookmarkEnd w:id="31"/>
     </w:p>
     <w:p>
       <w:pPr>
@@ -12506,11 +12793,11 @@
       <w:pPr>
         <w:pStyle w:val="Titre2"/>
       </w:pPr>
-      <w:bookmarkStart w:id="31" w:name="_Toc228405267"/>
+      <w:bookmarkStart w:id="32" w:name="_Toc228414686"/>
       <w:r>
         <w:t>Une posture de praticien-chercheur explicitement assumée</w:t>
       </w:r>
-      <w:bookmarkEnd w:id="31"/>
+      <w:bookmarkEnd w:id="32"/>
       <w:r>
         <w:t xml:space="preserve"> </w:t>
       </w:r>
@@ -12756,11 +13043,11 @@
       <w:pPr>
         <w:pStyle w:val="Titre2"/>
       </w:pPr>
-      <w:bookmarkStart w:id="32" w:name="_Toc228405268"/>
+      <w:bookmarkStart w:id="33" w:name="_Toc228414687"/>
       <w:r>
         <w:t>Un dispositif de réflexivité renforcé pour répondre au risque de biais</w:t>
       </w:r>
-      <w:bookmarkEnd w:id="32"/>
+      <w:bookmarkEnd w:id="33"/>
       <w:r>
         <w:t xml:space="preserve"> </w:t>
       </w:r>
@@ -12835,7 +13122,7 @@
       <w:pPr>
         <w:pStyle w:val="Titre1"/>
       </w:pPr>
-      <w:bookmarkStart w:id="33" w:name="_Toc228405269"/>
+      <w:bookmarkStart w:id="34" w:name="_Toc228414688"/>
       <w:r>
         <w:lastRenderedPageBreak/>
         <w:t>6</w:t>
@@ -12843,7 +13130,7 @@
       <w:r>
         <w:t>. ILLUSTRATION</w:t>
       </w:r>
-      <w:bookmarkEnd w:id="33"/>
+      <w:bookmarkEnd w:id="34"/>
     </w:p>
     <w:p>
       <w:pPr>
@@ -12852,7 +13139,7 @@
           <w:rFonts w:eastAsia="Times New Roman"/>
         </w:rPr>
       </w:pPr>
-      <w:bookmarkStart w:id="34" w:name="_Toc228405270"/>
+      <w:bookmarkStart w:id="35" w:name="_Toc228414689"/>
       <w:r>
         <w:rPr>
           <w:rFonts w:eastAsia="Times New Roman"/>
@@ -12865,7 +13152,7 @@
         </w:rPr>
         <w:t xml:space="preserve"> sur 10 semaines</w:t>
       </w:r>
-      <w:bookmarkEnd w:id="34"/>
+      <w:bookmarkEnd w:id="35"/>
     </w:p>
     <w:p>
       <w:r>
@@ -13076,7 +13363,7 @@
           <w:rFonts w:eastAsia="Times New Roman"/>
         </w:rPr>
       </w:pPr>
-      <w:bookmarkStart w:id="35" w:name="_Toc228405271"/>
+      <w:bookmarkStart w:id="36" w:name="_Toc228414690"/>
       <w:r>
         <w:rPr>
           <w:rFonts w:eastAsia="Times New Roman"/>
@@ -13101,7 +13388,7 @@
         </w:rPr>
         <w:t xml:space="preserve"> fictive de conseil</w:t>
       </w:r>
-      <w:bookmarkEnd w:id="35"/>
+      <w:bookmarkEnd w:id="36"/>
     </w:p>
     <w:p>
       <w:r>
@@ -13195,7 +13482,7 @@
           <w:color w:val="4472C4" w:themeColor="accent1"/>
         </w:rPr>
       </w:pPr>
-      <w:bookmarkStart w:id="36" w:name="_Toc228405272"/>
+      <w:bookmarkStart w:id="37" w:name="_Toc228414691"/>
       <w:r>
         <w:rPr>
           <w:rStyle w:val="lev"/>
@@ -13214,7 +13501,7 @@
         </w:rPr>
         <w:t>– Sem. 1-3</w:t>
       </w:r>
-      <w:bookmarkEnd w:id="36"/>
+      <w:bookmarkEnd w:id="37"/>
     </w:p>
     <w:p>
       <w:r>
@@ -13564,7 +13851,7 @@
           <w:color w:val="4472C4" w:themeColor="accent1"/>
         </w:rPr>
       </w:pPr>
-      <w:bookmarkStart w:id="37" w:name="_Toc228405273"/>
+      <w:bookmarkStart w:id="38" w:name="_Toc228414692"/>
       <w:r>
         <w:rPr>
           <w:rStyle w:val="lev"/>
@@ -13592,7 +13879,7 @@
         </w:rPr>
         <w:t>Analyse – Sem. 4-9</w:t>
       </w:r>
-      <w:bookmarkEnd w:id="37"/>
+      <w:bookmarkEnd w:id="38"/>
     </w:p>
     <w:p>
       <w:pPr>
@@ -14083,7 +14370,7 @@
           <w:color w:val="4472C4" w:themeColor="accent1"/>
         </w:rPr>
       </w:pPr>
-      <w:bookmarkStart w:id="38" w:name="_Toc228405274"/>
+      <w:bookmarkStart w:id="39" w:name="_Toc228414693"/>
       <w:r>
         <w:rPr>
           <w:rStyle w:val="lev"/>
@@ -14093,7 +14380,7 @@
         </w:rPr>
         <w:t>3. Recommandations — Sem. 10</w:t>
       </w:r>
-      <w:bookmarkEnd w:id="38"/>
+      <w:bookmarkEnd w:id="39"/>
     </w:p>
     <w:p>
       <w:pPr>
@@ -14255,7 +14542,7 @@
           <w:color w:val="4472C4" w:themeColor="accent1"/>
         </w:rPr>
       </w:pPr>
-      <w:bookmarkStart w:id="39" w:name="_Toc228405275"/>
+      <w:bookmarkStart w:id="40" w:name="_Toc228414694"/>
       <w:r>
         <w:rPr>
           <w:rStyle w:val="lev"/>
@@ -14265,7 +14552,7 @@
         </w:rPr>
         <w:t>4. Rétrospective — Post</w:t>
       </w:r>
-      <w:bookmarkEnd w:id="39"/>
+      <w:bookmarkEnd w:id="40"/>
     </w:p>
     <w:p>
       <w:pPr>
@@ -14410,7 +14697,7 @@
           <w:rFonts w:eastAsia="Times New Roman"/>
           <w:noProof/>
         </w:rPr>
-        <w:pict w14:anchorId="4E6E73E8">
+        <w:pict w14:anchorId="12C2C0DC">
           <v:rect id="_x0000_i1025" alt="" style="width:453.6pt;height:.05pt;mso-width-percent:0;mso-height-percent:0;mso-width-percent:0;mso-height-percent:0" o:hralign="center" o:hrstd="t" o:hr="t" fillcolor="#a0a0a0" stroked="f"/>
         </w:pict>
       </w:r>
@@ -14430,12 +14717,12 @@
         <w:pStyle w:val="Titre1"/>
         <w:divId w:val="491409308"/>
       </w:pPr>
-      <w:bookmarkStart w:id="40" w:name="_Toc228405276"/>
+      <w:bookmarkStart w:id="41" w:name="_Toc228414695"/>
       <w:r>
         <w:lastRenderedPageBreak/>
         <w:t>BIBLIOGRAPHIE</w:t>
       </w:r>
-      <w:bookmarkEnd w:id="40"/>
+      <w:bookmarkEnd w:id="41"/>
     </w:p>
     <w:p>
       <w:pPr>
@@ -18388,7 +18675,7 @@
 
 <file path=word/comments.xml><?xml version="1.0" encoding="utf-8"?>
 <w:comments xmlns:wpc="http://schemas.microsoft.com/office/word/2010/wordprocessingCanvas" xmlns:cx="http://schemas.microsoft.com/office/drawing/2014/chartex" xmlns:cx1="http://schemas.microsoft.com/office/drawing/2015/9/8/chartex" xmlns:cx2="http://schemas.microsoft.com/office/drawing/2015/10/21/chartex" xmlns:cx3="http://schemas.microsoft.com/office/drawing/2016/5/9/chartex" xmlns:cx4="http://schemas.microsoft.com/office/drawing/2016/5/10/chartex" xmlns:cx5="http://schemas.microsoft.com/office/drawing/2016/5/11/chartex" xmlns:cx6="http://schemas.microsoft.com/office/drawing/2016/5/12/chartex" xmlns:cx7="http://schemas.microsoft.com/office/drawing/2016/5/13/chartex" xmlns:cx8="http://schemas.microsoft.com/office/drawing/2016/5/14/chartex" xmlns:mc="http://schemas.openxmlformats.org/markup-compatibility/2006" xmlns:aink="http://schemas.microsoft.com/office/drawing/2016/ink" xmlns:am3d="http://schemas.microsoft.com/office/drawing/2017/model3d" xmlns:o="urn:schemas-microsoft-com:office:office" xmlns:oel="http://schemas.microsoft.com/office/2019/extlst" xmlns:r="http://schemas.openxmlformats.org/officeDocument/2006/relationships" xmlns:m="http://schemas.openxmlformats.org/officeDocument/2006/math" xmlns:v="urn:schemas-microsoft-com:vml" xmlns:wp14="http://schemas.microsoft.com/office/word/2010/wordprocessingDrawing" xmlns:wp="http://schemas.openxmlformats.org/drawingml/2006/wordprocessingDrawing" xmlns:w10="urn:schemas-microsoft-com:office:word" xmlns:w="http://schemas.openxmlformats.org/wordprocessingml/2006/main" xmlns:w14="http://schemas.microsoft.com/office/word/2010/wordml" xmlns:w15="http://schemas.microsoft.com/office/word/2012/wordml" xmlns:w16cex="http://schemas.microsoft.com/office/word/2018/wordml/cex" xmlns:w16cid="http://schemas.microsoft.com/office/word/2016/wordml/cid" xmlns:w16="http://schemas.microsoft.com/office/word/2018/wordml" xmlns:w16sdtdh="http://schemas.microsoft.com/office/word/2020/wordml/sdtdatahash" xmlns:w16se="http://schemas.microsoft.com/office/word/2015/wordml/symex" xmlns:wpg="http://schemas.microsoft.com/office/word/2010/wordprocessingGroup" xmlns:wpi="http://schemas.microsoft.com/office/word/2010/wordprocessingInk" xmlns:wne="http://schemas.microsoft.com/office/word/2006/wordml" xmlns:wps="http://schemas.microsoft.com/office/word/2010/wordprocessingShape" mc:Ignorable="w14 w15 w16se w16cid w16 w16cex w16sdtdh wp14">
-  <w:comment w:id="23" w:author="Clement Yunes" w:date="2026-04-30T02:51:00Z" w:initials="CY">
+  <w:comment w:id="24" w:author="Clement Yunes" w:date="2026-04-30T02:51:00Z" w:initials="CY">
     <w:p>
       <w:pPr>
         <w:pStyle w:val="Commentaire"/>
@@ -18401,7 +18688,7 @@
       </w:r>
     </w:p>
   </w:comment>
-  <w:comment w:id="24" w:author="Clement Yunes" w:date="2026-04-30T02:51:00Z" w:initials="CY">
+  <w:comment w:id="25" w:author="Clement Yunes" w:date="2026-04-30T02:51:00Z" w:initials="CY">
     <w:p>
       <w:pPr>
         <w:pStyle w:val="Commentaire"/>
@@ -20234,7 +20521,7 @@
   <w:style w:type="paragraph" w:default="1" w:styleId="Normal">
     <w:name w:val="Normal"/>
     <w:qFormat/>
-    <w:rsid w:val="00437527"/>
+    <w:rsid w:val="00B9429B"/>
     <w:pPr>
       <w:spacing w:before="200"/>
       <w:jc w:val="both"/>

</xml_diff>

<commit_message>
Refresh framework text from Word source
</commit_message>
<xml_diff>
--- a/docs/DOCUMENT_COMPLEMENTAIRE_CONTENU_FR.docx
+++ b/docs/DOCUMENT_COMPLEMENTAIRE_CONTENU_FR.docx
@@ -428,7 +428,7 @@
           <w14:ligatures w14:val="standardContextual"/>
         </w:rPr>
       </w:pPr>
-      <w:hyperlink w:anchor="_Toc228414660" w:history="1">
+      <w:hyperlink w:anchor="_Toc228416857" w:history="1">
         <w:r>
           <w:rPr>
             <w:rStyle w:val="Lienhypertexte"/>
@@ -455,7 +455,7 @@
             <w:noProof/>
             <w:webHidden/>
           </w:rPr>
-          <w:instrText xml:space="preserve"> PAGEREF _Toc228414660 \h </w:instrText>
+          <w:instrText xml:space="preserve"> PAGEREF _Toc228416857 \h </w:instrText>
         </w:r>
         <w:r>
           <w:rPr>
@@ -501,7 +501,7 @@
           <w14:ligatures w14:val="standardContextual"/>
         </w:rPr>
       </w:pPr>
-      <w:hyperlink w:anchor="_Toc228414661" w:history="1">
+      <w:hyperlink w:anchor="_Toc228416858" w:history="1">
         <w:r>
           <w:rPr>
             <w:rStyle w:val="Lienhypertexte"/>
@@ -529,7 +529,7 @@
             <w:noProof/>
             <w:webHidden/>
           </w:rPr>
-          <w:instrText xml:space="preserve"> PAGEREF _Toc228414661 \h </w:instrText>
+          <w:instrText xml:space="preserve"> PAGEREF _Toc228416858 \h </w:instrText>
         </w:r>
         <w:r>
           <w:rPr>
@@ -575,7 +575,7 @@
           <w14:ligatures w14:val="standardContextual"/>
         </w:rPr>
       </w:pPr>
-      <w:hyperlink w:anchor="_Toc228414662" w:history="1">
+      <w:hyperlink w:anchor="_Toc228416859" w:history="1">
         <w:r>
           <w:rPr>
             <w:rStyle w:val="Lienhypertexte"/>
@@ -603,7 +603,7 @@
             <w:noProof/>
             <w:webHidden/>
           </w:rPr>
-          <w:instrText xml:space="preserve"> PAGEREF _Toc228414662 \h </w:instrText>
+          <w:instrText xml:space="preserve"> PAGEREF _Toc228416859 \h </w:instrText>
         </w:r>
         <w:r>
           <w:rPr>
@@ -649,7 +649,7 @@
           <w14:ligatures w14:val="standardContextual"/>
         </w:rPr>
       </w:pPr>
-      <w:hyperlink w:anchor="_Toc228414663" w:history="1">
+      <w:hyperlink w:anchor="_Toc228416860" w:history="1">
         <w:r>
           <w:rPr>
             <w:rStyle w:val="Lienhypertexte"/>
@@ -676,7 +676,7 @@
             <w:noProof/>
             <w:webHidden/>
           </w:rPr>
-          <w:instrText xml:space="preserve"> PAGEREF _Toc228414663 \h </w:instrText>
+          <w:instrText xml:space="preserve"> PAGEREF _Toc228416860 \h </w:instrText>
         </w:r>
         <w:r>
           <w:rPr>
@@ -722,7 +722,7 @@
           <w14:ligatures w14:val="standardContextual"/>
         </w:rPr>
       </w:pPr>
-      <w:hyperlink w:anchor="_Toc228414664" w:history="1">
+      <w:hyperlink w:anchor="_Toc228416861" w:history="1">
         <w:r>
           <w:rPr>
             <w:rStyle w:val="Lienhypertexte"/>
@@ -750,7 +750,7 @@
             <w:noProof/>
             <w:webHidden/>
           </w:rPr>
-          <w:instrText xml:space="preserve"> PAGEREF _Toc228414664 \h </w:instrText>
+          <w:instrText xml:space="preserve"> PAGEREF _Toc228416861 \h </w:instrText>
         </w:r>
         <w:r>
           <w:rPr>
@@ -796,7 +796,7 @@
           <w14:ligatures w14:val="standardContextual"/>
         </w:rPr>
       </w:pPr>
-      <w:hyperlink w:anchor="_Toc228414665" w:history="1">
+      <w:hyperlink w:anchor="_Toc228416862" w:history="1">
         <w:r>
           <w:rPr>
             <w:rStyle w:val="Lienhypertexte"/>
@@ -823,7 +823,7 @@
             <w:noProof/>
             <w:webHidden/>
           </w:rPr>
-          <w:instrText xml:space="preserve"> PAGEREF _Toc228414665 \h </w:instrText>
+          <w:instrText xml:space="preserve"> PAGEREF _Toc228416862 \h </w:instrText>
         </w:r>
         <w:r>
           <w:rPr>
@@ -869,7 +869,7 @@
           <w14:ligatures w14:val="standardContextual"/>
         </w:rPr>
       </w:pPr>
-      <w:hyperlink w:anchor="_Toc228414666" w:history="1">
+      <w:hyperlink w:anchor="_Toc228416863" w:history="1">
         <w:r>
           <w:rPr>
             <w:rStyle w:val="Lienhypertexte"/>
@@ -896,7 +896,7 @@
             <w:noProof/>
             <w:webHidden/>
           </w:rPr>
-          <w:instrText xml:space="preserve"> PAGEREF _Toc228414666 \h </w:instrText>
+          <w:instrText xml:space="preserve"> PAGEREF _Toc228416863 \h </w:instrText>
         </w:r>
         <w:r>
           <w:rPr>
@@ -942,7 +942,7 @@
           <w14:ligatures w14:val="standardContextual"/>
         </w:rPr>
       </w:pPr>
-      <w:hyperlink w:anchor="_Toc228414667" w:history="1">
+      <w:hyperlink w:anchor="_Toc228416864" w:history="1">
         <w:r>
           <w:rPr>
             <w:rStyle w:val="Lienhypertexte"/>
@@ -969,7 +969,7 @@
             <w:noProof/>
             <w:webHidden/>
           </w:rPr>
-          <w:instrText xml:space="preserve"> PAGEREF _Toc228414667 \h </w:instrText>
+          <w:instrText xml:space="preserve"> PAGEREF _Toc228416864 \h </w:instrText>
         </w:r>
         <w:r>
           <w:rPr>
@@ -1015,7 +1015,7 @@
           <w14:ligatures w14:val="standardContextual"/>
         </w:rPr>
       </w:pPr>
-      <w:hyperlink w:anchor="_Toc228414668" w:history="1">
+      <w:hyperlink w:anchor="_Toc228416865" w:history="1">
         <w:r>
           <w:rPr>
             <w:rStyle w:val="Lienhypertexte"/>
@@ -1042,7 +1042,7 @@
             <w:noProof/>
             <w:webHidden/>
           </w:rPr>
-          <w:instrText xml:space="preserve"> PAGEREF _Toc228414668 \h </w:instrText>
+          <w:instrText xml:space="preserve"> PAGEREF _Toc228416865 \h </w:instrText>
         </w:r>
         <w:r>
           <w:rPr>
@@ -1062,7 +1062,7 @@
             <w:noProof/>
             <w:webHidden/>
           </w:rPr>
-          <w:t>9</w:t>
+          <w:t>8</w:t>
         </w:r>
         <w:r>
           <w:rPr>
@@ -1088,7 +1088,7 @@
           <w14:ligatures w14:val="standardContextual"/>
         </w:rPr>
       </w:pPr>
-      <w:hyperlink w:anchor="_Toc228414669" w:history="1">
+      <w:hyperlink w:anchor="_Toc228416866" w:history="1">
         <w:r>
           <w:rPr>
             <w:rStyle w:val="Lienhypertexte"/>
@@ -1115,7 +1115,7 @@
             <w:noProof/>
             <w:webHidden/>
           </w:rPr>
-          <w:instrText xml:space="preserve"> PAGEREF _Toc228414669 \h </w:instrText>
+          <w:instrText xml:space="preserve"> PAGEREF _Toc228416866 \h </w:instrText>
         </w:r>
         <w:r>
           <w:rPr>
@@ -1161,7 +1161,7 @@
           <w14:ligatures w14:val="standardContextual"/>
         </w:rPr>
       </w:pPr>
-      <w:hyperlink w:anchor="_Toc228414670" w:history="1">
+      <w:hyperlink w:anchor="_Toc228416867" w:history="1">
         <w:r>
           <w:rPr>
             <w:rStyle w:val="Lienhypertexte"/>
@@ -1188,7 +1188,7 @@
             <w:noProof/>
             <w:webHidden/>
           </w:rPr>
-          <w:instrText xml:space="preserve"> PAGEREF _Toc228414670 \h </w:instrText>
+          <w:instrText xml:space="preserve"> PAGEREF _Toc228416867 \h </w:instrText>
         </w:r>
         <w:r>
           <w:rPr>
@@ -1234,7 +1234,7 @@
           <w14:ligatures w14:val="standardContextual"/>
         </w:rPr>
       </w:pPr>
-      <w:hyperlink w:anchor="_Toc228414671" w:history="1">
+      <w:hyperlink w:anchor="_Toc228416868" w:history="1">
         <w:r>
           <w:rPr>
             <w:rStyle w:val="Lienhypertexte"/>
@@ -1261,7 +1261,7 @@
             <w:noProof/>
             <w:webHidden/>
           </w:rPr>
-          <w:instrText xml:space="preserve"> PAGEREF _Toc228414671 \h </w:instrText>
+          <w:instrText xml:space="preserve"> PAGEREF _Toc228416868 \h </w:instrText>
         </w:r>
         <w:r>
           <w:rPr>
@@ -1307,7 +1307,7 @@
           <w14:ligatures w14:val="standardContextual"/>
         </w:rPr>
       </w:pPr>
-      <w:hyperlink w:anchor="_Toc228414672" w:history="1">
+      <w:hyperlink w:anchor="_Toc228416869" w:history="1">
         <w:r>
           <w:rPr>
             <w:rStyle w:val="Lienhypertexte"/>
@@ -1334,7 +1334,7 @@
             <w:noProof/>
             <w:webHidden/>
           </w:rPr>
-          <w:instrText xml:space="preserve"> PAGEREF _Toc228414672 \h </w:instrText>
+          <w:instrText xml:space="preserve"> PAGEREF _Toc228416869 \h </w:instrText>
         </w:r>
         <w:r>
           <w:rPr>
@@ -1380,7 +1380,7 @@
           <w14:ligatures w14:val="standardContextual"/>
         </w:rPr>
       </w:pPr>
-      <w:hyperlink w:anchor="_Toc228414673" w:history="1">
+      <w:hyperlink w:anchor="_Toc228416870" w:history="1">
         <w:r>
           <w:rPr>
             <w:rStyle w:val="Lienhypertexte"/>
@@ -1407,7 +1407,7 @@
             <w:noProof/>
             <w:webHidden/>
           </w:rPr>
-          <w:instrText xml:space="preserve"> PAGEREF _Toc228414673 \h </w:instrText>
+          <w:instrText xml:space="preserve"> PAGEREF _Toc228416870 \h </w:instrText>
         </w:r>
         <w:r>
           <w:rPr>
@@ -1427,7 +1427,7 @@
             <w:noProof/>
             <w:webHidden/>
           </w:rPr>
-          <w:t>11</w:t>
+          <w:t>10</w:t>
         </w:r>
         <w:r>
           <w:rPr>
@@ -1453,7 +1453,7 @@
           <w14:ligatures w14:val="standardContextual"/>
         </w:rPr>
       </w:pPr>
-      <w:hyperlink w:anchor="_Toc228414674" w:history="1">
+      <w:hyperlink w:anchor="_Toc228416871" w:history="1">
         <w:r>
           <w:rPr>
             <w:rStyle w:val="Lienhypertexte"/>
@@ -1480,7 +1480,7 @@
             <w:noProof/>
             <w:webHidden/>
           </w:rPr>
-          <w:instrText xml:space="preserve"> PAGEREF _Toc228414674 \h </w:instrText>
+          <w:instrText xml:space="preserve"> PAGEREF _Toc228416871 \h </w:instrText>
         </w:r>
         <w:r>
           <w:rPr>
@@ -1526,7 +1526,7 @@
           <w14:ligatures w14:val="standardContextual"/>
         </w:rPr>
       </w:pPr>
-      <w:hyperlink w:anchor="_Toc228414675" w:history="1">
+      <w:hyperlink w:anchor="_Toc228416872" w:history="1">
         <w:r>
           <w:rPr>
             <w:rStyle w:val="Lienhypertexte"/>
@@ -1553,7 +1553,7 @@
             <w:noProof/>
             <w:webHidden/>
           </w:rPr>
-          <w:instrText xml:space="preserve"> PAGEREF _Toc228414675 \h </w:instrText>
+          <w:instrText xml:space="preserve"> PAGEREF _Toc228416872 \h </w:instrText>
         </w:r>
         <w:r>
           <w:rPr>
@@ -1599,7 +1599,7 @@
           <w14:ligatures w14:val="standardContextual"/>
         </w:rPr>
       </w:pPr>
-      <w:hyperlink w:anchor="_Toc228414676" w:history="1">
+      <w:hyperlink w:anchor="_Toc228416873" w:history="1">
         <w:r>
           <w:rPr>
             <w:rStyle w:val="Lienhypertexte"/>
@@ -1626,7 +1626,7 @@
             <w:noProof/>
             <w:webHidden/>
           </w:rPr>
-          <w:instrText xml:space="preserve"> PAGEREF _Toc228414676 \h </w:instrText>
+          <w:instrText xml:space="preserve"> PAGEREF _Toc228416873 \h </w:instrText>
         </w:r>
         <w:r>
           <w:rPr>
@@ -1672,7 +1672,7 @@
           <w14:ligatures w14:val="standardContextual"/>
         </w:rPr>
       </w:pPr>
-      <w:hyperlink w:anchor="_Toc228414677" w:history="1">
+      <w:hyperlink w:anchor="_Toc228416874" w:history="1">
         <w:r>
           <w:rPr>
             <w:rStyle w:val="Lienhypertexte"/>
@@ -1699,7 +1699,7 @@
             <w:noProof/>
             <w:webHidden/>
           </w:rPr>
-          <w:instrText xml:space="preserve"> PAGEREF _Toc228414677 \h </w:instrText>
+          <w:instrText xml:space="preserve"> PAGEREF _Toc228416874 \h </w:instrText>
         </w:r>
         <w:r>
           <w:rPr>
@@ -1745,7 +1745,7 @@
           <w14:ligatures w14:val="standardContextual"/>
         </w:rPr>
       </w:pPr>
-      <w:hyperlink w:anchor="_Toc228414678" w:history="1">
+      <w:hyperlink w:anchor="_Toc228416875" w:history="1">
         <w:r>
           <w:rPr>
             <w:rStyle w:val="Lienhypertexte"/>
@@ -1772,7 +1772,7 @@
             <w:noProof/>
             <w:webHidden/>
           </w:rPr>
-          <w:instrText xml:space="preserve"> PAGEREF _Toc228414678 \h </w:instrText>
+          <w:instrText xml:space="preserve"> PAGEREF _Toc228416875 \h </w:instrText>
         </w:r>
         <w:r>
           <w:rPr>
@@ -1818,7 +1818,7 @@
           <w14:ligatures w14:val="standardContextual"/>
         </w:rPr>
       </w:pPr>
-      <w:hyperlink w:anchor="_Toc228414679" w:history="1">
+      <w:hyperlink w:anchor="_Toc228416876" w:history="1">
         <w:r>
           <w:rPr>
             <w:rStyle w:val="Lienhypertexte"/>
@@ -1846,7 +1846,7 @@
             <w:noProof/>
             <w:webHidden/>
           </w:rPr>
-          <w:instrText xml:space="preserve"> PAGEREF _Toc228414679 \h </w:instrText>
+          <w:instrText xml:space="preserve"> PAGEREF _Toc228416876 \h </w:instrText>
         </w:r>
         <w:r>
           <w:rPr>
@@ -1892,7 +1892,7 @@
           <w14:ligatures w14:val="standardContextual"/>
         </w:rPr>
       </w:pPr>
-      <w:hyperlink w:anchor="_Toc228414680" w:history="1">
+      <w:hyperlink w:anchor="_Toc228416877" w:history="1">
         <w:r>
           <w:rPr>
             <w:rStyle w:val="Lienhypertexte"/>
@@ -1920,7 +1920,7 @@
             <w:noProof/>
             <w:webHidden/>
           </w:rPr>
-          <w:instrText xml:space="preserve"> PAGEREF _Toc228414680 \h </w:instrText>
+          <w:instrText xml:space="preserve"> PAGEREF _Toc228416877 \h </w:instrText>
         </w:r>
         <w:r>
           <w:rPr>
@@ -1966,7 +1966,7 @@
           <w14:ligatures w14:val="standardContextual"/>
         </w:rPr>
       </w:pPr>
-      <w:hyperlink w:anchor="_Toc228414681" w:history="1">
+      <w:hyperlink w:anchor="_Toc228416878" w:history="1">
         <w:r>
           <w:rPr>
             <w:rStyle w:val="Lienhypertexte"/>
@@ -1994,7 +1994,7 @@
             <w:noProof/>
             <w:webHidden/>
           </w:rPr>
-          <w:instrText xml:space="preserve"> PAGEREF _Toc228414681 \h </w:instrText>
+          <w:instrText xml:space="preserve"> PAGEREF _Toc228416878 \h </w:instrText>
         </w:r>
         <w:r>
           <w:rPr>
@@ -2040,7 +2040,7 @@
           <w14:ligatures w14:val="standardContextual"/>
         </w:rPr>
       </w:pPr>
-      <w:hyperlink w:anchor="_Toc228414682" w:history="1">
+      <w:hyperlink w:anchor="_Toc228416879" w:history="1">
         <w:r>
           <w:rPr>
             <w:rStyle w:val="Lienhypertexte"/>
@@ -2068,7 +2068,7 @@
             <w:noProof/>
             <w:webHidden/>
           </w:rPr>
-          <w:instrText xml:space="preserve"> PAGEREF _Toc228414682 \h </w:instrText>
+          <w:instrText xml:space="preserve"> PAGEREF _Toc228416879 \h </w:instrText>
         </w:r>
         <w:r>
           <w:rPr>
@@ -2114,7 +2114,7 @@
           <w14:ligatures w14:val="standardContextual"/>
         </w:rPr>
       </w:pPr>
-      <w:hyperlink w:anchor="_Toc228414683" w:history="1">
+      <w:hyperlink w:anchor="_Toc228416880" w:history="1">
         <w:r>
           <w:rPr>
             <w:rStyle w:val="Lienhypertexte"/>
@@ -2142,7 +2142,7 @@
             <w:noProof/>
             <w:webHidden/>
           </w:rPr>
-          <w:instrText xml:space="preserve"> PAGEREF _Toc228414683 \h </w:instrText>
+          <w:instrText xml:space="preserve"> PAGEREF _Toc228416880 \h </w:instrText>
         </w:r>
         <w:r>
           <w:rPr>
@@ -2188,7 +2188,7 @@
           <w14:ligatures w14:val="standardContextual"/>
         </w:rPr>
       </w:pPr>
-      <w:hyperlink w:anchor="_Toc228414684" w:history="1">
+      <w:hyperlink w:anchor="_Toc228416881" w:history="1">
         <w:r>
           <w:rPr>
             <w:rStyle w:val="Lienhypertexte"/>
@@ -2215,7 +2215,7 @@
             <w:noProof/>
             <w:webHidden/>
           </w:rPr>
-          <w:instrText xml:space="preserve"> PAGEREF _Toc228414684 \h </w:instrText>
+          <w:instrText xml:space="preserve"> PAGEREF _Toc228416881 \h </w:instrText>
         </w:r>
         <w:r>
           <w:rPr>
@@ -2261,7 +2261,7 @@
           <w14:ligatures w14:val="standardContextual"/>
         </w:rPr>
       </w:pPr>
-      <w:hyperlink w:anchor="_Toc228414685" w:history="1">
+      <w:hyperlink w:anchor="_Toc228416882" w:history="1">
         <w:r>
           <w:rPr>
             <w:rStyle w:val="Lienhypertexte"/>
@@ -2288,7 +2288,7 @@
             <w:noProof/>
             <w:webHidden/>
           </w:rPr>
-          <w:instrText xml:space="preserve"> PAGEREF _Toc228414685 \h </w:instrText>
+          <w:instrText xml:space="preserve"> PAGEREF _Toc228416882 \h </w:instrText>
         </w:r>
         <w:r>
           <w:rPr>
@@ -2334,7 +2334,7 @@
           <w14:ligatures w14:val="standardContextual"/>
         </w:rPr>
       </w:pPr>
-      <w:hyperlink w:anchor="_Toc228414686" w:history="1">
+      <w:hyperlink w:anchor="_Toc228416883" w:history="1">
         <w:r>
           <w:rPr>
             <w:rStyle w:val="Lienhypertexte"/>
@@ -2361,7 +2361,7 @@
             <w:noProof/>
             <w:webHidden/>
           </w:rPr>
-          <w:instrText xml:space="preserve"> PAGEREF _Toc228414686 \h </w:instrText>
+          <w:instrText xml:space="preserve"> PAGEREF _Toc228416883 \h </w:instrText>
         </w:r>
         <w:r>
           <w:rPr>
@@ -2407,7 +2407,7 @@
           <w14:ligatures w14:val="standardContextual"/>
         </w:rPr>
       </w:pPr>
-      <w:hyperlink w:anchor="_Toc228414687" w:history="1">
+      <w:hyperlink w:anchor="_Toc228416884" w:history="1">
         <w:r>
           <w:rPr>
             <w:rStyle w:val="Lienhypertexte"/>
@@ -2434,7 +2434,7 @@
             <w:noProof/>
             <w:webHidden/>
           </w:rPr>
-          <w:instrText xml:space="preserve"> PAGEREF _Toc228414687 \h </w:instrText>
+          <w:instrText xml:space="preserve"> PAGEREF _Toc228416884 \h </w:instrText>
         </w:r>
         <w:r>
           <w:rPr>
@@ -2480,7 +2480,7 @@
           <w14:ligatures w14:val="standardContextual"/>
         </w:rPr>
       </w:pPr>
-      <w:hyperlink w:anchor="_Toc228414688" w:history="1">
+      <w:hyperlink w:anchor="_Toc228416885" w:history="1">
         <w:r>
           <w:rPr>
             <w:rStyle w:val="Lienhypertexte"/>
@@ -2507,7 +2507,7 @@
             <w:noProof/>
             <w:webHidden/>
           </w:rPr>
-          <w:instrText xml:space="preserve"> PAGEREF _Toc228414688 \h </w:instrText>
+          <w:instrText xml:space="preserve"> PAGEREF _Toc228416885 \h </w:instrText>
         </w:r>
         <w:r>
           <w:rPr>
@@ -2553,7 +2553,7 @@
           <w14:ligatures w14:val="standardContextual"/>
         </w:rPr>
       </w:pPr>
-      <w:hyperlink w:anchor="_Toc228414689" w:history="1">
+      <w:hyperlink w:anchor="_Toc228416886" w:history="1">
         <w:r>
           <w:rPr>
             <w:rStyle w:val="Lienhypertexte"/>
@@ -2581,7 +2581,7 @@
             <w:noProof/>
             <w:webHidden/>
           </w:rPr>
-          <w:instrText xml:space="preserve"> PAGEREF _Toc228414689 \h </w:instrText>
+          <w:instrText xml:space="preserve"> PAGEREF _Toc228416886 \h </w:instrText>
         </w:r>
         <w:r>
           <w:rPr>
@@ -2627,7 +2627,7 @@
           <w14:ligatures w14:val="standardContextual"/>
         </w:rPr>
       </w:pPr>
-      <w:hyperlink w:anchor="_Toc228414690" w:history="1">
+      <w:hyperlink w:anchor="_Toc228416887" w:history="1">
         <w:r>
           <w:rPr>
             <w:rStyle w:val="Lienhypertexte"/>
@@ -2655,7 +2655,7 @@
             <w:noProof/>
             <w:webHidden/>
           </w:rPr>
-          <w:instrText xml:space="preserve"> PAGEREF _Toc228414690 \h </w:instrText>
+          <w:instrText xml:space="preserve"> PAGEREF _Toc228416887 \h </w:instrText>
         </w:r>
         <w:r>
           <w:rPr>
@@ -2701,7 +2701,7 @@
           <w14:ligatures w14:val="standardContextual"/>
         </w:rPr>
       </w:pPr>
-      <w:hyperlink w:anchor="_Toc228414691" w:history="1">
+      <w:hyperlink w:anchor="_Toc228416888" w:history="1">
         <w:r>
           <w:rPr>
             <w:rStyle w:val="Lienhypertexte"/>
@@ -2728,7 +2728,7 @@
             <w:noProof/>
             <w:webHidden/>
           </w:rPr>
-          <w:instrText xml:space="preserve"> PAGEREF _Toc228414691 \h </w:instrText>
+          <w:instrText xml:space="preserve"> PAGEREF _Toc228416888 \h </w:instrText>
         </w:r>
         <w:r>
           <w:rPr>
@@ -2774,7 +2774,7 @@
           <w14:ligatures w14:val="standardContextual"/>
         </w:rPr>
       </w:pPr>
-      <w:hyperlink w:anchor="_Toc228414692" w:history="1">
+      <w:hyperlink w:anchor="_Toc228416889" w:history="1">
         <w:r>
           <w:rPr>
             <w:rStyle w:val="Lienhypertexte"/>
@@ -2801,7 +2801,7 @@
             <w:noProof/>
             <w:webHidden/>
           </w:rPr>
-          <w:instrText xml:space="preserve"> PAGEREF _Toc228414692 \h </w:instrText>
+          <w:instrText xml:space="preserve"> PAGEREF _Toc228416889 \h </w:instrText>
         </w:r>
         <w:r>
           <w:rPr>
@@ -2847,7 +2847,7 @@
           <w14:ligatures w14:val="standardContextual"/>
         </w:rPr>
       </w:pPr>
-      <w:hyperlink w:anchor="_Toc228414693" w:history="1">
+      <w:hyperlink w:anchor="_Toc228416890" w:history="1">
         <w:r>
           <w:rPr>
             <w:rStyle w:val="Lienhypertexte"/>
@@ -2874,7 +2874,7 @@
             <w:noProof/>
             <w:webHidden/>
           </w:rPr>
-          <w:instrText xml:space="preserve"> PAGEREF _Toc228414693 \h </w:instrText>
+          <w:instrText xml:space="preserve"> PAGEREF _Toc228416890 \h </w:instrText>
         </w:r>
         <w:r>
           <w:rPr>
@@ -2920,7 +2920,7 @@
           <w14:ligatures w14:val="standardContextual"/>
         </w:rPr>
       </w:pPr>
-      <w:hyperlink w:anchor="_Toc228414694" w:history="1">
+      <w:hyperlink w:anchor="_Toc228416891" w:history="1">
         <w:r>
           <w:rPr>
             <w:rStyle w:val="Lienhypertexte"/>
@@ -2947,7 +2947,7 @@
             <w:noProof/>
             <w:webHidden/>
           </w:rPr>
-          <w:instrText xml:space="preserve"> PAGEREF _Toc228414694 \h </w:instrText>
+          <w:instrText xml:space="preserve"> PAGEREF _Toc228416891 \h </w:instrText>
         </w:r>
         <w:r>
           <w:rPr>
@@ -2993,7 +2993,7 @@
           <w14:ligatures w14:val="standardContextual"/>
         </w:rPr>
       </w:pPr>
-      <w:hyperlink w:anchor="_Toc228414695" w:history="1">
+      <w:hyperlink w:anchor="_Toc228416892" w:history="1">
         <w:r>
           <w:rPr>
             <w:rStyle w:val="Lienhypertexte"/>
@@ -3020,7 +3020,7 @@
             <w:noProof/>
             <w:webHidden/>
           </w:rPr>
-          <w:instrText xml:space="preserve"> PAGEREF _Toc228414695 \h </w:instrText>
+          <w:instrText xml:space="preserve"> PAGEREF _Toc228416892 \h </w:instrText>
         </w:r>
         <w:r>
           <w:rPr>
@@ -3074,7 +3074,7 @@
       <w:pPr>
         <w:pStyle w:val="Titre1"/>
       </w:pPr>
-      <w:bookmarkStart w:id="0" w:name="_Toc228414660"/>
+      <w:bookmarkStart w:id="0" w:name="_Toc228416857"/>
       <w:r>
         <w:lastRenderedPageBreak/>
         <w:t>1. POSITIONNEMENT DE LA RECHERCHE</w:t>
@@ -3089,7 +3089,7 @@
           <w:color w:val="4472C4" w:themeColor="accent1"/>
         </w:rPr>
       </w:pPr>
-      <w:bookmarkStart w:id="1" w:name="_Toc228414661"/>
+      <w:bookmarkStart w:id="1" w:name="_Toc228416858"/>
       <w:r>
         <w:rPr>
           <w:rFonts w:eastAsia="Times New Roman"/>
@@ -5737,7 +5737,7 @@
           <w:rFonts w:eastAsia="Times New Roman"/>
         </w:rPr>
       </w:pPr>
-      <w:bookmarkStart w:id="3" w:name="_Toc228414662"/>
+      <w:bookmarkStart w:id="3" w:name="_Toc228416859"/>
       <w:r>
         <w:rPr>
           <w:rFonts w:eastAsia="Times New Roman"/>
@@ -6189,7 +6189,7 @@
       <w:pPr>
         <w:pStyle w:val="Titre2"/>
       </w:pPr>
-      <w:bookmarkStart w:id="4" w:name="_Toc228414663"/>
+      <w:bookmarkStart w:id="4" w:name="_Toc228416860"/>
       <w:r>
         <w:t>E</w:t>
       </w:r>
@@ -7380,7 +7380,7 @@
         </w:rPr>
       </w:pPr>
       <w:bookmarkStart w:id="7" w:name="_Hlk227872854"/>
-      <w:bookmarkStart w:id="8" w:name="_Toc228414664"/>
+      <w:bookmarkStart w:id="8" w:name="_Toc228416861"/>
       <w:bookmarkEnd w:id="6"/>
       <w:r>
         <w:rPr>
@@ -7651,7 +7651,7 @@
       <w:pPr>
         <w:pStyle w:val="Titre1"/>
       </w:pPr>
-      <w:bookmarkStart w:id="9" w:name="_Toc228414665"/>
+      <w:bookmarkStart w:id="9" w:name="_Toc228416862"/>
       <w:r>
         <w:t xml:space="preserve">2. CADRE </w:t>
       </w:r>
@@ -7664,7 +7664,7 @@
       <w:pPr>
         <w:pStyle w:val="Titre2"/>
       </w:pPr>
-      <w:bookmarkStart w:id="10" w:name="_Toc228414666"/>
+      <w:bookmarkStart w:id="10" w:name="_Toc228416863"/>
       <w:r>
         <w:t>L</w:t>
       </w:r>
@@ -8608,53 +8608,87 @@
         <w:rPr>
           <w:highlight w:val="yellow"/>
         </w:rPr>
-        <w:t xml:space="preserve"> exemple, par une </w:t>
+        <w:t xml:space="preserve"> exemple, par une i</w:t>
       </w:r>
       <w:r>
         <w:rPr>
           <w:highlight w:val="yellow"/>
         </w:rPr>
-        <w:t xml:space="preserve">    </w:t>
+        <w:t xml:space="preserve">mpossibilité de recours : </w:t>
       </w:r>
       <w:r>
         <w:rPr>
           <w:highlight w:val="yellow"/>
         </w:rPr>
-        <w:t>i</w:t>
+        <w:t>s</w:t>
       </w:r>
       <w:r>
         <w:rPr>
           <w:highlight w:val="yellow"/>
         </w:rPr>
-        <w:t xml:space="preserve">mpossibilité de recours : </w:t>
-      </w:r>
-      <w:r>
-        <w:rPr>
-          <w:highlight w:val="yellow"/>
-        </w:rPr>
-        <w:t>s</w:t>
-      </w:r>
-      <w:r>
-        <w:rPr>
-          <w:highlight w:val="yellow"/>
-        </w:rPr>
         <w:t>i la recommandation enchevêtrée humain-IA cause un préjudice,</w:t>
       </w:r>
       <w:r>
-        <w:t xml:space="preserve"> qui est responsable ? Le consultant (qui a "interprété" l'IA) ? L'éditeur du logiciel ? Le client lui-même (qui a accepté l'interaction enchevêtrée) ? Cette indétermination est une externalité transactionnelle qui réduit la valeur perçue du service, surtout dans des contextes à haut risque.</w:t>
+        <w:t xml:space="preserve"> qui est responsable ? Le consultant (qui a "interprété" l'IA) ? L'éditeur du logiciel ? Le client lui-même (qui a accepté l'interaction enchevêtrée) ? Cette indétermination est une externalité transactionnelle qui </w:t>
+      </w:r>
+      <w:r>
+        <w:t>fragilise</w:t>
+      </w:r>
+      <w:r>
+        <w:t xml:space="preserve"> la valeur perçue du service, surtout dans des contextes à haut risque.</w:t>
       </w:r>
       <w:r>
         <w:t xml:space="preserve"> </w:t>
       </w:r>
     </w:p>
     <w:p>
+      <w:r>
+        <w:fldChar w:fldCharType="begin"/>
+      </w:r>
+      <w:r>
+        <w:instrText xml:space="preserve"> ADDIN ZOTERO_ITEM CSL_CITATION {"citationID":"axWyZjuO","properties":{"unsorted":false,"formattedCitation":"(Pl\\uc0\\u233{} &amp; C\\uc0\\u225{}ceres, 2010)","plainCitation":"(Plé &amp; Cáceres, 2010)","noteIndex":0},"citationItems":[{"id":13743,"uris":["http://zotero.org/users/12622049/items/YXBYGTIY"],"itemData":{"id":13743,"type":"article-journal","abstract":"Purpose – Noting that a fundamental tenet of service-dominant (S-D) logic is the co-creation of value-in-use, this paper aims to explore the theoretical possibility that the interactions between service systems cannot only co-create value, but also have adverse consequences leading to actual value co-destruction. Design/methodology/approach – This conceptual paper critically reviews the dominance of value co-creation and value-in-use in S-D logic. Noting the relative lack of research in the converse possibility, the study proposes and explores the implications of value co-destruction as a new concept which should be introduced within the framework of S-D logic. Findings – The study proposes a formal definition for the new proposed concept of value co-destruction. It describes in detail the process by which it occurs, showing that value can be co-destroyed through the interactions between different systems, resulting in value destruction-through-misuse. Indeed, value co-destruction occurs when a service system accidentally or intentionally misuses resources (its own resources and/or those of another service system) by acting in an inappropriate or unexpected manner. Research limitations/implications – This paper is purely conceptual and exploratory. Empirical examination of the theoretical findings regarding value-co-destruction is required. Possible avenues of interest for such empirical research of value co-destruction are suggested. Practical implications – Limiting the occurrence of misuse by aligning the mutual expectations of interacting service systems should reduce the risks of value co-destruction. Recovering from misuse should also be considered. Originality/value – This study is apparently the first to have introduced the notion of value co-destruction into the conceptual framework of S-D logic.","call-number":"1","citation-key":"pleNotAlwaysCocreation2010","container-title":"Journal of Services Marketing","DOI":"10.1108/08876041011072546","journalAbbreviation":"Journal of Services Marketing","page":"430-437","source":"ResearchGate","title":"Not always co-creation: introducing interactional co-destruction of value in Service-Dominant Logic. Keywords","title-short":"Not always co-creation","volume":"24","author":[{"family":"Plé","given":"Loïc"},{"family":"Cáceres","given":"Ruben"}],"issued":{"date-parts":[["2010",9,13]]}}}],"schema":"https://github.com/citation-style-language/schema/raw/master/csl-citation.json"} </w:instrText>
+      </w:r>
+      <w:r>
+        <w:fldChar w:fldCharType="separate"/>
+      </w:r>
       <w:proofErr w:type="spellStart"/>
       <w:r>
+        <w:rPr>
+          <w:rFonts w:eastAsia="Times New Roman"/>
+          <w:szCs w:val="24"/>
+        </w:rPr>
         <w:t>Plé</w:t>
       </w:r>
       <w:proofErr w:type="spellEnd"/>
       <w:r>
-        <w:t xml:space="preserve"> et Cáceres notent </w:t>
+        <w:rPr>
+          <w:rFonts w:eastAsia="Times New Roman"/>
+          <w:szCs w:val="24"/>
+        </w:rPr>
+        <w:t xml:space="preserve"> &amp; Cáceres</w:t>
+      </w:r>
+      <w:r>
+        <w:rPr>
+          <w:rFonts w:eastAsia="Times New Roman"/>
+          <w:szCs w:val="24"/>
+        </w:rPr>
+        <w:t xml:space="preserve"> (</w:t>
+      </w:r>
+      <w:r>
+        <w:rPr>
+          <w:rFonts w:eastAsia="Times New Roman"/>
+          <w:szCs w:val="24"/>
+        </w:rPr>
+        <w:t>2010)</w:t>
+      </w:r>
+      <w:r>
+        <w:fldChar w:fldCharType="end"/>
+      </w:r>
+      <w:r>
+        <w:t xml:space="preserve"> </w:t>
+      </w:r>
+      <w:r>
+        <w:t xml:space="preserve">notent </w:t>
       </w:r>
       <w:r>
         <w:t xml:space="preserve">ainsi </w:t>
@@ -8674,11 +8708,11 @@
         <w:t>,</w:t>
       </w:r>
       <w:r>
-        <w:t xml:space="preserve"> où un système voit sa valeur détruite tandis que l'autre en crée. Dans le conseil IA-augmenté, le consultant peut gagner en efficacité (plus de clients traités, recommandations plus rapides) tandis que le client perd en qualité perçue (moins d'empathie, </w:t>
+        <w:t xml:space="preserve"> où un système voit sa valeur détruite tandis que l'autre en crée. Dans le conseil IA-augmenté, le consultant peut gagner en efficacité (plus de clients traités, recommandations plus rapides) tandis que le client perd en qualité perçue (moins </w:t>
       </w:r>
       <w:r>
         <w:lastRenderedPageBreak/>
-        <w:t xml:space="preserve">recommandations inadaptées à son contexte spécifique). L'enchevêtrement masque ce déséquilibre en présentant une façade </w:t>
+        <w:t xml:space="preserve">d'empathie, recommandations inadaptées à son contexte spécifique). L'enchevêtrement masque ce déséquilibre en présentant une façade </w:t>
       </w:r>
       <w:proofErr w:type="gramStart"/>
       <w:r>
@@ -8982,7 +9016,7 @@
       <w:pPr>
         <w:pStyle w:val="Titre2"/>
       </w:pPr>
-      <w:bookmarkStart w:id="11" w:name="_Toc228414667"/>
+      <w:bookmarkStart w:id="11" w:name="_Toc228416864"/>
       <w:r>
         <w:t xml:space="preserve">La valeur perçue </w:t>
       </w:r>
@@ -8996,7 +9030,10 @@
     </w:p>
     <w:p>
       <w:r>
-        <w:t xml:space="preserve">Ainsi, dans le conseil, la valeur perçue relève de trois dimensions : fonctionnelle, émotionnelle et sociale </w:t>
+        <w:t xml:space="preserve">Nous l’avons vu, </w:t>
+      </w:r>
+      <w:r>
+        <w:t xml:space="preserve">dans le conseil, la valeur perçue relève de trois dimensions : fonctionnelle, émotionnelle et sociale </w:t>
       </w:r>
       <w:r>
         <w:fldChar w:fldCharType="begin"/>
@@ -9182,13 +9219,7 @@
     </w:p>
     <w:p>
       <w:r>
-        <w:t xml:space="preserve">Dans le conseil, la relation est </w:t>
-      </w:r>
-      <w:r>
-        <w:t xml:space="preserve">donc </w:t>
-      </w:r>
-      <w:r>
-        <w:t xml:space="preserve">première, et l’expertise, seconde, condition pas toujours nécessaire et jamais suffisante pour initier l’interaction </w:t>
+        <w:t xml:space="preserve">Dans le conseil, la relation est première, et l’expertise, seconde, condition pas toujours nécessaire et jamais suffisante pour initier l’interaction </w:t>
       </w:r>
       <w:r>
         <w:fldChar w:fldCharType="begin"/>
@@ -9212,15 +9243,19 @@
         <w:t>.</w:t>
       </w:r>
       <w:r>
-        <w:t xml:space="preserve"> La valeur perçue est donc un accomplissement social qui se produit et est réalisé au cours des interactions récurrentes entre consultant et client. </w:t>
-      </w:r>
-    </w:p>
-    <w:p>
+        <w:t xml:space="preserve"> La valeur perçue est un accomplissement social qui se produit et est réalisé au cours des interactions récurrentes entre consultant et client. </w:t>
+      </w:r>
       <w:r>
         <w:t>L</w:t>
       </w:r>
       <w:r>
-        <w:t xml:space="preserve">e prestataire, pour initier </w:t>
+        <w:t xml:space="preserve">e </w:t>
+      </w:r>
+      <w:r>
+        <w:t>consultant</w:t>
+      </w:r>
+      <w:r>
+        <w:t xml:space="preserve">, pour initier </w:t>
       </w:r>
       <w:r>
         <w:t xml:space="preserve">puis </w:t>
@@ -9322,638 +9357,440 @@
       </w:r>
     </w:p>
     <w:p>
-      <w:r>
-        <w:t>Premièrement</w:t>
-      </w:r>
-      <w:r>
-        <w:t>, l</w:t>
-      </w:r>
-      <w:r>
-        <w:t>’</w:t>
-      </w:r>
-      <w:r>
-        <w:t xml:space="preserve">interaction </w:t>
-      </w:r>
-      <w:r>
-        <w:t>permet</w:t>
-      </w:r>
+      <w:pPr>
+        <w:pStyle w:val="Titre2"/>
+      </w:pPr>
+      <w:bookmarkStart w:id="12" w:name="_Toc228416865"/>
+      <w:r>
+        <w:t>L’IA</w:t>
+      </w:r>
+      <w:r>
+        <w:t xml:space="preserve">, </w:t>
+      </w:r>
+      <w:r>
+        <w:t xml:space="preserve">élément perturbateur de </w:t>
+      </w:r>
+      <w:r>
+        <w:t>l</w:t>
+      </w:r>
+      <w:r>
+        <w:t>’accompliss</w:t>
+      </w:r>
+      <w:r>
+        <w:t>e</w:t>
+      </w:r>
+      <w:r>
+        <w:t>ment social</w:t>
+      </w:r>
+      <w:bookmarkEnd w:id="12"/>
       <w:r>
         <w:t xml:space="preserve"> </w:t>
       </w:r>
-      <w:r>
-        <w:t xml:space="preserve">avant tout </w:t>
-      </w:r>
-      <w:r>
-        <w:t>la réalisation d</w:t>
-      </w:r>
-      <w:r>
-        <w:t xml:space="preserve">es </w:t>
-      </w:r>
-      <w:r>
-        <w:t xml:space="preserve">activités </w:t>
+    </w:p>
+    <w:p>
+      <w:r>
+        <w:t xml:space="preserve">Premièrement, l’interaction permet </w:t>
+      </w:r>
+      <w:r>
+        <w:t>de satisfaire la dimension fonctionnelle du conseil</w:t>
+      </w:r>
+      <w:r>
+        <w:t xml:space="preserve">. </w:t>
+      </w:r>
+      <w:r>
+        <w:t>Deuxième, l’interaction apporte le surcroit de justification nécessaire, pour que le client perçoive la valeur du conseil.</w:t>
+      </w:r>
+    </w:p>
+    <w:p>
+      <w:pPr>
+        <w:pStyle w:val="doc-paragraph"/>
+      </w:pPr>
+      <w:r>
+        <w:lastRenderedPageBreak/>
+        <w:t>Or, l</w:t>
+      </w:r>
+      <w:r>
+        <w:t>’intégration de l’IA dans les pratiques du conseil</w:t>
+      </w:r>
+      <w:r>
+        <w:t>,</w:t>
+      </w:r>
+      <w:r>
+        <w:t xml:space="preserve"> </w:t>
+      </w:r>
+      <w:r>
+        <w:t xml:space="preserve">vient </w:t>
+      </w:r>
+      <w:r>
+        <w:t>perturbe</w:t>
+      </w:r>
+      <w:r>
+        <w:t>r</w:t>
+      </w:r>
+      <w:r>
+        <w:t xml:space="preserve"> dans les deux cas, </w:t>
+      </w:r>
+      <w:r>
+        <w:t>l</w:t>
+      </w:r>
+      <w:r>
+        <w:t xml:space="preserve">e processus à l’œuvre </w:t>
+      </w:r>
+      <w:r>
+        <w:t xml:space="preserve">dans les </w:t>
+      </w:r>
+      <w:r>
+        <w:t>interactions </w:t>
+      </w:r>
+      <w:r>
+        <w:t xml:space="preserve">de </w:t>
+      </w:r>
+      <w:proofErr w:type="spellStart"/>
+      <w:r>
+        <w:t>co-création</w:t>
+      </w:r>
+      <w:proofErr w:type="spellEnd"/>
+      <w:r>
+        <w:t xml:space="preserve"> </w:t>
+      </w:r>
+      <w:r>
+        <w:t>entre consultant et client</w:t>
+      </w:r>
+      <w:r>
+        <w:t>, et par voie de conséquence, la perception de la valeur pa</w:t>
+      </w:r>
+      <w:r>
+        <w:t>r</w:t>
+      </w:r>
+      <w:r>
+        <w:t xml:space="preserve"> le client</w:t>
+      </w:r>
+      <w:r>
+        <w:t>.</w:t>
+      </w:r>
+    </w:p>
+    <w:p>
+      <w:pPr>
+        <w:pStyle w:val="doc-paragraph"/>
+      </w:pPr>
+      <w:r>
+        <w:t>L</w:t>
+      </w:r>
+      <w:r>
+        <w:t xml:space="preserve">a réalisation des activités </w:t>
       </w:r>
       <w:r>
         <w:t xml:space="preserve">cognitives </w:t>
       </w:r>
       <w:r>
-        <w:t xml:space="preserve">conjointes de résolution du problème, </w:t>
-      </w:r>
-      <w:r>
-        <w:t xml:space="preserve">sous pilotage du </w:t>
-      </w:r>
-      <w:r>
-        <w:t xml:space="preserve">consultant, </w:t>
-      </w:r>
-      <w:r>
-        <w:t>comme la clarification du besoin</w:t>
+        <w:t>conjointes de résolution du problème</w:t>
+      </w:r>
+      <w:r>
+        <w:t xml:space="preserve"> peut désormais s’appuyer </w:t>
+      </w:r>
+      <w:r>
+        <w:t>sur</w:t>
+      </w:r>
+      <w:r>
+        <w:t xml:space="preserve"> l’IA</w:t>
+      </w:r>
+      <w:r>
+        <w:t xml:space="preserve"> </w:t>
+      </w:r>
+      <w:r>
+        <w:t xml:space="preserve">et moins sur le jugement humain </w:t>
+      </w:r>
+      <w:r>
+        <w:t>(par exemple, automatisa</w:t>
+      </w:r>
+      <w:r>
+        <w:t>tion</w:t>
+      </w:r>
+      <w:r>
+        <w:t xml:space="preserve"> </w:t>
+      </w:r>
+      <w:r>
+        <w:t xml:space="preserve">de </w:t>
+      </w:r>
+      <w:r>
+        <w:t>l’étape de clarification du diagnostic)</w:t>
+      </w:r>
+      <w:r>
+        <w:t xml:space="preserve">. </w:t>
+      </w:r>
+      <w:r>
+        <w:t>Or, l</w:t>
+      </w:r>
+      <w:r>
+        <w:t xml:space="preserve">a symétrie de l’interaction consultant-client </w:t>
+      </w:r>
+      <w:r>
+        <w:t xml:space="preserve">devient </w:t>
+      </w:r>
+      <w:r>
+        <w:t>sujette à déstabilisation</w:t>
+      </w:r>
+      <w:r>
+        <w:t>, par le fait du floutage des contributions</w:t>
+      </w:r>
+      <w:r>
+        <w:t xml:space="preserve"> humain-IA</w:t>
+      </w:r>
+      <w:r>
+        <w:t>.</w:t>
+      </w:r>
+      <w:r>
+        <w:t xml:space="preserve"> </w:t>
+      </w:r>
+      <w:r>
+        <w:t xml:space="preserve"> </w:t>
+      </w:r>
+    </w:p>
+    <w:p>
+      <w:r>
+        <w:t>Les</w:t>
+      </w:r>
+      <w:r>
+        <w:t xml:space="preserve"> </w:t>
+      </w:r>
+      <w:r>
+        <w:t>pratiques de justification</w:t>
+      </w:r>
+      <w:r>
+        <w:t xml:space="preserve"> (</w:t>
+      </w:r>
+      <w:r>
+        <w:t xml:space="preserve">formulation commerciale du service, la présentation graphique du diagnostic, le </w:t>
+      </w:r>
+      <w:bookmarkStart w:id="13" w:name="_Hlk228416393"/>
+      <w:r>
+        <w:t>signalement de l’activité</w:t>
+      </w:r>
+      <w:bookmarkEnd w:id="13"/>
+      <w:r>
+        <w:t>, la montée en compétence du consultant et la production de son autorité</w:t>
+      </w:r>
+      <w:r>
+        <w:t xml:space="preserve">), </w:t>
+      </w:r>
+      <w:r>
+        <w:t xml:space="preserve">dont la logique nous semble d’autant plus pertinente </w:t>
+      </w:r>
+      <w:r>
+        <w:t>du fait du floutage de l’attribution, doivent être revues</w:t>
+      </w:r>
+      <w:r>
+        <w:t xml:space="preserve"> au prisme de l’IA</w:t>
+      </w:r>
+      <w:r>
+        <w:t> : premièrement, certaines sont</w:t>
+      </w:r>
+      <w:r>
+        <w:t xml:space="preserve"> </w:t>
+      </w:r>
+      <w:r>
+        <w:t>automatis</w:t>
+      </w:r>
+      <w:r>
+        <w:t>a</w:t>
+      </w:r>
+      <w:r>
+        <w:t>bles</w:t>
+      </w:r>
+      <w:r>
+        <w:t xml:space="preserve"> </w:t>
+      </w:r>
+      <w:r>
+        <w:t>(par exemple, l’IA dispense d</w:t>
+      </w:r>
+      <w:r>
+        <w:t xml:space="preserve">’une </w:t>
+      </w:r>
+      <w:r>
+        <w:t xml:space="preserve">formulation commerciale du service, </w:t>
+      </w:r>
+      <w:r>
+        <w:t>des compétences de</w:t>
+      </w:r>
+      <w:r>
+        <w:t xml:space="preserve"> présentation graphique du diagnostic</w:t>
+      </w:r>
+      <w:r>
+        <w:t xml:space="preserve">, ou accélère la montée en compétence </w:t>
+      </w:r>
+      <w:r>
+        <w:fldChar w:fldCharType="begin"/>
+      </w:r>
+      <w:r>
+        <w:instrText xml:space="preserve"> ADDIN ZOTERO_ITEM CSL_CITATION {"citationID":"cXEi3lIs","properties":{"unsorted":false,"formattedCitation":"(Cahier &amp; Quesson, 2025)","plainCitation":"(Cahier &amp; Quesson, 2025)","noteIndex":0},"citationItems":[{"id":10027,"uris":["http://zotero.org/users/12622049/items/GVFDL83E"],"itemData":{"id":10027,"type":"article-journal","citation-key":"cahierTravaillerAvecIA2025","container-title":"Chaire Futurs de l'Industrie et du Travail (FIT)","language":"fr","publisher":"Les ouvrages de la chaire FIT2","source":"Zotero","title":"Travailler avec les IA génératives","author":[{"family":"Cahier","given":"Marie-Laure"},{"family":"Quesson","given":"Pierre"}],"issued":{"date-parts":[["2025"]]}}}],"schema":"https://github.com/citation-style-language/schema/raw/master/csl-citation.json"} </w:instrText>
+      </w:r>
+      <w:r>
+        <w:fldChar w:fldCharType="separate"/>
+      </w:r>
+      <w:r>
+        <w:rPr>
+          <w:noProof/>
+        </w:rPr>
+        <w:t>(Cahier &amp; Quesson, 2025)</w:t>
+      </w:r>
+      <w:r>
+        <w:fldChar w:fldCharType="end"/>
+      </w:r>
+      <w:r>
+        <w:t>)</w:t>
+      </w:r>
+      <w:r>
+        <w:t xml:space="preserve">. Deuxièmement, </w:t>
+      </w:r>
+      <w:r>
+        <w:t>certaines</w:t>
+      </w:r>
+      <w:r>
+        <w:t xml:space="preserve"> perdent de leur intérêt </w:t>
+      </w:r>
+      <w:r>
+        <w:t xml:space="preserve">(par exemple, quelle est la signification d’un </w:t>
+      </w:r>
+      <w:r>
+        <w:t>signalement de l’activité</w:t>
+      </w:r>
+      <w:r>
+        <w:t>, pour une analyse entièrement réalisée par l’IA</w:t>
+      </w:r>
+      <w:r>
+        <w:t> ?</w:t>
+      </w:r>
+      <w:r>
+        <w:t>)</w:t>
+      </w:r>
+      <w:r>
+        <w:t>. Troisièmement,</w:t>
+      </w:r>
+      <w:r>
+        <w:t xml:space="preserve"> certaines dépendent de la capacité même d’</w:t>
+      </w:r>
+      <w:r>
+        <w:t>interagir</w:t>
+      </w:r>
+      <w:r>
+        <w:t xml:space="preserve"> avec l’IA (par exemple, quelle peut être l’autorité d’un consultant qui ne peut expliciter une analyse menée par l’IA ?).   </w:t>
+      </w:r>
+    </w:p>
+    <w:p>
+      <w:pPr>
+        <w:pStyle w:val="doc-paragraph"/>
+      </w:pPr>
+      <w:r>
+        <w:t xml:space="preserve">Pour le conseil, ce n’est pas </w:t>
+      </w:r>
+      <w:r>
+        <w:t>la finalité</w:t>
+      </w:r>
+      <w:r>
+        <w:t xml:space="preserve"> du processus de </w:t>
+      </w:r>
+      <w:proofErr w:type="spellStart"/>
+      <w:r>
+        <w:t>co-création</w:t>
+      </w:r>
+      <w:proofErr w:type="spellEnd"/>
+      <w:r>
+        <w:t xml:space="preserve"> qui est remis en cause. Il s’agit bien toujours, de produire les connaissances managériales nécessaires au client, pour lui permettre de percevoir la valeur du conseil</w:t>
+      </w:r>
+      <w:r>
+        <w:t xml:space="preserve"> vis-à-vis de ses propres problématiques</w:t>
+      </w:r>
+      <w:r>
+        <w:t xml:space="preserve">. Simplement, la </w:t>
+      </w:r>
+      <w:r>
+        <w:t>nature du processus</w:t>
+      </w:r>
+      <w:r>
+        <w:t xml:space="preserve"> de production diffère fondamentalement </w:t>
+      </w:r>
+      <w:r>
+        <w:t>à l’ère de l’IA</w:t>
+      </w:r>
+      <w:r>
+        <w:t>.</w:t>
+      </w:r>
+      <w:r>
+        <w:t xml:space="preserve"> </w:t>
+      </w:r>
+      <w:r>
+        <w:t>Il faut repenser l</w:t>
+      </w:r>
+      <w:r>
+        <w:t xml:space="preserve">a </w:t>
+      </w:r>
+      <w:proofErr w:type="spellStart"/>
+      <w:r>
+        <w:t>co-création</w:t>
+      </w:r>
+      <w:proofErr w:type="spellEnd"/>
+      <w:r>
+        <w:t xml:space="preserve"> des connaissances managériales</w:t>
       </w:r>
       <w:r>
         <w:t xml:space="preserve">, </w:t>
       </w:r>
       <w:r>
-        <w:t>la définition de la solution</w:t>
-      </w:r>
-      <w:r>
-        <w:t xml:space="preserve">, l’organisation de la mission </w:t>
+        <w:t>à l’ère de l’IA.</w:t>
+      </w:r>
+    </w:p>
+    <w:p>
+      <w:pPr>
+        <w:pStyle w:val="doc-paragraph"/>
+      </w:pPr>
+      <w:r>
+        <w:t>L’enjeu nous semble suffisamment d’importance : q</w:t>
+      </w:r>
+      <w:r>
+        <w:t xml:space="preserve">uelle est </w:t>
+      </w:r>
+      <w:r>
+        <w:t xml:space="preserve">la </w:t>
+      </w:r>
+      <w:r>
+        <w:t>dynamique de reconfiguration</w:t>
+      </w:r>
+      <w:r>
+        <w:t xml:space="preserve"> à l’</w:t>
+      </w:r>
+      <w:r>
+        <w:t>œuvre</w:t>
+      </w:r>
+      <w:r>
+        <w:t xml:space="preserve">, </w:t>
+      </w:r>
+      <w:r>
+        <w:t xml:space="preserve">pour la valeur perçue du </w:t>
+      </w:r>
+      <w:r>
+        <w:t>conseil à l’ère de l’IA</w:t>
+      </w:r>
+      <w:r>
+        <w:t>, et sous quelles conditions</w:t>
+      </w:r>
+      <w:r>
+        <w:t> </w:t>
+      </w:r>
+      <w:r>
+        <w:t xml:space="preserve">se renforce-t-elle plutôt qu’elle ne se fragilise </w:t>
+      </w:r>
+      <w:r>
+        <w:t>?</w:t>
       </w:r>
       <w:r>
         <w:t xml:space="preserve"> </w:t>
       </w:r>
-      <w:r>
-        <w:fldChar w:fldCharType="begin"/>
-      </w:r>
-      <w:r>
-        <w:instrText xml:space="preserve"> ADDIN ZOTERO_ITEM CSL_CITATION {"citationID":"Zq0uzcSf","properties":{"unsorted":false,"formattedCitation":"(Aarikka-Stenroos &amp; Jaakkola, 2012; Svensson, 2010)","plainCitation":"(Aarikka-Stenroos &amp; Jaakkola, 2012; Svensson, 2010)","noteIndex":0},"citationItems":[{"id":14589,"uris":["http://zotero.org/users/12622049/items/RE29AQ34"],"itemData":{"id":14589,"type":"article-journal","call-number":"2","citation-key":"aarikka-stenroosValueCocreationKnowledge2012","container-title":"Industrial Marketing Management","DOI":"10.1016/j.indmarman.2011.11.008","ISSN":"00198501","issue":"1","journalAbbreviation":"Industrial Marketing Management","language":"en","license":"https://www.elsevier.com/tdm/userlicense/1.0/","page":"15-26","source":"DOI.org (Crossref)","title":"Value co-creation in knowledge intensive business services: A dyadic perspective on the joint problem solving process","title-short":"Value co-creation in knowledge intensive business services","volume":"41","author":[{"family":"Aarikka-Stenroos","given":"Leena"},{"family":"Jaakkola","given":"Elina"}],"issued":{"date-parts":[["2012",1]]}}},{"id":4988,"uris":["http://zotero.org/users/12622049/items/SWQCNPRP"],"itemData":{"id":4988,"type":"article-journal","abstract":"This paper examines the ways in which the value of management consultancy services is socially and discursively accomplished in the social interaction between consultants and their clients. A meeting between a consultant and his potential client is studied in detail, with a particular focus on discursive interaction. It is suggested that value is accomplished as an ongoing interplay between exclusion and inclusion of consultancy knowledge. The tension between what is included and excluded is related to Georg Simmel’s ideas on the geometry of value and the ideal type of ‘the stranger’, the figure who is both near and far.","citation-key":"svenssonDoingValueExclusion2010","container-title":"Lund University - Working papers series","language":"en","source":"Zotero","title":"Doing value : Exclusion and Inclusion in Management Consultant-Client Interactions","author":[{"family":"Svensson","given":"Peter"}],"issued":{"date-parts":[["2010"]]}}}],"schema":"https://github.com/citation-style-language/schema/raw/master/csl-citation.json"} </w:instrText>
-      </w:r>
-      <w:r>
-        <w:fldChar w:fldCharType="separate"/>
-      </w:r>
-      <w:r>
-        <w:rPr>
-          <w:noProof/>
-        </w:rPr>
-        <w:t>(Aarikka-Stenroos &amp; Jaakkola, 2012; Svensson, 2010)</w:t>
-      </w:r>
-      <w:r>
-        <w:fldChar w:fldCharType="end"/>
-      </w:r>
-      <w:r>
-        <w:t xml:space="preserve">. </w:t>
-      </w:r>
-    </w:p>
-    <w:p>
-      <w:r>
-        <w:lastRenderedPageBreak/>
-        <w:t xml:space="preserve">La </w:t>
-      </w:r>
-      <w:proofErr w:type="spellStart"/>
-      <w:r>
-        <w:t>co-création</w:t>
-      </w:r>
-      <w:proofErr w:type="spellEnd"/>
-      <w:r>
-        <w:t xml:space="preserve"> de valeur perçue </w:t>
-      </w:r>
-      <w:proofErr w:type="spellStart"/>
-      <w:r>
-        <w:rPr>
-          <w:i/>
-          <w:iCs/>
-        </w:rPr>
-        <w:t>pré-suppose</w:t>
-      </w:r>
-      <w:proofErr w:type="spellEnd"/>
-      <w:r>
-        <w:t xml:space="preserve"> </w:t>
-      </w:r>
-      <w:r>
-        <w:t xml:space="preserve">donc </w:t>
-      </w:r>
-      <w:r>
-        <w:t>une symétrie des rôles</w:t>
-      </w:r>
-      <w:r>
-        <w:t xml:space="preserve"> </w:t>
-      </w:r>
-      <w:r>
-        <w:t>et respons</w:t>
-      </w:r>
-      <w:r>
-        <w:t>a</w:t>
-      </w:r>
-      <w:r>
-        <w:t>bilités</w:t>
-      </w:r>
-      <w:r>
-        <w:t xml:space="preserve"> du consultant</w:t>
-      </w:r>
-      <w:r>
-        <w:t xml:space="preserve"> et du client</w:t>
-      </w:r>
-      <w:r>
-        <w:t> : l</w:t>
-      </w:r>
-      <w:r>
-        <w:t xml:space="preserve">e </w:t>
-      </w:r>
-      <w:r>
-        <w:t xml:space="preserve">premier </w:t>
-      </w:r>
-      <w:r>
-        <w:t>cadre</w:t>
-      </w:r>
-      <w:r>
-        <w:t>, analyse, préconise</w:t>
-      </w:r>
-      <w:r>
-        <w:t> ; l</w:t>
-      </w:r>
-      <w:r>
-        <w:t>e</w:t>
-      </w:r>
-      <w:r>
-        <w:t xml:space="preserve"> second </w:t>
-      </w:r>
-      <w:r>
-        <w:t xml:space="preserve">fournit l’information, </w:t>
-      </w:r>
-      <w:r>
-        <w:t>revoit, valide</w:t>
-      </w:r>
-      <w:r>
-        <w:t>.</w:t>
-      </w:r>
-      <w:r>
-        <w:t xml:space="preserve"> Le premier pilote, le second supporte.</w:t>
-      </w:r>
-      <w:r>
-        <w:t xml:space="preserve"> </w:t>
-      </w:r>
-    </w:p>
-    <w:p>
-      <w:r>
-        <w:t>Cette approche est d’autant plus pertinente que le contexte du conseil se nourrit d’ambiguïté, et donc réclame des mythes et discours particuliers, dont la fonction est de persuader la clientèle de la valeur du service fourni.</w:t>
-      </w:r>
-      <w:r>
-        <w:t xml:space="preserve"> </w:t>
-      </w:r>
-    </w:p>
-    <w:p>
-      <w:r>
-        <w:t>Clarifions donc ce point </w:t>
-      </w:r>
-      <w:r>
-        <w:t xml:space="preserve">dès à présent </w:t>
-      </w:r>
-      <w:r>
-        <w:t xml:space="preserve">: pour Bourgoin, le consultant, associé au client, est </w:t>
-      </w:r>
-      <w:r>
-        <w:t xml:space="preserve">bien </w:t>
-      </w:r>
-      <w:r>
-        <w:t>source de valeur perçue</w:t>
-      </w:r>
-      <w:r>
-        <w:t xml:space="preserve"> (et non un « professionnel de la persuasion », position défendue par l’école critique, à laquelle nous ne souscrivons pas</w:t>
-      </w:r>
-      <w:r>
-        <w:t>, car trop simpliste</w:t>
-      </w:r>
-      <w:r>
-        <w:t xml:space="preserve">, </w:t>
-      </w:r>
-      <w:r>
-        <w:t xml:space="preserve">voir </w:t>
-      </w:r>
-      <w:r>
-        <w:t xml:space="preserve">sur ce point </w:t>
-      </w:r>
-      <w:r>
-        <w:t xml:space="preserve">l’analyse de </w:t>
-      </w:r>
-      <w:r>
-        <w:fldChar w:fldCharType="begin"/>
-      </w:r>
-      <w:r>
-        <w:instrText xml:space="preserve"> ADDIN ZOTERO_ITEM CSL_CITATION {"citationID":"ZykYJJKR","properties":{"unsorted":false,"formattedCitation":"(Nikolova &amp; Devinney, 2012)","plainCitation":"(Nikolova &amp; Devinney, 2012)","dontUpdate":true,"noteIndex":0},"citationItems":[{"id":44,"uris":["http://zotero.org/users/12622049/items/GAEFL669"],"itemData":{"id":44,"type":"paper-conference","abstract":"In this paper, we analyse the complex interaction between professional advisors and their clients. Our aim is to summarize and critically review the relevant literature and to outline major directions for future research. There are three competing models that discuss the interaction between professional service providers and their clients: the expert model, the ‘reflective practitioner’ model and the critical model. After reviewing assumptions underlying these approaches as well as their contributions and shortcomings, we suggest that the key problem with these models is that they offer only partial insights into the relationship between clients and professional business service providers. Additionally, they have different epistemological foundations and, as such, they are incompatible. Building upon the existing research and our discussion, we outline the major issues of client-consultant interaction that future research needs to address in order to provide a multifaceted understanding of the client-consultant relationship.","citation-key":"nikolovaNatureClientConsultant2012","DOI":"10.1093/oxfordhb/9780199235049.013.0019","note":"DOI: 10.1093/oxfordhb/9780199235049.013.0019","publisher":"Oxford University Press","source":"Semantic Scholar","title":"The Nature Of Client–Consultant Interaction: A Critical Review","title-short":"The Nature Of Client–Consultant Interaction","URL":"https://academic.oup.com/edited-volume/38572/chapter/334566078","author":[{"family":"Nikolova","given":"Natalia"},{"family":"Devinney","given":"Timothy"}],"accessed":{"date-parts":[["2023",10,7]]},"issued":{"date-parts":[["2012",3,29]]}}}],"schema":"https://github.com/citation-style-language/schema/raw/master/csl-citation.json"} </w:instrText>
-      </w:r>
-      <w:r>
-        <w:fldChar w:fldCharType="separate"/>
-      </w:r>
-      <w:r>
-        <w:rPr>
-          <w:noProof/>
-        </w:rPr>
-        <w:t>Nikolova &amp; Devinney</w:t>
-      </w:r>
-      <w:r>
-        <w:rPr>
-          <w:noProof/>
-        </w:rPr>
-        <w:t xml:space="preserve">, </w:t>
-      </w:r>
-      <w:r>
-        <w:rPr>
-          <w:noProof/>
-        </w:rPr>
-        <w:t>2012)</w:t>
-      </w:r>
-      <w:r>
-        <w:fldChar w:fldCharType="end"/>
-      </w:r>
-      <w:r>
-        <w:t>. Mais celle-ci nécessite un « surcroit de justification » pour être effectivement perçue.</w:t>
-      </w:r>
-      <w:r>
-        <w:t xml:space="preserve">  </w:t>
-      </w:r>
-    </w:p>
-    <w:p>
-      <w:pPr>
-        <w:pStyle w:val="Titre2"/>
-      </w:pPr>
-      <w:bookmarkStart w:id="12" w:name="_Toc228414668"/>
-      <w:r>
-        <w:t>L’IA</w:t>
-      </w:r>
-      <w:r>
-        <w:t xml:space="preserve">, </w:t>
-      </w:r>
-      <w:r>
-        <w:t xml:space="preserve">élément perturbateur de </w:t>
-      </w:r>
-      <w:r>
-        <w:t>l</w:t>
-      </w:r>
-      <w:r>
-        <w:t>’accompliss</w:t>
-      </w:r>
-      <w:r>
-        <w:t>e</w:t>
-      </w:r>
-      <w:r>
-        <w:t>ment social</w:t>
-      </w:r>
-      <w:bookmarkEnd w:id="12"/>
-      <w:r>
-        <w:t xml:space="preserve"> </w:t>
-      </w:r>
-    </w:p>
-    <w:p>
-      <w:pPr>
-        <w:pStyle w:val="doc-paragraph"/>
-      </w:pPr>
-      <w:r>
-        <w:t>Or, l</w:t>
-      </w:r>
-      <w:r>
-        <w:t>’intégration de l’IA dans les pratiques du conseil</w:t>
-      </w:r>
-      <w:r>
-        <w:t>,</w:t>
-      </w:r>
-      <w:r>
-        <w:t xml:space="preserve"> </w:t>
-      </w:r>
-      <w:r>
-        <w:t xml:space="preserve">vient </w:t>
-      </w:r>
-      <w:r>
-        <w:t>perturbe</w:t>
-      </w:r>
-      <w:r>
-        <w:t>r</w:t>
-      </w:r>
-      <w:r>
-        <w:t xml:space="preserve"> dans les deux cas, </w:t>
-      </w:r>
-      <w:r>
-        <w:t>l</w:t>
-      </w:r>
-      <w:r>
-        <w:t xml:space="preserve">e processus à l’œuvre </w:t>
-      </w:r>
-      <w:r>
-        <w:t xml:space="preserve">dans les </w:t>
-      </w:r>
-      <w:r>
-        <w:t>interactions </w:t>
-      </w:r>
-      <w:r>
-        <w:t xml:space="preserve">de </w:t>
-      </w:r>
-      <w:proofErr w:type="spellStart"/>
-      <w:r>
-        <w:t>co-création</w:t>
-      </w:r>
-      <w:proofErr w:type="spellEnd"/>
-      <w:r>
-        <w:t xml:space="preserve"> </w:t>
-      </w:r>
-      <w:r>
-        <w:t>entre consultant et client</w:t>
-      </w:r>
-      <w:r>
-        <w:t>, et par voie de conséquence, la perception de la valeur pa</w:t>
-      </w:r>
-      <w:r>
-        <w:t>r</w:t>
-      </w:r>
-      <w:r>
-        <w:t xml:space="preserve"> le client</w:t>
-      </w:r>
-      <w:r>
-        <w:t>.</w:t>
-      </w:r>
-    </w:p>
-    <w:p>
-      <w:pPr>
-        <w:pStyle w:val="doc-paragraph"/>
-      </w:pPr>
-      <w:r>
-        <w:t>L</w:t>
-      </w:r>
-      <w:r>
-        <w:t xml:space="preserve">a réalisation des activités </w:t>
-      </w:r>
-      <w:r>
-        <w:t xml:space="preserve">cognitives </w:t>
-      </w:r>
-      <w:r>
-        <w:t>conjointes de résolution du problème</w:t>
-      </w:r>
-      <w:r>
-        <w:t xml:space="preserve"> peut désormais s’appuyer </w:t>
-      </w:r>
-      <w:r>
-        <w:t>sur</w:t>
-      </w:r>
-      <w:r>
-        <w:t xml:space="preserve"> l’IA</w:t>
-      </w:r>
-      <w:r>
-        <w:t xml:space="preserve"> </w:t>
-      </w:r>
-      <w:r>
-        <w:t xml:space="preserve">et moins sur le jugement humain </w:t>
-      </w:r>
-      <w:r>
-        <w:t>(par exemple, automatisa</w:t>
-      </w:r>
-      <w:r>
-        <w:t>tion</w:t>
-      </w:r>
-      <w:r>
-        <w:t xml:space="preserve"> </w:t>
-      </w:r>
-      <w:r>
-        <w:t xml:space="preserve">de </w:t>
-      </w:r>
-      <w:r>
-        <w:t>l’étape de clarification du diagnostic)</w:t>
-      </w:r>
-      <w:r>
-        <w:t xml:space="preserve">. La symétrie de l’interaction consultant-client </w:t>
-      </w:r>
-      <w:r>
-        <w:t xml:space="preserve">devient </w:t>
-      </w:r>
-      <w:r>
-        <w:t>sujette à déstabilisation</w:t>
-      </w:r>
-      <w:r>
-        <w:t>, par le fait du floutage des contributions</w:t>
-      </w:r>
-      <w:r>
-        <w:t xml:space="preserve"> humain-IA</w:t>
-      </w:r>
-      <w:r>
-        <w:t>.</w:t>
-      </w:r>
-      <w:r>
-        <w:t xml:space="preserve"> </w:t>
-      </w:r>
-      <w:r>
-        <w:t xml:space="preserve"> </w:t>
-      </w:r>
-    </w:p>
-    <w:p>
-      <w:pPr>
-        <w:pStyle w:val="doc-paragraph"/>
-      </w:pPr>
-      <w:r>
-        <w:t xml:space="preserve">Il en est de même pour les </w:t>
-      </w:r>
-      <w:r>
-        <w:t xml:space="preserve">pratiques de justification, </w:t>
-      </w:r>
-      <w:r>
-        <w:t xml:space="preserve">non seulement </w:t>
-      </w:r>
-      <w:r>
-        <w:t>à la portée d</w:t>
-      </w:r>
-      <w:r>
-        <w:t>’une automatis</w:t>
-      </w:r>
-      <w:r>
-        <w:t xml:space="preserve">ation </w:t>
-      </w:r>
-      <w:r>
-        <w:t xml:space="preserve">par </w:t>
-      </w:r>
-      <w:r>
-        <w:t xml:space="preserve">l’IA, </w:t>
-      </w:r>
-      <w:r>
-        <w:t>mais aussi rendues floues par l’insécabilité du système humain-IA. Ces pratiques</w:t>
-      </w:r>
-      <w:r>
-        <w:t xml:space="preserve">, dont la logique </w:t>
-      </w:r>
-      <w:r>
-        <w:t xml:space="preserve">nous semble </w:t>
-      </w:r>
-      <w:r>
-        <w:t xml:space="preserve">d’autant </w:t>
-      </w:r>
-      <w:r>
-        <w:t xml:space="preserve">plus pertinente </w:t>
-      </w:r>
-      <w:r>
-        <w:t xml:space="preserve">avec l’IA, </w:t>
-      </w:r>
-      <w:r>
-        <w:t xml:space="preserve">sont </w:t>
-      </w:r>
-      <w:r>
-        <w:t xml:space="preserve">néanmoins </w:t>
-      </w:r>
-      <w:r>
-        <w:t xml:space="preserve">vouées à </w:t>
-      </w:r>
-      <w:r>
-        <w:t>changer de nature</w:t>
-      </w:r>
-      <w:r>
-        <w:t>.</w:t>
-      </w:r>
-      <w:r>
-        <w:t xml:space="preserve"> </w:t>
-      </w:r>
-    </w:p>
-    <w:p>
-      <w:pPr>
-        <w:pStyle w:val="doc-paragraph"/>
-      </w:pPr>
-      <w:r>
-        <w:t xml:space="preserve">Pour le conseil, ce n’est pas </w:t>
-      </w:r>
-      <w:r>
-        <w:t>la finalité</w:t>
-      </w:r>
-      <w:r>
-        <w:t xml:space="preserve"> du processus de </w:t>
-      </w:r>
-      <w:proofErr w:type="spellStart"/>
-      <w:r>
-        <w:t>co-création</w:t>
-      </w:r>
-      <w:proofErr w:type="spellEnd"/>
-      <w:r>
-        <w:t xml:space="preserve"> qui est remis en cause. Il s’agit bien toujours, de produire les connaissances managériales nécessaires au client, pour lui permettre de percevoir la valeur du conseil</w:t>
-      </w:r>
-      <w:r>
-        <w:t xml:space="preserve"> vis-à-vis de ses propres problématiques</w:t>
-      </w:r>
-      <w:r>
-        <w:t xml:space="preserve">. Simplement, la </w:t>
-      </w:r>
-      <w:r>
-        <w:t xml:space="preserve">nature du processus, autrement dit, la </w:t>
-      </w:r>
-      <w:r>
-        <w:t>manière d’y arriver</w:t>
-      </w:r>
-      <w:r>
-        <w:t>,</w:t>
-      </w:r>
-      <w:r>
-        <w:t xml:space="preserve"> diffère à l’ère de l’IA</w:t>
-      </w:r>
-      <w:r>
-        <w:t>.</w:t>
-      </w:r>
-      <w:r>
-        <w:t xml:space="preserve"> </w:t>
-      </w:r>
-      <w:r>
-        <w:t>L</w:t>
-      </w:r>
-      <w:r>
-        <w:t xml:space="preserve">a </w:t>
-      </w:r>
-      <w:proofErr w:type="spellStart"/>
-      <w:r>
-        <w:t>co-création</w:t>
-      </w:r>
-      <w:proofErr w:type="spellEnd"/>
-      <w:r>
-        <w:t xml:space="preserve">, </w:t>
-      </w:r>
-      <w:r>
-        <w:t xml:space="preserve">source </w:t>
-      </w:r>
-      <w:r>
-        <w:t xml:space="preserve">de </w:t>
-      </w:r>
-      <w:r>
-        <w:t>la</w:t>
-      </w:r>
-      <w:r>
-        <w:t xml:space="preserve"> </w:t>
-      </w:r>
-      <w:r>
-        <w:t>valeur perçue</w:t>
-      </w:r>
-      <w:r>
-        <w:t xml:space="preserve">, </w:t>
-      </w:r>
-      <w:r>
-        <w:t xml:space="preserve">est en </w:t>
-      </w:r>
-      <w:r>
-        <w:t>voie</w:t>
-      </w:r>
-      <w:r>
-        <w:t xml:space="preserve"> de </w:t>
-      </w:r>
-      <w:r>
-        <w:t>reconfigur</w:t>
-      </w:r>
-      <w:r>
-        <w:t>ation</w:t>
-      </w:r>
-      <w:r>
-        <w:t>.</w:t>
-      </w:r>
-      <w:r>
-        <w:t xml:space="preserve"> </w:t>
-      </w:r>
-    </w:p>
-    <w:p>
-      <w:pPr>
-        <w:pStyle w:val="doc-paragraph"/>
-      </w:pPr>
-      <w:r>
-        <w:t>L’enjeu nous semble suffisamment d’importance : q</w:t>
-      </w:r>
-      <w:r>
-        <w:t xml:space="preserve">uelle est </w:t>
-      </w:r>
-      <w:r>
-        <w:t xml:space="preserve">la </w:t>
-      </w:r>
-      <w:r>
-        <w:t>dynamique de reconfiguration</w:t>
-      </w:r>
-      <w:r>
-        <w:t xml:space="preserve"> à l’</w:t>
-      </w:r>
-      <w:r>
-        <w:t>œuvre</w:t>
-      </w:r>
-      <w:r>
-        <w:t xml:space="preserve">, </w:t>
-      </w:r>
-      <w:r>
-        <w:t xml:space="preserve">pour la valeur perçue du </w:t>
-      </w:r>
-      <w:r>
-        <w:t>conseil à l’ère de l’IA</w:t>
-      </w:r>
-      <w:r>
-        <w:t>, et sous quelles conditions</w:t>
-      </w:r>
-      <w:r>
-        <w:t> </w:t>
-      </w:r>
-      <w:r>
-        <w:t xml:space="preserve">se renforce-t-elle plutôt qu’elle ne se fragilise </w:t>
-      </w:r>
-      <w:r>
-        <w:t>?</w:t>
-      </w:r>
-      <w:r>
-        <w:t xml:space="preserve"> </w:t>
-      </w:r>
     </w:p>
     <w:p>
       <w:pPr>
         <w:pStyle w:val="Titre1"/>
       </w:pPr>
-      <w:bookmarkStart w:id="13" w:name="_Toc228414669"/>
+      <w:bookmarkStart w:id="14" w:name="_Toc228416866"/>
       <w:r>
         <w:t xml:space="preserve">3. </w:t>
       </w:r>
@@ -9963,7 +9800,7 @@
       <w:r>
         <w:t>ADRE PROPOSITIONNEL</w:t>
       </w:r>
-      <w:bookmarkEnd w:id="13"/>
+      <w:bookmarkEnd w:id="14"/>
     </w:p>
     <w:p>
       <w:pPr>
@@ -10071,15 +9908,14 @@
       <w:pPr>
         <w:pStyle w:val="Titre2"/>
       </w:pPr>
-      <w:bookmarkStart w:id="14" w:name="_Toc228414670"/>
+      <w:bookmarkStart w:id="15" w:name="_Toc228416867"/>
       <w:r>
         <w:t>P1 — Reconfiguration multidimensionnelle de la valeur perçue</w:t>
       </w:r>
-      <w:bookmarkEnd w:id="14"/>
-    </w:p>
-    <w:p>
-      <w:r>
-        <w:lastRenderedPageBreak/>
+      <w:bookmarkEnd w:id="15"/>
+    </w:p>
+    <w:p>
+      <w:r>
         <w:t xml:space="preserve">L'intégration de l'IA dans les missions de conseil reconfigure la valeur perçue par le client selon trois dimensions interdépendantes — </w:t>
       </w:r>
       <w:r>
@@ -10123,6 +9959,7 @@
     </w:p>
     <w:p>
       <w:r>
+        <w:lastRenderedPageBreak/>
         <w:t xml:space="preserve">La dimension politique des missions de conseil n'est pas vue comme une quatrième dimension de la valeur perçue, mais comme contexte dans lequel la lisibilité, l'attribution et l'appropriation des connaissances managériales </w:t>
       </w:r>
       <w:proofErr w:type="spellStart"/>
@@ -10143,7 +9980,7 @@
       <w:pPr>
         <w:pStyle w:val="Titre2"/>
       </w:pPr>
-      <w:bookmarkStart w:id="15" w:name="_Toc228414671"/>
+      <w:bookmarkStart w:id="16" w:name="_Toc228416868"/>
       <w:r>
         <w:t>D</w:t>
       </w:r>
@@ -10186,7 +10023,7 @@
       <w:r>
         <w:t>(à vérifier)</w:t>
       </w:r>
-      <w:bookmarkEnd w:id="15"/>
+      <w:bookmarkEnd w:id="16"/>
     </w:p>
     <w:p>
       <w:r>
@@ -10346,7 +10183,7 @@
       <w:pPr>
         <w:pStyle w:val="Titre3"/>
       </w:pPr>
-      <w:bookmarkStart w:id="16" w:name="_Toc228414672"/>
+      <w:bookmarkStart w:id="17" w:name="_Toc228416869"/>
       <w:r>
         <w:rPr>
           <w:rStyle w:val="lev"/>
@@ -10356,11 +10193,10 @@
         </w:rPr>
         <w:t>R — Relationnelle</w:t>
       </w:r>
-      <w:bookmarkEnd w:id="16"/>
-    </w:p>
-    <w:p>
-      <w:r>
-        <w:lastRenderedPageBreak/>
+      <w:bookmarkEnd w:id="17"/>
+    </w:p>
+    <w:p>
+      <w:r>
         <w:t>Confiance</w:t>
       </w:r>
       <w:r>
@@ -10386,7 +10222,7 @@
           <w:color w:val="4472C4" w:themeColor="accent1"/>
         </w:rPr>
       </w:pPr>
-      <w:bookmarkStart w:id="17" w:name="_Toc228414673"/>
+      <w:bookmarkStart w:id="18" w:name="_Toc228416870"/>
       <w:r>
         <w:rPr>
           <w:rStyle w:val="lev"/>
@@ -10396,10 +10232,11 @@
         </w:rPr>
         <w:t>P — Processuelle</w:t>
       </w:r>
-      <w:bookmarkEnd w:id="17"/>
-    </w:p>
-    <w:p>
-      <w:r>
+      <w:bookmarkEnd w:id="18"/>
+    </w:p>
+    <w:p>
+      <w:r>
+        <w:lastRenderedPageBreak/>
         <w:t xml:space="preserve">L'expérience même de </w:t>
       </w:r>
       <w:proofErr w:type="spellStart"/>
@@ -10428,7 +10265,7 @@
           <w:color w:val="4472C4" w:themeColor="accent1"/>
         </w:rPr>
       </w:pPr>
-      <w:bookmarkStart w:id="18" w:name="_Toc228414674"/>
+      <w:bookmarkStart w:id="19" w:name="_Toc228416871"/>
       <w:r>
         <w:rPr>
           <w:rStyle w:val="lev"/>
@@ -10438,7 +10275,7 @@
         </w:rPr>
         <w:t>C — Cognitive</w:t>
       </w:r>
-      <w:bookmarkEnd w:id="18"/>
+      <w:bookmarkEnd w:id="19"/>
     </w:p>
     <w:p>
       <w:r>
@@ -10718,7 +10555,7 @@
       <w:pPr>
         <w:pStyle w:val="Titre3"/>
       </w:pPr>
-      <w:bookmarkStart w:id="19" w:name="_Toc228414675"/>
+      <w:bookmarkStart w:id="20" w:name="_Toc228416872"/>
       <w:r>
         <w:t xml:space="preserve">Comment l'IA reconfigure </w:t>
       </w:r>
@@ -10743,7 +10580,7 @@
       <w:r>
         <w:t>)</w:t>
       </w:r>
-      <w:bookmarkEnd w:id="19"/>
+      <w:bookmarkEnd w:id="20"/>
     </w:p>
     <w:tbl>
       <w:tblPr>
@@ -11052,7 +10889,7 @@
                 <w:sz w:val="18"/>
                 <w:szCs w:val="18"/>
               </w:rPr>
-              <w:t xml:space="preserve"> visible avec l'IA enrichit la diversité et la </w:t>
+              <w:t xml:space="preserve"> visible avec l'IA enrichit la diversité et la nouveauté des insights (C₁ appropriation, C₂ création) lorsque le client est cognitivement engagé. Réciproquement, l'appropriation et la création de connaissances </w:t>
             </w:r>
             <w:r>
               <w:rPr>
@@ -11061,7 +10898,7 @@
                 <w:szCs w:val="18"/>
               </w:rPr>
               <w:lastRenderedPageBreak/>
-              <w:t>nouveauté des insights (C₁ appropriation, C₂ création) lorsque le client est cognitivement engagé. Réciproquement, l'appropriation et la création de connaissances nourrissent l'engagement dans la suite de la mission.</w:t>
+              <w:t>nourrissent l'engagement dans la suite de la mission.</w:t>
             </w:r>
           </w:p>
         </w:tc>
@@ -11086,16 +10923,7 @@
                 <w:szCs w:val="18"/>
               </w:rPr>
               <w:lastRenderedPageBreak/>
-              <w:t xml:space="preserve">L'IA peut découpler la connaissance de la co-production : </w:t>
-            </w:r>
-            <w:r>
-              <w:rPr>
-                <w:color w:val="000000"/>
-                <w:sz w:val="18"/>
-                <w:szCs w:val="18"/>
-              </w:rPr>
-              <w:lastRenderedPageBreak/>
-              <w:t>le client reçoit des outputs sans participer à leur génération, ce qui inhibe l'appropriation (C₁) et empêche la création de connaissances tacites (C₂).</w:t>
+              <w:t>L'IA peut découpler la connaissance de la co-production : le client reçoit des outputs sans participer à leur génération, ce qui inhibe l'appropriation (C₁) et empêche la création de connaissances tacites (C₂).</w:t>
             </w:r>
           </w:p>
         </w:tc>
@@ -11119,17 +10947,7 @@
                 <w:sz w:val="18"/>
                 <w:szCs w:val="18"/>
               </w:rPr>
-              <w:lastRenderedPageBreak/>
-              <w:t xml:space="preserve">Dépend de l'explicitation substantive du consultant (P2) </w:t>
-            </w:r>
-            <w:r>
-              <w:rPr>
-                <w:color w:val="000000"/>
-                <w:sz w:val="18"/>
-                <w:szCs w:val="18"/>
-              </w:rPr>
-              <w:lastRenderedPageBreak/>
-              <w:t>et, via P3, de l'intelligibilité, de l'acceptation et des conditions situationnelles.</w:t>
+              <w:t>Dépend de l'explicitation substantive du consultant (P2) et, via P3, de l'intelligibilité, de l'acceptation et des conditions situationnelles.</w:t>
             </w:r>
           </w:p>
         </w:tc>
@@ -11164,7 +10982,6 @@
                 <w:sz w:val="18"/>
                 <w:szCs w:val="18"/>
               </w:rPr>
-              <w:lastRenderedPageBreak/>
               <w:t>R</w:t>
             </w:r>
             <w:r>
@@ -11307,11 +11124,11 @@
       <w:pPr>
         <w:pStyle w:val="Titre2"/>
       </w:pPr>
-      <w:bookmarkStart w:id="20" w:name="_Toc228414676"/>
+      <w:bookmarkStart w:id="21" w:name="_Toc228416873"/>
       <w:r>
         <w:t>P2 — La transparence comme mécanisme médiateur</w:t>
       </w:r>
-      <w:bookmarkEnd w:id="20"/>
+      <w:bookmarkEnd w:id="21"/>
     </w:p>
     <w:p>
       <w:r>
@@ -11408,7 +11225,7 @@
       <w:pPr>
         <w:pStyle w:val="Titre2"/>
       </w:pPr>
-      <w:bookmarkStart w:id="21" w:name="_Toc228414677"/>
+      <w:bookmarkStart w:id="22" w:name="_Toc228416874"/>
       <w:r>
         <w:t xml:space="preserve">P3 — </w:t>
       </w:r>
@@ -11424,7 +11241,7 @@
       <w:r>
         <w:t>onditions de modération</w:t>
       </w:r>
-      <w:bookmarkEnd w:id="21"/>
+      <w:bookmarkEnd w:id="22"/>
     </w:p>
     <w:p>
       <w:r>
@@ -11630,15 +11447,15 @@
           <w:b/>
           <w:bCs/>
         </w:rPr>
+        <w:t>au niveau de l’acteur</w:t>
+      </w:r>
+      <w:r>
+        <w:t>, non parce qu’elles épuisent le phénomène, mais parce qu’elles constituent, à l’ère de l’IA, le foyer théoriquement le plus distinctif et le plus accessible dans un design qualitatif de cas exemplaire unique, tel que nous le prévoyons.</w:t>
+      </w:r>
+    </w:p>
+    <w:p>
+      <w:r>
         <w:lastRenderedPageBreak/>
-        <w:t>au niveau de l’acteur</w:t>
-      </w:r>
-      <w:r>
-        <w:t>, non parce qu’elles épuisent le phénomène, mais parce qu’elles constituent, à l’ère de l’IA, le foyer théoriquement le plus distinctif et le plus accessible dans un design qualitatif de cas exemplaire unique, tel que nous le prévoyons.</w:t>
-      </w:r>
-    </w:p>
-    <w:p>
-      <w:r>
         <w:t>La littératie IA (variable de compétence) et l'aversion à l’algorithme (variable attitudinale) sont distinctes : un client peut être ‘AI-</w:t>
       </w:r>
       <w:proofErr w:type="spellStart"/>
@@ -11719,7 +11536,7 @@
       <w:pPr>
         <w:pStyle w:val="Titre1"/>
       </w:pPr>
-      <w:bookmarkStart w:id="22" w:name="_Toc228414678"/>
+      <w:bookmarkStart w:id="23" w:name="_Toc228416875"/>
       <w:r>
         <w:lastRenderedPageBreak/>
         <w:t>4</w:t>
@@ -11727,7 +11544,7 @@
       <w:r>
         <w:t>. CADRE D'OBSERVATION</w:t>
       </w:r>
-      <w:bookmarkEnd w:id="22"/>
+      <w:bookmarkEnd w:id="23"/>
     </w:p>
     <w:p>
       <w:pPr>
@@ -11736,7 +11553,7 @@
           <w:rFonts w:eastAsia="Times New Roman"/>
         </w:rPr>
       </w:pPr>
-      <w:bookmarkStart w:id="23" w:name="_Toc228414679"/>
+      <w:bookmarkStart w:id="24" w:name="_Toc228416876"/>
       <w:r>
         <w:rPr>
           <w:rFonts w:eastAsia="Times New Roman"/>
@@ -11763,7 +11580,7 @@
         </w:rPr>
         <w:t> : S1, S2, S3</w:t>
       </w:r>
-      <w:bookmarkEnd w:id="23"/>
+      <w:bookmarkEnd w:id="24"/>
     </w:p>
     <w:p>
       <w:r>
@@ -12050,8 +11867,8 @@
         <w:pStyle w:val="figure-title"/>
         <w:divId w:val="118577035"/>
       </w:pPr>
-      <w:commentRangeStart w:id="24"/>
       <w:commentRangeStart w:id="25"/>
+      <w:commentRangeStart w:id="26"/>
       <w:r>
         <w:rPr>
           <w:noProof/>
@@ -12092,7 +11909,7 @@
           </wp:inline>
         </w:drawing>
       </w:r>
-      <w:commentRangeEnd w:id="24"/>
+      <w:commentRangeEnd w:id="25"/>
       <w:r>
         <w:rPr>
           <w:rStyle w:val="Marquedecommentaire"/>
@@ -12102,9 +11919,9 @@
           <w:color w:val="auto"/>
           <w:spacing w:val="0"/>
         </w:rPr>
-        <w:commentReference w:id="24"/>
-      </w:r>
-      <w:commentRangeEnd w:id="25"/>
+        <w:commentReference w:id="25"/>
+      </w:r>
+      <w:commentRangeEnd w:id="26"/>
       <w:r>
         <w:rPr>
           <w:rStyle w:val="Marquedecommentaire"/>
@@ -12114,7 +11931,7 @@
           <w:color w:val="auto"/>
           <w:spacing w:val="0"/>
         </w:rPr>
-        <w:commentReference w:id="25"/>
+        <w:commentReference w:id="26"/>
       </w:r>
     </w:p>
     <w:p>
@@ -12285,14 +12102,14 @@
           <w:rFonts w:eastAsia="Times New Roman"/>
         </w:rPr>
       </w:pPr>
-      <w:bookmarkStart w:id="26" w:name="_Toc228414680"/>
+      <w:bookmarkStart w:id="27" w:name="_Toc228416877"/>
       <w:r>
         <w:rPr>
           <w:rFonts w:eastAsia="Times New Roman"/>
         </w:rPr>
         <w:t>Situations et observables</w:t>
       </w:r>
-      <w:bookmarkEnd w:id="26"/>
+      <w:bookmarkEnd w:id="27"/>
     </w:p>
     <w:p>
       <w:pPr>
@@ -12301,14 +12118,14 @@
           <w:rFonts w:eastAsia="Times New Roman"/>
         </w:rPr>
       </w:pPr>
-      <w:bookmarkStart w:id="27" w:name="_Toc228414681"/>
+      <w:bookmarkStart w:id="28" w:name="_Toc228416878"/>
       <w:r>
         <w:rPr>
           <w:rFonts w:eastAsia="Times New Roman"/>
         </w:rPr>
         <w:t>S1 — Sans IA</w:t>
       </w:r>
-      <w:bookmarkEnd w:id="27"/>
+      <w:bookmarkEnd w:id="28"/>
     </w:p>
     <w:p>
       <w:r>
@@ -12413,14 +12230,14 @@
           <w:color w:val="4A4038"/>
         </w:rPr>
       </w:pPr>
-      <w:bookmarkStart w:id="28" w:name="_Toc228414682"/>
+      <w:bookmarkStart w:id="29" w:name="_Toc228416879"/>
       <w:r>
         <w:rPr>
           <w:rFonts w:eastAsia="Times New Roman"/>
         </w:rPr>
         <w:t>S2 — IA en silo</w:t>
       </w:r>
-      <w:bookmarkEnd w:id="28"/>
+      <w:bookmarkEnd w:id="29"/>
     </w:p>
     <w:p>
       <w:r>
@@ -12504,7 +12321,7 @@
           <w:color w:val="4A4038"/>
         </w:rPr>
       </w:pPr>
-      <w:bookmarkStart w:id="29" w:name="_Toc228414683"/>
+      <w:bookmarkStart w:id="30" w:name="_Toc228416880"/>
       <w:r>
         <w:rPr>
           <w:rFonts w:eastAsia="Times New Roman"/>
@@ -12525,7 +12342,7 @@
         </w:rPr>
         <w:t xml:space="preserve"> tripartite</w:t>
       </w:r>
-      <w:bookmarkEnd w:id="29"/>
+      <w:bookmarkEnd w:id="30"/>
     </w:p>
     <w:p>
       <w:pPr>
@@ -12641,19 +12458,9 @@
     </w:p>
     <w:p>
       <w:pPr>
-        <w:spacing w:before="0"/>
-        <w:jc w:val="left"/>
-      </w:pPr>
-      <w:r>
-        <w:lastRenderedPageBreak/>
-        <w:br w:type="page"/>
-      </w:r>
-    </w:p>
-    <w:p>
-      <w:pPr>
         <w:pStyle w:val="Titre1"/>
       </w:pPr>
-      <w:bookmarkStart w:id="30" w:name="_Toc228414684"/>
+      <w:bookmarkStart w:id="31" w:name="_Toc228416881"/>
       <w:r>
         <w:lastRenderedPageBreak/>
         <w:t xml:space="preserve">5. </w:t>
@@ -12664,17 +12471,17 @@
       <w:r>
         <w:t>OSTURE DU CHERCHEUR ET DESIGN DE LA RECHERCHE</w:t>
       </w:r>
-      <w:bookmarkEnd w:id="30"/>
+      <w:bookmarkEnd w:id="31"/>
     </w:p>
     <w:p>
       <w:pPr>
         <w:pStyle w:val="Titre2"/>
       </w:pPr>
-      <w:bookmarkStart w:id="31" w:name="_Toc228414685"/>
+      <w:bookmarkStart w:id="32" w:name="_Toc228416882"/>
       <w:r>
         <w:t>Un design d'étude de cas exemplaire en grandeur réelle</w:t>
       </w:r>
-      <w:bookmarkEnd w:id="31"/>
+      <w:bookmarkEnd w:id="32"/>
     </w:p>
     <w:p>
       <w:pPr>
@@ -12793,11 +12600,11 @@
       <w:pPr>
         <w:pStyle w:val="Titre2"/>
       </w:pPr>
-      <w:bookmarkStart w:id="32" w:name="_Toc228414686"/>
+      <w:bookmarkStart w:id="33" w:name="_Toc228416883"/>
       <w:r>
         <w:t>Une posture de praticien-chercheur explicitement assumée</w:t>
       </w:r>
-      <w:bookmarkEnd w:id="32"/>
+      <w:bookmarkEnd w:id="33"/>
       <w:r>
         <w:t xml:space="preserve"> </w:t>
       </w:r>
@@ -13043,11 +12850,11 @@
       <w:pPr>
         <w:pStyle w:val="Titre2"/>
       </w:pPr>
-      <w:bookmarkStart w:id="33" w:name="_Toc228414687"/>
+      <w:bookmarkStart w:id="34" w:name="_Toc228416884"/>
       <w:r>
         <w:t>Un dispositif de réflexivité renforcé pour répondre au risque de biais</w:t>
       </w:r>
-      <w:bookmarkEnd w:id="33"/>
+      <w:bookmarkEnd w:id="34"/>
       <w:r>
         <w:t xml:space="preserve"> </w:t>
       </w:r>
@@ -13122,7 +12929,7 @@
       <w:pPr>
         <w:pStyle w:val="Titre1"/>
       </w:pPr>
-      <w:bookmarkStart w:id="34" w:name="_Toc228414688"/>
+      <w:bookmarkStart w:id="35" w:name="_Toc228416885"/>
       <w:r>
         <w:lastRenderedPageBreak/>
         <w:t>6</w:t>
@@ -13130,7 +12937,7 @@
       <w:r>
         <w:t>. ILLUSTRATION</w:t>
       </w:r>
-      <w:bookmarkEnd w:id="34"/>
+      <w:bookmarkEnd w:id="35"/>
     </w:p>
     <w:p>
       <w:pPr>
@@ -13139,7 +12946,7 @@
           <w:rFonts w:eastAsia="Times New Roman"/>
         </w:rPr>
       </w:pPr>
-      <w:bookmarkStart w:id="35" w:name="_Toc228414689"/>
+      <w:bookmarkStart w:id="36" w:name="_Toc228416886"/>
       <w:r>
         <w:rPr>
           <w:rFonts w:eastAsia="Times New Roman"/>
@@ -13152,7 +12959,7 @@
         </w:rPr>
         <w:t xml:space="preserve"> sur 10 semaines</w:t>
       </w:r>
-      <w:bookmarkEnd w:id="35"/>
+      <w:bookmarkEnd w:id="36"/>
     </w:p>
     <w:p>
       <w:r>
@@ -13363,7 +13170,7 @@
           <w:rFonts w:eastAsia="Times New Roman"/>
         </w:rPr>
       </w:pPr>
-      <w:bookmarkStart w:id="36" w:name="_Toc228414690"/>
+      <w:bookmarkStart w:id="37" w:name="_Toc228416887"/>
       <w:r>
         <w:rPr>
           <w:rFonts w:eastAsia="Times New Roman"/>
@@ -13388,7 +13195,7 @@
         </w:rPr>
         <w:t xml:space="preserve"> fictive de conseil</w:t>
       </w:r>
-      <w:bookmarkEnd w:id="36"/>
+      <w:bookmarkEnd w:id="37"/>
     </w:p>
     <w:p>
       <w:r>
@@ -13401,7 +13208,7 @@
             <wp:extent cx="4488325" cy="2979487"/>
             <wp:effectExtent l="0" t="0" r="0" b="5080"/>
             <wp:docPr id="541714034" name="Image 1">
-              <a:hlinkClick xmlns:a="http://schemas.openxmlformats.org/drawingml/2006/main" r:id="rId7"/>
+              <a:hlinkClick xmlns:a="http://schemas.openxmlformats.org/drawingml/2006/main" r:id="rId15"/>
             </wp:docPr>
             <wp:cNvGraphicFramePr>
               <a:graphicFrameLocks xmlns:a="http://schemas.openxmlformats.org/drawingml/2006/main" noChangeAspect="1"/>
@@ -13411,7 +13218,7 @@
                 <pic:pic xmlns:pic="http://schemas.openxmlformats.org/drawingml/2006/picture">
                   <pic:nvPicPr>
                     <pic:cNvPr id="541714034" name="Image 1">
-                      <a:hlinkClick r:id="rId7"/>
+                      <a:hlinkClick r:id="rId15"/>
                     </pic:cNvPr>
                     <pic:cNvPicPr/>
                   </pic:nvPicPr>
@@ -13482,7 +13289,7 @@
           <w:color w:val="4472C4" w:themeColor="accent1"/>
         </w:rPr>
       </w:pPr>
-      <w:bookmarkStart w:id="37" w:name="_Toc228414691"/>
+      <w:bookmarkStart w:id="38" w:name="_Toc228416888"/>
       <w:r>
         <w:rPr>
           <w:rStyle w:val="lev"/>
@@ -13501,7 +13308,7 @@
         </w:rPr>
         <w:t>– Sem. 1-3</w:t>
       </w:r>
-      <w:bookmarkEnd w:id="37"/>
+      <w:bookmarkEnd w:id="38"/>
     </w:p>
     <w:p>
       <w:r>
@@ -13851,7 +13658,7 @@
           <w:color w:val="4472C4" w:themeColor="accent1"/>
         </w:rPr>
       </w:pPr>
-      <w:bookmarkStart w:id="38" w:name="_Toc228414692"/>
+      <w:bookmarkStart w:id="39" w:name="_Toc228416889"/>
       <w:r>
         <w:rPr>
           <w:rStyle w:val="lev"/>
@@ -13879,7 +13686,7 @@
         </w:rPr>
         <w:t>Analyse – Sem. 4-9</w:t>
       </w:r>
-      <w:bookmarkEnd w:id="38"/>
+      <w:bookmarkEnd w:id="39"/>
     </w:p>
     <w:p>
       <w:pPr>
@@ -14370,7 +14177,7 @@
           <w:color w:val="4472C4" w:themeColor="accent1"/>
         </w:rPr>
       </w:pPr>
-      <w:bookmarkStart w:id="39" w:name="_Toc228414693"/>
+      <w:bookmarkStart w:id="40" w:name="_Toc228416890"/>
       <w:r>
         <w:rPr>
           <w:rStyle w:val="lev"/>
@@ -14380,7 +14187,7 @@
         </w:rPr>
         <w:t>3. Recommandations — Sem. 10</w:t>
       </w:r>
-      <w:bookmarkEnd w:id="39"/>
+      <w:bookmarkEnd w:id="40"/>
     </w:p>
     <w:p>
       <w:pPr>
@@ -14542,7 +14349,7 @@
           <w:color w:val="4472C4" w:themeColor="accent1"/>
         </w:rPr>
       </w:pPr>
-      <w:bookmarkStart w:id="40" w:name="_Toc228414694"/>
+      <w:bookmarkStart w:id="41" w:name="_Toc228416891"/>
       <w:r>
         <w:rPr>
           <w:rStyle w:val="lev"/>
@@ -14552,7 +14359,7 @@
         </w:rPr>
         <w:t>4. Rétrospective — Post</w:t>
       </w:r>
-      <w:bookmarkEnd w:id="40"/>
+      <w:bookmarkEnd w:id="41"/>
     </w:p>
     <w:p>
       <w:pPr>
@@ -14717,12 +14524,12 @@
         <w:pStyle w:val="Titre1"/>
         <w:divId w:val="491409308"/>
       </w:pPr>
-      <w:bookmarkStart w:id="41" w:name="_Toc228414695"/>
+      <w:bookmarkStart w:id="42" w:name="_Toc228416892"/>
       <w:r>
         <w:lastRenderedPageBreak/>
         <w:t>BIBLIOGRAPHIE</w:t>
       </w:r>
-      <w:bookmarkEnd w:id="41"/>
+      <w:bookmarkEnd w:id="42"/>
     </w:p>
     <w:p>
       <w:pPr>
@@ -18675,7 +18482,7 @@
 
 <file path=word/comments.xml><?xml version="1.0" encoding="utf-8"?>
 <w:comments xmlns:wpc="http://schemas.microsoft.com/office/word/2010/wordprocessingCanvas" xmlns:cx="http://schemas.microsoft.com/office/drawing/2014/chartex" xmlns:cx1="http://schemas.microsoft.com/office/drawing/2015/9/8/chartex" xmlns:cx2="http://schemas.microsoft.com/office/drawing/2015/10/21/chartex" xmlns:cx3="http://schemas.microsoft.com/office/drawing/2016/5/9/chartex" xmlns:cx4="http://schemas.microsoft.com/office/drawing/2016/5/10/chartex" xmlns:cx5="http://schemas.microsoft.com/office/drawing/2016/5/11/chartex" xmlns:cx6="http://schemas.microsoft.com/office/drawing/2016/5/12/chartex" xmlns:cx7="http://schemas.microsoft.com/office/drawing/2016/5/13/chartex" xmlns:cx8="http://schemas.microsoft.com/office/drawing/2016/5/14/chartex" xmlns:mc="http://schemas.openxmlformats.org/markup-compatibility/2006" xmlns:aink="http://schemas.microsoft.com/office/drawing/2016/ink" xmlns:am3d="http://schemas.microsoft.com/office/drawing/2017/model3d" xmlns:o="urn:schemas-microsoft-com:office:office" xmlns:oel="http://schemas.microsoft.com/office/2019/extlst" xmlns:r="http://schemas.openxmlformats.org/officeDocument/2006/relationships" xmlns:m="http://schemas.openxmlformats.org/officeDocument/2006/math" xmlns:v="urn:schemas-microsoft-com:vml" xmlns:wp14="http://schemas.microsoft.com/office/word/2010/wordprocessingDrawing" xmlns:wp="http://schemas.openxmlformats.org/drawingml/2006/wordprocessingDrawing" xmlns:w10="urn:schemas-microsoft-com:office:word" xmlns:w="http://schemas.openxmlformats.org/wordprocessingml/2006/main" xmlns:w14="http://schemas.microsoft.com/office/word/2010/wordml" xmlns:w15="http://schemas.microsoft.com/office/word/2012/wordml" xmlns:w16cex="http://schemas.microsoft.com/office/word/2018/wordml/cex" xmlns:w16cid="http://schemas.microsoft.com/office/word/2016/wordml/cid" xmlns:w16="http://schemas.microsoft.com/office/word/2018/wordml" xmlns:w16sdtdh="http://schemas.microsoft.com/office/word/2020/wordml/sdtdatahash" xmlns:w16se="http://schemas.microsoft.com/office/word/2015/wordml/symex" xmlns:wpg="http://schemas.microsoft.com/office/word/2010/wordprocessingGroup" xmlns:wpi="http://schemas.microsoft.com/office/word/2010/wordprocessingInk" xmlns:wne="http://schemas.microsoft.com/office/word/2006/wordml" xmlns:wps="http://schemas.microsoft.com/office/word/2010/wordprocessingShape" mc:Ignorable="w14 w15 w16se w16cid w16 w16cex w16sdtdh wp14">
-  <w:comment w:id="24" w:author="Clement Yunes" w:date="2026-04-30T02:51:00Z" w:initials="CY">
+  <w:comment w:id="25" w:author="Clement Yunes" w:date="2026-04-30T02:51:00Z" w:initials="CY">
     <w:p>
       <w:pPr>
         <w:pStyle w:val="Commentaire"/>
@@ -18688,7 +18495,7 @@
       </w:r>
     </w:p>
   </w:comment>
-  <w:comment w:id="25" w:author="Clement Yunes" w:date="2026-04-30T02:51:00Z" w:initials="CY">
+  <w:comment w:id="26" w:author="Clement Yunes" w:date="2026-04-30T02:51:00Z" w:initials="CY">
     <w:p>
       <w:pPr>
         <w:pStyle w:val="Commentaire"/>
@@ -20521,7 +20328,7 @@
   <w:style w:type="paragraph" w:default="1" w:styleId="Normal">
     <w:name w:val="Normal"/>
     <w:qFormat/>
-    <w:rsid w:val="00B9429B"/>
+    <w:rsid w:val="006627FE"/>
     <w:pPr>
       <w:spacing w:before="200"/>
       <w:jc w:val="both"/>

</xml_diff>

<commit_message>
Serve original exploratory framework Word document
</commit_message>
<xml_diff>
--- a/docs/DOCUMENT_COMPLEMENTAIRE_CONTENU_FR.docx
+++ b/docs/DOCUMENT_COMPLEMENTAIRE_CONTENU_FR.docx
@@ -1271,7 +1271,21 @@
             <w:rStyle w:val="Lienhypertexte"/>
             <w:noProof/>
           </w:rPr>
-          <w:t>Figure 3 - La transparence substantive (P2), comme variable médiatrice de la valeur perçue du conseil</w:t>
+          <w:t>Figure 3 - La transparence substantive (P2), comme variable médiatric</w:t>
+        </w:r>
+        <w:r>
+          <w:rPr>
+            <w:rStyle w:val="Lienhypertexte"/>
+            <w:noProof/>
+          </w:rPr>
+          <w:t>e</w:t>
+        </w:r>
+        <w:r>
+          <w:rPr>
+            <w:rStyle w:val="Lienhypertexte"/>
+            <w:noProof/>
+          </w:rPr>
+          <w:t xml:space="preserve"> de la valeur perçue du conseil</w:t>
         </w:r>
         <w:r>
           <w:rPr>
@@ -5140,7 +5154,39 @@
           <w:rFonts w:eastAsia="Times New Roman"/>
           <w:szCs w:val="24"/>
         </w:rPr>
-        <w:t>(Grönroos &amp; Voima, 2013)</w:t>
+        <w:t>(</w:t>
+      </w:r>
+      <w:proofErr w:type="spellStart"/>
+      <w:r>
+        <w:rPr>
+          <w:rFonts w:eastAsia="Times New Roman"/>
+          <w:szCs w:val="24"/>
+        </w:rPr>
+        <w:t>Grönroos</w:t>
+      </w:r>
+      <w:proofErr w:type="spellEnd"/>
+      <w:r>
+        <w:rPr>
+          <w:rFonts w:eastAsia="Times New Roman"/>
+          <w:szCs w:val="24"/>
+        </w:rPr>
+        <w:t xml:space="preserve"> &amp; </w:t>
+      </w:r>
+      <w:proofErr w:type="spellStart"/>
+      <w:r>
+        <w:rPr>
+          <w:rFonts w:eastAsia="Times New Roman"/>
+          <w:szCs w:val="24"/>
+        </w:rPr>
+        <w:t>Voima</w:t>
+      </w:r>
+      <w:proofErr w:type="spellEnd"/>
+      <w:r>
+        <w:rPr>
+          <w:rFonts w:eastAsia="Times New Roman"/>
+          <w:szCs w:val="24"/>
+        </w:rPr>
+        <w:t>, 2013)</w:t>
       </w:r>
       <w:r>
         <w:rPr>
@@ -5398,7 +5444,87 @@
           <w:iCs/>
           <w:szCs w:val="24"/>
         </w:rPr>
-        <w:t>(Echeverri &amp; Skålén, 2011; Lumivalo et al., 2024; Plé &amp; Cáceres, 2010)</w:t>
+        <w:t>(</w:t>
+      </w:r>
+      <w:proofErr w:type="spellStart"/>
+      <w:r>
+        <w:rPr>
+          <w:rFonts w:eastAsia="Times New Roman"/>
+          <w:i/>
+          <w:iCs/>
+          <w:szCs w:val="24"/>
+        </w:rPr>
+        <w:t>Echeverri</w:t>
+      </w:r>
+      <w:proofErr w:type="spellEnd"/>
+      <w:r>
+        <w:rPr>
+          <w:rFonts w:eastAsia="Times New Roman"/>
+          <w:i/>
+          <w:iCs/>
+          <w:szCs w:val="24"/>
+        </w:rPr>
+        <w:t xml:space="preserve"> &amp; </w:t>
+      </w:r>
+      <w:proofErr w:type="spellStart"/>
+      <w:r>
+        <w:rPr>
+          <w:rFonts w:eastAsia="Times New Roman"/>
+          <w:i/>
+          <w:iCs/>
+          <w:szCs w:val="24"/>
+        </w:rPr>
+        <w:t>Skålén</w:t>
+      </w:r>
+      <w:proofErr w:type="spellEnd"/>
+      <w:r>
+        <w:rPr>
+          <w:rFonts w:eastAsia="Times New Roman"/>
+          <w:i/>
+          <w:iCs/>
+          <w:szCs w:val="24"/>
+        </w:rPr>
+        <w:t xml:space="preserve">, 2011; </w:t>
+      </w:r>
+      <w:proofErr w:type="spellStart"/>
+      <w:r>
+        <w:rPr>
+          <w:rFonts w:eastAsia="Times New Roman"/>
+          <w:i/>
+          <w:iCs/>
+          <w:szCs w:val="24"/>
+        </w:rPr>
+        <w:t>Lumivalo</w:t>
+      </w:r>
+      <w:proofErr w:type="spellEnd"/>
+      <w:r>
+        <w:rPr>
+          <w:rFonts w:eastAsia="Times New Roman"/>
+          <w:i/>
+          <w:iCs/>
+          <w:szCs w:val="24"/>
+        </w:rPr>
+        <w:t xml:space="preserve"> et al., 2024; </w:t>
+      </w:r>
+      <w:proofErr w:type="spellStart"/>
+      <w:r>
+        <w:rPr>
+          <w:rFonts w:eastAsia="Times New Roman"/>
+          <w:i/>
+          <w:iCs/>
+          <w:szCs w:val="24"/>
+        </w:rPr>
+        <w:t>Plé</w:t>
+      </w:r>
+      <w:proofErr w:type="spellEnd"/>
+      <w:r>
+        <w:rPr>
+          <w:rFonts w:eastAsia="Times New Roman"/>
+          <w:i/>
+          <w:iCs/>
+          <w:szCs w:val="24"/>
+        </w:rPr>
+        <w:t xml:space="preserve"> &amp; Cáceres, 2010)</w:t>
       </w:r>
       <w:r>
         <w:rPr>
@@ -7830,7 +7956,27 @@
           <w:iCs/>
           <w:szCs w:val="24"/>
         </w:rPr>
-        <w:t>(Schön, 1983)</w:t>
+        <w:t>(</w:t>
+      </w:r>
+      <w:proofErr w:type="spellStart"/>
+      <w:r>
+        <w:rPr>
+          <w:rFonts w:eastAsia="Times New Roman"/>
+          <w:i/>
+          <w:iCs/>
+          <w:szCs w:val="24"/>
+        </w:rPr>
+        <w:t>Schön</w:t>
+      </w:r>
+      <w:proofErr w:type="spellEnd"/>
+      <w:r>
+        <w:rPr>
+          <w:rFonts w:eastAsia="Times New Roman"/>
+          <w:i/>
+          <w:iCs/>
+          <w:szCs w:val="24"/>
+        </w:rPr>
+        <w:t>, 1983)</w:t>
       </w:r>
       <w:r>
         <w:rPr>
@@ -8126,7 +8272,27 @@
           <w:iCs/>
           <w:szCs w:val="24"/>
         </w:rPr>
-        <w:t>(Schön, 1983)</w:t>
+        <w:t>(</w:t>
+      </w:r>
+      <w:proofErr w:type="spellStart"/>
+      <w:r>
+        <w:rPr>
+          <w:rFonts w:eastAsia="Times New Roman"/>
+          <w:i/>
+          <w:iCs/>
+          <w:szCs w:val="24"/>
+        </w:rPr>
+        <w:t>Schön</w:t>
+      </w:r>
+      <w:proofErr w:type="spellEnd"/>
+      <w:r>
+        <w:rPr>
+          <w:rFonts w:eastAsia="Times New Roman"/>
+          <w:i/>
+          <w:iCs/>
+          <w:szCs w:val="24"/>
+        </w:rPr>
+        <w:t>, 1983)</w:t>
       </w:r>
       <w:r>
         <w:rPr>
@@ -15622,12 +15788,69 @@
         </w:rPr>
         <w:t xml:space="preserve">: </w:t>
       </w:r>
+      <w:proofErr w:type="spellStart"/>
       <w:r>
         <w:rPr>
           <w:rFonts w:eastAsia="Times New Roman"/>
           <w:szCs w:val="24"/>
         </w:rPr>
-        <w:t>Echeverri &amp; Skålén, 2011; Lumivalo et al., 2024; Plé &amp; Cáceres, 2010)</w:t>
+        <w:t>Echeverri</w:t>
+      </w:r>
+      <w:proofErr w:type="spellEnd"/>
+      <w:r>
+        <w:rPr>
+          <w:rFonts w:eastAsia="Times New Roman"/>
+          <w:szCs w:val="24"/>
+        </w:rPr>
+        <w:t xml:space="preserve"> &amp; </w:t>
+      </w:r>
+      <w:proofErr w:type="spellStart"/>
+      <w:r>
+        <w:rPr>
+          <w:rFonts w:eastAsia="Times New Roman"/>
+          <w:szCs w:val="24"/>
+        </w:rPr>
+        <w:t>Skålén</w:t>
+      </w:r>
+      <w:proofErr w:type="spellEnd"/>
+      <w:r>
+        <w:rPr>
+          <w:rFonts w:eastAsia="Times New Roman"/>
+          <w:szCs w:val="24"/>
+        </w:rPr>
+        <w:t xml:space="preserve">, 2011; </w:t>
+      </w:r>
+      <w:proofErr w:type="spellStart"/>
+      <w:r>
+        <w:rPr>
+          <w:rFonts w:eastAsia="Times New Roman"/>
+          <w:szCs w:val="24"/>
+        </w:rPr>
+        <w:t>Lumivalo</w:t>
+      </w:r>
+      <w:proofErr w:type="spellEnd"/>
+      <w:r>
+        <w:rPr>
+          <w:rFonts w:eastAsia="Times New Roman"/>
+          <w:szCs w:val="24"/>
+        </w:rPr>
+        <w:t xml:space="preserve"> et al., 2024; </w:t>
+      </w:r>
+      <w:proofErr w:type="spellStart"/>
+      <w:r>
+        <w:rPr>
+          <w:rFonts w:eastAsia="Times New Roman"/>
+          <w:szCs w:val="24"/>
+        </w:rPr>
+        <w:t>Plé</w:t>
+      </w:r>
+      <w:proofErr w:type="spellEnd"/>
+      <w:r>
+        <w:rPr>
+          <w:rFonts w:eastAsia="Times New Roman"/>
+          <w:szCs w:val="24"/>
+        </w:rPr>
+        <w:t xml:space="preserve"> &amp; Cáceres, 2010)</w:t>
       </w:r>
       <w:r>
         <w:fldChar w:fldCharType="end"/>
@@ -16621,7 +16844,55 @@
           <w:rFonts w:eastAsia="Times New Roman"/>
           <w:szCs w:val="24"/>
         </w:rPr>
-        <w:t>(Dell’Acqua et al., 2023; Lebovitz et al., 2022; Logg et al., 2019)</w:t>
+        <w:t>(</w:t>
+      </w:r>
+      <w:proofErr w:type="spellStart"/>
+      <w:r>
+        <w:rPr>
+          <w:rFonts w:eastAsia="Times New Roman"/>
+          <w:szCs w:val="24"/>
+        </w:rPr>
+        <w:t>Dell’Acqua</w:t>
+      </w:r>
+      <w:proofErr w:type="spellEnd"/>
+      <w:r>
+        <w:rPr>
+          <w:rFonts w:eastAsia="Times New Roman"/>
+          <w:szCs w:val="24"/>
+        </w:rPr>
+        <w:t xml:space="preserve"> et al., 2023; </w:t>
+      </w:r>
+      <w:proofErr w:type="spellStart"/>
+      <w:r>
+        <w:rPr>
+          <w:rFonts w:eastAsia="Times New Roman"/>
+          <w:szCs w:val="24"/>
+        </w:rPr>
+        <w:t>Lebovitz</w:t>
+      </w:r>
+      <w:proofErr w:type="spellEnd"/>
+      <w:r>
+        <w:rPr>
+          <w:rFonts w:eastAsia="Times New Roman"/>
+          <w:szCs w:val="24"/>
+        </w:rPr>
+        <w:t xml:space="preserve"> et al., 2022; </w:t>
+      </w:r>
+      <w:proofErr w:type="spellStart"/>
+      <w:r>
+        <w:rPr>
+          <w:rFonts w:eastAsia="Times New Roman"/>
+          <w:szCs w:val="24"/>
+        </w:rPr>
+        <w:t>Logg</w:t>
+      </w:r>
+      <w:proofErr w:type="spellEnd"/>
+      <w:r>
+        <w:rPr>
+          <w:rFonts w:eastAsia="Times New Roman"/>
+          <w:szCs w:val="24"/>
+        </w:rPr>
+        <w:t xml:space="preserve"> et al., 2019)</w:t>
       </w:r>
       <w:r>
         <w:rPr>
@@ -18306,7 +18577,23 @@
           <w:rFonts w:eastAsia="Times New Roman"/>
           <w:szCs w:val="24"/>
         </w:rPr>
-        <w:t>(Brynjolfsson et al., 2023; Dell’Acqua et al., 2023)</w:t>
+        <w:t xml:space="preserve">(Brynjolfsson et al., 2023; </w:t>
+      </w:r>
+      <w:proofErr w:type="spellStart"/>
+      <w:r>
+        <w:rPr>
+          <w:rFonts w:eastAsia="Times New Roman"/>
+          <w:szCs w:val="24"/>
+        </w:rPr>
+        <w:t>Dell’Acqua</w:t>
+      </w:r>
+      <w:proofErr w:type="spellEnd"/>
+      <w:r>
+        <w:rPr>
+          <w:rFonts w:eastAsia="Times New Roman"/>
+          <w:szCs w:val="24"/>
+        </w:rPr>
+        <w:t xml:space="preserve"> et al., 2023)</w:t>
       </w:r>
       <w:r>
         <w:rPr>
@@ -18873,7 +19160,23 @@
           <w:rFonts w:eastAsia="Times New Roman"/>
           <w:szCs w:val="24"/>
         </w:rPr>
-        <w:t>(Rivière &amp; Mencarelli, 2012)</w:t>
+        <w:t xml:space="preserve">(Rivière &amp; </w:t>
+      </w:r>
+      <w:proofErr w:type="spellStart"/>
+      <w:r>
+        <w:rPr>
+          <w:rFonts w:eastAsia="Times New Roman"/>
+          <w:szCs w:val="24"/>
+        </w:rPr>
+        <w:t>Mencarelli</w:t>
+      </w:r>
+      <w:proofErr w:type="spellEnd"/>
+      <w:r>
+        <w:rPr>
+          <w:rFonts w:eastAsia="Times New Roman"/>
+          <w:szCs w:val="24"/>
+        </w:rPr>
+        <w:t>, 2012)</w:t>
       </w:r>
       <w:r>
         <w:rPr>
@@ -19193,13 +19496,22 @@
           <w:rFonts w:eastAsia="Times New Roman"/>
           <w:szCs w:val="24"/>
         </w:rPr>
-        <w:t>Rivière &amp; Mencarelli</w:t>
-      </w:r>
+        <w:t xml:space="preserve">Rivière &amp; </w:t>
+      </w:r>
+      <w:proofErr w:type="spellStart"/>
       <w:r>
         <w:rPr>
           <w:rFonts w:eastAsia="Times New Roman"/>
           <w:szCs w:val="24"/>
         </w:rPr>
+        <w:t>Mencarelli</w:t>
+      </w:r>
+      <w:proofErr w:type="spellEnd"/>
+      <w:r>
+        <w:rPr>
+          <w:rFonts w:eastAsia="Times New Roman"/>
+          <w:szCs w:val="24"/>
+        </w:rPr>
         <w:t xml:space="preserve"> (</w:t>
       </w:r>
       <w:r>
@@ -19330,13 +19642,29 @@
           <w:rFonts w:eastAsia="Times New Roman"/>
           <w:szCs w:val="24"/>
         </w:rPr>
-        <w:t>(Rivière &amp; Mencarelli, 2012</w:t>
-      </w:r>
+        <w:t xml:space="preserve">(Rivière &amp; </w:t>
+      </w:r>
+      <w:proofErr w:type="spellStart"/>
       <w:r>
         <w:rPr>
           <w:rFonts w:eastAsia="Times New Roman"/>
           <w:szCs w:val="24"/>
         </w:rPr>
+        <w:t>Mencarelli</w:t>
+      </w:r>
+      <w:proofErr w:type="spellEnd"/>
+      <w:r>
+        <w:rPr>
+          <w:rFonts w:eastAsia="Times New Roman"/>
+          <w:szCs w:val="24"/>
+        </w:rPr>
+        <w:t>, 2012</w:t>
+      </w:r>
+      <w:r>
+        <w:rPr>
+          <w:rFonts w:eastAsia="Times New Roman"/>
+          <w:szCs w:val="24"/>
+        </w:rPr>
         <w:t>, p. 23</w:t>
       </w:r>
       <w:r>
@@ -19405,12 +19733,37 @@
         </w:rPr>
         <w:fldChar w:fldCharType="separate"/>
       </w:r>
+      <w:proofErr w:type="spellStart"/>
       <w:r>
         <w:rPr>
           <w:rFonts w:eastAsia="Times New Roman"/>
           <w:szCs w:val="24"/>
         </w:rPr>
-        <w:t xml:space="preserve">Grönroos &amp; Voima </w:t>
+        <w:t>Grönroos</w:t>
+      </w:r>
+      <w:proofErr w:type="spellEnd"/>
+      <w:r>
+        <w:rPr>
+          <w:rFonts w:eastAsia="Times New Roman"/>
+          <w:szCs w:val="24"/>
+        </w:rPr>
+        <w:t xml:space="preserve"> &amp; </w:t>
+      </w:r>
+      <w:proofErr w:type="spellStart"/>
+      <w:r>
+        <w:rPr>
+          <w:rFonts w:eastAsia="Times New Roman"/>
+          <w:szCs w:val="24"/>
+        </w:rPr>
+        <w:t>Voima</w:t>
+      </w:r>
+      <w:proofErr w:type="spellEnd"/>
+      <w:r>
+        <w:rPr>
+          <w:rFonts w:eastAsia="Times New Roman"/>
+          <w:szCs w:val="24"/>
+        </w:rPr>
+        <w:t xml:space="preserve"> </w:t>
       </w:r>
       <w:r>
         <w:rPr>
@@ -22659,7 +23012,39 @@
           <w:rFonts w:eastAsia="Times New Roman"/>
           <w:color w:val="000000"/>
         </w:rPr>
-        <w:t>(Echeverri &amp; Skålén, 2011)</w:t>
+        <w:t>(</w:t>
+      </w:r>
+      <w:proofErr w:type="spellStart"/>
+      <w:r>
+        <w:rPr>
+          <w:rFonts w:eastAsia="Times New Roman"/>
+          <w:color w:val="000000"/>
+        </w:rPr>
+        <w:t>Echeverri</w:t>
+      </w:r>
+      <w:proofErr w:type="spellEnd"/>
+      <w:r>
+        <w:rPr>
+          <w:rFonts w:eastAsia="Times New Roman"/>
+          <w:color w:val="000000"/>
+        </w:rPr>
+        <w:t xml:space="preserve"> &amp; </w:t>
+      </w:r>
+      <w:proofErr w:type="spellStart"/>
+      <w:r>
+        <w:rPr>
+          <w:rFonts w:eastAsia="Times New Roman"/>
+          <w:color w:val="000000"/>
+        </w:rPr>
+        <w:t>Skålén</w:t>
+      </w:r>
+      <w:proofErr w:type="spellEnd"/>
+      <w:r>
+        <w:rPr>
+          <w:rFonts w:eastAsia="Times New Roman"/>
+          <w:color w:val="000000"/>
+        </w:rPr>
+        <w:t>, 2011)</w:t>
       </w:r>
       <w:r>
         <w:fldChar w:fldCharType="end"/>
@@ -22695,7 +23080,39 @@
           <w:rFonts w:eastAsia="Times New Roman"/>
           <w:color w:val="000000"/>
         </w:rPr>
-        <w:t>(Lumivalo et al., 2024; Plé &amp; Cáceres, 2010)</w:t>
+        <w:t>(</w:t>
+      </w:r>
+      <w:proofErr w:type="spellStart"/>
+      <w:r>
+        <w:rPr>
+          <w:rFonts w:eastAsia="Times New Roman"/>
+          <w:color w:val="000000"/>
+        </w:rPr>
+        <w:t>Lumivalo</w:t>
+      </w:r>
+      <w:proofErr w:type="spellEnd"/>
+      <w:r>
+        <w:rPr>
+          <w:rFonts w:eastAsia="Times New Roman"/>
+          <w:color w:val="000000"/>
+        </w:rPr>
+        <w:t xml:space="preserve"> et al., 2024; </w:t>
+      </w:r>
+      <w:proofErr w:type="spellStart"/>
+      <w:r>
+        <w:rPr>
+          <w:rFonts w:eastAsia="Times New Roman"/>
+          <w:color w:val="000000"/>
+        </w:rPr>
+        <w:t>Plé</w:t>
+      </w:r>
+      <w:proofErr w:type="spellEnd"/>
+      <w:r>
+        <w:rPr>
+          <w:rFonts w:eastAsia="Times New Roman"/>
+          <w:color w:val="000000"/>
+        </w:rPr>
+        <w:t xml:space="preserve"> &amp; Cáceres, 2010)</w:t>
       </w:r>
       <w:r>
         <w:fldChar w:fldCharType="end"/>
@@ -22783,7 +23200,39 @@
           <w:rFonts w:eastAsia="Times New Roman"/>
           <w:szCs w:val="24"/>
         </w:rPr>
-        <w:t>(Echeverri &amp; Skålén, 2011)</w:t>
+        <w:t>(</w:t>
+      </w:r>
+      <w:proofErr w:type="spellStart"/>
+      <w:r>
+        <w:rPr>
+          <w:rFonts w:eastAsia="Times New Roman"/>
+          <w:szCs w:val="24"/>
+        </w:rPr>
+        <w:t>Echeverri</w:t>
+      </w:r>
+      <w:proofErr w:type="spellEnd"/>
+      <w:r>
+        <w:rPr>
+          <w:rFonts w:eastAsia="Times New Roman"/>
+          <w:szCs w:val="24"/>
+        </w:rPr>
+        <w:t xml:space="preserve"> &amp; </w:t>
+      </w:r>
+      <w:proofErr w:type="spellStart"/>
+      <w:r>
+        <w:rPr>
+          <w:rFonts w:eastAsia="Times New Roman"/>
+          <w:szCs w:val="24"/>
+        </w:rPr>
+        <w:t>Skålén</w:t>
+      </w:r>
+      <w:proofErr w:type="spellEnd"/>
+      <w:r>
+        <w:rPr>
+          <w:rFonts w:eastAsia="Times New Roman"/>
+          <w:szCs w:val="24"/>
+        </w:rPr>
+        <w:t>, 2011)</w:t>
       </w:r>
       <w:r>
         <w:fldChar w:fldCharType="end"/>
@@ -23069,7 +23518,23 @@
           <w:rFonts w:eastAsia="Times New Roman"/>
           <w:szCs w:val="24"/>
         </w:rPr>
-        <w:t>(Plé &amp; Cáceres, 2010)</w:t>
+        <w:t>(</w:t>
+      </w:r>
+      <w:proofErr w:type="spellStart"/>
+      <w:r>
+        <w:rPr>
+          <w:rFonts w:eastAsia="Times New Roman"/>
+          <w:szCs w:val="24"/>
+        </w:rPr>
+        <w:t>Plé</w:t>
+      </w:r>
+      <w:proofErr w:type="spellEnd"/>
+      <w:r>
+        <w:rPr>
+          <w:rFonts w:eastAsia="Times New Roman"/>
+          <w:szCs w:val="24"/>
+        </w:rPr>
+        <w:t xml:space="preserve"> &amp; Cáceres, 2010)</w:t>
       </w:r>
       <w:r>
         <w:fldChar w:fldCharType="end"/>
@@ -24020,9 +24485,15 @@
       <w:r>
         <w:rPr>
           <w:rFonts w:eastAsia="Times New Roman"/>
-          <w:lang w:val="en-US"/>
-        </w:rPr>
-        <w:instrText xml:space="preserve">l perceived value. Based on signaling theory, we conceptualize and empirically support links between the three dimensions of perceived value and its antecedents (perceived corporate reputation, perceived corporate credibility, and perceived relationship quality) and outcomes (satisfaction and loyalty). The results of a survey involving 228 business clients reveal differences in links between value antecedents and the three perceived value dimensions: while perceived corporate credibility and relationship quality impact all dimensions, perceived corporate reputation impacts only perceived emotional value. Results of our study help in understanding how satisfaction and loyalty are viewed as perceived value outcomes; apart from functional value, emotional and social values play a significant role in the satisfaction and loyalty of professional business services clients.","call-number":"2","citation-key":"arslanagic-kalajdzicPerceivedValueMore2017","container-title":"Industrial Marketing Management","DOI":"10.1016/j.indmarman.2017.05.005","ISSN":"0019-8501","journalAbbreviation":"Industrial Marketing Management","page":"47-58","source":"ScienceDirect","title":"Is perceived value more than value for money in professional business services?","volume":"65","author":[{"family":"Arslanagic-Kalajdzic","given":"Maja"},{"family":"Zabkar","given":"Vesna"}],"issued":{"date-parts":[["2017",8,1]]}}}],"schema":"https://github.com/citation-style-language/schema/raw/master/csl-citation.json"} </w:instrText>
+        </w:rPr>
+        <w:instrText>l perceived value. Based on signaling theory, we conceptualize and empirically support links between the three dimensions of perceived value and its antecedents (perceived corporate reputation, perceived corporate credibility, and perceiv</w:instrText>
+      </w:r>
+      <w:r>
+        <w:rPr>
+          <w:rFonts w:eastAsia="Times New Roman"/>
+          <w:lang w:val="en-US"/>
+        </w:rPr>
+        <w:instrText xml:space="preserve">ed relationship quality) and outcomes (satisfaction and loyalty). The results of a survey involving 228 business clients reveal differences in links between value antecedents and the three perceived value dimensions: while perceived corporate credibility and relationship quality impact all dimensions, perceived corporate reputation impacts only perceived emotional value. Results of our study help in understanding how satisfaction and loyalty are viewed as perceived value outcomes; apart from functional value, emotional and social values play a significant role in the satisfaction and loyalty of professional business services clients.","call-number":"2","citation-key":"arslanagic-kalajdzicPerceivedValueMore2017","container-title":"Industrial Marketing Management","DOI":"10.1016/j.indmarman.2017.05.005","ISSN":"0019-8501","journalAbbreviation":"Industrial Marketing Management","page":"47-58","source":"ScienceDirect","title":"Is perceived value more than value for money in professional business services?","volume":"65","author":[{"family":"Arslanagic-Kalajdzic","given":"Maja"},{"family":"Zabkar","given":"Vesna"}],"issued":{"date-parts":[["2017",8,1]]}}}],"schema":"https://github.com/citation-style-language/schema/raw/master/csl-citation.json"} </w:instrText>
       </w:r>
       <w:r>
         <w:rPr>
@@ -24250,237 +24721,34 @@
         <w:rPr>
           <w:sz w:val="16"/>
           <w:szCs w:val="16"/>
-          <w:lang w:val="en-US"/>
-        </w:rPr>
-        <w:t xml:space="preserve">La transparence substantive (P2), </w:t>
-      </w:r>
-      <w:proofErr w:type="spellStart"/>
+        </w:rPr>
+        <w:t xml:space="preserve">La transparence substantive (P2), placée immédiatement sous l'enchevêtrement, en désigne le traitement substantif </w:t>
+      </w:r>
       <w:r>
         <w:rPr>
           <w:sz w:val="16"/>
           <w:szCs w:val="16"/>
-          <w:lang w:val="en-US"/>
-        </w:rPr>
-        <w:t>placée</w:t>
-      </w:r>
-      <w:proofErr w:type="spellEnd"/>
+        </w:rPr>
+        <w:t>(</w:t>
+      </w:r>
       <w:r>
         <w:rPr>
           <w:sz w:val="16"/>
           <w:szCs w:val="16"/>
-          <w:lang w:val="en-US"/>
-        </w:rPr>
-        <w:t xml:space="preserve"> </w:t>
-      </w:r>
-      <w:proofErr w:type="spellStart"/>
+        </w:rPr>
+        <w:t>par opposition à une transparence performative</w:t>
+      </w:r>
       <w:r>
         <w:rPr>
           <w:sz w:val="16"/>
           <w:szCs w:val="16"/>
-          <w:lang w:val="en-US"/>
-        </w:rPr>
-        <w:t>immédiatement</w:t>
-      </w:r>
-      <w:proofErr w:type="spellEnd"/>
+        </w:rPr>
+        <w:t>, i.e. divulgation de l’usage de l’IA)</w:t>
+      </w:r>
       <w:r>
         <w:rPr>
           <w:sz w:val="16"/>
           <w:szCs w:val="16"/>
-          <w:lang w:val="en-US"/>
-        </w:rPr>
-        <w:t xml:space="preserve"> sous </w:t>
-      </w:r>
-      <w:proofErr w:type="spellStart"/>
-      <w:r>
-        <w:rPr>
-          <w:sz w:val="16"/>
-          <w:szCs w:val="16"/>
-          <w:lang w:val="en-US"/>
-        </w:rPr>
-        <w:t>l'enchevêtrement</w:t>
-      </w:r>
-      <w:proofErr w:type="spellEnd"/>
-      <w:r>
-        <w:rPr>
-          <w:sz w:val="16"/>
-          <w:szCs w:val="16"/>
-          <w:lang w:val="en-US"/>
-        </w:rPr>
-        <w:t xml:space="preserve">, </w:t>
-      </w:r>
-      <w:proofErr w:type="spellStart"/>
-      <w:r>
-        <w:rPr>
-          <w:sz w:val="16"/>
-          <w:szCs w:val="16"/>
-          <w:lang w:val="en-US"/>
-        </w:rPr>
-        <w:t>en</w:t>
-      </w:r>
-      <w:proofErr w:type="spellEnd"/>
-      <w:r>
-        <w:rPr>
-          <w:sz w:val="16"/>
-          <w:szCs w:val="16"/>
-          <w:lang w:val="en-US"/>
-        </w:rPr>
-        <w:t xml:space="preserve"> </w:t>
-      </w:r>
-      <w:proofErr w:type="spellStart"/>
-      <w:r>
-        <w:rPr>
-          <w:sz w:val="16"/>
-          <w:szCs w:val="16"/>
-          <w:lang w:val="en-US"/>
-        </w:rPr>
-        <w:t>désigne</w:t>
-      </w:r>
-      <w:proofErr w:type="spellEnd"/>
-      <w:r>
-        <w:rPr>
-          <w:sz w:val="16"/>
-          <w:szCs w:val="16"/>
-          <w:lang w:val="en-US"/>
-        </w:rPr>
-        <w:t xml:space="preserve"> le </w:t>
-      </w:r>
-      <w:proofErr w:type="spellStart"/>
-      <w:r>
-        <w:rPr>
-          <w:sz w:val="16"/>
-          <w:szCs w:val="16"/>
-          <w:lang w:val="en-US"/>
-        </w:rPr>
-        <w:t>traitement</w:t>
-      </w:r>
-      <w:proofErr w:type="spellEnd"/>
-      <w:r>
-        <w:rPr>
-          <w:sz w:val="16"/>
-          <w:szCs w:val="16"/>
-          <w:lang w:val="en-US"/>
-        </w:rPr>
-        <w:t xml:space="preserve"> </w:t>
-      </w:r>
-      <w:proofErr w:type="spellStart"/>
-      <w:r>
-        <w:rPr>
-          <w:sz w:val="16"/>
-          <w:szCs w:val="16"/>
-          <w:lang w:val="en-US"/>
-        </w:rPr>
-        <w:t>substantif</w:t>
-      </w:r>
-      <w:proofErr w:type="spellEnd"/>
-      <w:r>
-        <w:rPr>
-          <w:sz w:val="16"/>
-          <w:szCs w:val="16"/>
-          <w:lang w:val="en-US"/>
-        </w:rPr>
-        <w:t xml:space="preserve"> </w:t>
-      </w:r>
-      <w:r>
-        <w:rPr>
-          <w:sz w:val="16"/>
-          <w:szCs w:val="16"/>
-          <w:lang w:val="en-US"/>
-        </w:rPr>
-        <w:t>(</w:t>
-      </w:r>
-      <w:r>
-        <w:rPr>
-          <w:sz w:val="16"/>
-          <w:szCs w:val="16"/>
-          <w:lang w:val="en-US"/>
-        </w:rPr>
-        <w:t xml:space="preserve">par opposition à </w:t>
-      </w:r>
-      <w:proofErr w:type="spellStart"/>
-      <w:r>
-        <w:rPr>
-          <w:sz w:val="16"/>
-          <w:szCs w:val="16"/>
-          <w:lang w:val="en-US"/>
-        </w:rPr>
-        <w:t>une</w:t>
-      </w:r>
-      <w:proofErr w:type="spellEnd"/>
-      <w:r>
-        <w:rPr>
-          <w:sz w:val="16"/>
-          <w:szCs w:val="16"/>
-          <w:lang w:val="en-US"/>
-        </w:rPr>
-        <w:t xml:space="preserve"> transparence performative</w:t>
-      </w:r>
-      <w:r>
-        <w:rPr>
-          <w:sz w:val="16"/>
-          <w:szCs w:val="16"/>
-          <w:lang w:val="en-US"/>
-        </w:rPr>
-        <w:t xml:space="preserve">, </w:t>
-      </w:r>
-      <w:proofErr w:type="gramStart"/>
-      <w:r>
-        <w:rPr>
-          <w:sz w:val="16"/>
-          <w:szCs w:val="16"/>
-          <w:lang w:val="en-US"/>
-        </w:rPr>
-        <w:t>i.e.</w:t>
-      </w:r>
-      <w:proofErr w:type="gramEnd"/>
-      <w:r>
-        <w:rPr>
-          <w:sz w:val="16"/>
-          <w:szCs w:val="16"/>
-          <w:lang w:val="en-US"/>
-        </w:rPr>
-        <w:t xml:space="preserve"> divulgation de </w:t>
-      </w:r>
-      <w:proofErr w:type="spellStart"/>
-      <w:r>
-        <w:rPr>
-          <w:sz w:val="16"/>
-          <w:szCs w:val="16"/>
-          <w:lang w:val="en-US"/>
-        </w:rPr>
-        <w:t>l’usage</w:t>
-      </w:r>
-      <w:proofErr w:type="spellEnd"/>
-      <w:r>
-        <w:rPr>
-          <w:sz w:val="16"/>
-          <w:szCs w:val="16"/>
-          <w:lang w:val="en-US"/>
-        </w:rPr>
-        <w:t xml:space="preserve"> de </w:t>
-      </w:r>
-      <w:proofErr w:type="spellStart"/>
-      <w:r>
-        <w:rPr>
-          <w:sz w:val="16"/>
-          <w:szCs w:val="16"/>
-          <w:lang w:val="en-US"/>
-        </w:rPr>
-        <w:t>l’IA</w:t>
-      </w:r>
-      <w:proofErr w:type="spellEnd"/>
-      <w:r>
-        <w:rPr>
-          <w:sz w:val="16"/>
-          <w:szCs w:val="16"/>
-          <w:lang w:val="en-US"/>
-        </w:rPr>
-        <w:t>)</w:t>
-      </w:r>
-      <w:r>
-        <w:rPr>
-          <w:sz w:val="16"/>
-          <w:szCs w:val="16"/>
-          <w:lang w:val="en-US"/>
         </w:rPr>
         <w:t xml:space="preserve">. </w:t>
       </w:r>
@@ -24768,7 +25036,39 @@
           <w:rFonts w:eastAsia="Times New Roman"/>
           <w:szCs w:val="24"/>
         </w:rPr>
-        <w:t>(Grönroos &amp; Voima, 2013)</w:t>
+        <w:t>(</w:t>
+      </w:r>
+      <w:proofErr w:type="spellStart"/>
+      <w:r>
+        <w:rPr>
+          <w:rFonts w:eastAsia="Times New Roman"/>
+          <w:szCs w:val="24"/>
+        </w:rPr>
+        <w:t>Grönroos</w:t>
+      </w:r>
+      <w:proofErr w:type="spellEnd"/>
+      <w:r>
+        <w:rPr>
+          <w:rFonts w:eastAsia="Times New Roman"/>
+          <w:szCs w:val="24"/>
+        </w:rPr>
+        <w:t xml:space="preserve"> &amp; </w:t>
+      </w:r>
+      <w:proofErr w:type="spellStart"/>
+      <w:r>
+        <w:rPr>
+          <w:rFonts w:eastAsia="Times New Roman"/>
+          <w:szCs w:val="24"/>
+        </w:rPr>
+        <w:t>Voima</w:t>
+      </w:r>
+      <w:proofErr w:type="spellEnd"/>
+      <w:r>
+        <w:rPr>
+          <w:rFonts w:eastAsia="Times New Roman"/>
+          <w:szCs w:val="24"/>
+        </w:rPr>
+        <w:t>, 2013)</w:t>
       </w:r>
       <w:r>
         <w:fldChar w:fldCharType="end"/>
@@ -25241,7 +25541,71 @@
           <w:rFonts w:eastAsia="Times New Roman"/>
           <w:szCs w:val="24"/>
         </w:rPr>
-        <w:t>(Grönroos &amp; Voima, 2013; S. L. Vargo &amp; Lusch, 2016)</w:t>
+        <w:t>(</w:t>
+      </w:r>
+      <w:proofErr w:type="spellStart"/>
+      <w:r>
+        <w:rPr>
+          <w:rFonts w:eastAsia="Times New Roman"/>
+          <w:szCs w:val="24"/>
+        </w:rPr>
+        <w:t>Grönroos</w:t>
+      </w:r>
+      <w:proofErr w:type="spellEnd"/>
+      <w:r>
+        <w:rPr>
+          <w:rFonts w:eastAsia="Times New Roman"/>
+          <w:szCs w:val="24"/>
+        </w:rPr>
+        <w:t xml:space="preserve"> &amp; </w:t>
+      </w:r>
+      <w:proofErr w:type="spellStart"/>
+      <w:r>
+        <w:rPr>
+          <w:rFonts w:eastAsia="Times New Roman"/>
+          <w:szCs w:val="24"/>
+        </w:rPr>
+        <w:t>Voima</w:t>
+      </w:r>
+      <w:proofErr w:type="spellEnd"/>
+      <w:r>
+        <w:rPr>
+          <w:rFonts w:eastAsia="Times New Roman"/>
+          <w:szCs w:val="24"/>
+        </w:rPr>
+        <w:t xml:space="preserve">, 2013; S. L. </w:t>
+      </w:r>
+      <w:proofErr w:type="spellStart"/>
+      <w:r>
+        <w:rPr>
+          <w:rFonts w:eastAsia="Times New Roman"/>
+          <w:szCs w:val="24"/>
+        </w:rPr>
+        <w:t>Vargo</w:t>
+      </w:r>
+      <w:proofErr w:type="spellEnd"/>
+      <w:r>
+        <w:rPr>
+          <w:rFonts w:eastAsia="Times New Roman"/>
+          <w:szCs w:val="24"/>
+        </w:rPr>
+        <w:t xml:space="preserve"> &amp; </w:t>
+      </w:r>
+      <w:proofErr w:type="spellStart"/>
+      <w:r>
+        <w:rPr>
+          <w:rFonts w:eastAsia="Times New Roman"/>
+          <w:szCs w:val="24"/>
+        </w:rPr>
+        <w:t>Lusch</w:t>
+      </w:r>
+      <w:proofErr w:type="spellEnd"/>
+      <w:r>
+        <w:rPr>
+          <w:rFonts w:eastAsia="Times New Roman"/>
+          <w:szCs w:val="24"/>
+        </w:rPr>
+        <w:t>, 2016)</w:t>
       </w:r>
       <w:r>
         <w:fldChar w:fldCharType="end"/>
@@ -26654,7 +27018,21 @@
         <w:rPr>
           <w:noProof/>
         </w:rPr>
-        <w:t>(Plenge et al., 2008)</w:t>
+        <w:t>(</w:t>
+      </w:r>
+      <w:proofErr w:type="spellStart"/>
+      <w:r>
+        <w:rPr>
+          <w:noProof/>
+        </w:rPr>
+        <w:t>Plenge</w:t>
+      </w:r>
+      <w:proofErr w:type="spellEnd"/>
+      <w:r>
+        <w:rPr>
+          <w:noProof/>
+        </w:rPr>
+        <w:t xml:space="preserve"> et al., 2008)</w:t>
       </w:r>
       <w:r>
         <w:fldChar w:fldCharType="end"/>
@@ -27512,7 +27890,15 @@
       </w:r>
       <w:proofErr w:type="spellEnd"/>
       <w:r>
-        <w:t xml:space="preserve"> &amp; Voima, 2013)</w:t>
+        <w:t xml:space="preserve"> &amp; </w:t>
+      </w:r>
+      <w:proofErr w:type="spellStart"/>
+      <w:r>
+        <w:t>Voima</w:t>
+      </w:r>
+      <w:proofErr w:type="spellEnd"/>
+      <w:r>
+        <w:t>, 2013)</w:t>
       </w:r>
       <w:r>
         <w:fldChar w:fldCharType="end"/>
@@ -29527,7 +29913,23 @@
           <w:rFonts w:eastAsia="Times New Roman"/>
           <w:szCs w:val="24"/>
         </w:rPr>
-        <w:t>(Schön, 1983)</w:t>
+        <w:t>(</w:t>
+      </w:r>
+      <w:proofErr w:type="spellStart"/>
+      <w:r>
+        <w:rPr>
+          <w:rFonts w:eastAsia="Times New Roman"/>
+          <w:szCs w:val="24"/>
+        </w:rPr>
+        <w:t>Schön</w:t>
+      </w:r>
+      <w:proofErr w:type="spellEnd"/>
+      <w:r>
+        <w:rPr>
+          <w:rFonts w:eastAsia="Times New Roman"/>
+          <w:szCs w:val="24"/>
+        </w:rPr>
+        <w:t>, 1983)</w:t>
       </w:r>
       <w:r>
         <w:rPr>
@@ -30257,7 +30659,7 @@
             <wp:extent cx="4488325" cy="2979487"/>
             <wp:effectExtent l="0" t="0" r="0" b="5080"/>
             <wp:docPr id="541714034" name="Image 1">
-              <a:hlinkClick xmlns:a="http://schemas.openxmlformats.org/drawingml/2006/main" r:id="rId15"/>
+              <a:hlinkClick xmlns:a="http://schemas.openxmlformats.org/drawingml/2006/main" r:id="rId7"/>
             </wp:docPr>
             <wp:cNvGraphicFramePr>
               <a:graphicFrameLocks xmlns:a="http://schemas.openxmlformats.org/drawingml/2006/main" noChangeAspect="1"/>
@@ -30267,7 +30669,7 @@
                 <pic:pic xmlns:pic="http://schemas.openxmlformats.org/drawingml/2006/picture">
                   <pic:nvPicPr>
                     <pic:cNvPr id="541714034" name="Image 1">
-                      <a:hlinkClick r:id="rId15"/>
+                      <a:hlinkClick r:id="rId7"/>
                     </pic:cNvPr>
                     <pic:cNvPicPr/>
                   </pic:nvPicPr>
@@ -31572,7 +31974,7 @@
           <w:rFonts w:eastAsia="Times New Roman"/>
           <w:noProof/>
         </w:rPr>
-        <w:pict w14:anchorId="488B1387">
+        <w:pict w14:anchorId="6CBB2E35">
           <v:rect id="_x0000_i1025" alt="" style="width:453.6pt;height:.05pt;mso-width-percent:0;mso-height-percent:0;mso-width-percent:0;mso-height-percent:0" o:hralign="center" o:hrstd="t" o:hr="t" fillcolor="#a0a0a0" stroked="f"/>
         </w:pict>
       </w:r>
@@ -31619,9 +32021,6 @@
         <w:fldChar w:fldCharType="begin"/>
       </w:r>
       <w:r>
-        <w:rPr>
-          <w:lang w:val="en-US"/>
-        </w:rPr>
         <w:instrText xml:space="preserve"> ADDIN ZOTERO_BIBL {"uncited":[],"omitted":[],"custom":[]} CSL_BIBLIOGRAPHY </w:instrText>
       </w:r>
       <w:r>
@@ -31631,7 +32030,6 @@
       <w:r>
         <w:rPr>
           <w:rFonts w:eastAsia="Times New Roman"/>
-          <w:lang w:val="en-US"/>
         </w:rPr>
         <w:t>Aarikka-Stenroos</w:t>
       </w:r>
@@ -31639,7 +32037,6 @@
       <w:r>
         <w:rPr>
           <w:rFonts w:eastAsia="Times New Roman"/>
-          <w:lang w:val="en-US"/>
         </w:rPr>
         <w:t xml:space="preserve">, L., &amp; </w:t>
       </w:r>
@@ -31647,7 +32044,6 @@
       <w:r>
         <w:rPr>
           <w:rFonts w:eastAsia="Times New Roman"/>
-          <w:lang w:val="en-US"/>
         </w:rPr>
         <w:t>Jaakkola</w:t>
       </w:r>
@@ -31655,9 +32051,15 @@
       <w:r>
         <w:rPr>
           <w:rFonts w:eastAsia="Times New Roman"/>
-          <w:lang w:val="en-US"/>
-        </w:rPr>
-        <w:t xml:space="preserve">, E. (2012). Value co-creation in knowledge intensive business </w:t>
+        </w:rPr>
+        <w:t xml:space="preserve">, E. (2012). </w:t>
+      </w:r>
+      <w:r>
+        <w:rPr>
+          <w:rFonts w:eastAsia="Times New Roman"/>
+          <w:lang w:val="en-US"/>
+        </w:rPr>
+        <w:t xml:space="preserve">Value co-creation in knowledge intensive business </w:t>
       </w:r>
       <w:proofErr w:type="gramStart"/>
       <w:r>

</xml_diff>